<commit_message>
Avatars: Multiavatar set replaces the robots (same codes a01..a12, no data change); DiceBear removed; credit 'Avatars by Multiavatar.com' under the picker and in the README (Multiavatar License v1.0)
Co-Authored-By: Claude Opus 5.5 (1M context) <noreply@anthropic.com>
</commit_message>
<xml_diff>
--- a/docs/07-ui-ux/ZP-DOC-07_UI-UX-Design.docx
+++ b/docs/07-ui-ux/ZP-DOC-07_UI-UX-Design.docx
@@ -1843,7 +1843,7 @@
     <w:sdt>
       <w:sdtPr>
         <w:alias w:val="Contents"/>
-        <w:id w:val="-69275293"/>
+        <w:id w:val="760958949"/>
       </w:sdtPr>
       <w:sdtEndPr/>
       <w:sdtContent>
@@ -1872,7 +1872,7 @@
           <w:r>
             <w:fldChar w:fldCharType="separate"/>
           </w:r>
-          <w:hyperlink w:anchor="_Toc242656454" w:history="1">
+          <w:hyperlink w:anchor="_Toc242888138" w:history="1">
             <w:r>
               <w:rPr>
                 <w:rStyle w:val="Hyperlink"/>
@@ -1896,7 +1896,7 @@
               <w:rPr>
                 <w:noProof/>
               </w:rPr>
-              <w:instrText xml:space="preserve"> PAGEREF _Toc242656454 \h </w:instrText>
+              <w:instrText xml:space="preserve"> PAGEREF _Toc242888138 \h </w:instrText>
             </w:r>
             <w:r>
               <w:rPr>
@@ -1939,7 +1939,7 @@
               <w14:ligatures w14:val="standardContextual"/>
             </w:rPr>
           </w:pPr>
-          <w:hyperlink w:anchor="_Toc242656455" w:history="1">
+          <w:hyperlink w:anchor="_Toc242888139" w:history="1">
             <w:r>
               <w:rPr>
                 <w:rStyle w:val="Hyperlink"/>
@@ -1963,7 +1963,7 @@
               <w:rPr>
                 <w:noProof/>
               </w:rPr>
-              <w:instrText xml:space="preserve"> PAGEREF _Toc242656455 \h </w:instrText>
+              <w:instrText xml:space="preserve"> PAGEREF _Toc242888139 \h </w:instrText>
             </w:r>
             <w:r>
               <w:rPr>
@@ -2006,7 +2006,7 @@
               <w14:ligatures w14:val="standardContextual"/>
             </w:rPr>
           </w:pPr>
-          <w:hyperlink w:anchor="_Toc242656456" w:history="1">
+          <w:hyperlink w:anchor="_Toc242888140" w:history="1">
             <w:r>
               <w:rPr>
                 <w:rStyle w:val="Hyperlink"/>
@@ -2030,7 +2030,7 @@
               <w:rPr>
                 <w:noProof/>
               </w:rPr>
-              <w:instrText xml:space="preserve"> PAGEREF _Toc242656456 \h </w:instrText>
+              <w:instrText xml:space="preserve"> PAGEREF _Toc242888140 \h </w:instrText>
             </w:r>
             <w:r>
               <w:rPr>
@@ -2073,7 +2073,7 @@
               <w14:ligatures w14:val="standardContextual"/>
             </w:rPr>
           </w:pPr>
-          <w:hyperlink w:anchor="_Toc242656457" w:history="1">
+          <w:hyperlink w:anchor="_Toc242888141" w:history="1">
             <w:r>
               <w:rPr>
                 <w:rStyle w:val="Hyperlink"/>
@@ -2097,7 +2097,7 @@
               <w:rPr>
                 <w:noProof/>
               </w:rPr>
-              <w:instrText xml:space="preserve"> PAGEREF _Toc242656457 \h </w:instrText>
+              <w:instrText xml:space="preserve"> PAGEREF _Toc242888141 \h </w:instrText>
             </w:r>
             <w:r>
               <w:rPr>
@@ -2140,7 +2140,7 @@
               <w14:ligatures w14:val="standardContextual"/>
             </w:rPr>
           </w:pPr>
-          <w:hyperlink w:anchor="_Toc242656458" w:history="1">
+          <w:hyperlink w:anchor="_Toc242888142" w:history="1">
             <w:r>
               <w:rPr>
                 <w:rStyle w:val="Hyperlink"/>
@@ -2164,7 +2164,7 @@
               <w:rPr>
                 <w:noProof/>
               </w:rPr>
-              <w:instrText xml:space="preserve"> PAGEREF _Toc242656458 \h </w:instrText>
+              <w:instrText xml:space="preserve"> PAGEREF _Toc242888142 \h </w:instrText>
             </w:r>
             <w:r>
               <w:rPr>
@@ -2207,7 +2207,7 @@
               <w14:ligatures w14:val="standardContextual"/>
             </w:rPr>
           </w:pPr>
-          <w:hyperlink w:anchor="_Toc242656459" w:history="1">
+          <w:hyperlink w:anchor="_Toc242888143" w:history="1">
             <w:r>
               <w:rPr>
                 <w:rStyle w:val="Hyperlink"/>
@@ -2231,7 +2231,7 @@
               <w:rPr>
                 <w:noProof/>
               </w:rPr>
-              <w:instrText xml:space="preserve"> PAGEREF _Toc242656459 \h </w:instrText>
+              <w:instrText xml:space="preserve"> PAGEREF _Toc242888143 \h </w:instrText>
             </w:r>
             <w:r>
               <w:rPr>
@@ -2274,7 +2274,7 @@
               <w14:ligatures w14:val="standardContextual"/>
             </w:rPr>
           </w:pPr>
-          <w:hyperlink w:anchor="_Toc242656460" w:history="1">
+          <w:hyperlink w:anchor="_Toc242888144" w:history="1">
             <w:r>
               <w:rPr>
                 <w:rStyle w:val="Hyperlink"/>
@@ -2298,7 +2298,7 @@
               <w:rPr>
                 <w:noProof/>
               </w:rPr>
-              <w:instrText xml:space="preserve"> PAGEREF _Toc242656460 \h </w:instrText>
+              <w:instrText xml:space="preserve"> PAGEREF _Toc242888144 \h </w:instrText>
             </w:r>
             <w:r>
               <w:rPr>
@@ -2341,7 +2341,7 @@
               <w14:ligatures w14:val="standardContextual"/>
             </w:rPr>
           </w:pPr>
-          <w:hyperlink w:anchor="_Toc242656461" w:history="1">
+          <w:hyperlink w:anchor="_Toc242888145" w:history="1">
             <w:r>
               <w:rPr>
                 <w:rStyle w:val="Hyperlink"/>
@@ -2365,7 +2365,7 @@
               <w:rPr>
                 <w:noProof/>
               </w:rPr>
-              <w:instrText xml:space="preserve"> PAGEREF _Toc242656461 \h </w:instrText>
+              <w:instrText xml:space="preserve"> PAGEREF _Toc242888145 \h </w:instrText>
             </w:r>
             <w:r>
               <w:rPr>
@@ -2408,7 +2408,7 @@
               <w14:ligatures w14:val="standardContextual"/>
             </w:rPr>
           </w:pPr>
-          <w:hyperlink w:anchor="_Toc242656462" w:history="1">
+          <w:hyperlink w:anchor="_Toc242888146" w:history="1">
             <w:r>
               <w:rPr>
                 <w:rStyle w:val="Hyperlink"/>
@@ -2432,7 +2432,7 @@
               <w:rPr>
                 <w:noProof/>
               </w:rPr>
-              <w:instrText xml:space="preserve"> PAGEREF _Toc242656462 \h </w:instrText>
+              <w:instrText xml:space="preserve"> PAGEREF _Toc242888146 \h </w:instrText>
             </w:r>
             <w:r>
               <w:rPr>
@@ -2475,7 +2475,7 @@
               <w14:ligatures w14:val="standardContextual"/>
             </w:rPr>
           </w:pPr>
-          <w:hyperlink w:anchor="_Toc242656463" w:history="1">
+          <w:hyperlink w:anchor="_Toc242888147" w:history="1">
             <w:r>
               <w:rPr>
                 <w:rStyle w:val="Hyperlink"/>
@@ -2499,7 +2499,7 @@
               <w:rPr>
                 <w:noProof/>
               </w:rPr>
-              <w:instrText xml:space="preserve"> PAGEREF _Toc242656463 \h </w:instrText>
+              <w:instrText xml:space="preserve"> PAGEREF _Toc242888147 \h </w:instrText>
             </w:r>
             <w:r>
               <w:rPr>
@@ -2542,7 +2542,7 @@
               <w14:ligatures w14:val="standardContextual"/>
             </w:rPr>
           </w:pPr>
-          <w:hyperlink w:anchor="_Toc242656464" w:history="1">
+          <w:hyperlink w:anchor="_Toc242888148" w:history="1">
             <w:r>
               <w:rPr>
                 <w:rStyle w:val="Hyperlink"/>
@@ -2566,7 +2566,7 @@
               <w:rPr>
                 <w:noProof/>
               </w:rPr>
-              <w:instrText xml:space="preserve"> PAGEREF _Toc242656464 \h </w:instrText>
+              <w:instrText xml:space="preserve"> PAGEREF _Toc242888148 \h </w:instrText>
             </w:r>
             <w:r>
               <w:rPr>
@@ -2609,7 +2609,7 @@
               <w14:ligatures w14:val="standardContextual"/>
             </w:rPr>
           </w:pPr>
-          <w:hyperlink w:anchor="_Toc242656465" w:history="1">
+          <w:hyperlink w:anchor="_Toc242888149" w:history="1">
             <w:r>
               <w:rPr>
                 <w:rStyle w:val="Hyperlink"/>
@@ -2633,7 +2633,7 @@
               <w:rPr>
                 <w:noProof/>
               </w:rPr>
-              <w:instrText xml:space="preserve"> PAGEREF _Toc242656465 \h </w:instrText>
+              <w:instrText xml:space="preserve"> PAGEREF _Toc242888149 \h </w:instrText>
             </w:r>
             <w:r>
               <w:rPr>
@@ -2676,7 +2676,7 @@
               <w14:ligatures w14:val="standardContextual"/>
             </w:rPr>
           </w:pPr>
-          <w:hyperlink w:anchor="_Toc242656466" w:history="1">
+          <w:hyperlink w:anchor="_Toc242888150" w:history="1">
             <w:r>
               <w:rPr>
                 <w:rStyle w:val="Hyperlink"/>
@@ -2700,7 +2700,7 @@
               <w:rPr>
                 <w:noProof/>
               </w:rPr>
-              <w:instrText xml:space="preserve"> PAGEREF _Toc242656466 \h </w:instrText>
+              <w:instrText xml:space="preserve"> PAGEREF _Toc242888150 \h </w:instrText>
             </w:r>
             <w:r>
               <w:rPr>
@@ -2743,7 +2743,7 @@
               <w14:ligatures w14:val="standardContextual"/>
             </w:rPr>
           </w:pPr>
-          <w:hyperlink w:anchor="_Toc242656467" w:history="1">
+          <w:hyperlink w:anchor="_Toc242888151" w:history="1">
             <w:r>
               <w:rPr>
                 <w:rStyle w:val="Hyperlink"/>
@@ -2767,7 +2767,7 @@
               <w:rPr>
                 <w:noProof/>
               </w:rPr>
-              <w:instrText xml:space="preserve"> PAGEREF _Toc242656467 \h </w:instrText>
+              <w:instrText xml:space="preserve"> PAGEREF _Toc242888151 \h </w:instrText>
             </w:r>
             <w:r>
               <w:rPr>
@@ -2810,7 +2810,7 @@
               <w14:ligatures w14:val="standardContextual"/>
             </w:rPr>
           </w:pPr>
-          <w:hyperlink w:anchor="_Toc242656468" w:history="1">
+          <w:hyperlink w:anchor="_Toc242888152" w:history="1">
             <w:r>
               <w:rPr>
                 <w:rStyle w:val="Hyperlink"/>
@@ -2834,7 +2834,7 @@
               <w:rPr>
                 <w:noProof/>
               </w:rPr>
-              <w:instrText xml:space="preserve"> PAGEREF _Toc242656468 \h </w:instrText>
+              <w:instrText xml:space="preserve"> PAGEREF _Toc242888152 \h </w:instrText>
             </w:r>
             <w:r>
               <w:rPr>
@@ -2877,7 +2877,7 @@
               <w14:ligatures w14:val="standardContextual"/>
             </w:rPr>
           </w:pPr>
-          <w:hyperlink w:anchor="_Toc242656469" w:history="1">
+          <w:hyperlink w:anchor="_Toc242888153" w:history="1">
             <w:r>
               <w:rPr>
                 <w:rStyle w:val="Hyperlink"/>
@@ -2901,7 +2901,7 @@
               <w:rPr>
                 <w:noProof/>
               </w:rPr>
-              <w:instrText xml:space="preserve"> PAGEREF _Toc242656469 \h </w:instrText>
+              <w:instrText xml:space="preserve"> PAGEREF _Toc242888153 \h </w:instrText>
             </w:r>
             <w:r>
               <w:rPr>
@@ -2944,7 +2944,7 @@
               <w14:ligatures w14:val="standardContextual"/>
             </w:rPr>
           </w:pPr>
-          <w:hyperlink w:anchor="_Toc242656470" w:history="1">
+          <w:hyperlink w:anchor="_Toc242888154" w:history="1">
             <w:r>
               <w:rPr>
                 <w:rStyle w:val="Hyperlink"/>
@@ -2968,7 +2968,7 @@
               <w:rPr>
                 <w:noProof/>
               </w:rPr>
-              <w:instrText xml:space="preserve"> PAGEREF _Toc242656470 \h </w:instrText>
+              <w:instrText xml:space="preserve"> PAGEREF _Toc242888154 \h </w:instrText>
             </w:r>
             <w:r>
               <w:rPr>
@@ -3011,7 +3011,7 @@
               <w14:ligatures w14:val="standardContextual"/>
             </w:rPr>
           </w:pPr>
-          <w:hyperlink w:anchor="_Toc242656471" w:history="1">
+          <w:hyperlink w:anchor="_Toc242888155" w:history="1">
             <w:r>
               <w:rPr>
                 <w:rStyle w:val="Hyperlink"/>
@@ -3035,7 +3035,7 @@
               <w:rPr>
                 <w:noProof/>
               </w:rPr>
-              <w:instrText xml:space="preserve"> PAGEREF _Toc242656471 \h </w:instrText>
+              <w:instrText xml:space="preserve"> PAGEREF _Toc242888155 \h </w:instrText>
             </w:r>
             <w:r>
               <w:rPr>
@@ -3078,7 +3078,7 @@
               <w14:ligatures w14:val="standardContextual"/>
             </w:rPr>
           </w:pPr>
-          <w:hyperlink w:anchor="_Toc242656472" w:history="1">
+          <w:hyperlink w:anchor="_Toc242888156" w:history="1">
             <w:r>
               <w:rPr>
                 <w:rStyle w:val="Hyperlink"/>
@@ -3102,7 +3102,7 @@
               <w:rPr>
                 <w:noProof/>
               </w:rPr>
-              <w:instrText xml:space="preserve"> PAGEREF _Toc242656472 \h </w:instrText>
+              <w:instrText xml:space="preserve"> PAGEREF _Toc242888156 \h </w:instrText>
             </w:r>
             <w:r>
               <w:rPr>
@@ -3145,7 +3145,7 @@
               <w14:ligatures w14:val="standardContextual"/>
             </w:rPr>
           </w:pPr>
-          <w:hyperlink w:anchor="_Toc242656473" w:history="1">
+          <w:hyperlink w:anchor="_Toc242888157" w:history="1">
             <w:r>
               <w:rPr>
                 <w:rStyle w:val="Hyperlink"/>
@@ -3169,7 +3169,7 @@
               <w:rPr>
                 <w:noProof/>
               </w:rPr>
-              <w:instrText xml:space="preserve"> PAGEREF _Toc242656473 \h </w:instrText>
+              <w:instrText xml:space="preserve"> PAGEREF _Toc242888157 \h </w:instrText>
             </w:r>
             <w:r>
               <w:rPr>
@@ -3212,7 +3212,7 @@
               <w14:ligatures w14:val="standardContextual"/>
             </w:rPr>
           </w:pPr>
-          <w:hyperlink w:anchor="_Toc242656474" w:history="1">
+          <w:hyperlink w:anchor="_Toc242888158" w:history="1">
             <w:r>
               <w:rPr>
                 <w:rStyle w:val="Hyperlink"/>
@@ -3236,7 +3236,7 @@
               <w:rPr>
                 <w:noProof/>
               </w:rPr>
-              <w:instrText xml:space="preserve"> PAGEREF _Toc242656474 \h </w:instrText>
+              <w:instrText xml:space="preserve"> PAGEREF _Toc242888158 \h </w:instrText>
             </w:r>
             <w:r>
               <w:rPr>
@@ -3279,7 +3279,7 @@
               <w14:ligatures w14:val="standardContextual"/>
             </w:rPr>
           </w:pPr>
-          <w:hyperlink w:anchor="_Toc242656475" w:history="1">
+          <w:hyperlink w:anchor="_Toc242888159" w:history="1">
             <w:r>
               <w:rPr>
                 <w:rStyle w:val="Hyperlink"/>
@@ -3303,7 +3303,7 @@
               <w:rPr>
                 <w:noProof/>
               </w:rPr>
-              <w:instrText xml:space="preserve"> PAGEREF _Toc242656475 \h </w:instrText>
+              <w:instrText xml:space="preserve"> PAGEREF _Toc242888159 \h </w:instrText>
             </w:r>
             <w:r>
               <w:rPr>
@@ -3346,7 +3346,7 @@
               <w14:ligatures w14:val="standardContextual"/>
             </w:rPr>
           </w:pPr>
-          <w:hyperlink w:anchor="_Toc242656476" w:history="1">
+          <w:hyperlink w:anchor="_Toc242888160" w:history="1">
             <w:r>
               <w:rPr>
                 <w:rStyle w:val="Hyperlink"/>
@@ -3370,7 +3370,7 @@
               <w:rPr>
                 <w:noProof/>
               </w:rPr>
-              <w:instrText xml:space="preserve"> PAGEREF _Toc242656476 \h </w:instrText>
+              <w:instrText xml:space="preserve"> PAGEREF _Toc242888160 \h </w:instrText>
             </w:r>
             <w:r>
               <w:rPr>
@@ -3413,7 +3413,7 @@
               <w14:ligatures w14:val="standardContextual"/>
             </w:rPr>
           </w:pPr>
-          <w:hyperlink w:anchor="_Toc242656477" w:history="1">
+          <w:hyperlink w:anchor="_Toc242888161" w:history="1">
             <w:r>
               <w:rPr>
                 <w:rStyle w:val="Hyperlink"/>
@@ -3437,7 +3437,7 @@
               <w:rPr>
                 <w:noProof/>
               </w:rPr>
-              <w:instrText xml:space="preserve"> PAGEREF _Toc242656477 \h </w:instrText>
+              <w:instrText xml:space="preserve"> PAGEREF _Toc242888161 \h </w:instrText>
             </w:r>
             <w:r>
               <w:rPr>
@@ -3480,7 +3480,7 @@
               <w14:ligatures w14:val="standardContextual"/>
             </w:rPr>
           </w:pPr>
-          <w:hyperlink w:anchor="_Toc242656478" w:history="1">
+          <w:hyperlink w:anchor="_Toc242888162" w:history="1">
             <w:r>
               <w:rPr>
                 <w:rStyle w:val="Hyperlink"/>
@@ -3504,7 +3504,7 @@
               <w:rPr>
                 <w:noProof/>
               </w:rPr>
-              <w:instrText xml:space="preserve"> PAGEREF _Toc242656478 \h </w:instrText>
+              <w:instrText xml:space="preserve"> PAGEREF _Toc242888162 \h </w:instrText>
             </w:r>
             <w:r>
               <w:rPr>
@@ -3547,7 +3547,7 @@
               <w14:ligatures w14:val="standardContextual"/>
             </w:rPr>
           </w:pPr>
-          <w:hyperlink w:anchor="_Toc242656479" w:history="1">
+          <w:hyperlink w:anchor="_Toc242888163" w:history="1">
             <w:r>
               <w:rPr>
                 <w:rStyle w:val="Hyperlink"/>
@@ -3571,7 +3571,7 @@
               <w:rPr>
                 <w:noProof/>
               </w:rPr>
-              <w:instrText xml:space="preserve"> PAGEREF _Toc242656479 \h </w:instrText>
+              <w:instrText xml:space="preserve"> PAGEREF _Toc242888163 \h </w:instrText>
             </w:r>
             <w:r>
               <w:rPr>
@@ -3614,7 +3614,7 @@
               <w14:ligatures w14:val="standardContextual"/>
             </w:rPr>
           </w:pPr>
-          <w:hyperlink w:anchor="_Toc242656480" w:history="1">
+          <w:hyperlink w:anchor="_Toc242888164" w:history="1">
             <w:r>
               <w:rPr>
                 <w:rStyle w:val="Hyperlink"/>
@@ -3638,7 +3638,7 @@
               <w:rPr>
                 <w:noProof/>
               </w:rPr>
-              <w:instrText xml:space="preserve"> PAGEREF _Toc242656480 \h </w:instrText>
+              <w:instrText xml:space="preserve"> PAGEREF _Toc242888164 \h </w:instrText>
             </w:r>
             <w:r>
               <w:rPr>
@@ -3681,7 +3681,7 @@
               <w14:ligatures w14:val="standardContextual"/>
             </w:rPr>
           </w:pPr>
-          <w:hyperlink w:anchor="_Toc242656481" w:history="1">
+          <w:hyperlink w:anchor="_Toc242888165" w:history="1">
             <w:r>
               <w:rPr>
                 <w:rStyle w:val="Hyperlink"/>
@@ -3705,7 +3705,7 @@
               <w:rPr>
                 <w:noProof/>
               </w:rPr>
-              <w:instrText xml:space="preserve"> PAGEREF _Toc242656481 \h </w:instrText>
+              <w:instrText xml:space="preserve"> PAGEREF _Toc242888165 \h </w:instrText>
             </w:r>
             <w:r>
               <w:rPr>
@@ -3748,7 +3748,7 @@
               <w14:ligatures w14:val="standardContextual"/>
             </w:rPr>
           </w:pPr>
-          <w:hyperlink w:anchor="_Toc242656482" w:history="1">
+          <w:hyperlink w:anchor="_Toc242888166" w:history="1">
             <w:r>
               <w:rPr>
                 <w:rStyle w:val="Hyperlink"/>
@@ -3772,7 +3772,7 @@
               <w:rPr>
                 <w:noProof/>
               </w:rPr>
-              <w:instrText xml:space="preserve"> PAGEREF _Toc242656482 \h </w:instrText>
+              <w:instrText xml:space="preserve"> PAGEREF _Toc242888166 \h </w:instrText>
             </w:r>
             <w:r>
               <w:rPr>
@@ -3815,7 +3815,7 @@
               <w14:ligatures w14:val="standardContextual"/>
             </w:rPr>
           </w:pPr>
-          <w:hyperlink w:anchor="_Toc242656483" w:history="1">
+          <w:hyperlink w:anchor="_Toc242888167" w:history="1">
             <w:r>
               <w:rPr>
                 <w:rStyle w:val="Hyperlink"/>
@@ -3839,7 +3839,7 @@
               <w:rPr>
                 <w:noProof/>
               </w:rPr>
-              <w:instrText xml:space="preserve"> PAGEREF _Toc242656483 \h </w:instrText>
+              <w:instrText xml:space="preserve"> PAGEREF _Toc242888167 \h </w:instrText>
             </w:r>
             <w:r>
               <w:rPr>
@@ -3882,7 +3882,7 @@
               <w14:ligatures w14:val="standardContextual"/>
             </w:rPr>
           </w:pPr>
-          <w:hyperlink w:anchor="_Toc242656484" w:history="1">
+          <w:hyperlink w:anchor="_Toc242888168" w:history="1">
             <w:r>
               <w:rPr>
                 <w:rStyle w:val="Hyperlink"/>
@@ -3906,7 +3906,7 @@
               <w:rPr>
                 <w:noProof/>
               </w:rPr>
-              <w:instrText xml:space="preserve"> PAGEREF _Toc242656484 \h </w:instrText>
+              <w:instrText xml:space="preserve"> PAGEREF _Toc242888168 \h </w:instrText>
             </w:r>
             <w:r>
               <w:rPr>
@@ -3949,7 +3949,7 @@
               <w14:ligatures w14:val="standardContextual"/>
             </w:rPr>
           </w:pPr>
-          <w:hyperlink w:anchor="_Toc242656485" w:history="1">
+          <w:hyperlink w:anchor="_Toc242888169" w:history="1">
             <w:r>
               <w:rPr>
                 <w:rStyle w:val="Hyperlink"/>
@@ -3973,7 +3973,7 @@
               <w:rPr>
                 <w:noProof/>
               </w:rPr>
-              <w:instrText xml:space="preserve"> PAGEREF _Toc242656485 \h </w:instrText>
+              <w:instrText xml:space="preserve"> PAGEREF _Toc242888169 \h </w:instrText>
             </w:r>
             <w:r>
               <w:rPr>
@@ -4016,7 +4016,7 @@
               <w14:ligatures w14:val="standardContextual"/>
             </w:rPr>
           </w:pPr>
-          <w:hyperlink w:anchor="_Toc242656486" w:history="1">
+          <w:hyperlink w:anchor="_Toc242888170" w:history="1">
             <w:r>
               <w:rPr>
                 <w:rStyle w:val="Hyperlink"/>
@@ -4040,7 +4040,7 @@
               <w:rPr>
                 <w:noProof/>
               </w:rPr>
-              <w:instrText xml:space="preserve"> PAGEREF _Toc242656486 \h </w:instrText>
+              <w:instrText xml:space="preserve"> PAGEREF _Toc242888170 \h </w:instrText>
             </w:r>
             <w:r>
               <w:rPr>
@@ -4083,7 +4083,7 @@
               <w14:ligatures w14:val="standardContextual"/>
             </w:rPr>
           </w:pPr>
-          <w:hyperlink w:anchor="_Toc242656487" w:history="1">
+          <w:hyperlink w:anchor="_Toc242888171" w:history="1">
             <w:r>
               <w:rPr>
                 <w:rStyle w:val="Hyperlink"/>
@@ -4107,7 +4107,7 @@
               <w:rPr>
                 <w:noProof/>
               </w:rPr>
-              <w:instrText xml:space="preserve"> PAGEREF _Toc242656487 \h </w:instrText>
+              <w:instrText xml:space="preserve"> PAGEREF _Toc242888171 \h </w:instrText>
             </w:r>
             <w:r>
               <w:rPr>
@@ -4150,7 +4150,7 @@
               <w14:ligatures w14:val="standardContextual"/>
             </w:rPr>
           </w:pPr>
-          <w:hyperlink w:anchor="_Toc242656488" w:history="1">
+          <w:hyperlink w:anchor="_Toc242888172" w:history="1">
             <w:r>
               <w:rPr>
                 <w:rStyle w:val="Hyperlink"/>
@@ -4174,7 +4174,7 @@
               <w:rPr>
                 <w:noProof/>
               </w:rPr>
-              <w:instrText xml:space="preserve"> PAGEREF _Toc242656488 \h </w:instrText>
+              <w:instrText xml:space="preserve"> PAGEREF _Toc242888172 \h </w:instrText>
             </w:r>
             <w:r>
               <w:rPr>
@@ -4221,7 +4221,7 @@
     <w:sdt>
       <w:sdtPr>
         <w:alias w:val="Tables"/>
-        <w:id w:val="-802851129"/>
+        <w:id w:val="1495148843"/>
       </w:sdtPr>
       <w:sdtEndPr/>
       <w:sdtContent>
@@ -4250,7 +4250,7 @@
           <w:r>
             <w:fldChar w:fldCharType="separate"/>
           </w:r>
-          <w:hyperlink w:anchor="_Toc242656489" w:history="1">
+          <w:hyperlink w:anchor="_Toc242888173" w:history="1">
             <w:r>
               <w:rPr>
                 <w:rStyle w:val="Hyperlink"/>
@@ -4274,7 +4274,7 @@
               <w:rPr>
                 <w:noProof/>
               </w:rPr>
-              <w:instrText xml:space="preserve"> PAGEREF _Toc242656489 \h </w:instrText>
+              <w:instrText xml:space="preserve"> PAGEREF _Toc242888173 \h </w:instrText>
             </w:r>
             <w:r>
               <w:rPr>
@@ -4317,7 +4317,7 @@
               <w14:ligatures w14:val="standardContextual"/>
             </w:rPr>
           </w:pPr>
-          <w:hyperlink w:anchor="_Toc242656490" w:history="1">
+          <w:hyperlink w:anchor="_Toc242888174" w:history="1">
             <w:r>
               <w:rPr>
                 <w:rStyle w:val="Hyperlink"/>
@@ -4341,7 +4341,7 @@
               <w:rPr>
                 <w:noProof/>
               </w:rPr>
-              <w:instrText xml:space="preserve"> PAGEREF _Toc242656490 \h </w:instrText>
+              <w:instrText xml:space="preserve"> PAGEREF _Toc242888174 \h </w:instrText>
             </w:r>
             <w:r>
               <w:rPr>
@@ -4384,7 +4384,7 @@
               <w14:ligatures w14:val="standardContextual"/>
             </w:rPr>
           </w:pPr>
-          <w:hyperlink w:anchor="_Toc242656491" w:history="1">
+          <w:hyperlink w:anchor="_Toc242888175" w:history="1">
             <w:r>
               <w:rPr>
                 <w:rStyle w:val="Hyperlink"/>
@@ -4408,7 +4408,7 @@
               <w:rPr>
                 <w:noProof/>
               </w:rPr>
-              <w:instrText xml:space="preserve"> PAGEREF _Toc242656491 \h </w:instrText>
+              <w:instrText xml:space="preserve"> PAGEREF _Toc242888175 \h </w:instrText>
             </w:r>
             <w:r>
               <w:rPr>
@@ -4451,7 +4451,7 @@
               <w14:ligatures w14:val="standardContextual"/>
             </w:rPr>
           </w:pPr>
-          <w:hyperlink w:anchor="_Toc242656492" w:history="1">
+          <w:hyperlink w:anchor="_Toc242888176" w:history="1">
             <w:r>
               <w:rPr>
                 <w:rStyle w:val="Hyperlink"/>
@@ -4475,7 +4475,7 @@
               <w:rPr>
                 <w:noProof/>
               </w:rPr>
-              <w:instrText xml:space="preserve"> PAGEREF _Toc242656492 \h </w:instrText>
+              <w:instrText xml:space="preserve"> PAGEREF _Toc242888176 \h </w:instrText>
             </w:r>
             <w:r>
               <w:rPr>
@@ -4518,7 +4518,7 @@
               <w14:ligatures w14:val="standardContextual"/>
             </w:rPr>
           </w:pPr>
-          <w:hyperlink w:anchor="_Toc242656493" w:history="1">
+          <w:hyperlink w:anchor="_Toc242888177" w:history="1">
             <w:r>
               <w:rPr>
                 <w:rStyle w:val="Hyperlink"/>
@@ -4542,7 +4542,7 @@
               <w:rPr>
                 <w:noProof/>
               </w:rPr>
-              <w:instrText xml:space="preserve"> PAGEREF _Toc242656493 \h </w:instrText>
+              <w:instrText xml:space="preserve"> PAGEREF _Toc242888177 \h </w:instrText>
             </w:r>
             <w:r>
               <w:rPr>
@@ -4585,7 +4585,7 @@
               <w14:ligatures w14:val="standardContextual"/>
             </w:rPr>
           </w:pPr>
-          <w:hyperlink w:anchor="_Toc242656494" w:history="1">
+          <w:hyperlink w:anchor="_Toc242888178" w:history="1">
             <w:r>
               <w:rPr>
                 <w:rStyle w:val="Hyperlink"/>
@@ -4609,7 +4609,7 @@
               <w:rPr>
                 <w:noProof/>
               </w:rPr>
-              <w:instrText xml:space="preserve"> PAGEREF _Toc242656494 \h </w:instrText>
+              <w:instrText xml:space="preserve"> PAGEREF _Toc242888178 \h </w:instrText>
             </w:r>
             <w:r>
               <w:rPr>
@@ -4652,7 +4652,7 @@
               <w14:ligatures w14:val="standardContextual"/>
             </w:rPr>
           </w:pPr>
-          <w:hyperlink w:anchor="_Toc242656495" w:history="1">
+          <w:hyperlink w:anchor="_Toc242888179" w:history="1">
             <w:r>
               <w:rPr>
                 <w:rStyle w:val="Hyperlink"/>
@@ -4676,7 +4676,7 @@
               <w:rPr>
                 <w:noProof/>
               </w:rPr>
-              <w:instrText xml:space="preserve"> PAGEREF _Toc242656495 \h </w:instrText>
+              <w:instrText xml:space="preserve"> PAGEREF _Toc242888179 \h </w:instrText>
             </w:r>
             <w:r>
               <w:rPr>
@@ -4719,7 +4719,7 @@
               <w14:ligatures w14:val="standardContextual"/>
             </w:rPr>
           </w:pPr>
-          <w:hyperlink w:anchor="_Toc242656496" w:history="1">
+          <w:hyperlink w:anchor="_Toc242888180" w:history="1">
             <w:r>
               <w:rPr>
                 <w:rStyle w:val="Hyperlink"/>
@@ -4743,7 +4743,7 @@
               <w:rPr>
                 <w:noProof/>
               </w:rPr>
-              <w:instrText xml:space="preserve"> PAGEREF _Toc242656496 \h </w:instrText>
+              <w:instrText xml:space="preserve"> PAGEREF _Toc242888180 \h </w:instrText>
             </w:r>
             <w:r>
               <w:rPr>
@@ -4786,7 +4786,7 @@
               <w14:ligatures w14:val="standardContextual"/>
             </w:rPr>
           </w:pPr>
-          <w:hyperlink w:anchor="_Toc242656497" w:history="1">
+          <w:hyperlink w:anchor="_Toc242888181" w:history="1">
             <w:r>
               <w:rPr>
                 <w:rStyle w:val="Hyperlink"/>
@@ -4810,7 +4810,7 @@
               <w:rPr>
                 <w:noProof/>
               </w:rPr>
-              <w:instrText xml:space="preserve"> PAGEREF _Toc242656497 \h </w:instrText>
+              <w:instrText xml:space="preserve"> PAGEREF _Toc242888181 \h </w:instrText>
             </w:r>
             <w:r>
               <w:rPr>
@@ -4853,7 +4853,7 @@
               <w14:ligatures w14:val="standardContextual"/>
             </w:rPr>
           </w:pPr>
-          <w:hyperlink w:anchor="_Toc242656498" w:history="1">
+          <w:hyperlink w:anchor="_Toc242888182" w:history="1">
             <w:r>
               <w:rPr>
                 <w:rStyle w:val="Hyperlink"/>
@@ -4877,7 +4877,7 @@
               <w:rPr>
                 <w:noProof/>
               </w:rPr>
-              <w:instrText xml:space="preserve"> PAGEREF _Toc242656498 \h </w:instrText>
+              <w:instrText xml:space="preserve"> PAGEREF _Toc242888182 \h </w:instrText>
             </w:r>
             <w:r>
               <w:rPr>
@@ -4920,7 +4920,7 @@
               <w14:ligatures w14:val="standardContextual"/>
             </w:rPr>
           </w:pPr>
-          <w:hyperlink w:anchor="_Toc242656499" w:history="1">
+          <w:hyperlink w:anchor="_Toc242888183" w:history="1">
             <w:r>
               <w:rPr>
                 <w:rStyle w:val="Hyperlink"/>
@@ -4944,7 +4944,7 @@
               <w:rPr>
                 <w:noProof/>
               </w:rPr>
-              <w:instrText xml:space="preserve"> PAGEREF _Toc242656499 \h </w:instrText>
+              <w:instrText xml:space="preserve"> PAGEREF _Toc242888183 \h </w:instrText>
             </w:r>
             <w:r>
               <w:rPr>
@@ -4987,7 +4987,7 @@
               <w14:ligatures w14:val="standardContextual"/>
             </w:rPr>
           </w:pPr>
-          <w:hyperlink w:anchor="_Toc242656500" w:history="1">
+          <w:hyperlink w:anchor="_Toc242888184" w:history="1">
             <w:r>
               <w:rPr>
                 <w:rStyle w:val="Hyperlink"/>
@@ -5011,7 +5011,7 @@
               <w:rPr>
                 <w:noProof/>
               </w:rPr>
-              <w:instrText xml:space="preserve"> PAGEREF _Toc242656500 \h </w:instrText>
+              <w:instrText xml:space="preserve"> PAGEREF _Toc242888184 \h </w:instrText>
             </w:r>
             <w:r>
               <w:rPr>
@@ -5054,7 +5054,7 @@
               <w14:ligatures w14:val="standardContextual"/>
             </w:rPr>
           </w:pPr>
-          <w:hyperlink w:anchor="_Toc242656501" w:history="1">
+          <w:hyperlink w:anchor="_Toc242888185" w:history="1">
             <w:r>
               <w:rPr>
                 <w:rStyle w:val="Hyperlink"/>
@@ -5078,7 +5078,7 @@
               <w:rPr>
                 <w:noProof/>
               </w:rPr>
-              <w:instrText xml:space="preserve"> PAGEREF _Toc242656501 \h </w:instrText>
+              <w:instrText xml:space="preserve"> PAGEREF _Toc242888185 \h </w:instrText>
             </w:r>
             <w:r>
               <w:rPr>
@@ -5121,7 +5121,7 @@
               <w14:ligatures w14:val="standardContextual"/>
             </w:rPr>
           </w:pPr>
-          <w:hyperlink w:anchor="_Toc242656502" w:history="1">
+          <w:hyperlink w:anchor="_Toc242888186" w:history="1">
             <w:r>
               <w:rPr>
                 <w:rStyle w:val="Hyperlink"/>
@@ -5145,7 +5145,7 @@
               <w:rPr>
                 <w:noProof/>
               </w:rPr>
-              <w:instrText xml:space="preserve"> PAGEREF _Toc242656502 \h </w:instrText>
+              <w:instrText xml:space="preserve"> PAGEREF _Toc242888186 \h </w:instrText>
             </w:r>
             <w:r>
               <w:rPr>
@@ -5188,7 +5188,7 @@
               <w14:ligatures w14:val="standardContextual"/>
             </w:rPr>
           </w:pPr>
-          <w:hyperlink w:anchor="_Toc242656503" w:history="1">
+          <w:hyperlink w:anchor="_Toc242888187" w:history="1">
             <w:r>
               <w:rPr>
                 <w:rStyle w:val="Hyperlink"/>
@@ -5212,7 +5212,7 @@
               <w:rPr>
                 <w:noProof/>
               </w:rPr>
-              <w:instrText xml:space="preserve"> PAGEREF _Toc242656503 \h </w:instrText>
+              <w:instrText xml:space="preserve"> PAGEREF _Toc242888187 \h </w:instrText>
             </w:r>
             <w:r>
               <w:rPr>
@@ -5255,7 +5255,7 @@
               <w14:ligatures w14:val="standardContextual"/>
             </w:rPr>
           </w:pPr>
-          <w:hyperlink w:anchor="_Toc242656504" w:history="1">
+          <w:hyperlink w:anchor="_Toc242888188" w:history="1">
             <w:r>
               <w:rPr>
                 <w:rStyle w:val="Hyperlink"/>
@@ -5279,7 +5279,7 @@
               <w:rPr>
                 <w:noProof/>
               </w:rPr>
-              <w:instrText xml:space="preserve"> PAGEREF _Toc242656504 \h </w:instrText>
+              <w:instrText xml:space="preserve"> PAGEREF _Toc242888188 \h </w:instrText>
             </w:r>
             <w:r>
               <w:rPr>
@@ -5322,7 +5322,7 @@
               <w14:ligatures w14:val="standardContextual"/>
             </w:rPr>
           </w:pPr>
-          <w:hyperlink w:anchor="_Toc242656505" w:history="1">
+          <w:hyperlink w:anchor="_Toc242888189" w:history="1">
             <w:r>
               <w:rPr>
                 <w:rStyle w:val="Hyperlink"/>
@@ -5346,7 +5346,7 @@
               <w:rPr>
                 <w:noProof/>
               </w:rPr>
-              <w:instrText xml:space="preserve"> PAGEREF _Toc242656505 \h </w:instrText>
+              <w:instrText xml:space="preserve"> PAGEREF _Toc242888189 \h </w:instrText>
             </w:r>
             <w:r>
               <w:rPr>
@@ -5389,7 +5389,7 @@
               <w14:ligatures w14:val="standardContextual"/>
             </w:rPr>
           </w:pPr>
-          <w:hyperlink w:anchor="_Toc242656506" w:history="1">
+          <w:hyperlink w:anchor="_Toc242888190" w:history="1">
             <w:r>
               <w:rPr>
                 <w:rStyle w:val="Hyperlink"/>
@@ -5413,7 +5413,7 @@
               <w:rPr>
                 <w:noProof/>
               </w:rPr>
-              <w:instrText xml:space="preserve"> PAGEREF _Toc242656506 \h </w:instrText>
+              <w:instrText xml:space="preserve"> PAGEREF _Toc242888190 \h </w:instrText>
             </w:r>
             <w:r>
               <w:rPr>
@@ -5456,7 +5456,7 @@
               <w14:ligatures w14:val="standardContextual"/>
             </w:rPr>
           </w:pPr>
-          <w:hyperlink w:anchor="_Toc242656507" w:history="1">
+          <w:hyperlink w:anchor="_Toc242888191" w:history="1">
             <w:r>
               <w:rPr>
                 <w:rStyle w:val="Hyperlink"/>
@@ -5480,7 +5480,7 @@
               <w:rPr>
                 <w:noProof/>
               </w:rPr>
-              <w:instrText xml:space="preserve"> PAGEREF _Toc242656507 \h </w:instrText>
+              <w:instrText xml:space="preserve"> PAGEREF _Toc242888191 \h </w:instrText>
             </w:r>
             <w:r>
               <w:rPr>
@@ -5523,7 +5523,7 @@
               <w14:ligatures w14:val="standardContextual"/>
             </w:rPr>
           </w:pPr>
-          <w:hyperlink w:anchor="_Toc242656508" w:history="1">
+          <w:hyperlink w:anchor="_Toc242888192" w:history="1">
             <w:r>
               <w:rPr>
                 <w:rStyle w:val="Hyperlink"/>
@@ -5547,7 +5547,7 @@
               <w:rPr>
                 <w:noProof/>
               </w:rPr>
-              <w:instrText xml:space="preserve"> PAGEREF _Toc242656508 \h </w:instrText>
+              <w:instrText xml:space="preserve"> PAGEREF _Toc242888192 \h </w:instrText>
             </w:r>
             <w:r>
               <w:rPr>
@@ -5590,7 +5590,7 @@
               <w14:ligatures w14:val="standardContextual"/>
             </w:rPr>
           </w:pPr>
-          <w:hyperlink w:anchor="_Toc242656509" w:history="1">
+          <w:hyperlink w:anchor="_Toc242888193" w:history="1">
             <w:r>
               <w:rPr>
                 <w:rStyle w:val="Hyperlink"/>
@@ -5614,7 +5614,7 @@
               <w:rPr>
                 <w:noProof/>
               </w:rPr>
-              <w:instrText xml:space="preserve"> PAGEREF _Toc242656509 \h </w:instrText>
+              <w:instrText xml:space="preserve"> PAGEREF _Toc242888193 \h </w:instrText>
             </w:r>
             <w:r>
               <w:rPr>
@@ -5657,7 +5657,7 @@
               <w14:ligatures w14:val="standardContextual"/>
             </w:rPr>
           </w:pPr>
-          <w:hyperlink w:anchor="_Toc242656510" w:history="1">
+          <w:hyperlink w:anchor="_Toc242888194" w:history="1">
             <w:r>
               <w:rPr>
                 <w:rStyle w:val="Hyperlink"/>
@@ -5681,7 +5681,7 @@
               <w:rPr>
                 <w:noProof/>
               </w:rPr>
-              <w:instrText xml:space="preserve"> PAGEREF _Toc242656510 \h </w:instrText>
+              <w:instrText xml:space="preserve"> PAGEREF _Toc242888194 \h </w:instrText>
             </w:r>
             <w:r>
               <w:rPr>
@@ -5724,7 +5724,7 @@
               <w14:ligatures w14:val="standardContextual"/>
             </w:rPr>
           </w:pPr>
-          <w:hyperlink w:anchor="_Toc242656511" w:history="1">
+          <w:hyperlink w:anchor="_Toc242888195" w:history="1">
             <w:r>
               <w:rPr>
                 <w:rStyle w:val="Hyperlink"/>
@@ -5748,7 +5748,7 @@
               <w:rPr>
                 <w:noProof/>
               </w:rPr>
-              <w:instrText xml:space="preserve"> PAGEREF _Toc242656511 \h </w:instrText>
+              <w:instrText xml:space="preserve"> PAGEREF _Toc242888195 \h </w:instrText>
             </w:r>
             <w:r>
               <w:rPr>
@@ -5791,7 +5791,7 @@
               <w14:ligatures w14:val="standardContextual"/>
             </w:rPr>
           </w:pPr>
-          <w:hyperlink w:anchor="_Toc242656512" w:history="1">
+          <w:hyperlink w:anchor="_Toc242888196" w:history="1">
             <w:r>
               <w:rPr>
                 <w:rStyle w:val="Hyperlink"/>
@@ -5815,7 +5815,7 @@
               <w:rPr>
                 <w:noProof/>
               </w:rPr>
-              <w:instrText xml:space="preserve"> PAGEREF _Toc242656512 \h </w:instrText>
+              <w:instrText xml:space="preserve"> PAGEREF _Toc242888196 \h </w:instrText>
             </w:r>
             <w:r>
               <w:rPr>
@@ -5858,7 +5858,7 @@
               <w14:ligatures w14:val="standardContextual"/>
             </w:rPr>
           </w:pPr>
-          <w:hyperlink w:anchor="_Toc242656513" w:history="1">
+          <w:hyperlink w:anchor="_Toc242888197" w:history="1">
             <w:r>
               <w:rPr>
                 <w:rStyle w:val="Hyperlink"/>
@@ -5882,7 +5882,7 @@
               <w:rPr>
                 <w:noProof/>
               </w:rPr>
-              <w:instrText xml:space="preserve"> PAGEREF _Toc242656513 \h </w:instrText>
+              <w:instrText xml:space="preserve"> PAGEREF _Toc242888197 \h </w:instrText>
             </w:r>
             <w:r>
               <w:rPr>
@@ -5925,7 +5925,7 @@
               <w14:ligatures w14:val="standardContextual"/>
             </w:rPr>
           </w:pPr>
-          <w:hyperlink w:anchor="_Toc242656514" w:history="1">
+          <w:hyperlink w:anchor="_Toc242888198" w:history="1">
             <w:r>
               <w:rPr>
                 <w:rStyle w:val="Hyperlink"/>
@@ -5949,7 +5949,7 @@
               <w:rPr>
                 <w:noProof/>
               </w:rPr>
-              <w:instrText xml:space="preserve"> PAGEREF _Toc242656514 \h </w:instrText>
+              <w:instrText xml:space="preserve"> PAGEREF _Toc242888198 \h </w:instrText>
             </w:r>
             <w:r>
               <w:rPr>
@@ -5992,7 +5992,7 @@
               <w14:ligatures w14:val="standardContextual"/>
             </w:rPr>
           </w:pPr>
-          <w:hyperlink w:anchor="_Toc242656515" w:history="1">
+          <w:hyperlink w:anchor="_Toc242888199" w:history="1">
             <w:r>
               <w:rPr>
                 <w:rStyle w:val="Hyperlink"/>
@@ -6016,7 +6016,7 @@
               <w:rPr>
                 <w:noProof/>
               </w:rPr>
-              <w:instrText xml:space="preserve"> PAGEREF _Toc242656515 \h </w:instrText>
+              <w:instrText xml:space="preserve"> PAGEREF _Toc242888199 \h </w:instrText>
             </w:r>
             <w:r>
               <w:rPr>
@@ -6059,7 +6059,7 @@
               <w14:ligatures w14:val="standardContextual"/>
             </w:rPr>
           </w:pPr>
-          <w:hyperlink w:anchor="_Toc242656516" w:history="1">
+          <w:hyperlink w:anchor="_Toc242888200" w:history="1">
             <w:r>
               <w:rPr>
                 <w:rStyle w:val="Hyperlink"/>
@@ -6083,7 +6083,7 @@
               <w:rPr>
                 <w:noProof/>
               </w:rPr>
-              <w:instrText xml:space="preserve"> PAGEREF _Toc242656516 \h </w:instrText>
+              <w:instrText xml:space="preserve"> PAGEREF _Toc242888200 \h </w:instrText>
             </w:r>
             <w:r>
               <w:rPr>
@@ -6124,7 +6124,7 @@
         <w:keepLines/>
         <w:pageBreakBefore/>
       </w:pPr>
-      <w:bookmarkStart w:id="0" w:name="_Toc242656454"/>
+      <w:bookmarkStart w:id="0" w:name="_Toc242888138"/>
       <w:r>
         <w:lastRenderedPageBreak/>
         <w:t>1 Introduction</w:t>
@@ -6137,7 +6137,7 @@
         <w:keepNext/>
         <w:keepLines/>
       </w:pPr>
-      <w:bookmarkStart w:id="1" w:name="_Toc242656455"/>
+      <w:bookmarkStart w:id="1" w:name="_Toc242888139"/>
       <w:r>
         <w:t>1.1 Purpose</w:t>
       </w:r>
@@ -6170,7 +6170,7 @@
         <w:keepNext/>
         <w:keepLines/>
       </w:pPr>
-      <w:bookmarkStart w:id="2" w:name="_Toc242656456"/>
+      <w:bookmarkStart w:id="2" w:name="_Toc242888140"/>
       <w:r>
         <w:t>1.2 Scope</w:t>
       </w:r>
@@ -6190,7 +6190,7 @@
         <w:keepNext/>
         <w:keepLines/>
       </w:pPr>
-      <w:bookmarkStart w:id="3" w:name="_Toc242656457"/>
+      <w:bookmarkStart w:id="3" w:name="_Toc242888141"/>
       <w:r>
         <w:t>1.3 Intended audience</w:t>
       </w:r>
@@ -6210,7 +6210,7 @@
         <w:keepNext/>
         <w:keepLines/>
       </w:pPr>
-      <w:bookmarkStart w:id="4" w:name="_Toc242656458"/>
+      <w:bookmarkStart w:id="4" w:name="_Toc242888142"/>
       <w:r>
         <w:t>1.4 Relationship to other documents</w:t>
       </w:r>
@@ -6221,7 +6221,7 @@
         <w:pStyle w:val="Caption"/>
         <w:keepNext/>
       </w:pPr>
-      <w:bookmarkStart w:id="5" w:name="_Toc242656489"/>
+      <w:bookmarkStart w:id="5" w:name="_Toc242888173"/>
       <w:r>
         <w:t xml:space="preserve">Table </w:t>
       </w:r>
@@ -6982,7 +6982,7 @@
         <w:keepNext/>
         <w:keepLines/>
       </w:pPr>
-      <w:bookmarkStart w:id="6" w:name="_Toc242656459"/>
+      <w:bookmarkStart w:id="6" w:name="_Toc242888143"/>
       <w:r>
         <w:t>1.5 Conventions</w:t>
       </w:r>
@@ -7030,7 +7030,7 @@
         <w:keepLines/>
         <w:pageBreakBefore/>
       </w:pPr>
-      <w:bookmarkStart w:id="7" w:name="_Toc242656460"/>
+      <w:bookmarkStart w:id="7" w:name="_Toc242888144"/>
       <w:r>
         <w:lastRenderedPageBreak/>
         <w:t>2 Design principles</w:t>
@@ -7042,7 +7042,7 @@
         <w:pStyle w:val="Caption"/>
         <w:keepNext/>
       </w:pPr>
-      <w:bookmarkStart w:id="8" w:name="_Toc242656490"/>
+      <w:bookmarkStart w:id="8" w:name="_Toc242888174"/>
       <w:r>
         <w:t xml:space="preserve">Table </w:t>
       </w:r>
@@ -8466,7 +8466,7 @@
         <w:keepLines/>
         <w:pageBreakBefore/>
       </w:pPr>
-      <w:bookmarkStart w:id="9" w:name="_Toc242656461"/>
+      <w:bookmarkStart w:id="9" w:name="_Toc242888145"/>
       <w:r>
         <w:lastRenderedPageBreak/>
         <w:t>3 Personas and key journeys</w:t>
@@ -8486,7 +8486,7 @@
         <w:pStyle w:val="Caption"/>
         <w:keepNext/>
       </w:pPr>
-      <w:bookmarkStart w:id="10" w:name="_Toc242656491"/>
+      <w:bookmarkStart w:id="10" w:name="_Toc242888175"/>
       <w:r>
         <w:t xml:space="preserve">Table </w:t>
       </w:r>
@@ -9275,7 +9275,7 @@
         <w:pStyle w:val="Caption"/>
         <w:keepNext/>
       </w:pPr>
-      <w:bookmarkStart w:id="11" w:name="_Toc242656492"/>
+      <w:bookmarkStart w:id="11" w:name="_Toc242888176"/>
       <w:r>
         <w:t xml:space="preserve">Table </w:t>
       </w:r>
@@ -10167,7 +10167,7 @@
         <w:keepLines/>
         <w:pageBreakBefore/>
       </w:pPr>
-      <w:bookmarkStart w:id="12" w:name="_Toc242656462"/>
+      <w:bookmarkStart w:id="12" w:name="_Toc242888146"/>
       <w:r>
         <w:lastRenderedPageBreak/>
         <w:t>4 Information architecture and navigation</w:t>
@@ -10180,7 +10180,7 @@
         <w:keepNext/>
         <w:keepLines/>
       </w:pPr>
-      <w:bookmarkStart w:id="13" w:name="_Toc242656463"/>
+      <w:bookmarkStart w:id="13" w:name="_Toc242888147"/>
       <w:r>
         <w:t>4.1 Structure</w:t>
       </w:r>
@@ -10219,7 +10219,7 @@
         <w:pStyle w:val="Caption"/>
         <w:keepNext/>
       </w:pPr>
-      <w:bookmarkStart w:id="14" w:name="_Toc242656493"/>
+      <w:bookmarkStart w:id="14" w:name="_Toc242888177"/>
       <w:r>
         <w:t xml:space="preserve">Table </w:t>
       </w:r>
@@ -11102,7 +11102,7 @@
         <w:keepNext/>
         <w:keepLines/>
       </w:pPr>
-      <w:bookmarkStart w:id="15" w:name="_Toc242656464"/>
+      <w:bookmarkStart w:id="15" w:name="_Toc242888148"/>
       <w:r>
         <w:t>4.2 Route table</w:t>
       </w:r>
@@ -11113,7 +11113,7 @@
         <w:pStyle w:val="Caption"/>
         <w:keepNext/>
       </w:pPr>
-      <w:bookmarkStart w:id="16" w:name="_Toc242656494"/>
+      <w:bookmarkStart w:id="16" w:name="_Toc242888178"/>
       <w:r>
         <w:t xml:space="preserve">Table </w:t>
       </w:r>
@@ -13914,7 +13914,7 @@
         <w:keepNext/>
         <w:keepLines/>
       </w:pPr>
-      <w:bookmarkStart w:id="17" w:name="_Toc242656465"/>
+      <w:bookmarkStart w:id="17" w:name="_Toc242888149"/>
       <w:r>
         <w:t>4.3 Guards</w:t>
       </w:r>
@@ -13925,7 +13925,7 @@
         <w:pStyle w:val="Caption"/>
         <w:keepNext/>
       </w:pPr>
-      <w:bookmarkStart w:id="18" w:name="_Toc242656495"/>
+      <w:bookmarkStart w:id="18" w:name="_Toc242888179"/>
       <w:r>
         <w:t xml:space="preserve">Table </w:t>
       </w:r>
@@ -14425,7 +14425,7 @@
         <w:keepLines/>
         <w:pageBreakBefore/>
       </w:pPr>
-      <w:bookmarkStart w:id="19" w:name="_Toc242656466"/>
+      <w:bookmarkStart w:id="19" w:name="_Toc242888150"/>
       <w:r>
         <w:lastRenderedPageBreak/>
         <w:t>5 Design system</w:t>
@@ -14438,7 +14438,7 @@
         <w:keepNext/>
         <w:keepLines/>
       </w:pPr>
-      <w:bookmarkStart w:id="20" w:name="_Toc242656467"/>
+      <w:bookmarkStart w:id="20" w:name="_Toc242888151"/>
       <w:r>
         <w:t>5.1 Colour roles</w:t>
       </w:r>
@@ -14457,7 +14457,7 @@
         <w:pStyle w:val="Caption"/>
         <w:keepNext/>
       </w:pPr>
-      <w:bookmarkStart w:id="21" w:name="_Toc242656496"/>
+      <w:bookmarkStart w:id="21" w:name="_Toc242888180"/>
       <w:r>
         <w:t xml:space="preserve">Table </w:t>
       </w:r>
@@ -16447,7 +16447,7 @@
         <w:keepNext/>
         <w:keepLines/>
       </w:pPr>
-      <w:bookmarkStart w:id="22" w:name="_Toc242656468"/>
+      <w:bookmarkStart w:id="22" w:name="_Toc242888152"/>
       <w:r>
         <w:t>5.2 Typography</w:t>
       </w:r>
@@ -16521,7 +16521,7 @@
         <w:pStyle w:val="Caption"/>
         <w:keepNext/>
       </w:pPr>
-      <w:bookmarkStart w:id="23" w:name="_Toc242656497"/>
+      <w:bookmarkStart w:id="23" w:name="_Toc242888181"/>
       <w:r>
         <w:t xml:space="preserve">Table </w:t>
       </w:r>
@@ -18235,7 +18235,7 @@
         <w:keepNext/>
         <w:keepLines/>
       </w:pPr>
-      <w:bookmarkStart w:id="24" w:name="_Toc242656469"/>
+      <w:bookmarkStart w:id="24" w:name="_Toc242888153"/>
       <w:r>
         <w:t>5.3 Spacing, shape and elevation</w:t>
       </w:r>
@@ -18246,7 +18246,7 @@
         <w:pStyle w:val="Caption"/>
         <w:keepNext/>
       </w:pPr>
-      <w:bookmarkStart w:id="25" w:name="_Toc242656498"/>
+      <w:bookmarkStart w:id="25" w:name="_Toc242888182"/>
       <w:r>
         <w:t xml:space="preserve">Table </w:t>
       </w:r>
@@ -18934,7 +18934,7 @@
         <w:keepNext/>
         <w:keepLines/>
       </w:pPr>
-      <w:bookmarkStart w:id="26" w:name="_Toc242656470"/>
+      <w:bookmarkStart w:id="26" w:name="_Toc242888154"/>
       <w:r>
         <w:t>5.4 Components</w:t>
       </w:r>
@@ -18945,7 +18945,7 @@
         <w:pStyle w:val="Caption"/>
         <w:keepNext/>
       </w:pPr>
-      <w:bookmarkStart w:id="27" w:name="_Toc242656499"/>
+      <w:bookmarkStart w:id="27" w:name="_Toc242888183"/>
       <w:r>
         <w:t xml:space="preserve">Table </w:t>
       </w:r>
@@ -20551,7 +20551,7 @@
                 <w:sz w:val="19"/>
                 <w:szCs w:val="19"/>
               </w:rPr>
-              <w:t>12 preset robot characters (Bottts), or initials on a steady colour; decorative (</w:t>
+              <w:t>12 preset characters (Multiavatar), or initials on a steady colour; decorative (</w:t>
             </w:r>
             <w:r>
               <w:rPr>
@@ -20902,7 +20902,7 @@
         <w:keepLines/>
         <w:pageBreakBefore/>
       </w:pPr>
-      <w:bookmarkStart w:id="28" w:name="_Toc242656471"/>
+      <w:bookmarkStart w:id="28" w:name="_Toc242888155"/>
       <w:r>
         <w:lastRenderedPageBreak/>
         <w:t>6 Screen specifications</w:t>
@@ -20963,7 +20963,7 @@
         <w:keepNext/>
         <w:keepLines/>
       </w:pPr>
-      <w:bookmarkStart w:id="29" w:name="_Toc242656472"/>
+      <w:bookmarkStart w:id="29" w:name="_Toc242888156"/>
       <w:r>
         <w:t>6.1 Welcome, Intro and About you (onboarding)</w:t>
       </w:r>
@@ -20974,7 +20974,7 @@
         <w:pStyle w:val="Caption"/>
         <w:keepNext/>
       </w:pPr>
-      <w:bookmarkStart w:id="30" w:name="_Toc242656500"/>
+      <w:bookmarkStart w:id="30" w:name="_Toc242888184"/>
       <w:r>
         <w:t xml:space="preserve">Table </w:t>
       </w:r>
@@ -21446,7 +21446,7 @@
         <w:keepNext/>
         <w:keepLines/>
       </w:pPr>
-      <w:bookmarkStart w:id="31" w:name="_Toc242656473"/>
+      <w:bookmarkStart w:id="31" w:name="_Toc242888157"/>
       <w:r>
         <w:t>6.2 Account (sign up, log in, recover, recovery code, complete your account)</w:t>
       </w:r>
@@ -21457,7 +21457,7 @@
         <w:pStyle w:val="Caption"/>
         <w:keepNext/>
       </w:pPr>
-      <w:bookmarkStart w:id="32" w:name="_Toc242656501"/>
+      <w:bookmarkStart w:id="32" w:name="_Toc242888185"/>
       <w:r>
         <w:t xml:space="preserve">Table </w:t>
       </w:r>
@@ -21901,7 +21901,7 @@
         <w:keepNext/>
         <w:keepLines/>
       </w:pPr>
-      <w:bookmarkStart w:id="33" w:name="_Toc242656474"/>
+      <w:bookmarkStart w:id="33" w:name="_Toc242888158"/>
       <w:r>
         <w:t>6.3 Paths (home)</w:t>
       </w:r>
@@ -21912,7 +21912,7 @@
         <w:pStyle w:val="Caption"/>
         <w:keepNext/>
       </w:pPr>
-      <w:bookmarkStart w:id="34" w:name="_Toc242656502"/>
+      <w:bookmarkStart w:id="34" w:name="_Toc242888186"/>
       <w:r>
         <w:t xml:space="preserve">Table </w:t>
       </w:r>
@@ -22267,7 +22267,7 @@
         <w:keepNext/>
         <w:keepLines/>
       </w:pPr>
-      <w:bookmarkStart w:id="35" w:name="_Toc242656475"/>
+      <w:bookmarkStart w:id="35" w:name="_Toc242888159"/>
       <w:r>
         <w:t>6.4 Courses</w:t>
       </w:r>
@@ -22278,7 +22278,7 @@
         <w:pStyle w:val="Caption"/>
         <w:keepNext/>
       </w:pPr>
-      <w:bookmarkStart w:id="36" w:name="_Toc242656503"/>
+      <w:bookmarkStart w:id="36" w:name="_Toc242888187"/>
       <w:r>
         <w:t xml:space="preserve">Table </w:t>
       </w:r>
@@ -22739,7 +22739,7 @@
         <w:keepNext/>
         <w:keepLines/>
       </w:pPr>
-      <w:bookmarkStart w:id="37" w:name="_Toc242656476"/>
+      <w:bookmarkStart w:id="37" w:name="_Toc242888160"/>
       <w:r>
         <w:t>6.5 Course detail</w:t>
       </w:r>
@@ -22750,7 +22750,7 @@
         <w:pStyle w:val="Caption"/>
         <w:keepNext/>
       </w:pPr>
-      <w:bookmarkStart w:id="38" w:name="_Toc242656504"/>
+      <w:bookmarkStart w:id="38" w:name="_Toc242888188"/>
       <w:r>
         <w:t xml:space="preserve">Table </w:t>
       </w:r>
@@ -23121,7 +23121,7 @@
         <w:keepNext/>
         <w:keepLines/>
       </w:pPr>
-      <w:bookmarkStart w:id="39" w:name="_Toc242656477"/>
+      <w:bookmarkStart w:id="39" w:name="_Toc242888161"/>
       <w:r>
         <w:t>6.6 Compare</w:t>
       </w:r>
@@ -23132,7 +23132,7 @@
         <w:pStyle w:val="Caption"/>
         <w:keepNext/>
       </w:pPr>
-      <w:bookmarkStart w:id="40" w:name="_Toc242656505"/>
+      <w:bookmarkStart w:id="40" w:name="_Toc242888189"/>
       <w:r>
         <w:t xml:space="preserve">Table </w:t>
       </w:r>
@@ -23560,7 +23560,7 @@
         <w:keepNext/>
         <w:keepLines/>
       </w:pPr>
-      <w:bookmarkStart w:id="41" w:name="_Toc242656478"/>
+      <w:bookmarkStart w:id="41" w:name="_Toc242888162"/>
       <w:r>
         <w:t>6.7 My list</w:t>
       </w:r>
@@ -23571,7 +23571,7 @@
         <w:pStyle w:val="Caption"/>
         <w:keepNext/>
       </w:pPr>
-      <w:bookmarkStart w:id="42" w:name="_Toc242656506"/>
+      <w:bookmarkStart w:id="42" w:name="_Toc242888190"/>
       <w:r>
         <w:t xml:space="preserve">Table </w:t>
       </w:r>
@@ -24024,7 +24024,7 @@
         <w:keepNext/>
         <w:keepLines/>
       </w:pPr>
-      <w:bookmarkStart w:id="43" w:name="_Toc242656479"/>
+      <w:bookmarkStart w:id="43" w:name="_Toc242888163"/>
       <w:r>
         <w:lastRenderedPageBreak/>
         <w:t>6.8 Journey</w:t>
@@ -24036,7 +24036,7 @@
         <w:pStyle w:val="Caption"/>
         <w:keepNext/>
       </w:pPr>
-      <w:bookmarkStart w:id="44" w:name="_Toc242656507"/>
+      <w:bookmarkStart w:id="44" w:name="_Toc242888191"/>
       <w:r>
         <w:t xml:space="preserve">Table </w:t>
       </w:r>
@@ -24512,7 +24512,7 @@
         <w:keepNext/>
         <w:keepLines/>
       </w:pPr>
-      <w:bookmarkStart w:id="45" w:name="_Toc242656480"/>
+      <w:bookmarkStart w:id="45" w:name="_Toc242888164"/>
       <w:r>
         <w:t>6.9 Ask ZedPath</w:t>
       </w:r>
@@ -24523,7 +24523,7 @@
         <w:pStyle w:val="Caption"/>
         <w:keepNext/>
       </w:pPr>
-      <w:bookmarkStart w:id="46" w:name="_Toc242656508"/>
+      <w:bookmarkStart w:id="46" w:name="_Toc242888192"/>
       <w:r>
         <w:t xml:space="preserve">Table </w:t>
       </w:r>
@@ -25047,7 +25047,7 @@
         <w:keepNext/>
         <w:keepLines/>
       </w:pPr>
-      <w:bookmarkStart w:id="47" w:name="_Toc242656481"/>
+      <w:bookmarkStart w:id="47" w:name="_Toc242888165"/>
       <w:r>
         <w:t>6.10 Groups, Group room and Group info</w:t>
       </w:r>
@@ -25058,7 +25058,7 @@
         <w:pStyle w:val="Caption"/>
         <w:keepNext/>
       </w:pPr>
-      <w:bookmarkStart w:id="48" w:name="_Toc242656509"/>
+      <w:bookmarkStart w:id="48" w:name="_Toc242888193"/>
       <w:r>
         <w:t xml:space="preserve">Table </w:t>
       </w:r>
@@ -25527,7 +25527,7 @@
         <w:keepNext/>
         <w:keepLines/>
       </w:pPr>
-      <w:bookmarkStart w:id="49" w:name="_Toc242656482"/>
+      <w:bookmarkStart w:id="49" w:name="_Toc242888166"/>
       <w:r>
         <w:lastRenderedPageBreak/>
         <w:t>6.11 Me</w:t>
@@ -25539,7 +25539,7 @@
         <w:pStyle w:val="Caption"/>
         <w:keepNext/>
       </w:pPr>
-      <w:bookmarkStart w:id="50" w:name="_Toc242656510"/>
+      <w:bookmarkStart w:id="50" w:name="_Toc242888194"/>
       <w:r>
         <w:t xml:space="preserve">Table </w:t>
       </w:r>
@@ -25927,7 +25927,7 @@
         <w:keepLines/>
         <w:pageBreakBefore/>
       </w:pPr>
-      <w:bookmarkStart w:id="51" w:name="_Toc242656483"/>
+      <w:bookmarkStart w:id="51" w:name="_Toc242888167"/>
       <w:r>
         <w:lastRenderedPageBreak/>
         <w:t>7 Interaction patterns</w:t>
@@ -25939,7 +25939,7 @@
         <w:pStyle w:val="Caption"/>
         <w:keepNext/>
       </w:pPr>
-      <w:bookmarkStart w:id="52" w:name="_Toc242656511"/>
+      <w:bookmarkStart w:id="52" w:name="_Toc242888195"/>
       <w:r>
         <w:t xml:space="preserve">Table </w:t>
       </w:r>
@@ -26985,7 +26985,7 @@
         <w:keepLines/>
         <w:pageBreakBefore/>
       </w:pPr>
-      <w:bookmarkStart w:id="53" w:name="_Toc242656484"/>
+      <w:bookmarkStart w:id="53" w:name="_Toc242888168"/>
       <w:r>
         <w:lastRenderedPageBreak/>
         <w:t>8 Content and language</w:t>
@@ -26997,7 +26997,7 @@
         <w:pStyle w:val="Caption"/>
         <w:keepNext/>
       </w:pPr>
-      <w:bookmarkStart w:id="54" w:name="_Toc242656512"/>
+      <w:bookmarkStart w:id="54" w:name="_Toc242888196"/>
       <w:r>
         <w:t xml:space="preserve">Table </w:t>
       </w:r>
@@ -27586,7 +27586,7 @@
         <w:keepLines/>
         <w:pageBreakBefore/>
       </w:pPr>
-      <w:bookmarkStart w:id="55" w:name="_Toc242656485"/>
+      <w:bookmarkStart w:id="55" w:name="_Toc242888169"/>
       <w:r>
         <w:lastRenderedPageBreak/>
         <w:t>9 Accessibility checklist (WCAG 2.2 AA)</w:t>
@@ -27606,7 +27606,7 @@
         <w:pStyle w:val="Caption"/>
         <w:keepNext/>
       </w:pPr>
-      <w:bookmarkStart w:id="56" w:name="_Toc242656513"/>
+      <w:bookmarkStart w:id="56" w:name="_Toc242888197"/>
       <w:r>
         <w:t xml:space="preserve">Table </w:t>
       </w:r>
@@ -29360,7 +29360,7 @@
         <w:keepLines/>
         <w:pageBreakBefore/>
       </w:pPr>
-      <w:bookmarkStart w:id="57" w:name="_Toc242656486"/>
+      <w:bookmarkStart w:id="57" w:name="_Toc242888170"/>
       <w:r>
         <w:lastRenderedPageBreak/>
         <w:t>10 Performance budget for 3G</w:t>
@@ -29372,7 +29372,7 @@
         <w:pStyle w:val="Caption"/>
         <w:keepNext/>
       </w:pPr>
-      <w:bookmarkStart w:id="58" w:name="_Toc242656514"/>
+      <w:bookmarkStart w:id="58" w:name="_Toc242888198"/>
       <w:r>
         <w:t xml:space="preserve">Table </w:t>
       </w:r>
@@ -30204,7 +30204,7 @@
         <w:keepLines/>
         <w:pageBreakBefore/>
       </w:pPr>
-      <w:bookmarkStart w:id="59" w:name="_Toc242656487"/>
+      <w:bookmarkStart w:id="59" w:name="_Toc242888171"/>
       <w:r>
         <w:lastRenderedPageBreak/>
         <w:t>11 Usability evidence</w:t>
@@ -30227,7 +30227,7 @@
         <w:pStyle w:val="Caption"/>
         <w:keepNext/>
       </w:pPr>
-      <w:bookmarkStart w:id="60" w:name="_Toc242656515"/>
+      <w:bookmarkStart w:id="60" w:name="_Toc242888199"/>
       <w:r>
         <w:t xml:space="preserve">Table </w:t>
       </w:r>
@@ -31119,7 +31119,7 @@
         <w:keepLines/>
         <w:pageBreakBefore/>
       </w:pPr>
-      <w:bookmarkStart w:id="61" w:name="_Toc242656488"/>
+      <w:bookmarkStart w:id="61" w:name="_Toc242888172"/>
       <w:r>
         <w:lastRenderedPageBreak/>
         <w:t>12 Traceability</w:t>
@@ -31131,7 +31131,7 @@
         <w:pStyle w:val="Caption"/>
         <w:keepNext/>
       </w:pPr>
-      <w:bookmarkStart w:id="62" w:name="_Toc242656516"/>
+      <w:bookmarkStart w:id="62" w:name="_Toc242888200"/>
       <w:r>
         <w:t xml:space="preserve">Table </w:t>
       </w:r>
@@ -32382,10 +32382,72 @@
 <file path=word/numbering.xml><?xml version="1.0" encoding="utf-8"?>
 <w:numbering xmlns:wpc="http://schemas.microsoft.com/office/word/2010/wordprocessingCanvas" xmlns:cx="http://schemas.microsoft.com/office/drawing/2014/chartex" xmlns:cx1="http://schemas.microsoft.com/office/drawing/2015/9/8/chartex" xmlns:cx2="http://schemas.microsoft.com/office/drawing/2015/10/21/chartex" xmlns:cx3="http://schemas.microsoft.com/office/drawing/2016/5/9/chartex" xmlns:cx4="http://schemas.microsoft.com/office/drawing/2016/5/10/chartex" xmlns:cx5="http://schemas.microsoft.com/office/drawing/2016/5/11/chartex" xmlns:cx6="http://schemas.microsoft.com/office/drawing/2016/5/12/chartex" xmlns:cx7="http://schemas.microsoft.com/office/drawing/2016/5/13/chartex" xmlns:cx8="http://schemas.microsoft.com/office/drawing/2016/5/14/chartex" xmlns:mc="http://schemas.openxmlformats.org/markup-compatibility/2006" xmlns:aink="http://schemas.microsoft.com/office/drawing/2016/ink" xmlns:am3d="http://schemas.microsoft.com/office/drawing/2017/model3d" xmlns:o="urn:schemas-microsoft-com:office:office" xmlns:oel="http://schemas.microsoft.com/office/2019/extlst" xmlns:r="http://schemas.openxmlformats.org/officeDocument/2006/relationships" xmlns:m="http://schemas.openxmlformats.org/officeDocument/2006/math" xmlns:v="urn:schemas-microsoft-com:vml" xmlns:wp14="http://schemas.microsoft.com/office/word/2010/wordprocessingDrawing" xmlns:wp="http://schemas.openxmlformats.org/drawingml/2006/wordprocessingDrawing" xmlns:w10="urn:schemas-microsoft-com:office:word" xmlns:w="http://schemas.openxmlformats.org/wordprocessingml/2006/main" xmlns:w14="http://schemas.microsoft.com/office/word/2010/wordml" xmlns:w15="http://schemas.microsoft.com/office/word/2012/wordml" xmlns:w16cex="http://schemas.microsoft.com/office/word/2018/wordml/cex" xmlns:w16cid="http://schemas.microsoft.com/office/word/2016/wordml/cid" xmlns:w16="http://schemas.microsoft.com/office/word/2018/wordml" xmlns:w16du="http://schemas.microsoft.com/office/word/2023/wordml/word16du" xmlns:w16sdtdh="http://schemas.microsoft.com/office/word/2020/wordml/sdtdatahash" xmlns:w16sdtfl="http://schemas.microsoft.com/office/word/2024/wordml/sdtformatlock" xmlns:w16se="http://schemas.microsoft.com/office/word/2015/wordml/symex" xmlns:wpg="http://schemas.microsoft.com/office/word/2010/wordprocessingGroup" xmlns:wpi="http://schemas.microsoft.com/office/word/2010/wordprocessingInk" xmlns:wne="http://schemas.microsoft.com/office/word/2006/wordml" xmlns:wps="http://schemas.microsoft.com/office/word/2010/wordprocessingShape" mc:Ignorable="w14 w15 w16se w16cid w16 w16cex w16sdtdh w16sdtfl w16du wp14">
   <w:abstractNum w:abstractNumId="0" w15:restartNumberingAfterBreak="0">
-    <w:nsid w:val="3A5A49A6"/>
+    <w:nsid w:val="0B5144A7"/>
     <w:multiLevelType w:val="hybridMultilevel"/>
-    <w:tmpl w:val="34C02BAE"/>
-    <w:lvl w:ilvl="0" w:tplc="09160974" w:tentative="1">
+    <w:tmpl w:val="19D434A4"/>
+    <w:lvl w:ilvl="0" w:tplc="0240A882" w:tentative="1">
+      <w:start w:val="1"/>
+      <w:numFmt w:val="bullet"/>
+      <w:lvlText w:val="•"/>
+      <w:lvlJc w:val="left"/>
+      <w:pPr>
+        <w:ind w:left="720" w:hanging="280"/>
+      </w:pPr>
+    </w:lvl>
+    <w:lvl w:ilvl="1" w:tplc="2054A024" w:tentative="1">
+      <w:start w:val="1"/>
+      <w:numFmt w:val="bullet"/>
+      <w:lvlText w:val="–"/>
+      <w:lvlJc w:val="left"/>
+      <w:pPr>
+        <w:ind w:left="1080" w:hanging="280"/>
+      </w:pPr>
+    </w:lvl>
+    <w:lvl w:ilvl="2" w:tplc="0FAA67C2" w:tentative="1">
+      <w:start w:val="1"/>
+      <w:numFmt w:val="bullet"/>
+      <w:lvlText w:val="▪"/>
+      <w:lvlJc w:val="left"/>
+      <w:pPr>
+        <w:ind w:left="1440" w:hanging="280"/>
+      </w:pPr>
+    </w:lvl>
+    <w:lvl w:ilvl="3" w:tplc="1EF287E4">
+      <w:numFmt w:val="decimal"/>
+      <w:lvlText w:val=""/>
+      <w:lvlJc w:val="left"/>
+    </w:lvl>
+    <w:lvl w:ilvl="4" w:tplc="D46CD546">
+      <w:numFmt w:val="decimal"/>
+      <w:lvlText w:val=""/>
+      <w:lvlJc w:val="left"/>
+    </w:lvl>
+    <w:lvl w:ilvl="5" w:tplc="9A948582">
+      <w:numFmt w:val="decimal"/>
+      <w:lvlText w:val=""/>
+      <w:lvlJc w:val="left"/>
+    </w:lvl>
+    <w:lvl w:ilvl="6" w:tplc="6EC2990A">
+      <w:numFmt w:val="decimal"/>
+      <w:lvlText w:val=""/>
+      <w:lvlJc w:val="left"/>
+    </w:lvl>
+    <w:lvl w:ilvl="7" w:tplc="836AF5A4">
+      <w:numFmt w:val="decimal"/>
+      <w:lvlText w:val=""/>
+      <w:lvlJc w:val="left"/>
+    </w:lvl>
+    <w:lvl w:ilvl="8" w:tplc="5F9C6B84">
+      <w:numFmt w:val="decimal"/>
+      <w:lvlText w:val=""/>
+      <w:lvlJc w:val="left"/>
+    </w:lvl>
+  </w:abstractNum>
+  <w:abstractNum w:abstractNumId="1" w15:restartNumberingAfterBreak="0">
+    <w:nsid w:val="315A0906"/>
+    <w:multiLevelType w:val="hybridMultilevel"/>
+    <w:tmpl w:val="C7DAAF58"/>
+    <w:lvl w:ilvl="0" w:tplc="4796A208" w:tentative="1">
       <w:start w:val="1"/>
       <w:numFmt w:val="decimal"/>
       <w:lvlText w:val="%1."/>
@@ -32394,7 +32456,7 @@
         <w:ind w:left="720" w:hanging="360"/>
       </w:pPr>
     </w:lvl>
-    <w:lvl w:ilvl="1" w:tplc="128872D0" w:tentative="1">
+    <w:lvl w:ilvl="1" w:tplc="BF4C5676" w:tentative="1">
       <w:start w:val="1"/>
       <w:numFmt w:val="lowerLetter"/>
       <w:lvlText w:val="%2."/>
@@ -32403,7 +32465,7 @@
         <w:ind w:left="1080" w:hanging="360"/>
       </w:pPr>
     </w:lvl>
-    <w:lvl w:ilvl="2" w:tplc="FD203C92" w:tentative="1">
+    <w:lvl w:ilvl="2" w:tplc="51B84F08" w:tentative="1">
       <w:start w:val="1"/>
       <w:numFmt w:val="lowerRoman"/>
       <w:lvlText w:val="%3."/>
@@ -32412,104 +32474,42 @@
         <w:ind w:left="1440" w:hanging="360"/>
       </w:pPr>
     </w:lvl>
-    <w:lvl w:ilvl="3" w:tplc="39167C5A">
+    <w:lvl w:ilvl="3" w:tplc="345E61A4">
       <w:numFmt w:val="decimal"/>
       <w:lvlText w:val=""/>
       <w:lvlJc w:val="left"/>
     </w:lvl>
-    <w:lvl w:ilvl="4" w:tplc="EF262A44">
+    <w:lvl w:ilvl="4" w:tplc="6486FF62">
       <w:numFmt w:val="decimal"/>
       <w:lvlText w:val=""/>
       <w:lvlJc w:val="left"/>
     </w:lvl>
-    <w:lvl w:ilvl="5" w:tplc="EF96E800">
+    <w:lvl w:ilvl="5" w:tplc="1B26E7B8">
       <w:numFmt w:val="decimal"/>
       <w:lvlText w:val=""/>
       <w:lvlJc w:val="left"/>
     </w:lvl>
-    <w:lvl w:ilvl="6" w:tplc="E4A29912">
+    <w:lvl w:ilvl="6" w:tplc="2F44B8B4">
       <w:numFmt w:val="decimal"/>
       <w:lvlText w:val=""/>
       <w:lvlJc w:val="left"/>
     </w:lvl>
-    <w:lvl w:ilvl="7" w:tplc="CC849AA0">
+    <w:lvl w:ilvl="7" w:tplc="533EC7E0">
       <w:numFmt w:val="decimal"/>
       <w:lvlText w:val=""/>
       <w:lvlJc w:val="left"/>
     </w:lvl>
-    <w:lvl w:ilvl="8" w:tplc="7474F0A6">
-      <w:numFmt w:val="decimal"/>
-      <w:lvlText w:val=""/>
-      <w:lvlJc w:val="left"/>
-    </w:lvl>
-  </w:abstractNum>
-  <w:abstractNum w:abstractNumId="1" w15:restartNumberingAfterBreak="0">
-    <w:nsid w:val="5A861DB6"/>
-    <w:multiLevelType w:val="hybridMultilevel"/>
-    <w:tmpl w:val="02FCC926"/>
-    <w:lvl w:ilvl="0" w:tplc="702CBEF8" w:tentative="1">
-      <w:start w:val="1"/>
-      <w:numFmt w:val="bullet"/>
-      <w:lvlText w:val="•"/>
-      <w:lvlJc w:val="left"/>
-      <w:pPr>
-        <w:ind w:left="720" w:hanging="280"/>
-      </w:pPr>
-    </w:lvl>
-    <w:lvl w:ilvl="1" w:tplc="C7FA7FDC" w:tentative="1">
-      <w:start w:val="1"/>
-      <w:numFmt w:val="bullet"/>
-      <w:lvlText w:val="–"/>
-      <w:lvlJc w:val="left"/>
-      <w:pPr>
-        <w:ind w:left="1080" w:hanging="280"/>
-      </w:pPr>
-    </w:lvl>
-    <w:lvl w:ilvl="2" w:tplc="BA4EE5D2" w:tentative="1">
-      <w:start w:val="1"/>
-      <w:numFmt w:val="bullet"/>
-      <w:lvlText w:val="▪"/>
-      <w:lvlJc w:val="left"/>
-      <w:pPr>
-        <w:ind w:left="1440" w:hanging="280"/>
-      </w:pPr>
-    </w:lvl>
-    <w:lvl w:ilvl="3" w:tplc="66BCC936">
-      <w:numFmt w:val="decimal"/>
-      <w:lvlText w:val=""/>
-      <w:lvlJc w:val="left"/>
-    </w:lvl>
-    <w:lvl w:ilvl="4" w:tplc="BA0E3B36">
-      <w:numFmt w:val="decimal"/>
-      <w:lvlText w:val=""/>
-      <w:lvlJc w:val="left"/>
-    </w:lvl>
-    <w:lvl w:ilvl="5" w:tplc="E0FA5234">
-      <w:numFmt w:val="decimal"/>
-      <w:lvlText w:val=""/>
-      <w:lvlJc w:val="left"/>
-    </w:lvl>
-    <w:lvl w:ilvl="6" w:tplc="1E3A22A6">
-      <w:numFmt w:val="decimal"/>
-      <w:lvlText w:val=""/>
-      <w:lvlJc w:val="left"/>
-    </w:lvl>
-    <w:lvl w:ilvl="7" w:tplc="B832FFF4">
-      <w:numFmt w:val="decimal"/>
-      <w:lvlText w:val=""/>
-      <w:lvlJc w:val="left"/>
-    </w:lvl>
-    <w:lvl w:ilvl="8" w:tplc="E3AAA9C4">
+    <w:lvl w:ilvl="8" w:tplc="99A00B56">
       <w:numFmt w:val="decimal"/>
       <w:lvlText w:val=""/>
       <w:lvlJc w:val="left"/>
     </w:lvl>
   </w:abstractNum>
   <w:abstractNum w:abstractNumId="2" w15:restartNumberingAfterBreak="0">
-    <w:nsid w:val="72340D1B"/>
+    <w:nsid w:val="4DD107B9"/>
     <w:multiLevelType w:val="hybridMultilevel"/>
-    <w:tmpl w:val="3B8CE37A"/>
-    <w:lvl w:ilvl="0" w:tplc="5ECC1008" w:tentative="1">
+    <w:tmpl w:val="CD4C5CDC"/>
+    <w:lvl w:ilvl="0" w:tplc="DB783164" w:tentative="1">
       <w:start w:val="1"/>
       <w:numFmt w:val="bullet"/>
       <w:lvlText w:val="●"/>
@@ -32518,7 +32518,7 @@
         <w:ind w:left="720" w:hanging="360"/>
       </w:pPr>
     </w:lvl>
-    <w:lvl w:ilvl="1" w:tplc="5F886082" w:tentative="1">
+    <w:lvl w:ilvl="1" w:tplc="3C084986" w:tentative="1">
       <w:start w:val="1"/>
       <w:numFmt w:val="bullet"/>
       <w:lvlText w:val="○"/>
@@ -32527,7 +32527,7 @@
         <w:ind w:left="1440" w:hanging="360"/>
       </w:pPr>
     </w:lvl>
-    <w:lvl w:ilvl="2" w:tplc="CD2EE812" w:tentative="1">
+    <w:lvl w:ilvl="2" w:tplc="FE3CFE8A" w:tentative="1">
       <w:start w:val="1"/>
       <w:numFmt w:val="bullet"/>
       <w:lvlText w:val="■"/>
@@ -32536,7 +32536,7 @@
         <w:ind w:left="2160" w:hanging="360"/>
       </w:pPr>
     </w:lvl>
-    <w:lvl w:ilvl="3" w:tplc="8FF07568" w:tentative="1">
+    <w:lvl w:ilvl="3" w:tplc="A5CE6690" w:tentative="1">
       <w:start w:val="1"/>
       <w:numFmt w:val="bullet"/>
       <w:lvlText w:val="●"/>
@@ -32545,7 +32545,7 @@
         <w:ind w:left="2880" w:hanging="360"/>
       </w:pPr>
     </w:lvl>
-    <w:lvl w:ilvl="4" w:tplc="A3C8ADCA" w:tentative="1">
+    <w:lvl w:ilvl="4" w:tplc="1B46CF24" w:tentative="1">
       <w:start w:val="1"/>
       <w:numFmt w:val="bullet"/>
       <w:lvlText w:val="○"/>
@@ -32554,7 +32554,7 @@
         <w:ind w:left="3600" w:hanging="360"/>
       </w:pPr>
     </w:lvl>
-    <w:lvl w:ilvl="5" w:tplc="BDB2F0F6" w:tentative="1">
+    <w:lvl w:ilvl="5" w:tplc="3D264AF0" w:tentative="1">
       <w:start w:val="1"/>
       <w:numFmt w:val="bullet"/>
       <w:lvlText w:val="■"/>
@@ -32563,7 +32563,7 @@
         <w:ind w:left="4320" w:hanging="360"/>
       </w:pPr>
     </w:lvl>
-    <w:lvl w:ilvl="6" w:tplc="C85E586E" w:tentative="1">
+    <w:lvl w:ilvl="6" w:tplc="40C4ECD2" w:tentative="1">
       <w:start w:val="1"/>
       <w:numFmt w:val="bullet"/>
       <w:lvlText w:val="●"/>
@@ -32572,7 +32572,7 @@
         <w:ind w:left="5040" w:hanging="360"/>
       </w:pPr>
     </w:lvl>
-    <w:lvl w:ilvl="7" w:tplc="D670170E" w:tentative="1">
+    <w:lvl w:ilvl="7" w:tplc="DBF6F3F0" w:tentative="1">
       <w:start w:val="1"/>
       <w:numFmt w:val="bullet"/>
       <w:lvlText w:val="●"/>
@@ -32581,7 +32581,7 @@
         <w:ind w:left="5760" w:hanging="360"/>
       </w:pPr>
     </w:lvl>
-    <w:lvl w:ilvl="8" w:tplc="D4AC610E" w:tentative="1">
+    <w:lvl w:ilvl="8" w:tplc="03123708" w:tentative="1">
       <w:start w:val="1"/>
       <w:numFmt w:val="bullet"/>
       <w:lvlText w:val="●"/>
@@ -32591,7 +32591,7 @@
       </w:pPr>
     </w:lvl>
   </w:abstractNum>
-  <w:num w:numId="1" w16cid:durableId="1859810900">
+  <w:num w:numId="1" w16cid:durableId="461966924">
     <w:abstractNumId w:val="2"/>
     <w:lvlOverride w:ilvl="0">
       <w:startOverride w:val="1"/>
@@ -33296,7 +33296,7 @@
     <w:autoRedefine/>
     <w:uiPriority w:val="39"/>
     <w:unhideWhenUsed/>
-    <w:rsid w:val="002E4861"/>
+    <w:rsid w:val="00631E1D"/>
     <w:pPr>
       <w:spacing w:after="100"/>
     </w:pPr>
@@ -33308,7 +33308,7 @@
     <w:autoRedefine/>
     <w:uiPriority w:val="39"/>
     <w:unhideWhenUsed/>
-    <w:rsid w:val="002E4861"/>
+    <w:rsid w:val="00631E1D"/>
     <w:pPr>
       <w:spacing w:after="100"/>
       <w:ind w:left="210"/>
@@ -33320,7 +33320,7 @@
     <w:next w:val="Normal"/>
     <w:uiPriority w:val="99"/>
     <w:unhideWhenUsed/>
-    <w:rsid w:val="002E4861"/>
+    <w:rsid w:val="00631E1D"/>
   </w:style>
 </w:styles>
 </file>

</xml_diff>

<commit_message>
Avatars: plain silhouettes in 12 colours (own artwork, no licence or credit) replace Multiavatar; package and credit line removed; same codes a01..a12
Co-Authored-By: Claude Opus 5.5 (1M context) <noreply@anthropic.com>
</commit_message>
<xml_diff>
--- a/docs/07-ui-ux/ZP-DOC-07_UI-UX-Design.docx
+++ b/docs/07-ui-ux/ZP-DOC-07_UI-UX-Design.docx
@@ -1843,7 +1843,7 @@
     <w:sdt>
       <w:sdtPr>
         <w:alias w:val="Contents"/>
-        <w:id w:val="760958949"/>
+        <w:id w:val="139313791"/>
       </w:sdtPr>
       <w:sdtEndPr/>
       <w:sdtContent>
@@ -1872,7 +1872,7 @@
           <w:r>
             <w:fldChar w:fldCharType="separate"/>
           </w:r>
-          <w:hyperlink w:anchor="_Toc242888138" w:history="1">
+          <w:hyperlink w:anchor="_Toc242889119" w:history="1">
             <w:r>
               <w:rPr>
                 <w:rStyle w:val="Hyperlink"/>
@@ -1896,7 +1896,7 @@
               <w:rPr>
                 <w:noProof/>
               </w:rPr>
-              <w:instrText xml:space="preserve"> PAGEREF _Toc242888138 \h </w:instrText>
+              <w:instrText xml:space="preserve"> PAGEREF _Toc242889119 \h </w:instrText>
             </w:r>
             <w:r>
               <w:rPr>
@@ -1939,7 +1939,7 @@
               <w14:ligatures w14:val="standardContextual"/>
             </w:rPr>
           </w:pPr>
-          <w:hyperlink w:anchor="_Toc242888139" w:history="1">
+          <w:hyperlink w:anchor="_Toc242889120" w:history="1">
             <w:r>
               <w:rPr>
                 <w:rStyle w:val="Hyperlink"/>
@@ -1963,7 +1963,7 @@
               <w:rPr>
                 <w:noProof/>
               </w:rPr>
-              <w:instrText xml:space="preserve"> PAGEREF _Toc242888139 \h </w:instrText>
+              <w:instrText xml:space="preserve"> PAGEREF _Toc242889120 \h </w:instrText>
             </w:r>
             <w:r>
               <w:rPr>
@@ -2006,7 +2006,7 @@
               <w14:ligatures w14:val="standardContextual"/>
             </w:rPr>
           </w:pPr>
-          <w:hyperlink w:anchor="_Toc242888140" w:history="1">
+          <w:hyperlink w:anchor="_Toc242889121" w:history="1">
             <w:r>
               <w:rPr>
                 <w:rStyle w:val="Hyperlink"/>
@@ -2030,7 +2030,7 @@
               <w:rPr>
                 <w:noProof/>
               </w:rPr>
-              <w:instrText xml:space="preserve"> PAGEREF _Toc242888140 \h </w:instrText>
+              <w:instrText xml:space="preserve"> PAGEREF _Toc242889121 \h </w:instrText>
             </w:r>
             <w:r>
               <w:rPr>
@@ -2073,7 +2073,7 @@
               <w14:ligatures w14:val="standardContextual"/>
             </w:rPr>
           </w:pPr>
-          <w:hyperlink w:anchor="_Toc242888141" w:history="1">
+          <w:hyperlink w:anchor="_Toc242889122" w:history="1">
             <w:r>
               <w:rPr>
                 <w:rStyle w:val="Hyperlink"/>
@@ -2097,7 +2097,7 @@
               <w:rPr>
                 <w:noProof/>
               </w:rPr>
-              <w:instrText xml:space="preserve"> PAGEREF _Toc242888141 \h </w:instrText>
+              <w:instrText xml:space="preserve"> PAGEREF _Toc242889122 \h </w:instrText>
             </w:r>
             <w:r>
               <w:rPr>
@@ -2140,7 +2140,7 @@
               <w14:ligatures w14:val="standardContextual"/>
             </w:rPr>
           </w:pPr>
-          <w:hyperlink w:anchor="_Toc242888142" w:history="1">
+          <w:hyperlink w:anchor="_Toc242889123" w:history="1">
             <w:r>
               <w:rPr>
                 <w:rStyle w:val="Hyperlink"/>
@@ -2164,7 +2164,7 @@
               <w:rPr>
                 <w:noProof/>
               </w:rPr>
-              <w:instrText xml:space="preserve"> PAGEREF _Toc242888142 \h </w:instrText>
+              <w:instrText xml:space="preserve"> PAGEREF _Toc242889123 \h </w:instrText>
             </w:r>
             <w:r>
               <w:rPr>
@@ -2207,7 +2207,7 @@
               <w14:ligatures w14:val="standardContextual"/>
             </w:rPr>
           </w:pPr>
-          <w:hyperlink w:anchor="_Toc242888143" w:history="1">
+          <w:hyperlink w:anchor="_Toc242889124" w:history="1">
             <w:r>
               <w:rPr>
                 <w:rStyle w:val="Hyperlink"/>
@@ -2231,7 +2231,7 @@
               <w:rPr>
                 <w:noProof/>
               </w:rPr>
-              <w:instrText xml:space="preserve"> PAGEREF _Toc242888143 \h </w:instrText>
+              <w:instrText xml:space="preserve"> PAGEREF _Toc242889124 \h </w:instrText>
             </w:r>
             <w:r>
               <w:rPr>
@@ -2274,7 +2274,7 @@
               <w14:ligatures w14:val="standardContextual"/>
             </w:rPr>
           </w:pPr>
-          <w:hyperlink w:anchor="_Toc242888144" w:history="1">
+          <w:hyperlink w:anchor="_Toc242889125" w:history="1">
             <w:r>
               <w:rPr>
                 <w:rStyle w:val="Hyperlink"/>
@@ -2298,7 +2298,7 @@
               <w:rPr>
                 <w:noProof/>
               </w:rPr>
-              <w:instrText xml:space="preserve"> PAGEREF _Toc242888144 \h </w:instrText>
+              <w:instrText xml:space="preserve"> PAGEREF _Toc242889125 \h </w:instrText>
             </w:r>
             <w:r>
               <w:rPr>
@@ -2341,7 +2341,7 @@
               <w14:ligatures w14:val="standardContextual"/>
             </w:rPr>
           </w:pPr>
-          <w:hyperlink w:anchor="_Toc242888145" w:history="1">
+          <w:hyperlink w:anchor="_Toc242889126" w:history="1">
             <w:r>
               <w:rPr>
                 <w:rStyle w:val="Hyperlink"/>
@@ -2365,7 +2365,7 @@
               <w:rPr>
                 <w:noProof/>
               </w:rPr>
-              <w:instrText xml:space="preserve"> PAGEREF _Toc242888145 \h </w:instrText>
+              <w:instrText xml:space="preserve"> PAGEREF _Toc242889126 \h </w:instrText>
             </w:r>
             <w:r>
               <w:rPr>
@@ -2408,7 +2408,7 @@
               <w14:ligatures w14:val="standardContextual"/>
             </w:rPr>
           </w:pPr>
-          <w:hyperlink w:anchor="_Toc242888146" w:history="1">
+          <w:hyperlink w:anchor="_Toc242889127" w:history="1">
             <w:r>
               <w:rPr>
                 <w:rStyle w:val="Hyperlink"/>
@@ -2432,7 +2432,7 @@
               <w:rPr>
                 <w:noProof/>
               </w:rPr>
-              <w:instrText xml:space="preserve"> PAGEREF _Toc242888146 \h </w:instrText>
+              <w:instrText xml:space="preserve"> PAGEREF _Toc242889127 \h </w:instrText>
             </w:r>
             <w:r>
               <w:rPr>
@@ -2475,7 +2475,7 @@
               <w14:ligatures w14:val="standardContextual"/>
             </w:rPr>
           </w:pPr>
-          <w:hyperlink w:anchor="_Toc242888147" w:history="1">
+          <w:hyperlink w:anchor="_Toc242889128" w:history="1">
             <w:r>
               <w:rPr>
                 <w:rStyle w:val="Hyperlink"/>
@@ -2499,7 +2499,7 @@
               <w:rPr>
                 <w:noProof/>
               </w:rPr>
-              <w:instrText xml:space="preserve"> PAGEREF _Toc242888147 \h </w:instrText>
+              <w:instrText xml:space="preserve"> PAGEREF _Toc242889128 \h </w:instrText>
             </w:r>
             <w:r>
               <w:rPr>
@@ -2542,7 +2542,7 @@
               <w14:ligatures w14:val="standardContextual"/>
             </w:rPr>
           </w:pPr>
-          <w:hyperlink w:anchor="_Toc242888148" w:history="1">
+          <w:hyperlink w:anchor="_Toc242889129" w:history="1">
             <w:r>
               <w:rPr>
                 <w:rStyle w:val="Hyperlink"/>
@@ -2566,7 +2566,7 @@
               <w:rPr>
                 <w:noProof/>
               </w:rPr>
-              <w:instrText xml:space="preserve"> PAGEREF _Toc242888148 \h </w:instrText>
+              <w:instrText xml:space="preserve"> PAGEREF _Toc242889129 \h </w:instrText>
             </w:r>
             <w:r>
               <w:rPr>
@@ -2609,7 +2609,7 @@
               <w14:ligatures w14:val="standardContextual"/>
             </w:rPr>
           </w:pPr>
-          <w:hyperlink w:anchor="_Toc242888149" w:history="1">
+          <w:hyperlink w:anchor="_Toc242889130" w:history="1">
             <w:r>
               <w:rPr>
                 <w:rStyle w:val="Hyperlink"/>
@@ -2633,7 +2633,7 @@
               <w:rPr>
                 <w:noProof/>
               </w:rPr>
-              <w:instrText xml:space="preserve"> PAGEREF _Toc242888149 \h </w:instrText>
+              <w:instrText xml:space="preserve"> PAGEREF _Toc242889130 \h </w:instrText>
             </w:r>
             <w:r>
               <w:rPr>
@@ -2676,7 +2676,7 @@
               <w14:ligatures w14:val="standardContextual"/>
             </w:rPr>
           </w:pPr>
-          <w:hyperlink w:anchor="_Toc242888150" w:history="1">
+          <w:hyperlink w:anchor="_Toc242889131" w:history="1">
             <w:r>
               <w:rPr>
                 <w:rStyle w:val="Hyperlink"/>
@@ -2700,7 +2700,7 @@
               <w:rPr>
                 <w:noProof/>
               </w:rPr>
-              <w:instrText xml:space="preserve"> PAGEREF _Toc242888150 \h </w:instrText>
+              <w:instrText xml:space="preserve"> PAGEREF _Toc242889131 \h </w:instrText>
             </w:r>
             <w:r>
               <w:rPr>
@@ -2743,7 +2743,7 @@
               <w14:ligatures w14:val="standardContextual"/>
             </w:rPr>
           </w:pPr>
-          <w:hyperlink w:anchor="_Toc242888151" w:history="1">
+          <w:hyperlink w:anchor="_Toc242889132" w:history="1">
             <w:r>
               <w:rPr>
                 <w:rStyle w:val="Hyperlink"/>
@@ -2767,7 +2767,7 @@
               <w:rPr>
                 <w:noProof/>
               </w:rPr>
-              <w:instrText xml:space="preserve"> PAGEREF _Toc242888151 \h </w:instrText>
+              <w:instrText xml:space="preserve"> PAGEREF _Toc242889132 \h </w:instrText>
             </w:r>
             <w:r>
               <w:rPr>
@@ -2810,7 +2810,7 @@
               <w14:ligatures w14:val="standardContextual"/>
             </w:rPr>
           </w:pPr>
-          <w:hyperlink w:anchor="_Toc242888152" w:history="1">
+          <w:hyperlink w:anchor="_Toc242889133" w:history="1">
             <w:r>
               <w:rPr>
                 <w:rStyle w:val="Hyperlink"/>
@@ -2834,7 +2834,7 @@
               <w:rPr>
                 <w:noProof/>
               </w:rPr>
-              <w:instrText xml:space="preserve"> PAGEREF _Toc242888152 \h </w:instrText>
+              <w:instrText xml:space="preserve"> PAGEREF _Toc242889133 \h </w:instrText>
             </w:r>
             <w:r>
               <w:rPr>
@@ -2877,7 +2877,7 @@
               <w14:ligatures w14:val="standardContextual"/>
             </w:rPr>
           </w:pPr>
-          <w:hyperlink w:anchor="_Toc242888153" w:history="1">
+          <w:hyperlink w:anchor="_Toc242889134" w:history="1">
             <w:r>
               <w:rPr>
                 <w:rStyle w:val="Hyperlink"/>
@@ -2901,7 +2901,7 @@
               <w:rPr>
                 <w:noProof/>
               </w:rPr>
-              <w:instrText xml:space="preserve"> PAGEREF _Toc242888153 \h </w:instrText>
+              <w:instrText xml:space="preserve"> PAGEREF _Toc242889134 \h </w:instrText>
             </w:r>
             <w:r>
               <w:rPr>
@@ -2944,7 +2944,7 @@
               <w14:ligatures w14:val="standardContextual"/>
             </w:rPr>
           </w:pPr>
-          <w:hyperlink w:anchor="_Toc242888154" w:history="1">
+          <w:hyperlink w:anchor="_Toc242889135" w:history="1">
             <w:r>
               <w:rPr>
                 <w:rStyle w:val="Hyperlink"/>
@@ -2968,7 +2968,7 @@
               <w:rPr>
                 <w:noProof/>
               </w:rPr>
-              <w:instrText xml:space="preserve"> PAGEREF _Toc242888154 \h </w:instrText>
+              <w:instrText xml:space="preserve"> PAGEREF _Toc242889135 \h </w:instrText>
             </w:r>
             <w:r>
               <w:rPr>
@@ -3011,7 +3011,7 @@
               <w14:ligatures w14:val="standardContextual"/>
             </w:rPr>
           </w:pPr>
-          <w:hyperlink w:anchor="_Toc242888155" w:history="1">
+          <w:hyperlink w:anchor="_Toc242889136" w:history="1">
             <w:r>
               <w:rPr>
                 <w:rStyle w:val="Hyperlink"/>
@@ -3035,7 +3035,7 @@
               <w:rPr>
                 <w:noProof/>
               </w:rPr>
-              <w:instrText xml:space="preserve"> PAGEREF _Toc242888155 \h </w:instrText>
+              <w:instrText xml:space="preserve"> PAGEREF _Toc242889136 \h </w:instrText>
             </w:r>
             <w:r>
               <w:rPr>
@@ -3078,7 +3078,7 @@
               <w14:ligatures w14:val="standardContextual"/>
             </w:rPr>
           </w:pPr>
-          <w:hyperlink w:anchor="_Toc242888156" w:history="1">
+          <w:hyperlink w:anchor="_Toc242889137" w:history="1">
             <w:r>
               <w:rPr>
                 <w:rStyle w:val="Hyperlink"/>
@@ -3102,7 +3102,7 @@
               <w:rPr>
                 <w:noProof/>
               </w:rPr>
-              <w:instrText xml:space="preserve"> PAGEREF _Toc242888156 \h </w:instrText>
+              <w:instrText xml:space="preserve"> PAGEREF _Toc242889137 \h </w:instrText>
             </w:r>
             <w:r>
               <w:rPr>
@@ -3145,7 +3145,7 @@
               <w14:ligatures w14:val="standardContextual"/>
             </w:rPr>
           </w:pPr>
-          <w:hyperlink w:anchor="_Toc242888157" w:history="1">
+          <w:hyperlink w:anchor="_Toc242889138" w:history="1">
             <w:r>
               <w:rPr>
                 <w:rStyle w:val="Hyperlink"/>
@@ -3169,7 +3169,7 @@
               <w:rPr>
                 <w:noProof/>
               </w:rPr>
-              <w:instrText xml:space="preserve"> PAGEREF _Toc242888157 \h </w:instrText>
+              <w:instrText xml:space="preserve"> PAGEREF _Toc242889138 \h </w:instrText>
             </w:r>
             <w:r>
               <w:rPr>
@@ -3212,7 +3212,7 @@
               <w14:ligatures w14:val="standardContextual"/>
             </w:rPr>
           </w:pPr>
-          <w:hyperlink w:anchor="_Toc242888158" w:history="1">
+          <w:hyperlink w:anchor="_Toc242889139" w:history="1">
             <w:r>
               <w:rPr>
                 <w:rStyle w:val="Hyperlink"/>
@@ -3236,7 +3236,7 @@
               <w:rPr>
                 <w:noProof/>
               </w:rPr>
-              <w:instrText xml:space="preserve"> PAGEREF _Toc242888158 \h </w:instrText>
+              <w:instrText xml:space="preserve"> PAGEREF _Toc242889139 \h </w:instrText>
             </w:r>
             <w:r>
               <w:rPr>
@@ -3279,7 +3279,7 @@
               <w14:ligatures w14:val="standardContextual"/>
             </w:rPr>
           </w:pPr>
-          <w:hyperlink w:anchor="_Toc242888159" w:history="1">
+          <w:hyperlink w:anchor="_Toc242889140" w:history="1">
             <w:r>
               <w:rPr>
                 <w:rStyle w:val="Hyperlink"/>
@@ -3303,7 +3303,7 @@
               <w:rPr>
                 <w:noProof/>
               </w:rPr>
-              <w:instrText xml:space="preserve"> PAGEREF _Toc242888159 \h </w:instrText>
+              <w:instrText xml:space="preserve"> PAGEREF _Toc242889140 \h </w:instrText>
             </w:r>
             <w:r>
               <w:rPr>
@@ -3346,7 +3346,7 @@
               <w14:ligatures w14:val="standardContextual"/>
             </w:rPr>
           </w:pPr>
-          <w:hyperlink w:anchor="_Toc242888160" w:history="1">
+          <w:hyperlink w:anchor="_Toc242889141" w:history="1">
             <w:r>
               <w:rPr>
                 <w:rStyle w:val="Hyperlink"/>
@@ -3370,7 +3370,7 @@
               <w:rPr>
                 <w:noProof/>
               </w:rPr>
-              <w:instrText xml:space="preserve"> PAGEREF _Toc242888160 \h </w:instrText>
+              <w:instrText xml:space="preserve"> PAGEREF _Toc242889141 \h </w:instrText>
             </w:r>
             <w:r>
               <w:rPr>
@@ -3413,7 +3413,7 @@
               <w14:ligatures w14:val="standardContextual"/>
             </w:rPr>
           </w:pPr>
-          <w:hyperlink w:anchor="_Toc242888161" w:history="1">
+          <w:hyperlink w:anchor="_Toc242889142" w:history="1">
             <w:r>
               <w:rPr>
                 <w:rStyle w:val="Hyperlink"/>
@@ -3437,7 +3437,7 @@
               <w:rPr>
                 <w:noProof/>
               </w:rPr>
-              <w:instrText xml:space="preserve"> PAGEREF _Toc242888161 \h </w:instrText>
+              <w:instrText xml:space="preserve"> PAGEREF _Toc242889142 \h </w:instrText>
             </w:r>
             <w:r>
               <w:rPr>
@@ -3480,7 +3480,7 @@
               <w14:ligatures w14:val="standardContextual"/>
             </w:rPr>
           </w:pPr>
-          <w:hyperlink w:anchor="_Toc242888162" w:history="1">
+          <w:hyperlink w:anchor="_Toc242889143" w:history="1">
             <w:r>
               <w:rPr>
                 <w:rStyle w:val="Hyperlink"/>
@@ -3504,7 +3504,7 @@
               <w:rPr>
                 <w:noProof/>
               </w:rPr>
-              <w:instrText xml:space="preserve"> PAGEREF _Toc242888162 \h </w:instrText>
+              <w:instrText xml:space="preserve"> PAGEREF _Toc242889143 \h </w:instrText>
             </w:r>
             <w:r>
               <w:rPr>
@@ -3547,7 +3547,7 @@
               <w14:ligatures w14:val="standardContextual"/>
             </w:rPr>
           </w:pPr>
-          <w:hyperlink w:anchor="_Toc242888163" w:history="1">
+          <w:hyperlink w:anchor="_Toc242889144" w:history="1">
             <w:r>
               <w:rPr>
                 <w:rStyle w:val="Hyperlink"/>
@@ -3571,7 +3571,7 @@
               <w:rPr>
                 <w:noProof/>
               </w:rPr>
-              <w:instrText xml:space="preserve"> PAGEREF _Toc242888163 \h </w:instrText>
+              <w:instrText xml:space="preserve"> PAGEREF _Toc242889144 \h </w:instrText>
             </w:r>
             <w:r>
               <w:rPr>
@@ -3614,7 +3614,7 @@
               <w14:ligatures w14:val="standardContextual"/>
             </w:rPr>
           </w:pPr>
-          <w:hyperlink w:anchor="_Toc242888164" w:history="1">
+          <w:hyperlink w:anchor="_Toc242889145" w:history="1">
             <w:r>
               <w:rPr>
                 <w:rStyle w:val="Hyperlink"/>
@@ -3638,7 +3638,7 @@
               <w:rPr>
                 <w:noProof/>
               </w:rPr>
-              <w:instrText xml:space="preserve"> PAGEREF _Toc242888164 \h </w:instrText>
+              <w:instrText xml:space="preserve"> PAGEREF _Toc242889145 \h </w:instrText>
             </w:r>
             <w:r>
               <w:rPr>
@@ -3681,7 +3681,7 @@
               <w14:ligatures w14:val="standardContextual"/>
             </w:rPr>
           </w:pPr>
-          <w:hyperlink w:anchor="_Toc242888165" w:history="1">
+          <w:hyperlink w:anchor="_Toc242889146" w:history="1">
             <w:r>
               <w:rPr>
                 <w:rStyle w:val="Hyperlink"/>
@@ -3705,7 +3705,7 @@
               <w:rPr>
                 <w:noProof/>
               </w:rPr>
-              <w:instrText xml:space="preserve"> PAGEREF _Toc242888165 \h </w:instrText>
+              <w:instrText xml:space="preserve"> PAGEREF _Toc242889146 \h </w:instrText>
             </w:r>
             <w:r>
               <w:rPr>
@@ -3748,7 +3748,7 @@
               <w14:ligatures w14:val="standardContextual"/>
             </w:rPr>
           </w:pPr>
-          <w:hyperlink w:anchor="_Toc242888166" w:history="1">
+          <w:hyperlink w:anchor="_Toc242889147" w:history="1">
             <w:r>
               <w:rPr>
                 <w:rStyle w:val="Hyperlink"/>
@@ -3772,7 +3772,7 @@
               <w:rPr>
                 <w:noProof/>
               </w:rPr>
-              <w:instrText xml:space="preserve"> PAGEREF _Toc242888166 \h </w:instrText>
+              <w:instrText xml:space="preserve"> PAGEREF _Toc242889147 \h </w:instrText>
             </w:r>
             <w:r>
               <w:rPr>
@@ -3815,7 +3815,7 @@
               <w14:ligatures w14:val="standardContextual"/>
             </w:rPr>
           </w:pPr>
-          <w:hyperlink w:anchor="_Toc242888167" w:history="1">
+          <w:hyperlink w:anchor="_Toc242889148" w:history="1">
             <w:r>
               <w:rPr>
                 <w:rStyle w:val="Hyperlink"/>
@@ -3839,7 +3839,7 @@
               <w:rPr>
                 <w:noProof/>
               </w:rPr>
-              <w:instrText xml:space="preserve"> PAGEREF _Toc242888167 \h </w:instrText>
+              <w:instrText xml:space="preserve"> PAGEREF _Toc242889148 \h </w:instrText>
             </w:r>
             <w:r>
               <w:rPr>
@@ -3882,7 +3882,7 @@
               <w14:ligatures w14:val="standardContextual"/>
             </w:rPr>
           </w:pPr>
-          <w:hyperlink w:anchor="_Toc242888168" w:history="1">
+          <w:hyperlink w:anchor="_Toc242889149" w:history="1">
             <w:r>
               <w:rPr>
                 <w:rStyle w:val="Hyperlink"/>
@@ -3906,7 +3906,7 @@
               <w:rPr>
                 <w:noProof/>
               </w:rPr>
-              <w:instrText xml:space="preserve"> PAGEREF _Toc242888168 \h </w:instrText>
+              <w:instrText xml:space="preserve"> PAGEREF _Toc242889149 \h </w:instrText>
             </w:r>
             <w:r>
               <w:rPr>
@@ -3949,7 +3949,7 @@
               <w14:ligatures w14:val="standardContextual"/>
             </w:rPr>
           </w:pPr>
-          <w:hyperlink w:anchor="_Toc242888169" w:history="1">
+          <w:hyperlink w:anchor="_Toc242889150" w:history="1">
             <w:r>
               <w:rPr>
                 <w:rStyle w:val="Hyperlink"/>
@@ -3973,7 +3973,7 @@
               <w:rPr>
                 <w:noProof/>
               </w:rPr>
-              <w:instrText xml:space="preserve"> PAGEREF _Toc242888169 \h </w:instrText>
+              <w:instrText xml:space="preserve"> PAGEREF _Toc242889150 \h </w:instrText>
             </w:r>
             <w:r>
               <w:rPr>
@@ -4016,7 +4016,7 @@
               <w14:ligatures w14:val="standardContextual"/>
             </w:rPr>
           </w:pPr>
-          <w:hyperlink w:anchor="_Toc242888170" w:history="1">
+          <w:hyperlink w:anchor="_Toc242889151" w:history="1">
             <w:r>
               <w:rPr>
                 <w:rStyle w:val="Hyperlink"/>
@@ -4040,7 +4040,7 @@
               <w:rPr>
                 <w:noProof/>
               </w:rPr>
-              <w:instrText xml:space="preserve"> PAGEREF _Toc242888170 \h </w:instrText>
+              <w:instrText xml:space="preserve"> PAGEREF _Toc242889151 \h </w:instrText>
             </w:r>
             <w:r>
               <w:rPr>
@@ -4083,7 +4083,7 @@
               <w14:ligatures w14:val="standardContextual"/>
             </w:rPr>
           </w:pPr>
-          <w:hyperlink w:anchor="_Toc242888171" w:history="1">
+          <w:hyperlink w:anchor="_Toc242889152" w:history="1">
             <w:r>
               <w:rPr>
                 <w:rStyle w:val="Hyperlink"/>
@@ -4107,7 +4107,7 @@
               <w:rPr>
                 <w:noProof/>
               </w:rPr>
-              <w:instrText xml:space="preserve"> PAGEREF _Toc242888171 \h </w:instrText>
+              <w:instrText xml:space="preserve"> PAGEREF _Toc242889152 \h </w:instrText>
             </w:r>
             <w:r>
               <w:rPr>
@@ -4150,7 +4150,7 @@
               <w14:ligatures w14:val="standardContextual"/>
             </w:rPr>
           </w:pPr>
-          <w:hyperlink w:anchor="_Toc242888172" w:history="1">
+          <w:hyperlink w:anchor="_Toc242889153" w:history="1">
             <w:r>
               <w:rPr>
                 <w:rStyle w:val="Hyperlink"/>
@@ -4174,7 +4174,7 @@
               <w:rPr>
                 <w:noProof/>
               </w:rPr>
-              <w:instrText xml:space="preserve"> PAGEREF _Toc242888172 \h </w:instrText>
+              <w:instrText xml:space="preserve"> PAGEREF _Toc242889153 \h </w:instrText>
             </w:r>
             <w:r>
               <w:rPr>
@@ -4221,7 +4221,7 @@
     <w:sdt>
       <w:sdtPr>
         <w:alias w:val="Tables"/>
-        <w:id w:val="1495148843"/>
+        <w:id w:val="-614990031"/>
       </w:sdtPr>
       <w:sdtEndPr/>
       <w:sdtContent>
@@ -4250,7 +4250,7 @@
           <w:r>
             <w:fldChar w:fldCharType="separate"/>
           </w:r>
-          <w:hyperlink w:anchor="_Toc242888173" w:history="1">
+          <w:hyperlink w:anchor="_Toc242889154" w:history="1">
             <w:r>
               <w:rPr>
                 <w:rStyle w:val="Hyperlink"/>
@@ -4274,7 +4274,7 @@
               <w:rPr>
                 <w:noProof/>
               </w:rPr>
-              <w:instrText xml:space="preserve"> PAGEREF _Toc242888173 \h </w:instrText>
+              <w:instrText xml:space="preserve"> PAGEREF _Toc242889154 \h </w:instrText>
             </w:r>
             <w:r>
               <w:rPr>
@@ -4317,7 +4317,7 @@
               <w14:ligatures w14:val="standardContextual"/>
             </w:rPr>
           </w:pPr>
-          <w:hyperlink w:anchor="_Toc242888174" w:history="1">
+          <w:hyperlink w:anchor="_Toc242889155" w:history="1">
             <w:r>
               <w:rPr>
                 <w:rStyle w:val="Hyperlink"/>
@@ -4341,7 +4341,7 @@
               <w:rPr>
                 <w:noProof/>
               </w:rPr>
-              <w:instrText xml:space="preserve"> PAGEREF _Toc242888174 \h </w:instrText>
+              <w:instrText xml:space="preserve"> PAGEREF _Toc242889155 \h </w:instrText>
             </w:r>
             <w:r>
               <w:rPr>
@@ -4384,7 +4384,7 @@
               <w14:ligatures w14:val="standardContextual"/>
             </w:rPr>
           </w:pPr>
-          <w:hyperlink w:anchor="_Toc242888175" w:history="1">
+          <w:hyperlink w:anchor="_Toc242889156" w:history="1">
             <w:r>
               <w:rPr>
                 <w:rStyle w:val="Hyperlink"/>
@@ -4408,7 +4408,7 @@
               <w:rPr>
                 <w:noProof/>
               </w:rPr>
-              <w:instrText xml:space="preserve"> PAGEREF _Toc242888175 \h </w:instrText>
+              <w:instrText xml:space="preserve"> PAGEREF _Toc242889156 \h </w:instrText>
             </w:r>
             <w:r>
               <w:rPr>
@@ -4451,7 +4451,7 @@
               <w14:ligatures w14:val="standardContextual"/>
             </w:rPr>
           </w:pPr>
-          <w:hyperlink w:anchor="_Toc242888176" w:history="1">
+          <w:hyperlink w:anchor="_Toc242889157" w:history="1">
             <w:r>
               <w:rPr>
                 <w:rStyle w:val="Hyperlink"/>
@@ -4475,7 +4475,7 @@
               <w:rPr>
                 <w:noProof/>
               </w:rPr>
-              <w:instrText xml:space="preserve"> PAGEREF _Toc242888176 \h </w:instrText>
+              <w:instrText xml:space="preserve"> PAGEREF _Toc242889157 \h </w:instrText>
             </w:r>
             <w:r>
               <w:rPr>
@@ -4518,7 +4518,7 @@
               <w14:ligatures w14:val="standardContextual"/>
             </w:rPr>
           </w:pPr>
-          <w:hyperlink w:anchor="_Toc242888177" w:history="1">
+          <w:hyperlink w:anchor="_Toc242889158" w:history="1">
             <w:r>
               <w:rPr>
                 <w:rStyle w:val="Hyperlink"/>
@@ -4542,7 +4542,7 @@
               <w:rPr>
                 <w:noProof/>
               </w:rPr>
-              <w:instrText xml:space="preserve"> PAGEREF _Toc242888177 \h </w:instrText>
+              <w:instrText xml:space="preserve"> PAGEREF _Toc242889158 \h </w:instrText>
             </w:r>
             <w:r>
               <w:rPr>
@@ -4585,7 +4585,7 @@
               <w14:ligatures w14:val="standardContextual"/>
             </w:rPr>
           </w:pPr>
-          <w:hyperlink w:anchor="_Toc242888178" w:history="1">
+          <w:hyperlink w:anchor="_Toc242889159" w:history="1">
             <w:r>
               <w:rPr>
                 <w:rStyle w:val="Hyperlink"/>
@@ -4609,7 +4609,7 @@
               <w:rPr>
                 <w:noProof/>
               </w:rPr>
-              <w:instrText xml:space="preserve"> PAGEREF _Toc242888178 \h </w:instrText>
+              <w:instrText xml:space="preserve"> PAGEREF _Toc242889159 \h </w:instrText>
             </w:r>
             <w:r>
               <w:rPr>
@@ -4652,7 +4652,7 @@
               <w14:ligatures w14:val="standardContextual"/>
             </w:rPr>
           </w:pPr>
-          <w:hyperlink w:anchor="_Toc242888179" w:history="1">
+          <w:hyperlink w:anchor="_Toc242889160" w:history="1">
             <w:r>
               <w:rPr>
                 <w:rStyle w:val="Hyperlink"/>
@@ -4676,7 +4676,7 @@
               <w:rPr>
                 <w:noProof/>
               </w:rPr>
-              <w:instrText xml:space="preserve"> PAGEREF _Toc242888179 \h </w:instrText>
+              <w:instrText xml:space="preserve"> PAGEREF _Toc242889160 \h </w:instrText>
             </w:r>
             <w:r>
               <w:rPr>
@@ -4719,7 +4719,7 @@
               <w14:ligatures w14:val="standardContextual"/>
             </w:rPr>
           </w:pPr>
-          <w:hyperlink w:anchor="_Toc242888180" w:history="1">
+          <w:hyperlink w:anchor="_Toc242889161" w:history="1">
             <w:r>
               <w:rPr>
                 <w:rStyle w:val="Hyperlink"/>
@@ -4743,7 +4743,7 @@
               <w:rPr>
                 <w:noProof/>
               </w:rPr>
-              <w:instrText xml:space="preserve"> PAGEREF _Toc242888180 \h </w:instrText>
+              <w:instrText xml:space="preserve"> PAGEREF _Toc242889161 \h </w:instrText>
             </w:r>
             <w:r>
               <w:rPr>
@@ -4786,7 +4786,7 @@
               <w14:ligatures w14:val="standardContextual"/>
             </w:rPr>
           </w:pPr>
-          <w:hyperlink w:anchor="_Toc242888181" w:history="1">
+          <w:hyperlink w:anchor="_Toc242889162" w:history="1">
             <w:r>
               <w:rPr>
                 <w:rStyle w:val="Hyperlink"/>
@@ -4810,7 +4810,7 @@
               <w:rPr>
                 <w:noProof/>
               </w:rPr>
-              <w:instrText xml:space="preserve"> PAGEREF _Toc242888181 \h </w:instrText>
+              <w:instrText xml:space="preserve"> PAGEREF _Toc242889162 \h </w:instrText>
             </w:r>
             <w:r>
               <w:rPr>
@@ -4853,7 +4853,7 @@
               <w14:ligatures w14:val="standardContextual"/>
             </w:rPr>
           </w:pPr>
-          <w:hyperlink w:anchor="_Toc242888182" w:history="1">
+          <w:hyperlink w:anchor="_Toc242889163" w:history="1">
             <w:r>
               <w:rPr>
                 <w:rStyle w:val="Hyperlink"/>
@@ -4877,7 +4877,7 @@
               <w:rPr>
                 <w:noProof/>
               </w:rPr>
-              <w:instrText xml:space="preserve"> PAGEREF _Toc242888182 \h </w:instrText>
+              <w:instrText xml:space="preserve"> PAGEREF _Toc242889163 \h </w:instrText>
             </w:r>
             <w:r>
               <w:rPr>
@@ -4920,7 +4920,7 @@
               <w14:ligatures w14:val="standardContextual"/>
             </w:rPr>
           </w:pPr>
-          <w:hyperlink w:anchor="_Toc242888183" w:history="1">
+          <w:hyperlink w:anchor="_Toc242889164" w:history="1">
             <w:r>
               <w:rPr>
                 <w:rStyle w:val="Hyperlink"/>
@@ -4944,7 +4944,7 @@
               <w:rPr>
                 <w:noProof/>
               </w:rPr>
-              <w:instrText xml:space="preserve"> PAGEREF _Toc242888183 \h </w:instrText>
+              <w:instrText xml:space="preserve"> PAGEREF _Toc242889164 \h </w:instrText>
             </w:r>
             <w:r>
               <w:rPr>
@@ -4987,7 +4987,7 @@
               <w14:ligatures w14:val="standardContextual"/>
             </w:rPr>
           </w:pPr>
-          <w:hyperlink w:anchor="_Toc242888184" w:history="1">
+          <w:hyperlink w:anchor="_Toc242889165" w:history="1">
             <w:r>
               <w:rPr>
                 <w:rStyle w:val="Hyperlink"/>
@@ -5011,7 +5011,7 @@
               <w:rPr>
                 <w:noProof/>
               </w:rPr>
-              <w:instrText xml:space="preserve"> PAGEREF _Toc242888184 \h </w:instrText>
+              <w:instrText xml:space="preserve"> PAGEREF _Toc242889165 \h </w:instrText>
             </w:r>
             <w:r>
               <w:rPr>
@@ -5054,7 +5054,7 @@
               <w14:ligatures w14:val="standardContextual"/>
             </w:rPr>
           </w:pPr>
-          <w:hyperlink w:anchor="_Toc242888185" w:history="1">
+          <w:hyperlink w:anchor="_Toc242889166" w:history="1">
             <w:r>
               <w:rPr>
                 <w:rStyle w:val="Hyperlink"/>
@@ -5078,7 +5078,7 @@
               <w:rPr>
                 <w:noProof/>
               </w:rPr>
-              <w:instrText xml:space="preserve"> PAGEREF _Toc242888185 \h </w:instrText>
+              <w:instrText xml:space="preserve"> PAGEREF _Toc242889166 \h </w:instrText>
             </w:r>
             <w:r>
               <w:rPr>
@@ -5121,7 +5121,7 @@
               <w14:ligatures w14:val="standardContextual"/>
             </w:rPr>
           </w:pPr>
-          <w:hyperlink w:anchor="_Toc242888186" w:history="1">
+          <w:hyperlink w:anchor="_Toc242889167" w:history="1">
             <w:r>
               <w:rPr>
                 <w:rStyle w:val="Hyperlink"/>
@@ -5145,7 +5145,7 @@
               <w:rPr>
                 <w:noProof/>
               </w:rPr>
-              <w:instrText xml:space="preserve"> PAGEREF _Toc242888186 \h </w:instrText>
+              <w:instrText xml:space="preserve"> PAGEREF _Toc242889167 \h </w:instrText>
             </w:r>
             <w:r>
               <w:rPr>
@@ -5188,7 +5188,7 @@
               <w14:ligatures w14:val="standardContextual"/>
             </w:rPr>
           </w:pPr>
-          <w:hyperlink w:anchor="_Toc242888187" w:history="1">
+          <w:hyperlink w:anchor="_Toc242889168" w:history="1">
             <w:r>
               <w:rPr>
                 <w:rStyle w:val="Hyperlink"/>
@@ -5212,7 +5212,7 @@
               <w:rPr>
                 <w:noProof/>
               </w:rPr>
-              <w:instrText xml:space="preserve"> PAGEREF _Toc242888187 \h </w:instrText>
+              <w:instrText xml:space="preserve"> PAGEREF _Toc242889168 \h </w:instrText>
             </w:r>
             <w:r>
               <w:rPr>
@@ -5255,7 +5255,7 @@
               <w14:ligatures w14:val="standardContextual"/>
             </w:rPr>
           </w:pPr>
-          <w:hyperlink w:anchor="_Toc242888188" w:history="1">
+          <w:hyperlink w:anchor="_Toc242889169" w:history="1">
             <w:r>
               <w:rPr>
                 <w:rStyle w:val="Hyperlink"/>
@@ -5279,7 +5279,7 @@
               <w:rPr>
                 <w:noProof/>
               </w:rPr>
-              <w:instrText xml:space="preserve"> PAGEREF _Toc242888188 \h </w:instrText>
+              <w:instrText xml:space="preserve"> PAGEREF _Toc242889169 \h </w:instrText>
             </w:r>
             <w:r>
               <w:rPr>
@@ -5322,7 +5322,7 @@
               <w14:ligatures w14:val="standardContextual"/>
             </w:rPr>
           </w:pPr>
-          <w:hyperlink w:anchor="_Toc242888189" w:history="1">
+          <w:hyperlink w:anchor="_Toc242889170" w:history="1">
             <w:r>
               <w:rPr>
                 <w:rStyle w:val="Hyperlink"/>
@@ -5346,7 +5346,7 @@
               <w:rPr>
                 <w:noProof/>
               </w:rPr>
-              <w:instrText xml:space="preserve"> PAGEREF _Toc242888189 \h </w:instrText>
+              <w:instrText xml:space="preserve"> PAGEREF _Toc242889170 \h </w:instrText>
             </w:r>
             <w:r>
               <w:rPr>
@@ -5389,7 +5389,7 @@
               <w14:ligatures w14:val="standardContextual"/>
             </w:rPr>
           </w:pPr>
-          <w:hyperlink w:anchor="_Toc242888190" w:history="1">
+          <w:hyperlink w:anchor="_Toc242889171" w:history="1">
             <w:r>
               <w:rPr>
                 <w:rStyle w:val="Hyperlink"/>
@@ -5413,7 +5413,7 @@
               <w:rPr>
                 <w:noProof/>
               </w:rPr>
-              <w:instrText xml:space="preserve"> PAGEREF _Toc242888190 \h </w:instrText>
+              <w:instrText xml:space="preserve"> PAGEREF _Toc242889171 \h </w:instrText>
             </w:r>
             <w:r>
               <w:rPr>
@@ -5456,7 +5456,7 @@
               <w14:ligatures w14:val="standardContextual"/>
             </w:rPr>
           </w:pPr>
-          <w:hyperlink w:anchor="_Toc242888191" w:history="1">
+          <w:hyperlink w:anchor="_Toc242889172" w:history="1">
             <w:r>
               <w:rPr>
                 <w:rStyle w:val="Hyperlink"/>
@@ -5480,7 +5480,7 @@
               <w:rPr>
                 <w:noProof/>
               </w:rPr>
-              <w:instrText xml:space="preserve"> PAGEREF _Toc242888191 \h </w:instrText>
+              <w:instrText xml:space="preserve"> PAGEREF _Toc242889172 \h </w:instrText>
             </w:r>
             <w:r>
               <w:rPr>
@@ -5523,7 +5523,7 @@
               <w14:ligatures w14:val="standardContextual"/>
             </w:rPr>
           </w:pPr>
-          <w:hyperlink w:anchor="_Toc242888192" w:history="1">
+          <w:hyperlink w:anchor="_Toc242889173" w:history="1">
             <w:r>
               <w:rPr>
                 <w:rStyle w:val="Hyperlink"/>
@@ -5547,7 +5547,7 @@
               <w:rPr>
                 <w:noProof/>
               </w:rPr>
-              <w:instrText xml:space="preserve"> PAGEREF _Toc242888192 \h </w:instrText>
+              <w:instrText xml:space="preserve"> PAGEREF _Toc242889173 \h </w:instrText>
             </w:r>
             <w:r>
               <w:rPr>
@@ -5590,7 +5590,7 @@
               <w14:ligatures w14:val="standardContextual"/>
             </w:rPr>
           </w:pPr>
-          <w:hyperlink w:anchor="_Toc242888193" w:history="1">
+          <w:hyperlink w:anchor="_Toc242889174" w:history="1">
             <w:r>
               <w:rPr>
                 <w:rStyle w:val="Hyperlink"/>
@@ -5614,7 +5614,7 @@
               <w:rPr>
                 <w:noProof/>
               </w:rPr>
-              <w:instrText xml:space="preserve"> PAGEREF _Toc242888193 \h </w:instrText>
+              <w:instrText xml:space="preserve"> PAGEREF _Toc242889174 \h </w:instrText>
             </w:r>
             <w:r>
               <w:rPr>
@@ -5657,7 +5657,7 @@
               <w14:ligatures w14:val="standardContextual"/>
             </w:rPr>
           </w:pPr>
-          <w:hyperlink w:anchor="_Toc242888194" w:history="1">
+          <w:hyperlink w:anchor="_Toc242889175" w:history="1">
             <w:r>
               <w:rPr>
                 <w:rStyle w:val="Hyperlink"/>
@@ -5681,7 +5681,7 @@
               <w:rPr>
                 <w:noProof/>
               </w:rPr>
-              <w:instrText xml:space="preserve"> PAGEREF _Toc242888194 \h </w:instrText>
+              <w:instrText xml:space="preserve"> PAGEREF _Toc242889175 \h </w:instrText>
             </w:r>
             <w:r>
               <w:rPr>
@@ -5724,7 +5724,7 @@
               <w14:ligatures w14:val="standardContextual"/>
             </w:rPr>
           </w:pPr>
-          <w:hyperlink w:anchor="_Toc242888195" w:history="1">
+          <w:hyperlink w:anchor="_Toc242889176" w:history="1">
             <w:r>
               <w:rPr>
                 <w:rStyle w:val="Hyperlink"/>
@@ -5748,7 +5748,7 @@
               <w:rPr>
                 <w:noProof/>
               </w:rPr>
-              <w:instrText xml:space="preserve"> PAGEREF _Toc242888195 \h </w:instrText>
+              <w:instrText xml:space="preserve"> PAGEREF _Toc242889176 \h </w:instrText>
             </w:r>
             <w:r>
               <w:rPr>
@@ -5791,7 +5791,7 @@
               <w14:ligatures w14:val="standardContextual"/>
             </w:rPr>
           </w:pPr>
-          <w:hyperlink w:anchor="_Toc242888196" w:history="1">
+          <w:hyperlink w:anchor="_Toc242889177" w:history="1">
             <w:r>
               <w:rPr>
                 <w:rStyle w:val="Hyperlink"/>
@@ -5815,7 +5815,7 @@
               <w:rPr>
                 <w:noProof/>
               </w:rPr>
-              <w:instrText xml:space="preserve"> PAGEREF _Toc242888196 \h </w:instrText>
+              <w:instrText xml:space="preserve"> PAGEREF _Toc242889177 \h </w:instrText>
             </w:r>
             <w:r>
               <w:rPr>
@@ -5858,7 +5858,7 @@
               <w14:ligatures w14:val="standardContextual"/>
             </w:rPr>
           </w:pPr>
-          <w:hyperlink w:anchor="_Toc242888197" w:history="1">
+          <w:hyperlink w:anchor="_Toc242889178" w:history="1">
             <w:r>
               <w:rPr>
                 <w:rStyle w:val="Hyperlink"/>
@@ -5882,7 +5882,7 @@
               <w:rPr>
                 <w:noProof/>
               </w:rPr>
-              <w:instrText xml:space="preserve"> PAGEREF _Toc242888197 \h </w:instrText>
+              <w:instrText xml:space="preserve"> PAGEREF _Toc242889178 \h </w:instrText>
             </w:r>
             <w:r>
               <w:rPr>
@@ -5925,7 +5925,7 @@
               <w14:ligatures w14:val="standardContextual"/>
             </w:rPr>
           </w:pPr>
-          <w:hyperlink w:anchor="_Toc242888198" w:history="1">
+          <w:hyperlink w:anchor="_Toc242889179" w:history="1">
             <w:r>
               <w:rPr>
                 <w:rStyle w:val="Hyperlink"/>
@@ -5949,7 +5949,7 @@
               <w:rPr>
                 <w:noProof/>
               </w:rPr>
-              <w:instrText xml:space="preserve"> PAGEREF _Toc242888198 \h </w:instrText>
+              <w:instrText xml:space="preserve"> PAGEREF _Toc242889179 \h </w:instrText>
             </w:r>
             <w:r>
               <w:rPr>
@@ -5992,7 +5992,7 @@
               <w14:ligatures w14:val="standardContextual"/>
             </w:rPr>
           </w:pPr>
-          <w:hyperlink w:anchor="_Toc242888199" w:history="1">
+          <w:hyperlink w:anchor="_Toc242889180" w:history="1">
             <w:r>
               <w:rPr>
                 <w:rStyle w:val="Hyperlink"/>
@@ -6016,7 +6016,7 @@
               <w:rPr>
                 <w:noProof/>
               </w:rPr>
-              <w:instrText xml:space="preserve"> PAGEREF _Toc242888199 \h </w:instrText>
+              <w:instrText xml:space="preserve"> PAGEREF _Toc242889180 \h </w:instrText>
             </w:r>
             <w:r>
               <w:rPr>
@@ -6059,7 +6059,7 @@
               <w14:ligatures w14:val="standardContextual"/>
             </w:rPr>
           </w:pPr>
-          <w:hyperlink w:anchor="_Toc242888200" w:history="1">
+          <w:hyperlink w:anchor="_Toc242889181" w:history="1">
             <w:r>
               <w:rPr>
                 <w:rStyle w:val="Hyperlink"/>
@@ -6083,7 +6083,7 @@
               <w:rPr>
                 <w:noProof/>
               </w:rPr>
-              <w:instrText xml:space="preserve"> PAGEREF _Toc242888200 \h </w:instrText>
+              <w:instrText xml:space="preserve"> PAGEREF _Toc242889181 \h </w:instrText>
             </w:r>
             <w:r>
               <w:rPr>
@@ -6124,7 +6124,7 @@
         <w:keepLines/>
         <w:pageBreakBefore/>
       </w:pPr>
-      <w:bookmarkStart w:id="0" w:name="_Toc242888138"/>
+      <w:bookmarkStart w:id="0" w:name="_Toc242889119"/>
       <w:r>
         <w:lastRenderedPageBreak/>
         <w:t>1 Introduction</w:t>
@@ -6137,7 +6137,7 @@
         <w:keepNext/>
         <w:keepLines/>
       </w:pPr>
-      <w:bookmarkStart w:id="1" w:name="_Toc242888139"/>
+      <w:bookmarkStart w:id="1" w:name="_Toc242889120"/>
       <w:r>
         <w:t>1.1 Purpose</w:t>
       </w:r>
@@ -6170,7 +6170,7 @@
         <w:keepNext/>
         <w:keepLines/>
       </w:pPr>
-      <w:bookmarkStart w:id="2" w:name="_Toc242888140"/>
+      <w:bookmarkStart w:id="2" w:name="_Toc242889121"/>
       <w:r>
         <w:t>1.2 Scope</w:t>
       </w:r>
@@ -6190,7 +6190,7 @@
         <w:keepNext/>
         <w:keepLines/>
       </w:pPr>
-      <w:bookmarkStart w:id="3" w:name="_Toc242888141"/>
+      <w:bookmarkStart w:id="3" w:name="_Toc242889122"/>
       <w:r>
         <w:t>1.3 Intended audience</w:t>
       </w:r>
@@ -6210,7 +6210,7 @@
         <w:keepNext/>
         <w:keepLines/>
       </w:pPr>
-      <w:bookmarkStart w:id="4" w:name="_Toc242888142"/>
+      <w:bookmarkStart w:id="4" w:name="_Toc242889123"/>
       <w:r>
         <w:t>1.4 Relationship to other documents</w:t>
       </w:r>
@@ -6221,7 +6221,7 @@
         <w:pStyle w:val="Caption"/>
         <w:keepNext/>
       </w:pPr>
-      <w:bookmarkStart w:id="5" w:name="_Toc242888173"/>
+      <w:bookmarkStart w:id="5" w:name="_Toc242889154"/>
       <w:r>
         <w:t xml:space="preserve">Table </w:t>
       </w:r>
@@ -6982,7 +6982,7 @@
         <w:keepNext/>
         <w:keepLines/>
       </w:pPr>
-      <w:bookmarkStart w:id="6" w:name="_Toc242888143"/>
+      <w:bookmarkStart w:id="6" w:name="_Toc242889124"/>
       <w:r>
         <w:t>1.5 Conventions</w:t>
       </w:r>
@@ -7030,7 +7030,7 @@
         <w:keepLines/>
         <w:pageBreakBefore/>
       </w:pPr>
-      <w:bookmarkStart w:id="7" w:name="_Toc242888144"/>
+      <w:bookmarkStart w:id="7" w:name="_Toc242889125"/>
       <w:r>
         <w:lastRenderedPageBreak/>
         <w:t>2 Design principles</w:t>
@@ -7042,7 +7042,7 @@
         <w:pStyle w:val="Caption"/>
         <w:keepNext/>
       </w:pPr>
-      <w:bookmarkStart w:id="8" w:name="_Toc242888174"/>
+      <w:bookmarkStart w:id="8" w:name="_Toc242889155"/>
       <w:r>
         <w:t xml:space="preserve">Table </w:t>
       </w:r>
@@ -8466,7 +8466,7 @@
         <w:keepLines/>
         <w:pageBreakBefore/>
       </w:pPr>
-      <w:bookmarkStart w:id="9" w:name="_Toc242888145"/>
+      <w:bookmarkStart w:id="9" w:name="_Toc242889126"/>
       <w:r>
         <w:lastRenderedPageBreak/>
         <w:t>3 Personas and key journeys</w:t>
@@ -8486,7 +8486,7 @@
         <w:pStyle w:val="Caption"/>
         <w:keepNext/>
       </w:pPr>
-      <w:bookmarkStart w:id="10" w:name="_Toc242888175"/>
+      <w:bookmarkStart w:id="10" w:name="_Toc242889156"/>
       <w:r>
         <w:t xml:space="preserve">Table </w:t>
       </w:r>
@@ -9275,7 +9275,7 @@
         <w:pStyle w:val="Caption"/>
         <w:keepNext/>
       </w:pPr>
-      <w:bookmarkStart w:id="11" w:name="_Toc242888176"/>
+      <w:bookmarkStart w:id="11" w:name="_Toc242889157"/>
       <w:r>
         <w:t xml:space="preserve">Table </w:t>
       </w:r>
@@ -10167,7 +10167,7 @@
         <w:keepLines/>
         <w:pageBreakBefore/>
       </w:pPr>
-      <w:bookmarkStart w:id="12" w:name="_Toc242888146"/>
+      <w:bookmarkStart w:id="12" w:name="_Toc242889127"/>
       <w:r>
         <w:lastRenderedPageBreak/>
         <w:t>4 Information architecture and navigation</w:t>
@@ -10180,7 +10180,7 @@
         <w:keepNext/>
         <w:keepLines/>
       </w:pPr>
-      <w:bookmarkStart w:id="13" w:name="_Toc242888147"/>
+      <w:bookmarkStart w:id="13" w:name="_Toc242889128"/>
       <w:r>
         <w:t>4.1 Structure</w:t>
       </w:r>
@@ -10219,7 +10219,7 @@
         <w:pStyle w:val="Caption"/>
         <w:keepNext/>
       </w:pPr>
-      <w:bookmarkStart w:id="14" w:name="_Toc242888177"/>
+      <w:bookmarkStart w:id="14" w:name="_Toc242889158"/>
       <w:r>
         <w:t xml:space="preserve">Table </w:t>
       </w:r>
@@ -11102,7 +11102,7 @@
         <w:keepNext/>
         <w:keepLines/>
       </w:pPr>
-      <w:bookmarkStart w:id="15" w:name="_Toc242888148"/>
+      <w:bookmarkStart w:id="15" w:name="_Toc242889129"/>
       <w:r>
         <w:t>4.2 Route table</w:t>
       </w:r>
@@ -11113,7 +11113,7 @@
         <w:pStyle w:val="Caption"/>
         <w:keepNext/>
       </w:pPr>
-      <w:bookmarkStart w:id="16" w:name="_Toc242888178"/>
+      <w:bookmarkStart w:id="16" w:name="_Toc242889159"/>
       <w:r>
         <w:t xml:space="preserve">Table </w:t>
       </w:r>
@@ -13914,7 +13914,7 @@
         <w:keepNext/>
         <w:keepLines/>
       </w:pPr>
-      <w:bookmarkStart w:id="17" w:name="_Toc242888149"/>
+      <w:bookmarkStart w:id="17" w:name="_Toc242889130"/>
       <w:r>
         <w:t>4.3 Guards</w:t>
       </w:r>
@@ -13925,7 +13925,7 @@
         <w:pStyle w:val="Caption"/>
         <w:keepNext/>
       </w:pPr>
-      <w:bookmarkStart w:id="18" w:name="_Toc242888179"/>
+      <w:bookmarkStart w:id="18" w:name="_Toc242889160"/>
       <w:r>
         <w:t xml:space="preserve">Table </w:t>
       </w:r>
@@ -14425,7 +14425,7 @@
         <w:keepLines/>
         <w:pageBreakBefore/>
       </w:pPr>
-      <w:bookmarkStart w:id="19" w:name="_Toc242888150"/>
+      <w:bookmarkStart w:id="19" w:name="_Toc242889131"/>
       <w:r>
         <w:lastRenderedPageBreak/>
         <w:t>5 Design system</w:t>
@@ -14438,7 +14438,7 @@
         <w:keepNext/>
         <w:keepLines/>
       </w:pPr>
-      <w:bookmarkStart w:id="20" w:name="_Toc242888151"/>
+      <w:bookmarkStart w:id="20" w:name="_Toc242889132"/>
       <w:r>
         <w:t>5.1 Colour roles</w:t>
       </w:r>
@@ -14457,7 +14457,7 @@
         <w:pStyle w:val="Caption"/>
         <w:keepNext/>
       </w:pPr>
-      <w:bookmarkStart w:id="21" w:name="_Toc242888180"/>
+      <w:bookmarkStart w:id="21" w:name="_Toc242889161"/>
       <w:r>
         <w:t xml:space="preserve">Table </w:t>
       </w:r>
@@ -16447,7 +16447,7 @@
         <w:keepNext/>
         <w:keepLines/>
       </w:pPr>
-      <w:bookmarkStart w:id="22" w:name="_Toc242888152"/>
+      <w:bookmarkStart w:id="22" w:name="_Toc242889133"/>
       <w:r>
         <w:t>5.2 Typography</w:t>
       </w:r>
@@ -16521,7 +16521,7 @@
         <w:pStyle w:val="Caption"/>
         <w:keepNext/>
       </w:pPr>
-      <w:bookmarkStart w:id="23" w:name="_Toc242888181"/>
+      <w:bookmarkStart w:id="23" w:name="_Toc242889162"/>
       <w:r>
         <w:t xml:space="preserve">Table </w:t>
       </w:r>
@@ -18235,7 +18235,7 @@
         <w:keepNext/>
         <w:keepLines/>
       </w:pPr>
-      <w:bookmarkStart w:id="24" w:name="_Toc242888153"/>
+      <w:bookmarkStart w:id="24" w:name="_Toc242889134"/>
       <w:r>
         <w:t>5.3 Spacing, shape and elevation</w:t>
       </w:r>
@@ -18246,7 +18246,7 @@
         <w:pStyle w:val="Caption"/>
         <w:keepNext/>
       </w:pPr>
-      <w:bookmarkStart w:id="25" w:name="_Toc242888182"/>
+      <w:bookmarkStart w:id="25" w:name="_Toc242889163"/>
       <w:r>
         <w:t xml:space="preserve">Table </w:t>
       </w:r>
@@ -18934,7 +18934,7 @@
         <w:keepNext/>
         <w:keepLines/>
       </w:pPr>
-      <w:bookmarkStart w:id="26" w:name="_Toc242888154"/>
+      <w:bookmarkStart w:id="26" w:name="_Toc242889135"/>
       <w:r>
         <w:t>5.4 Components</w:t>
       </w:r>
@@ -18945,7 +18945,7 @@
         <w:pStyle w:val="Caption"/>
         <w:keepNext/>
       </w:pPr>
-      <w:bookmarkStart w:id="27" w:name="_Toc242888183"/>
+      <w:bookmarkStart w:id="27" w:name="_Toc242889164"/>
       <w:r>
         <w:t xml:space="preserve">Table </w:t>
       </w:r>
@@ -20551,7 +20551,7 @@
                 <w:sz w:val="19"/>
                 <w:szCs w:val="19"/>
               </w:rPr>
-              <w:t>12 preset characters (Multiavatar), or initials on a steady colour; decorative (</w:t>
+              <w:t>12 preset silhouettes in different colours, or initials on a steady colour; decorative (</w:t>
             </w:r>
             <w:r>
               <w:rPr>
@@ -20902,7 +20902,7 @@
         <w:keepLines/>
         <w:pageBreakBefore/>
       </w:pPr>
-      <w:bookmarkStart w:id="28" w:name="_Toc242888155"/>
+      <w:bookmarkStart w:id="28" w:name="_Toc242889136"/>
       <w:r>
         <w:lastRenderedPageBreak/>
         <w:t>6 Screen specifications</w:t>
@@ -20963,7 +20963,7 @@
         <w:keepNext/>
         <w:keepLines/>
       </w:pPr>
-      <w:bookmarkStart w:id="29" w:name="_Toc242888156"/>
+      <w:bookmarkStart w:id="29" w:name="_Toc242889137"/>
       <w:r>
         <w:t>6.1 Welcome, Intro and About you (onboarding)</w:t>
       </w:r>
@@ -20974,7 +20974,7 @@
         <w:pStyle w:val="Caption"/>
         <w:keepNext/>
       </w:pPr>
-      <w:bookmarkStart w:id="30" w:name="_Toc242888184"/>
+      <w:bookmarkStart w:id="30" w:name="_Toc242889165"/>
       <w:r>
         <w:t xml:space="preserve">Table </w:t>
       </w:r>
@@ -21446,7 +21446,7 @@
         <w:keepNext/>
         <w:keepLines/>
       </w:pPr>
-      <w:bookmarkStart w:id="31" w:name="_Toc242888157"/>
+      <w:bookmarkStart w:id="31" w:name="_Toc242889138"/>
       <w:r>
         <w:t>6.2 Account (sign up, log in, recover, recovery code, complete your account)</w:t>
       </w:r>
@@ -21457,7 +21457,7 @@
         <w:pStyle w:val="Caption"/>
         <w:keepNext/>
       </w:pPr>
-      <w:bookmarkStart w:id="32" w:name="_Toc242888185"/>
+      <w:bookmarkStart w:id="32" w:name="_Toc242889166"/>
       <w:r>
         <w:t xml:space="preserve">Table </w:t>
       </w:r>
@@ -21901,7 +21901,7 @@
         <w:keepNext/>
         <w:keepLines/>
       </w:pPr>
-      <w:bookmarkStart w:id="33" w:name="_Toc242888158"/>
+      <w:bookmarkStart w:id="33" w:name="_Toc242889139"/>
       <w:r>
         <w:t>6.3 Paths (home)</w:t>
       </w:r>
@@ -21912,7 +21912,7 @@
         <w:pStyle w:val="Caption"/>
         <w:keepNext/>
       </w:pPr>
-      <w:bookmarkStart w:id="34" w:name="_Toc242888186"/>
+      <w:bookmarkStart w:id="34" w:name="_Toc242889167"/>
       <w:r>
         <w:t xml:space="preserve">Table </w:t>
       </w:r>
@@ -22267,7 +22267,7 @@
         <w:keepNext/>
         <w:keepLines/>
       </w:pPr>
-      <w:bookmarkStart w:id="35" w:name="_Toc242888159"/>
+      <w:bookmarkStart w:id="35" w:name="_Toc242889140"/>
       <w:r>
         <w:t>6.4 Courses</w:t>
       </w:r>
@@ -22278,7 +22278,7 @@
         <w:pStyle w:val="Caption"/>
         <w:keepNext/>
       </w:pPr>
-      <w:bookmarkStart w:id="36" w:name="_Toc242888187"/>
+      <w:bookmarkStart w:id="36" w:name="_Toc242889168"/>
       <w:r>
         <w:t xml:space="preserve">Table </w:t>
       </w:r>
@@ -22739,7 +22739,7 @@
         <w:keepNext/>
         <w:keepLines/>
       </w:pPr>
-      <w:bookmarkStart w:id="37" w:name="_Toc242888160"/>
+      <w:bookmarkStart w:id="37" w:name="_Toc242889141"/>
       <w:r>
         <w:t>6.5 Course detail</w:t>
       </w:r>
@@ -22750,7 +22750,7 @@
         <w:pStyle w:val="Caption"/>
         <w:keepNext/>
       </w:pPr>
-      <w:bookmarkStart w:id="38" w:name="_Toc242888188"/>
+      <w:bookmarkStart w:id="38" w:name="_Toc242889169"/>
       <w:r>
         <w:t xml:space="preserve">Table </w:t>
       </w:r>
@@ -23121,7 +23121,7 @@
         <w:keepNext/>
         <w:keepLines/>
       </w:pPr>
-      <w:bookmarkStart w:id="39" w:name="_Toc242888161"/>
+      <w:bookmarkStart w:id="39" w:name="_Toc242889142"/>
       <w:r>
         <w:t>6.6 Compare</w:t>
       </w:r>
@@ -23132,7 +23132,7 @@
         <w:pStyle w:val="Caption"/>
         <w:keepNext/>
       </w:pPr>
-      <w:bookmarkStart w:id="40" w:name="_Toc242888189"/>
+      <w:bookmarkStart w:id="40" w:name="_Toc242889170"/>
       <w:r>
         <w:t xml:space="preserve">Table </w:t>
       </w:r>
@@ -23560,7 +23560,7 @@
         <w:keepNext/>
         <w:keepLines/>
       </w:pPr>
-      <w:bookmarkStart w:id="41" w:name="_Toc242888162"/>
+      <w:bookmarkStart w:id="41" w:name="_Toc242889143"/>
       <w:r>
         <w:t>6.7 My list</w:t>
       </w:r>
@@ -23571,7 +23571,7 @@
         <w:pStyle w:val="Caption"/>
         <w:keepNext/>
       </w:pPr>
-      <w:bookmarkStart w:id="42" w:name="_Toc242888190"/>
+      <w:bookmarkStart w:id="42" w:name="_Toc242889171"/>
       <w:r>
         <w:t xml:space="preserve">Table </w:t>
       </w:r>
@@ -24024,7 +24024,7 @@
         <w:keepNext/>
         <w:keepLines/>
       </w:pPr>
-      <w:bookmarkStart w:id="43" w:name="_Toc242888163"/>
+      <w:bookmarkStart w:id="43" w:name="_Toc242889144"/>
       <w:r>
         <w:lastRenderedPageBreak/>
         <w:t>6.8 Journey</w:t>
@@ -24036,7 +24036,7 @@
         <w:pStyle w:val="Caption"/>
         <w:keepNext/>
       </w:pPr>
-      <w:bookmarkStart w:id="44" w:name="_Toc242888191"/>
+      <w:bookmarkStart w:id="44" w:name="_Toc242889172"/>
       <w:r>
         <w:t xml:space="preserve">Table </w:t>
       </w:r>
@@ -24512,7 +24512,7 @@
         <w:keepNext/>
         <w:keepLines/>
       </w:pPr>
-      <w:bookmarkStart w:id="45" w:name="_Toc242888164"/>
+      <w:bookmarkStart w:id="45" w:name="_Toc242889145"/>
       <w:r>
         <w:t>6.9 Ask ZedPath</w:t>
       </w:r>
@@ -24523,7 +24523,7 @@
         <w:pStyle w:val="Caption"/>
         <w:keepNext/>
       </w:pPr>
-      <w:bookmarkStart w:id="46" w:name="_Toc242888192"/>
+      <w:bookmarkStart w:id="46" w:name="_Toc242889173"/>
       <w:r>
         <w:t xml:space="preserve">Table </w:t>
       </w:r>
@@ -25047,7 +25047,7 @@
         <w:keepNext/>
         <w:keepLines/>
       </w:pPr>
-      <w:bookmarkStart w:id="47" w:name="_Toc242888165"/>
+      <w:bookmarkStart w:id="47" w:name="_Toc242889146"/>
       <w:r>
         <w:t>6.10 Groups, Group room and Group info</w:t>
       </w:r>
@@ -25058,7 +25058,7 @@
         <w:pStyle w:val="Caption"/>
         <w:keepNext/>
       </w:pPr>
-      <w:bookmarkStart w:id="48" w:name="_Toc242888193"/>
+      <w:bookmarkStart w:id="48" w:name="_Toc242889174"/>
       <w:r>
         <w:t xml:space="preserve">Table </w:t>
       </w:r>
@@ -25527,7 +25527,7 @@
         <w:keepNext/>
         <w:keepLines/>
       </w:pPr>
-      <w:bookmarkStart w:id="49" w:name="_Toc242888166"/>
+      <w:bookmarkStart w:id="49" w:name="_Toc242889147"/>
       <w:r>
         <w:lastRenderedPageBreak/>
         <w:t>6.11 Me</w:t>
@@ -25539,7 +25539,7 @@
         <w:pStyle w:val="Caption"/>
         <w:keepNext/>
       </w:pPr>
-      <w:bookmarkStart w:id="50" w:name="_Toc242888194"/>
+      <w:bookmarkStart w:id="50" w:name="_Toc242889175"/>
       <w:r>
         <w:t xml:space="preserve">Table </w:t>
       </w:r>
@@ -25927,7 +25927,7 @@
         <w:keepLines/>
         <w:pageBreakBefore/>
       </w:pPr>
-      <w:bookmarkStart w:id="51" w:name="_Toc242888167"/>
+      <w:bookmarkStart w:id="51" w:name="_Toc242889148"/>
       <w:r>
         <w:lastRenderedPageBreak/>
         <w:t>7 Interaction patterns</w:t>
@@ -25939,7 +25939,7 @@
         <w:pStyle w:val="Caption"/>
         <w:keepNext/>
       </w:pPr>
-      <w:bookmarkStart w:id="52" w:name="_Toc242888195"/>
+      <w:bookmarkStart w:id="52" w:name="_Toc242889176"/>
       <w:r>
         <w:t xml:space="preserve">Table </w:t>
       </w:r>
@@ -26985,7 +26985,7 @@
         <w:keepLines/>
         <w:pageBreakBefore/>
       </w:pPr>
-      <w:bookmarkStart w:id="53" w:name="_Toc242888168"/>
+      <w:bookmarkStart w:id="53" w:name="_Toc242889149"/>
       <w:r>
         <w:lastRenderedPageBreak/>
         <w:t>8 Content and language</w:t>
@@ -26997,7 +26997,7 @@
         <w:pStyle w:val="Caption"/>
         <w:keepNext/>
       </w:pPr>
-      <w:bookmarkStart w:id="54" w:name="_Toc242888196"/>
+      <w:bookmarkStart w:id="54" w:name="_Toc242889177"/>
       <w:r>
         <w:t xml:space="preserve">Table </w:t>
       </w:r>
@@ -27586,7 +27586,7 @@
         <w:keepLines/>
         <w:pageBreakBefore/>
       </w:pPr>
-      <w:bookmarkStart w:id="55" w:name="_Toc242888169"/>
+      <w:bookmarkStart w:id="55" w:name="_Toc242889150"/>
       <w:r>
         <w:lastRenderedPageBreak/>
         <w:t>9 Accessibility checklist (WCAG 2.2 AA)</w:t>
@@ -27606,7 +27606,7 @@
         <w:pStyle w:val="Caption"/>
         <w:keepNext/>
       </w:pPr>
-      <w:bookmarkStart w:id="56" w:name="_Toc242888197"/>
+      <w:bookmarkStart w:id="56" w:name="_Toc242889178"/>
       <w:r>
         <w:t xml:space="preserve">Table </w:t>
       </w:r>
@@ -29360,7 +29360,7 @@
         <w:keepLines/>
         <w:pageBreakBefore/>
       </w:pPr>
-      <w:bookmarkStart w:id="57" w:name="_Toc242888170"/>
+      <w:bookmarkStart w:id="57" w:name="_Toc242889151"/>
       <w:r>
         <w:lastRenderedPageBreak/>
         <w:t>10 Performance budget for 3G</w:t>
@@ -29372,7 +29372,7 @@
         <w:pStyle w:val="Caption"/>
         <w:keepNext/>
       </w:pPr>
-      <w:bookmarkStart w:id="58" w:name="_Toc242888198"/>
+      <w:bookmarkStart w:id="58" w:name="_Toc242889179"/>
       <w:r>
         <w:t xml:space="preserve">Table </w:t>
       </w:r>
@@ -30204,7 +30204,7 @@
         <w:keepLines/>
         <w:pageBreakBefore/>
       </w:pPr>
-      <w:bookmarkStart w:id="59" w:name="_Toc242888171"/>
+      <w:bookmarkStart w:id="59" w:name="_Toc242889152"/>
       <w:r>
         <w:lastRenderedPageBreak/>
         <w:t>11 Usability evidence</w:t>
@@ -30227,7 +30227,7 @@
         <w:pStyle w:val="Caption"/>
         <w:keepNext/>
       </w:pPr>
-      <w:bookmarkStart w:id="60" w:name="_Toc242888199"/>
+      <w:bookmarkStart w:id="60" w:name="_Toc242889180"/>
       <w:r>
         <w:t xml:space="preserve">Table </w:t>
       </w:r>
@@ -31119,7 +31119,7 @@
         <w:keepLines/>
         <w:pageBreakBefore/>
       </w:pPr>
-      <w:bookmarkStart w:id="61" w:name="_Toc242888172"/>
+      <w:bookmarkStart w:id="61" w:name="_Toc242889153"/>
       <w:r>
         <w:lastRenderedPageBreak/>
         <w:t>12 Traceability</w:t>
@@ -31131,7 +31131,7 @@
         <w:pStyle w:val="Caption"/>
         <w:keepNext/>
       </w:pPr>
-      <w:bookmarkStart w:id="62" w:name="_Toc242888200"/>
+      <w:bookmarkStart w:id="62" w:name="_Toc242889181"/>
       <w:r>
         <w:t xml:space="preserve">Table </w:t>
       </w:r>
@@ -32382,10 +32382,10 @@
 <file path=word/numbering.xml><?xml version="1.0" encoding="utf-8"?>
 <w:numbering xmlns:wpc="http://schemas.microsoft.com/office/word/2010/wordprocessingCanvas" xmlns:cx="http://schemas.microsoft.com/office/drawing/2014/chartex" xmlns:cx1="http://schemas.microsoft.com/office/drawing/2015/9/8/chartex" xmlns:cx2="http://schemas.microsoft.com/office/drawing/2015/10/21/chartex" xmlns:cx3="http://schemas.microsoft.com/office/drawing/2016/5/9/chartex" xmlns:cx4="http://schemas.microsoft.com/office/drawing/2016/5/10/chartex" xmlns:cx5="http://schemas.microsoft.com/office/drawing/2016/5/11/chartex" xmlns:cx6="http://schemas.microsoft.com/office/drawing/2016/5/12/chartex" xmlns:cx7="http://schemas.microsoft.com/office/drawing/2016/5/13/chartex" xmlns:cx8="http://schemas.microsoft.com/office/drawing/2016/5/14/chartex" xmlns:mc="http://schemas.openxmlformats.org/markup-compatibility/2006" xmlns:aink="http://schemas.microsoft.com/office/drawing/2016/ink" xmlns:am3d="http://schemas.microsoft.com/office/drawing/2017/model3d" xmlns:o="urn:schemas-microsoft-com:office:office" xmlns:oel="http://schemas.microsoft.com/office/2019/extlst" xmlns:r="http://schemas.openxmlformats.org/officeDocument/2006/relationships" xmlns:m="http://schemas.openxmlformats.org/officeDocument/2006/math" xmlns:v="urn:schemas-microsoft-com:vml" xmlns:wp14="http://schemas.microsoft.com/office/word/2010/wordprocessingDrawing" xmlns:wp="http://schemas.openxmlformats.org/drawingml/2006/wordprocessingDrawing" xmlns:w10="urn:schemas-microsoft-com:office:word" xmlns:w="http://schemas.openxmlformats.org/wordprocessingml/2006/main" xmlns:w14="http://schemas.microsoft.com/office/word/2010/wordml" xmlns:w15="http://schemas.microsoft.com/office/word/2012/wordml" xmlns:w16cex="http://schemas.microsoft.com/office/word/2018/wordml/cex" xmlns:w16cid="http://schemas.microsoft.com/office/word/2016/wordml/cid" xmlns:w16="http://schemas.microsoft.com/office/word/2018/wordml" xmlns:w16du="http://schemas.microsoft.com/office/word/2023/wordml/word16du" xmlns:w16sdtdh="http://schemas.microsoft.com/office/word/2020/wordml/sdtdatahash" xmlns:w16sdtfl="http://schemas.microsoft.com/office/word/2024/wordml/sdtformatlock" xmlns:w16se="http://schemas.microsoft.com/office/word/2015/wordml/symex" xmlns:wpg="http://schemas.microsoft.com/office/word/2010/wordprocessingGroup" xmlns:wpi="http://schemas.microsoft.com/office/word/2010/wordprocessingInk" xmlns:wne="http://schemas.microsoft.com/office/word/2006/wordml" xmlns:wps="http://schemas.microsoft.com/office/word/2010/wordprocessingShape" mc:Ignorable="w14 w15 w16se w16cid w16 w16cex w16sdtdh w16sdtfl w16du wp14">
   <w:abstractNum w:abstractNumId="0" w15:restartNumberingAfterBreak="0">
-    <w:nsid w:val="0B5144A7"/>
+    <w:nsid w:val="0C1941D9"/>
     <w:multiLevelType w:val="hybridMultilevel"/>
-    <w:tmpl w:val="19D434A4"/>
-    <w:lvl w:ilvl="0" w:tplc="0240A882" w:tentative="1">
+    <w:tmpl w:val="B71E6BC0"/>
+    <w:lvl w:ilvl="0" w:tplc="2ADEDB7C" w:tentative="1">
       <w:start w:val="1"/>
       <w:numFmt w:val="bullet"/>
       <w:lvlText w:val="•"/>
@@ -32394,7 +32394,7 @@
         <w:ind w:left="720" w:hanging="280"/>
       </w:pPr>
     </w:lvl>
-    <w:lvl w:ilvl="1" w:tplc="2054A024" w:tentative="1">
+    <w:lvl w:ilvl="1" w:tplc="9F6094BE" w:tentative="1">
       <w:start w:val="1"/>
       <w:numFmt w:val="bullet"/>
       <w:lvlText w:val="–"/>
@@ -32403,7 +32403,7 @@
         <w:ind w:left="1080" w:hanging="280"/>
       </w:pPr>
     </w:lvl>
-    <w:lvl w:ilvl="2" w:tplc="0FAA67C2" w:tentative="1">
+    <w:lvl w:ilvl="2" w:tplc="A63E1234" w:tentative="1">
       <w:start w:val="1"/>
       <w:numFmt w:val="bullet"/>
       <w:lvlText w:val="▪"/>
@@ -32412,104 +32412,42 @@
         <w:ind w:left="1440" w:hanging="280"/>
       </w:pPr>
     </w:lvl>
-    <w:lvl w:ilvl="3" w:tplc="1EF287E4">
+    <w:lvl w:ilvl="3" w:tplc="DA06AC4A">
       <w:numFmt w:val="decimal"/>
       <w:lvlText w:val=""/>
       <w:lvlJc w:val="left"/>
     </w:lvl>
-    <w:lvl w:ilvl="4" w:tplc="D46CD546">
+    <w:lvl w:ilvl="4" w:tplc="25628742">
       <w:numFmt w:val="decimal"/>
       <w:lvlText w:val=""/>
       <w:lvlJc w:val="left"/>
     </w:lvl>
-    <w:lvl w:ilvl="5" w:tplc="9A948582">
+    <w:lvl w:ilvl="5" w:tplc="58C84E2E">
       <w:numFmt w:val="decimal"/>
       <w:lvlText w:val=""/>
       <w:lvlJc w:val="left"/>
     </w:lvl>
-    <w:lvl w:ilvl="6" w:tplc="6EC2990A">
+    <w:lvl w:ilvl="6" w:tplc="8AD0F912">
       <w:numFmt w:val="decimal"/>
       <w:lvlText w:val=""/>
       <w:lvlJc w:val="left"/>
     </w:lvl>
-    <w:lvl w:ilvl="7" w:tplc="836AF5A4">
+    <w:lvl w:ilvl="7" w:tplc="EC44AAB8">
       <w:numFmt w:val="decimal"/>
       <w:lvlText w:val=""/>
       <w:lvlJc w:val="left"/>
     </w:lvl>
-    <w:lvl w:ilvl="8" w:tplc="5F9C6B84">
+    <w:lvl w:ilvl="8" w:tplc="00B8CE90">
       <w:numFmt w:val="decimal"/>
       <w:lvlText w:val=""/>
       <w:lvlJc w:val="left"/>
     </w:lvl>
   </w:abstractNum>
   <w:abstractNum w:abstractNumId="1" w15:restartNumberingAfterBreak="0">
-    <w:nsid w:val="315A0906"/>
+    <w:nsid w:val="1AF26152"/>
     <w:multiLevelType w:val="hybridMultilevel"/>
-    <w:tmpl w:val="C7DAAF58"/>
-    <w:lvl w:ilvl="0" w:tplc="4796A208" w:tentative="1">
-      <w:start w:val="1"/>
-      <w:numFmt w:val="decimal"/>
-      <w:lvlText w:val="%1."/>
-      <w:lvlJc w:val="left"/>
-      <w:pPr>
-        <w:ind w:left="720" w:hanging="360"/>
-      </w:pPr>
-    </w:lvl>
-    <w:lvl w:ilvl="1" w:tplc="BF4C5676" w:tentative="1">
-      <w:start w:val="1"/>
-      <w:numFmt w:val="lowerLetter"/>
-      <w:lvlText w:val="%2."/>
-      <w:lvlJc w:val="left"/>
-      <w:pPr>
-        <w:ind w:left="1080" w:hanging="360"/>
-      </w:pPr>
-    </w:lvl>
-    <w:lvl w:ilvl="2" w:tplc="51B84F08" w:tentative="1">
-      <w:start w:val="1"/>
-      <w:numFmt w:val="lowerRoman"/>
-      <w:lvlText w:val="%3."/>
-      <w:lvlJc w:val="left"/>
-      <w:pPr>
-        <w:ind w:left="1440" w:hanging="360"/>
-      </w:pPr>
-    </w:lvl>
-    <w:lvl w:ilvl="3" w:tplc="345E61A4">
-      <w:numFmt w:val="decimal"/>
-      <w:lvlText w:val=""/>
-      <w:lvlJc w:val="left"/>
-    </w:lvl>
-    <w:lvl w:ilvl="4" w:tplc="6486FF62">
-      <w:numFmt w:val="decimal"/>
-      <w:lvlText w:val=""/>
-      <w:lvlJc w:val="left"/>
-    </w:lvl>
-    <w:lvl w:ilvl="5" w:tplc="1B26E7B8">
-      <w:numFmt w:val="decimal"/>
-      <w:lvlText w:val=""/>
-      <w:lvlJc w:val="left"/>
-    </w:lvl>
-    <w:lvl w:ilvl="6" w:tplc="2F44B8B4">
-      <w:numFmt w:val="decimal"/>
-      <w:lvlText w:val=""/>
-      <w:lvlJc w:val="left"/>
-    </w:lvl>
-    <w:lvl w:ilvl="7" w:tplc="533EC7E0">
-      <w:numFmt w:val="decimal"/>
-      <w:lvlText w:val=""/>
-      <w:lvlJc w:val="left"/>
-    </w:lvl>
-    <w:lvl w:ilvl="8" w:tplc="99A00B56">
-      <w:numFmt w:val="decimal"/>
-      <w:lvlText w:val=""/>
-      <w:lvlJc w:val="left"/>
-    </w:lvl>
-  </w:abstractNum>
-  <w:abstractNum w:abstractNumId="2" w15:restartNumberingAfterBreak="0">
-    <w:nsid w:val="4DD107B9"/>
-    <w:multiLevelType w:val="hybridMultilevel"/>
-    <w:tmpl w:val="CD4C5CDC"/>
-    <w:lvl w:ilvl="0" w:tplc="DB783164" w:tentative="1">
+    <w:tmpl w:val="7124CEB4"/>
+    <w:lvl w:ilvl="0" w:tplc="85DCAC74" w:tentative="1">
       <w:start w:val="1"/>
       <w:numFmt w:val="bullet"/>
       <w:lvlText w:val="●"/>
@@ -32518,7 +32456,7 @@
         <w:ind w:left="720" w:hanging="360"/>
       </w:pPr>
     </w:lvl>
-    <w:lvl w:ilvl="1" w:tplc="3C084986" w:tentative="1">
+    <w:lvl w:ilvl="1" w:tplc="6B749CB0" w:tentative="1">
       <w:start w:val="1"/>
       <w:numFmt w:val="bullet"/>
       <w:lvlText w:val="○"/>
@@ -32527,7 +32465,7 @@
         <w:ind w:left="1440" w:hanging="360"/>
       </w:pPr>
     </w:lvl>
-    <w:lvl w:ilvl="2" w:tplc="FE3CFE8A" w:tentative="1">
+    <w:lvl w:ilvl="2" w:tplc="BD865E5E" w:tentative="1">
       <w:start w:val="1"/>
       <w:numFmt w:val="bullet"/>
       <w:lvlText w:val="■"/>
@@ -32536,7 +32474,7 @@
         <w:ind w:left="2160" w:hanging="360"/>
       </w:pPr>
     </w:lvl>
-    <w:lvl w:ilvl="3" w:tplc="A5CE6690" w:tentative="1">
+    <w:lvl w:ilvl="3" w:tplc="BF966970" w:tentative="1">
       <w:start w:val="1"/>
       <w:numFmt w:val="bullet"/>
       <w:lvlText w:val="●"/>
@@ -32545,7 +32483,7 @@
         <w:ind w:left="2880" w:hanging="360"/>
       </w:pPr>
     </w:lvl>
-    <w:lvl w:ilvl="4" w:tplc="1B46CF24" w:tentative="1">
+    <w:lvl w:ilvl="4" w:tplc="57E2F86A" w:tentative="1">
       <w:start w:val="1"/>
       <w:numFmt w:val="bullet"/>
       <w:lvlText w:val="○"/>
@@ -32554,7 +32492,7 @@
         <w:ind w:left="3600" w:hanging="360"/>
       </w:pPr>
     </w:lvl>
-    <w:lvl w:ilvl="5" w:tplc="3D264AF0" w:tentative="1">
+    <w:lvl w:ilvl="5" w:tplc="9C529658" w:tentative="1">
       <w:start w:val="1"/>
       <w:numFmt w:val="bullet"/>
       <w:lvlText w:val="■"/>
@@ -32563,7 +32501,7 @@
         <w:ind w:left="4320" w:hanging="360"/>
       </w:pPr>
     </w:lvl>
-    <w:lvl w:ilvl="6" w:tplc="40C4ECD2" w:tentative="1">
+    <w:lvl w:ilvl="6" w:tplc="34561BA6" w:tentative="1">
       <w:start w:val="1"/>
       <w:numFmt w:val="bullet"/>
       <w:lvlText w:val="●"/>
@@ -32572,7 +32510,7 @@
         <w:ind w:left="5040" w:hanging="360"/>
       </w:pPr>
     </w:lvl>
-    <w:lvl w:ilvl="7" w:tplc="DBF6F3F0" w:tentative="1">
+    <w:lvl w:ilvl="7" w:tplc="19961664" w:tentative="1">
       <w:start w:val="1"/>
       <w:numFmt w:val="bullet"/>
       <w:lvlText w:val="●"/>
@@ -32581,7 +32519,7 @@
         <w:ind w:left="5760" w:hanging="360"/>
       </w:pPr>
     </w:lvl>
-    <w:lvl w:ilvl="8" w:tplc="03123708" w:tentative="1">
+    <w:lvl w:ilvl="8" w:tplc="436CDE3E" w:tentative="1">
       <w:start w:val="1"/>
       <w:numFmt w:val="bullet"/>
       <w:lvlText w:val="●"/>
@@ -32591,8 +32529,70 @@
       </w:pPr>
     </w:lvl>
   </w:abstractNum>
-  <w:num w:numId="1" w16cid:durableId="461966924">
-    <w:abstractNumId w:val="2"/>
+  <w:abstractNum w:abstractNumId="2" w15:restartNumberingAfterBreak="0">
+    <w:nsid w:val="2B14471A"/>
+    <w:multiLevelType w:val="hybridMultilevel"/>
+    <w:tmpl w:val="0E14735E"/>
+    <w:lvl w:ilvl="0" w:tplc="68E472FA" w:tentative="1">
+      <w:start w:val="1"/>
+      <w:numFmt w:val="decimal"/>
+      <w:lvlText w:val="%1."/>
+      <w:lvlJc w:val="left"/>
+      <w:pPr>
+        <w:ind w:left="720" w:hanging="360"/>
+      </w:pPr>
+    </w:lvl>
+    <w:lvl w:ilvl="1" w:tplc="6A442C44" w:tentative="1">
+      <w:start w:val="1"/>
+      <w:numFmt w:val="lowerLetter"/>
+      <w:lvlText w:val="%2."/>
+      <w:lvlJc w:val="left"/>
+      <w:pPr>
+        <w:ind w:left="1080" w:hanging="360"/>
+      </w:pPr>
+    </w:lvl>
+    <w:lvl w:ilvl="2" w:tplc="839436C8" w:tentative="1">
+      <w:start w:val="1"/>
+      <w:numFmt w:val="lowerRoman"/>
+      <w:lvlText w:val="%3."/>
+      <w:lvlJc w:val="left"/>
+      <w:pPr>
+        <w:ind w:left="1440" w:hanging="360"/>
+      </w:pPr>
+    </w:lvl>
+    <w:lvl w:ilvl="3" w:tplc="0396E228">
+      <w:numFmt w:val="decimal"/>
+      <w:lvlText w:val=""/>
+      <w:lvlJc w:val="left"/>
+    </w:lvl>
+    <w:lvl w:ilvl="4" w:tplc="D35AD5EE">
+      <w:numFmt w:val="decimal"/>
+      <w:lvlText w:val=""/>
+      <w:lvlJc w:val="left"/>
+    </w:lvl>
+    <w:lvl w:ilvl="5" w:tplc="9DC29A66">
+      <w:numFmt w:val="decimal"/>
+      <w:lvlText w:val=""/>
+      <w:lvlJc w:val="left"/>
+    </w:lvl>
+    <w:lvl w:ilvl="6" w:tplc="B4944222">
+      <w:numFmt w:val="decimal"/>
+      <w:lvlText w:val=""/>
+      <w:lvlJc w:val="left"/>
+    </w:lvl>
+    <w:lvl w:ilvl="7" w:tplc="7A268058">
+      <w:numFmt w:val="decimal"/>
+      <w:lvlText w:val=""/>
+      <w:lvlJc w:val="left"/>
+    </w:lvl>
+    <w:lvl w:ilvl="8" w:tplc="270EA676">
+      <w:numFmt w:val="decimal"/>
+      <w:lvlText w:val=""/>
+      <w:lvlJc w:val="left"/>
+    </w:lvl>
+  </w:abstractNum>
+  <w:num w:numId="1" w16cid:durableId="1711881204">
+    <w:abstractNumId w:val="1"/>
     <w:lvlOverride w:ilvl="0">
       <w:startOverride w:val="1"/>
     </w:lvlOverride>
@@ -33296,7 +33296,7 @@
     <w:autoRedefine/>
     <w:uiPriority w:val="39"/>
     <w:unhideWhenUsed/>
-    <w:rsid w:val="00631E1D"/>
+    <w:rsid w:val="0078197B"/>
     <w:pPr>
       <w:spacing w:after="100"/>
     </w:pPr>
@@ -33308,7 +33308,7 @@
     <w:autoRedefine/>
     <w:uiPriority w:val="39"/>
     <w:unhideWhenUsed/>
-    <w:rsid w:val="00631E1D"/>
+    <w:rsid w:val="0078197B"/>
     <w:pPr>
       <w:spacing w:after="100"/>
       <w:ind w:left="210"/>
@@ -33320,7 +33320,7 @@
     <w:next w:val="Normal"/>
     <w:uiPriority w:val="99"/>
     <w:unhideWhenUsed/>
-    <w:rsid w:val="00631E1D"/>
+    <w:rsid w:val="0078197B"/>
   </w:style>
 </w:styles>
 </file>

</xml_diff>

<commit_message>
Docs for VR4: ZP-DOC-07 (My list add box, added confirmation, VR4 row); ZP-DOC-08 TC-140 and 539 passed; Test Summary Report; README; rebuilt
Co-Authored-By: Claude Opus 5.5 (1M context) <noreply@anthropic.com>
</commit_message>
<xml_diff>
--- a/docs/07-ui-ux/ZP-DOC-07_UI-UX-Design.docx
+++ b/docs/07-ui-ux/ZP-DOC-07_UI-UX-Design.docx
@@ -289,7 +289,7 @@
                 <w:sz w:val="19"/>
                 <w:szCs w:val="19"/>
               </w:rPr>
-              <w:t>21 October 2026</w:t>
+              <w:t>23 October 2026</w:t>
             </w:r>
           </w:p>
         </w:tc>
@@ -1683,6 +1683,122 @@
           </w:p>
         </w:tc>
       </w:tr>
+      <w:tr>
+        <w:tblPrEx>
+          <w:tblCellMar>
+            <w:top w:w="0" w:type="dxa"/>
+            <w:bottom w:w="0" w:type="dxa"/>
+          </w:tblCellMar>
+        </w:tblPrEx>
+        <w:trPr>
+          <w:cantSplit/>
+          <w:trHeight w:val="420"/>
+        </w:trPr>
+        <w:tc>
+          <w:tcPr>
+            <w:tcW w:w="964" w:type="dxa"/>
+            <w:tcBorders>
+              <w:top w:val="single" w:sz="4" w:space="0" w:color="C9D3D0"/>
+              <w:left w:val="single" w:sz="4" w:space="0" w:color="C9D3D0"/>
+              <w:bottom w:val="single" w:sz="4" w:space="0" w:color="C9D3D0"/>
+              <w:right w:val="single" w:sz="4" w:space="0" w:color="C9D3D0"/>
+            </w:tcBorders>
+            <w:tcMar>
+              <w:top w:w="50" w:type="dxa"/>
+              <w:left w:w="100" w:type="dxa"/>
+              <w:bottom w:w="50" w:type="dxa"/>
+              <w:right w:w="100" w:type="dxa"/>
+            </w:tcMar>
+          </w:tcPr>
+          <w:p>
+            <w:r>
+              <w:rPr>
+                <w:sz w:val="19"/>
+                <w:szCs w:val="19"/>
+              </w:rPr>
+              <w:t>0.9</w:t>
+            </w:r>
+          </w:p>
+        </w:tc>
+        <w:tc>
+          <w:tcPr>
+            <w:tcW w:w="1542" w:type="dxa"/>
+            <w:tcBorders>
+              <w:top w:val="single" w:sz="4" w:space="0" w:color="C9D3D0"/>
+              <w:left w:val="single" w:sz="4" w:space="0" w:color="C9D3D0"/>
+              <w:bottom w:val="single" w:sz="4" w:space="0" w:color="C9D3D0"/>
+              <w:right w:val="single" w:sz="4" w:space="0" w:color="C9D3D0"/>
+            </w:tcBorders>
+            <w:tcMar>
+              <w:top w:w="50" w:type="dxa"/>
+              <w:left w:w="100" w:type="dxa"/>
+              <w:bottom w:w="50" w:type="dxa"/>
+              <w:right w:w="100" w:type="dxa"/>
+            </w:tcMar>
+          </w:tcPr>
+          <w:p>
+            <w:r>
+              <w:rPr>
+                <w:sz w:val="19"/>
+                <w:szCs w:val="19"/>
+              </w:rPr>
+              <w:t>23 Oct 2026</w:t>
+            </w:r>
+          </w:p>
+        </w:tc>
+        <w:tc>
+          <w:tcPr>
+            <w:tcW w:w="1928" w:type="dxa"/>
+            <w:tcBorders>
+              <w:top w:val="single" w:sz="4" w:space="0" w:color="C9D3D0"/>
+              <w:left w:val="single" w:sz="4" w:space="0" w:color="C9D3D0"/>
+              <w:bottom w:val="single" w:sz="4" w:space="0" w:color="C9D3D0"/>
+              <w:right w:val="single" w:sz="4" w:space="0" w:color="C9D3D0"/>
+            </w:tcBorders>
+            <w:tcMar>
+              <w:top w:w="50" w:type="dxa"/>
+              <w:left w:w="100" w:type="dxa"/>
+              <w:bottom w:w="50" w:type="dxa"/>
+              <w:right w:w="100" w:type="dxa"/>
+            </w:tcMar>
+          </w:tcPr>
+          <w:p>
+            <w:r>
+              <w:rPr>
+                <w:sz w:val="19"/>
+                <w:szCs w:val="19"/>
+              </w:rPr>
+              <w:t>Team Kestrel</w:t>
+            </w:r>
+          </w:p>
+        </w:tc>
+        <w:tc>
+          <w:tcPr>
+            <w:tcW w:w="5204" w:type="dxa"/>
+            <w:tcBorders>
+              <w:top w:val="single" w:sz="4" w:space="0" w:color="C9D3D0"/>
+              <w:left w:val="single" w:sz="4" w:space="0" w:color="C9D3D0"/>
+              <w:bottom w:val="single" w:sz="4" w:space="0" w:color="C9D3D0"/>
+              <w:right w:val="single" w:sz="4" w:space="0" w:color="C9D3D0"/>
+            </w:tcBorders>
+            <w:tcMar>
+              <w:top w:w="50" w:type="dxa"/>
+              <w:left w:w="100" w:type="dxa"/>
+              <w:bottom w:w="50" w:type="dxa"/>
+              <w:right w:w="100" w:type="dxa"/>
+            </w:tcMar>
+          </w:tcPr>
+          <w:p>
+            <w:r>
+              <w:rPr>
+                <w:sz w:val="19"/>
+                <w:szCs w:val="19"/>
+              </w:rPr>
+              <w:t>My list: "+ Add a course" box below the last course opens the course picker; a green confirmation with a tick whenever courses are added (Courses, course page, My list)</w:t>
+            </w:r>
+          </w:p>
+        </w:tc>
+      </w:tr>
     </w:tbl>
     <w:p>
       <w:pPr>
@@ -1769,6 +1885,7 @@
                 <w:sz w:val="19"/>
                 <w:szCs w:val="19"/>
               </w:rPr>
+              <w:lastRenderedPageBreak/>
               <w:t>Role</w:t>
             </w:r>
           </w:p>
@@ -1997,7 +2114,6 @@
                 <w:sz w:val="19"/>
                 <w:szCs w:val="19"/>
               </w:rPr>
-              <w:lastRenderedPageBreak/>
               <w:t>Approver</w:t>
             </w:r>
           </w:p>
@@ -2083,7 +2199,7 @@
     <w:sdt>
       <w:sdtPr>
         <w:alias w:val="Contents"/>
-        <w:id w:val="914058990"/>
+        <w:id w:val="-685979827"/>
       </w:sdtPr>
       <w:sdtEndPr/>
       <w:sdtContent>
@@ -2112,7 +2228,7 @@
           <w:r>
             <w:fldChar w:fldCharType="separate"/>
           </w:r>
-          <w:hyperlink w:anchor="_Toc243516475" w:history="1">
+          <w:hyperlink w:anchor="_Toc243644691" w:history="1">
             <w:r>
               <w:rPr>
                 <w:rStyle w:val="Hyperlink"/>
@@ -2136,7 +2252,7 @@
               <w:rPr>
                 <w:noProof/>
               </w:rPr>
-              <w:instrText xml:space="preserve"> PAGEREF _Toc243516475 \h </w:instrText>
+              <w:instrText xml:space="preserve"> PAGEREF _Toc243644691 \h </w:instrText>
             </w:r>
             <w:r>
               <w:rPr>
@@ -2179,7 +2295,7 @@
               <w14:ligatures w14:val="standardContextual"/>
             </w:rPr>
           </w:pPr>
-          <w:hyperlink w:anchor="_Toc243516476" w:history="1">
+          <w:hyperlink w:anchor="_Toc243644692" w:history="1">
             <w:r>
               <w:rPr>
                 <w:rStyle w:val="Hyperlink"/>
@@ -2203,7 +2319,7 @@
               <w:rPr>
                 <w:noProof/>
               </w:rPr>
-              <w:instrText xml:space="preserve"> PAGEREF _Toc243516476 \h </w:instrText>
+              <w:instrText xml:space="preserve"> PAGEREF _Toc243644692 \h </w:instrText>
             </w:r>
             <w:r>
               <w:rPr>
@@ -2246,7 +2362,7 @@
               <w14:ligatures w14:val="standardContextual"/>
             </w:rPr>
           </w:pPr>
-          <w:hyperlink w:anchor="_Toc243516477" w:history="1">
+          <w:hyperlink w:anchor="_Toc243644693" w:history="1">
             <w:r>
               <w:rPr>
                 <w:rStyle w:val="Hyperlink"/>
@@ -2270,7 +2386,7 @@
               <w:rPr>
                 <w:noProof/>
               </w:rPr>
-              <w:instrText xml:space="preserve"> PAGEREF _Toc243516477 \h </w:instrText>
+              <w:instrText xml:space="preserve"> PAGEREF _Toc243644693 \h </w:instrText>
             </w:r>
             <w:r>
               <w:rPr>
@@ -2313,7 +2429,7 @@
               <w14:ligatures w14:val="standardContextual"/>
             </w:rPr>
           </w:pPr>
-          <w:hyperlink w:anchor="_Toc243516478" w:history="1">
+          <w:hyperlink w:anchor="_Toc243644694" w:history="1">
             <w:r>
               <w:rPr>
                 <w:rStyle w:val="Hyperlink"/>
@@ -2337,7 +2453,7 @@
               <w:rPr>
                 <w:noProof/>
               </w:rPr>
-              <w:instrText xml:space="preserve"> PAGEREF _Toc243516478 \h </w:instrText>
+              <w:instrText xml:space="preserve"> PAGEREF _Toc243644694 \h </w:instrText>
             </w:r>
             <w:r>
               <w:rPr>
@@ -2380,7 +2496,7 @@
               <w14:ligatures w14:val="standardContextual"/>
             </w:rPr>
           </w:pPr>
-          <w:hyperlink w:anchor="_Toc243516479" w:history="1">
+          <w:hyperlink w:anchor="_Toc243644695" w:history="1">
             <w:r>
               <w:rPr>
                 <w:rStyle w:val="Hyperlink"/>
@@ -2404,7 +2520,7 @@
               <w:rPr>
                 <w:noProof/>
               </w:rPr>
-              <w:instrText xml:space="preserve"> PAGEREF _Toc243516479 \h </w:instrText>
+              <w:instrText xml:space="preserve"> PAGEREF _Toc243644695 \h </w:instrText>
             </w:r>
             <w:r>
               <w:rPr>
@@ -2447,7 +2563,7 @@
               <w14:ligatures w14:val="standardContextual"/>
             </w:rPr>
           </w:pPr>
-          <w:hyperlink w:anchor="_Toc243516480" w:history="1">
+          <w:hyperlink w:anchor="_Toc243644696" w:history="1">
             <w:r>
               <w:rPr>
                 <w:rStyle w:val="Hyperlink"/>
@@ -2471,7 +2587,7 @@
               <w:rPr>
                 <w:noProof/>
               </w:rPr>
-              <w:instrText xml:space="preserve"> PAGEREF _Toc243516480 \h </w:instrText>
+              <w:instrText xml:space="preserve"> PAGEREF _Toc243644696 \h </w:instrText>
             </w:r>
             <w:r>
               <w:rPr>
@@ -2514,7 +2630,7 @@
               <w14:ligatures w14:val="standardContextual"/>
             </w:rPr>
           </w:pPr>
-          <w:hyperlink w:anchor="_Toc243516481" w:history="1">
+          <w:hyperlink w:anchor="_Toc243644697" w:history="1">
             <w:r>
               <w:rPr>
                 <w:rStyle w:val="Hyperlink"/>
@@ -2538,7 +2654,7 @@
               <w:rPr>
                 <w:noProof/>
               </w:rPr>
-              <w:instrText xml:space="preserve"> PAGEREF _Toc243516481 \h </w:instrText>
+              <w:instrText xml:space="preserve"> PAGEREF _Toc243644697 \h </w:instrText>
             </w:r>
             <w:r>
               <w:rPr>
@@ -2581,7 +2697,7 @@
               <w14:ligatures w14:val="standardContextual"/>
             </w:rPr>
           </w:pPr>
-          <w:hyperlink w:anchor="_Toc243516482" w:history="1">
+          <w:hyperlink w:anchor="_Toc243644698" w:history="1">
             <w:r>
               <w:rPr>
                 <w:rStyle w:val="Hyperlink"/>
@@ -2605,7 +2721,7 @@
               <w:rPr>
                 <w:noProof/>
               </w:rPr>
-              <w:instrText xml:space="preserve"> PAGEREF _Toc243516482 \h </w:instrText>
+              <w:instrText xml:space="preserve"> PAGEREF _Toc243644698 \h </w:instrText>
             </w:r>
             <w:r>
               <w:rPr>
@@ -2648,7 +2764,7 @@
               <w14:ligatures w14:val="standardContextual"/>
             </w:rPr>
           </w:pPr>
-          <w:hyperlink w:anchor="_Toc243516483" w:history="1">
+          <w:hyperlink w:anchor="_Toc243644699" w:history="1">
             <w:r>
               <w:rPr>
                 <w:rStyle w:val="Hyperlink"/>
@@ -2672,7 +2788,7 @@
               <w:rPr>
                 <w:noProof/>
               </w:rPr>
-              <w:instrText xml:space="preserve"> PAGEREF _Toc243516483 \h </w:instrText>
+              <w:instrText xml:space="preserve"> PAGEREF _Toc243644699 \h </w:instrText>
             </w:r>
             <w:r>
               <w:rPr>
@@ -2715,7 +2831,7 @@
               <w14:ligatures w14:val="standardContextual"/>
             </w:rPr>
           </w:pPr>
-          <w:hyperlink w:anchor="_Toc243516484" w:history="1">
+          <w:hyperlink w:anchor="_Toc243644700" w:history="1">
             <w:r>
               <w:rPr>
                 <w:rStyle w:val="Hyperlink"/>
@@ -2739,7 +2855,7 @@
               <w:rPr>
                 <w:noProof/>
               </w:rPr>
-              <w:instrText xml:space="preserve"> PAGEREF _Toc243516484 \h </w:instrText>
+              <w:instrText xml:space="preserve"> PAGEREF _Toc243644700 \h </w:instrText>
             </w:r>
             <w:r>
               <w:rPr>
@@ -2782,7 +2898,7 @@
               <w14:ligatures w14:val="standardContextual"/>
             </w:rPr>
           </w:pPr>
-          <w:hyperlink w:anchor="_Toc243516485" w:history="1">
+          <w:hyperlink w:anchor="_Toc243644701" w:history="1">
             <w:r>
               <w:rPr>
                 <w:rStyle w:val="Hyperlink"/>
@@ -2806,7 +2922,7 @@
               <w:rPr>
                 <w:noProof/>
               </w:rPr>
-              <w:instrText xml:space="preserve"> PAGEREF _Toc243516485 \h </w:instrText>
+              <w:instrText xml:space="preserve"> PAGEREF _Toc243644701 \h </w:instrText>
             </w:r>
             <w:r>
               <w:rPr>
@@ -2849,7 +2965,7 @@
               <w14:ligatures w14:val="standardContextual"/>
             </w:rPr>
           </w:pPr>
-          <w:hyperlink w:anchor="_Toc243516486" w:history="1">
+          <w:hyperlink w:anchor="_Toc243644702" w:history="1">
             <w:r>
               <w:rPr>
                 <w:rStyle w:val="Hyperlink"/>
@@ -2873,7 +2989,7 @@
               <w:rPr>
                 <w:noProof/>
               </w:rPr>
-              <w:instrText xml:space="preserve"> PAGEREF _Toc243516486 \h </w:instrText>
+              <w:instrText xml:space="preserve"> PAGEREF _Toc243644702 \h </w:instrText>
             </w:r>
             <w:r>
               <w:rPr>
@@ -2916,7 +3032,7 @@
               <w14:ligatures w14:val="standardContextual"/>
             </w:rPr>
           </w:pPr>
-          <w:hyperlink w:anchor="_Toc243516487" w:history="1">
+          <w:hyperlink w:anchor="_Toc243644703" w:history="1">
             <w:r>
               <w:rPr>
                 <w:rStyle w:val="Hyperlink"/>
@@ -2940,7 +3056,7 @@
               <w:rPr>
                 <w:noProof/>
               </w:rPr>
-              <w:instrText xml:space="preserve"> PAGEREF _Toc243516487 \h </w:instrText>
+              <w:instrText xml:space="preserve"> PAGEREF _Toc243644703 \h </w:instrText>
             </w:r>
             <w:r>
               <w:rPr>
@@ -2983,7 +3099,7 @@
               <w14:ligatures w14:val="standardContextual"/>
             </w:rPr>
           </w:pPr>
-          <w:hyperlink w:anchor="_Toc243516488" w:history="1">
+          <w:hyperlink w:anchor="_Toc243644704" w:history="1">
             <w:r>
               <w:rPr>
                 <w:rStyle w:val="Hyperlink"/>
@@ -3007,7 +3123,7 @@
               <w:rPr>
                 <w:noProof/>
               </w:rPr>
-              <w:instrText xml:space="preserve"> PAGEREF _Toc243516488 \h </w:instrText>
+              <w:instrText xml:space="preserve"> PAGEREF _Toc243644704 \h </w:instrText>
             </w:r>
             <w:r>
               <w:rPr>
@@ -3050,7 +3166,7 @@
               <w14:ligatures w14:val="standardContextual"/>
             </w:rPr>
           </w:pPr>
-          <w:hyperlink w:anchor="_Toc243516489" w:history="1">
+          <w:hyperlink w:anchor="_Toc243644705" w:history="1">
             <w:r>
               <w:rPr>
                 <w:rStyle w:val="Hyperlink"/>
@@ -3074,7 +3190,7 @@
               <w:rPr>
                 <w:noProof/>
               </w:rPr>
-              <w:instrText xml:space="preserve"> PAGEREF _Toc243516489 \h </w:instrText>
+              <w:instrText xml:space="preserve"> PAGEREF _Toc243644705 \h </w:instrText>
             </w:r>
             <w:r>
               <w:rPr>
@@ -3117,7 +3233,7 @@
               <w14:ligatures w14:val="standardContextual"/>
             </w:rPr>
           </w:pPr>
-          <w:hyperlink w:anchor="_Toc243516490" w:history="1">
+          <w:hyperlink w:anchor="_Toc243644706" w:history="1">
             <w:r>
               <w:rPr>
                 <w:rStyle w:val="Hyperlink"/>
@@ -3141,7 +3257,7 @@
               <w:rPr>
                 <w:noProof/>
               </w:rPr>
-              <w:instrText xml:space="preserve"> PAGEREF _Toc243516490 \h </w:instrText>
+              <w:instrText xml:space="preserve"> PAGEREF _Toc243644706 \h </w:instrText>
             </w:r>
             <w:r>
               <w:rPr>
@@ -3184,7 +3300,7 @@
               <w14:ligatures w14:val="standardContextual"/>
             </w:rPr>
           </w:pPr>
-          <w:hyperlink w:anchor="_Toc243516491" w:history="1">
+          <w:hyperlink w:anchor="_Toc243644707" w:history="1">
             <w:r>
               <w:rPr>
                 <w:rStyle w:val="Hyperlink"/>
@@ -3208,7 +3324,7 @@
               <w:rPr>
                 <w:noProof/>
               </w:rPr>
-              <w:instrText xml:space="preserve"> PAGEREF _Toc243516491 \h </w:instrText>
+              <w:instrText xml:space="preserve"> PAGEREF _Toc243644707 \h </w:instrText>
             </w:r>
             <w:r>
               <w:rPr>
@@ -3251,7 +3367,7 @@
               <w14:ligatures w14:val="standardContextual"/>
             </w:rPr>
           </w:pPr>
-          <w:hyperlink w:anchor="_Toc243516492" w:history="1">
+          <w:hyperlink w:anchor="_Toc243644708" w:history="1">
             <w:r>
               <w:rPr>
                 <w:rStyle w:val="Hyperlink"/>
@@ -3275,7 +3391,7 @@
               <w:rPr>
                 <w:noProof/>
               </w:rPr>
-              <w:instrText xml:space="preserve"> PAGEREF _Toc243516492 \h </w:instrText>
+              <w:instrText xml:space="preserve"> PAGEREF _Toc243644708 \h </w:instrText>
             </w:r>
             <w:r>
               <w:rPr>
@@ -3318,7 +3434,7 @@
               <w14:ligatures w14:val="standardContextual"/>
             </w:rPr>
           </w:pPr>
-          <w:hyperlink w:anchor="_Toc243516493" w:history="1">
+          <w:hyperlink w:anchor="_Toc243644709" w:history="1">
             <w:r>
               <w:rPr>
                 <w:rStyle w:val="Hyperlink"/>
@@ -3342,7 +3458,7 @@
               <w:rPr>
                 <w:noProof/>
               </w:rPr>
-              <w:instrText xml:space="preserve"> PAGEREF _Toc243516493 \h </w:instrText>
+              <w:instrText xml:space="preserve"> PAGEREF _Toc243644709 \h </w:instrText>
             </w:r>
             <w:r>
               <w:rPr>
@@ -3385,7 +3501,7 @@
               <w14:ligatures w14:val="standardContextual"/>
             </w:rPr>
           </w:pPr>
-          <w:hyperlink w:anchor="_Toc243516494" w:history="1">
+          <w:hyperlink w:anchor="_Toc243644710" w:history="1">
             <w:r>
               <w:rPr>
                 <w:rStyle w:val="Hyperlink"/>
@@ -3409,7 +3525,7 @@
               <w:rPr>
                 <w:noProof/>
               </w:rPr>
-              <w:instrText xml:space="preserve"> PAGEREF _Toc243516494 \h </w:instrText>
+              <w:instrText xml:space="preserve"> PAGEREF _Toc243644710 \h </w:instrText>
             </w:r>
             <w:r>
               <w:rPr>
@@ -3452,7 +3568,7 @@
               <w14:ligatures w14:val="standardContextual"/>
             </w:rPr>
           </w:pPr>
-          <w:hyperlink w:anchor="_Toc243516495" w:history="1">
+          <w:hyperlink w:anchor="_Toc243644711" w:history="1">
             <w:r>
               <w:rPr>
                 <w:rStyle w:val="Hyperlink"/>
@@ -3476,7 +3592,7 @@
               <w:rPr>
                 <w:noProof/>
               </w:rPr>
-              <w:instrText xml:space="preserve"> PAGEREF _Toc243516495 \h </w:instrText>
+              <w:instrText xml:space="preserve"> PAGEREF _Toc243644711 \h </w:instrText>
             </w:r>
             <w:r>
               <w:rPr>
@@ -3519,7 +3635,7 @@
               <w14:ligatures w14:val="standardContextual"/>
             </w:rPr>
           </w:pPr>
-          <w:hyperlink w:anchor="_Toc243516496" w:history="1">
+          <w:hyperlink w:anchor="_Toc243644712" w:history="1">
             <w:r>
               <w:rPr>
                 <w:rStyle w:val="Hyperlink"/>
@@ -3543,7 +3659,7 @@
               <w:rPr>
                 <w:noProof/>
               </w:rPr>
-              <w:instrText xml:space="preserve"> PAGEREF _Toc243516496 \h </w:instrText>
+              <w:instrText xml:space="preserve"> PAGEREF _Toc243644712 \h </w:instrText>
             </w:r>
             <w:r>
               <w:rPr>
@@ -3586,7 +3702,7 @@
               <w14:ligatures w14:val="standardContextual"/>
             </w:rPr>
           </w:pPr>
-          <w:hyperlink w:anchor="_Toc243516497" w:history="1">
+          <w:hyperlink w:anchor="_Toc243644713" w:history="1">
             <w:r>
               <w:rPr>
                 <w:rStyle w:val="Hyperlink"/>
@@ -3610,7 +3726,7 @@
               <w:rPr>
                 <w:noProof/>
               </w:rPr>
-              <w:instrText xml:space="preserve"> PAGEREF _Toc243516497 \h </w:instrText>
+              <w:instrText xml:space="preserve"> PAGEREF _Toc243644713 \h </w:instrText>
             </w:r>
             <w:r>
               <w:rPr>
@@ -3653,7 +3769,7 @@
               <w14:ligatures w14:val="standardContextual"/>
             </w:rPr>
           </w:pPr>
-          <w:hyperlink w:anchor="_Toc243516498" w:history="1">
+          <w:hyperlink w:anchor="_Toc243644714" w:history="1">
             <w:r>
               <w:rPr>
                 <w:rStyle w:val="Hyperlink"/>
@@ -3677,7 +3793,7 @@
               <w:rPr>
                 <w:noProof/>
               </w:rPr>
-              <w:instrText xml:space="preserve"> PAGEREF _Toc243516498 \h </w:instrText>
+              <w:instrText xml:space="preserve"> PAGEREF _Toc243644714 \h </w:instrText>
             </w:r>
             <w:r>
               <w:rPr>
@@ -3720,7 +3836,7 @@
               <w14:ligatures w14:val="standardContextual"/>
             </w:rPr>
           </w:pPr>
-          <w:hyperlink w:anchor="_Toc243516499" w:history="1">
+          <w:hyperlink w:anchor="_Toc243644715" w:history="1">
             <w:r>
               <w:rPr>
                 <w:rStyle w:val="Hyperlink"/>
@@ -3744,7 +3860,7 @@
               <w:rPr>
                 <w:noProof/>
               </w:rPr>
-              <w:instrText xml:space="preserve"> PAGEREF _Toc243516499 \h </w:instrText>
+              <w:instrText xml:space="preserve"> PAGEREF _Toc243644715 \h </w:instrText>
             </w:r>
             <w:r>
               <w:rPr>
@@ -3787,7 +3903,7 @@
               <w14:ligatures w14:val="standardContextual"/>
             </w:rPr>
           </w:pPr>
-          <w:hyperlink w:anchor="_Toc243516500" w:history="1">
+          <w:hyperlink w:anchor="_Toc243644716" w:history="1">
             <w:r>
               <w:rPr>
                 <w:rStyle w:val="Hyperlink"/>
@@ -3811,7 +3927,7 @@
               <w:rPr>
                 <w:noProof/>
               </w:rPr>
-              <w:instrText xml:space="preserve"> PAGEREF _Toc243516500 \h </w:instrText>
+              <w:instrText xml:space="preserve"> PAGEREF _Toc243644716 \h </w:instrText>
             </w:r>
             <w:r>
               <w:rPr>
@@ -3854,7 +3970,7 @@
               <w14:ligatures w14:val="standardContextual"/>
             </w:rPr>
           </w:pPr>
-          <w:hyperlink w:anchor="_Toc243516501" w:history="1">
+          <w:hyperlink w:anchor="_Toc243644717" w:history="1">
             <w:r>
               <w:rPr>
                 <w:rStyle w:val="Hyperlink"/>
@@ -3878,7 +3994,7 @@
               <w:rPr>
                 <w:noProof/>
               </w:rPr>
-              <w:instrText xml:space="preserve"> PAGEREF _Toc243516501 \h </w:instrText>
+              <w:instrText xml:space="preserve"> PAGEREF _Toc243644717 \h </w:instrText>
             </w:r>
             <w:r>
               <w:rPr>
@@ -3921,7 +4037,7 @@
               <w14:ligatures w14:val="standardContextual"/>
             </w:rPr>
           </w:pPr>
-          <w:hyperlink w:anchor="_Toc243516502" w:history="1">
+          <w:hyperlink w:anchor="_Toc243644718" w:history="1">
             <w:r>
               <w:rPr>
                 <w:rStyle w:val="Hyperlink"/>
@@ -3945,7 +4061,7 @@
               <w:rPr>
                 <w:noProof/>
               </w:rPr>
-              <w:instrText xml:space="preserve"> PAGEREF _Toc243516502 \h </w:instrText>
+              <w:instrText xml:space="preserve"> PAGEREF _Toc243644718 \h </w:instrText>
             </w:r>
             <w:r>
               <w:rPr>
@@ -3962,7 +4078,7 @@
               <w:rPr>
                 <w:noProof/>
               </w:rPr>
-              <w:t>17</w:t>
+              <w:t>18</w:t>
             </w:r>
             <w:r>
               <w:rPr>
@@ -3988,7 +4104,7 @@
               <w14:ligatures w14:val="standardContextual"/>
             </w:rPr>
           </w:pPr>
-          <w:hyperlink w:anchor="_Toc243516503" w:history="1">
+          <w:hyperlink w:anchor="_Toc243644719" w:history="1">
             <w:r>
               <w:rPr>
                 <w:rStyle w:val="Hyperlink"/>
@@ -4012,7 +4128,7 @@
               <w:rPr>
                 <w:noProof/>
               </w:rPr>
-              <w:instrText xml:space="preserve"> PAGEREF _Toc243516503 \h </w:instrText>
+              <w:instrText xml:space="preserve"> PAGEREF _Toc243644719 \h </w:instrText>
             </w:r>
             <w:r>
               <w:rPr>
@@ -4055,7 +4171,7 @@
               <w14:ligatures w14:val="standardContextual"/>
             </w:rPr>
           </w:pPr>
-          <w:hyperlink w:anchor="_Toc243516504" w:history="1">
+          <w:hyperlink w:anchor="_Toc243644720" w:history="1">
             <w:r>
               <w:rPr>
                 <w:rStyle w:val="Hyperlink"/>
@@ -4079,7 +4195,7 @@
               <w:rPr>
                 <w:noProof/>
               </w:rPr>
-              <w:instrText xml:space="preserve"> PAGEREF _Toc243516504 \h </w:instrText>
+              <w:instrText xml:space="preserve"> PAGEREF _Toc243644720 \h </w:instrText>
             </w:r>
             <w:r>
               <w:rPr>
@@ -4122,7 +4238,7 @@
               <w14:ligatures w14:val="standardContextual"/>
             </w:rPr>
           </w:pPr>
-          <w:hyperlink w:anchor="_Toc243516505" w:history="1">
+          <w:hyperlink w:anchor="_Toc243644721" w:history="1">
             <w:r>
               <w:rPr>
                 <w:rStyle w:val="Hyperlink"/>
@@ -4146,7 +4262,7 @@
               <w:rPr>
                 <w:noProof/>
               </w:rPr>
-              <w:instrText xml:space="preserve"> PAGEREF _Toc243516505 \h </w:instrText>
+              <w:instrText xml:space="preserve"> PAGEREF _Toc243644721 \h </w:instrText>
             </w:r>
             <w:r>
               <w:rPr>
@@ -4189,7 +4305,7 @@
               <w14:ligatures w14:val="standardContextual"/>
             </w:rPr>
           </w:pPr>
-          <w:hyperlink w:anchor="_Toc243516506" w:history="1">
+          <w:hyperlink w:anchor="_Toc243644722" w:history="1">
             <w:r>
               <w:rPr>
                 <w:rStyle w:val="Hyperlink"/>
@@ -4213,7 +4329,7 @@
               <w:rPr>
                 <w:noProof/>
               </w:rPr>
-              <w:instrText xml:space="preserve"> PAGEREF _Toc243516506 \h </w:instrText>
+              <w:instrText xml:space="preserve"> PAGEREF _Toc243644722 \h </w:instrText>
             </w:r>
             <w:r>
               <w:rPr>
@@ -4256,7 +4372,7 @@
               <w14:ligatures w14:val="standardContextual"/>
             </w:rPr>
           </w:pPr>
-          <w:hyperlink w:anchor="_Toc243516507" w:history="1">
+          <w:hyperlink w:anchor="_Toc243644723" w:history="1">
             <w:r>
               <w:rPr>
                 <w:rStyle w:val="Hyperlink"/>
@@ -4280,7 +4396,7 @@
               <w:rPr>
                 <w:noProof/>
               </w:rPr>
-              <w:instrText xml:space="preserve"> PAGEREF _Toc243516507 \h </w:instrText>
+              <w:instrText xml:space="preserve"> PAGEREF _Toc243644723 \h </w:instrText>
             </w:r>
             <w:r>
               <w:rPr>
@@ -4323,7 +4439,7 @@
               <w14:ligatures w14:val="standardContextual"/>
             </w:rPr>
           </w:pPr>
-          <w:hyperlink w:anchor="_Toc243516508" w:history="1">
+          <w:hyperlink w:anchor="_Toc243644724" w:history="1">
             <w:r>
               <w:rPr>
                 <w:rStyle w:val="Hyperlink"/>
@@ -4347,7 +4463,7 @@
               <w:rPr>
                 <w:noProof/>
               </w:rPr>
-              <w:instrText xml:space="preserve"> PAGEREF _Toc243516508 \h </w:instrText>
+              <w:instrText xml:space="preserve"> PAGEREF _Toc243644724 \h </w:instrText>
             </w:r>
             <w:r>
               <w:rPr>
@@ -4390,7 +4506,7 @@
               <w14:ligatures w14:val="standardContextual"/>
             </w:rPr>
           </w:pPr>
-          <w:hyperlink w:anchor="_Toc243516509" w:history="1">
+          <w:hyperlink w:anchor="_Toc243644725" w:history="1">
             <w:r>
               <w:rPr>
                 <w:rStyle w:val="Hyperlink"/>
@@ -4414,7 +4530,7 @@
               <w:rPr>
                 <w:noProof/>
               </w:rPr>
-              <w:instrText xml:space="preserve"> PAGEREF _Toc243516509 \h </w:instrText>
+              <w:instrText xml:space="preserve"> PAGEREF _Toc243644725 \h </w:instrText>
             </w:r>
             <w:r>
               <w:rPr>
@@ -4457,7 +4573,7 @@
               <w14:ligatures w14:val="standardContextual"/>
             </w:rPr>
           </w:pPr>
-          <w:hyperlink w:anchor="_Toc243516510" w:history="1">
+          <w:hyperlink w:anchor="_Toc243644726" w:history="1">
             <w:r>
               <w:rPr>
                 <w:rStyle w:val="Hyperlink"/>
@@ -4481,7 +4597,7 @@
               <w:rPr>
                 <w:noProof/>
               </w:rPr>
-              <w:instrText xml:space="preserve"> PAGEREF _Toc243516510 \h </w:instrText>
+              <w:instrText xml:space="preserve"> PAGEREF _Toc243644726 \h </w:instrText>
             </w:r>
             <w:r>
               <w:rPr>
@@ -4527,7 +4643,7 @@
     <w:sdt>
       <w:sdtPr>
         <w:alias w:val="Tables"/>
-        <w:id w:val="-262225181"/>
+        <w:id w:val="1196345053"/>
       </w:sdtPr>
       <w:sdtEndPr/>
       <w:sdtContent>
@@ -4556,7 +4672,7 @@
           <w:r>
             <w:fldChar w:fldCharType="separate"/>
           </w:r>
-          <w:hyperlink w:anchor="_Toc243516511" w:history="1">
+          <w:hyperlink w:anchor="_Toc243644727" w:history="1">
             <w:r>
               <w:rPr>
                 <w:rStyle w:val="Hyperlink"/>
@@ -4580,7 +4696,7 @@
               <w:rPr>
                 <w:noProof/>
               </w:rPr>
-              <w:instrText xml:space="preserve"> PAGEREF _Toc243516511 \h </w:instrText>
+              <w:instrText xml:space="preserve"> PAGEREF _Toc243644727 \h </w:instrText>
             </w:r>
             <w:r>
               <w:rPr>
@@ -4623,7 +4739,7 @@
               <w14:ligatures w14:val="standardContextual"/>
             </w:rPr>
           </w:pPr>
-          <w:hyperlink w:anchor="_Toc243516512" w:history="1">
+          <w:hyperlink w:anchor="_Toc243644728" w:history="1">
             <w:r>
               <w:rPr>
                 <w:rStyle w:val="Hyperlink"/>
@@ -4647,7 +4763,7 @@
               <w:rPr>
                 <w:noProof/>
               </w:rPr>
-              <w:instrText xml:space="preserve"> PAGEREF _Toc243516512 \h </w:instrText>
+              <w:instrText xml:space="preserve"> PAGEREF _Toc243644728 \h </w:instrText>
             </w:r>
             <w:r>
               <w:rPr>
@@ -4690,7 +4806,7 @@
               <w14:ligatures w14:val="standardContextual"/>
             </w:rPr>
           </w:pPr>
-          <w:hyperlink w:anchor="_Toc243516513" w:history="1">
+          <w:hyperlink w:anchor="_Toc243644729" w:history="1">
             <w:r>
               <w:rPr>
                 <w:rStyle w:val="Hyperlink"/>
@@ -4714,7 +4830,7 @@
               <w:rPr>
                 <w:noProof/>
               </w:rPr>
-              <w:instrText xml:space="preserve"> PAGEREF _Toc243516513 \h </w:instrText>
+              <w:instrText xml:space="preserve"> PAGEREF _Toc243644729 \h </w:instrText>
             </w:r>
             <w:r>
               <w:rPr>
@@ -4757,7 +4873,7 @@
               <w14:ligatures w14:val="standardContextual"/>
             </w:rPr>
           </w:pPr>
-          <w:hyperlink w:anchor="_Toc243516514" w:history="1">
+          <w:hyperlink w:anchor="_Toc243644730" w:history="1">
             <w:r>
               <w:rPr>
                 <w:rStyle w:val="Hyperlink"/>
@@ -4781,7 +4897,7 @@
               <w:rPr>
                 <w:noProof/>
               </w:rPr>
-              <w:instrText xml:space="preserve"> PAGEREF _Toc243516514 \h </w:instrText>
+              <w:instrText xml:space="preserve"> PAGEREF _Toc243644730 \h </w:instrText>
             </w:r>
             <w:r>
               <w:rPr>
@@ -4824,7 +4940,7 @@
               <w14:ligatures w14:val="standardContextual"/>
             </w:rPr>
           </w:pPr>
-          <w:hyperlink w:anchor="_Toc243516515" w:history="1">
+          <w:hyperlink w:anchor="_Toc243644731" w:history="1">
             <w:r>
               <w:rPr>
                 <w:rStyle w:val="Hyperlink"/>
@@ -4848,7 +4964,7 @@
               <w:rPr>
                 <w:noProof/>
               </w:rPr>
-              <w:instrText xml:space="preserve"> PAGEREF _Toc243516515 \h </w:instrText>
+              <w:instrText xml:space="preserve"> PAGEREF _Toc243644731 \h </w:instrText>
             </w:r>
             <w:r>
               <w:rPr>
@@ -4891,7 +5007,7 @@
               <w14:ligatures w14:val="standardContextual"/>
             </w:rPr>
           </w:pPr>
-          <w:hyperlink w:anchor="_Toc243516516" w:history="1">
+          <w:hyperlink w:anchor="_Toc243644732" w:history="1">
             <w:r>
               <w:rPr>
                 <w:rStyle w:val="Hyperlink"/>
@@ -4915,7 +5031,7 @@
               <w:rPr>
                 <w:noProof/>
               </w:rPr>
-              <w:instrText xml:space="preserve"> PAGEREF _Toc243516516 \h </w:instrText>
+              <w:instrText xml:space="preserve"> PAGEREF _Toc243644732 \h </w:instrText>
             </w:r>
             <w:r>
               <w:rPr>
@@ -4958,7 +5074,7 @@
               <w14:ligatures w14:val="standardContextual"/>
             </w:rPr>
           </w:pPr>
-          <w:hyperlink w:anchor="_Toc243516517" w:history="1">
+          <w:hyperlink w:anchor="_Toc243644733" w:history="1">
             <w:r>
               <w:rPr>
                 <w:rStyle w:val="Hyperlink"/>
@@ -4982,7 +5098,7 @@
               <w:rPr>
                 <w:noProof/>
               </w:rPr>
-              <w:instrText xml:space="preserve"> PAGEREF _Toc243516517 \h </w:instrText>
+              <w:instrText xml:space="preserve"> PAGEREF _Toc243644733 \h </w:instrText>
             </w:r>
             <w:r>
               <w:rPr>
@@ -5025,7 +5141,7 @@
               <w14:ligatures w14:val="standardContextual"/>
             </w:rPr>
           </w:pPr>
-          <w:hyperlink w:anchor="_Toc243516518" w:history="1">
+          <w:hyperlink w:anchor="_Toc243644734" w:history="1">
             <w:r>
               <w:rPr>
                 <w:rStyle w:val="Hyperlink"/>
@@ -5049,7 +5165,7 @@
               <w:rPr>
                 <w:noProof/>
               </w:rPr>
-              <w:instrText xml:space="preserve"> PAGEREF _Toc243516518 \h </w:instrText>
+              <w:instrText xml:space="preserve"> PAGEREF _Toc243644734 \h </w:instrText>
             </w:r>
             <w:r>
               <w:rPr>
@@ -5092,7 +5208,7 @@
               <w14:ligatures w14:val="standardContextual"/>
             </w:rPr>
           </w:pPr>
-          <w:hyperlink w:anchor="_Toc243516519" w:history="1">
+          <w:hyperlink w:anchor="_Toc243644735" w:history="1">
             <w:r>
               <w:rPr>
                 <w:rStyle w:val="Hyperlink"/>
@@ -5116,7 +5232,7 @@
               <w:rPr>
                 <w:noProof/>
               </w:rPr>
-              <w:instrText xml:space="preserve"> PAGEREF _Toc243516519 \h </w:instrText>
+              <w:instrText xml:space="preserve"> PAGEREF _Toc243644735 \h </w:instrText>
             </w:r>
             <w:r>
               <w:rPr>
@@ -5159,7 +5275,7 @@
               <w14:ligatures w14:val="standardContextual"/>
             </w:rPr>
           </w:pPr>
-          <w:hyperlink w:anchor="_Toc243516520" w:history="1">
+          <w:hyperlink w:anchor="_Toc243644736" w:history="1">
             <w:r>
               <w:rPr>
                 <w:rStyle w:val="Hyperlink"/>
@@ -5183,7 +5299,7 @@
               <w:rPr>
                 <w:noProof/>
               </w:rPr>
-              <w:instrText xml:space="preserve"> PAGEREF _Toc243516520 \h </w:instrText>
+              <w:instrText xml:space="preserve"> PAGEREF _Toc243644736 \h </w:instrText>
             </w:r>
             <w:r>
               <w:rPr>
@@ -5226,7 +5342,7 @@
               <w14:ligatures w14:val="standardContextual"/>
             </w:rPr>
           </w:pPr>
-          <w:hyperlink w:anchor="_Toc243516521" w:history="1">
+          <w:hyperlink w:anchor="_Toc243644737" w:history="1">
             <w:r>
               <w:rPr>
                 <w:rStyle w:val="Hyperlink"/>
@@ -5250,7 +5366,7 @@
               <w:rPr>
                 <w:noProof/>
               </w:rPr>
-              <w:instrText xml:space="preserve"> PAGEREF _Toc243516521 \h </w:instrText>
+              <w:instrText xml:space="preserve"> PAGEREF _Toc243644737 \h </w:instrText>
             </w:r>
             <w:r>
               <w:rPr>
@@ -5293,7 +5409,7 @@
               <w14:ligatures w14:val="standardContextual"/>
             </w:rPr>
           </w:pPr>
-          <w:hyperlink w:anchor="_Toc243516522" w:history="1">
+          <w:hyperlink w:anchor="_Toc243644738" w:history="1">
             <w:r>
               <w:rPr>
                 <w:rStyle w:val="Hyperlink"/>
@@ -5317,7 +5433,7 @@
               <w:rPr>
                 <w:noProof/>
               </w:rPr>
-              <w:instrText xml:space="preserve"> PAGEREF _Toc243516522 \h </w:instrText>
+              <w:instrText xml:space="preserve"> PAGEREF _Toc243644738 \h </w:instrText>
             </w:r>
             <w:r>
               <w:rPr>
@@ -5360,7 +5476,7 @@
               <w14:ligatures w14:val="standardContextual"/>
             </w:rPr>
           </w:pPr>
-          <w:hyperlink w:anchor="_Toc243516523" w:history="1">
+          <w:hyperlink w:anchor="_Toc243644739" w:history="1">
             <w:r>
               <w:rPr>
                 <w:rStyle w:val="Hyperlink"/>
@@ -5384,7 +5500,7 @@
               <w:rPr>
                 <w:noProof/>
               </w:rPr>
-              <w:instrText xml:space="preserve"> PAGEREF _Toc243516523 \h </w:instrText>
+              <w:instrText xml:space="preserve"> PAGEREF _Toc243644739 \h </w:instrText>
             </w:r>
             <w:r>
               <w:rPr>
@@ -5427,7 +5543,7 @@
               <w14:ligatures w14:val="standardContextual"/>
             </w:rPr>
           </w:pPr>
-          <w:hyperlink w:anchor="_Toc243516524" w:history="1">
+          <w:hyperlink w:anchor="_Toc243644740" w:history="1">
             <w:r>
               <w:rPr>
                 <w:rStyle w:val="Hyperlink"/>
@@ -5451,7 +5567,7 @@
               <w:rPr>
                 <w:noProof/>
               </w:rPr>
-              <w:instrText xml:space="preserve"> PAGEREF _Toc243516524 \h </w:instrText>
+              <w:instrText xml:space="preserve"> PAGEREF _Toc243644740 \h </w:instrText>
             </w:r>
             <w:r>
               <w:rPr>
@@ -5494,7 +5610,7 @@
               <w14:ligatures w14:val="standardContextual"/>
             </w:rPr>
           </w:pPr>
-          <w:hyperlink w:anchor="_Toc243516525" w:history="1">
+          <w:hyperlink w:anchor="_Toc243644741" w:history="1">
             <w:r>
               <w:rPr>
                 <w:rStyle w:val="Hyperlink"/>
@@ -5518,7 +5634,7 @@
               <w:rPr>
                 <w:noProof/>
               </w:rPr>
-              <w:instrText xml:space="preserve"> PAGEREF _Toc243516525 \h </w:instrText>
+              <w:instrText xml:space="preserve"> PAGEREF _Toc243644741 \h </w:instrText>
             </w:r>
             <w:r>
               <w:rPr>
@@ -5561,7 +5677,7 @@
               <w14:ligatures w14:val="standardContextual"/>
             </w:rPr>
           </w:pPr>
-          <w:hyperlink w:anchor="_Toc243516526" w:history="1">
+          <w:hyperlink w:anchor="_Toc243644742" w:history="1">
             <w:r>
               <w:rPr>
                 <w:rStyle w:val="Hyperlink"/>
@@ -5585,7 +5701,7 @@
               <w:rPr>
                 <w:noProof/>
               </w:rPr>
-              <w:instrText xml:space="preserve"> PAGEREF _Toc243516526 \h </w:instrText>
+              <w:instrText xml:space="preserve"> PAGEREF _Toc243644742 \h </w:instrText>
             </w:r>
             <w:r>
               <w:rPr>
@@ -5628,7 +5744,7 @@
               <w14:ligatures w14:val="standardContextual"/>
             </w:rPr>
           </w:pPr>
-          <w:hyperlink w:anchor="_Toc243516527" w:history="1">
+          <w:hyperlink w:anchor="_Toc243644743" w:history="1">
             <w:r>
               <w:rPr>
                 <w:rStyle w:val="Hyperlink"/>
@@ -5652,7 +5768,7 @@
               <w:rPr>
                 <w:noProof/>
               </w:rPr>
-              <w:instrText xml:space="preserve"> PAGEREF _Toc243516527 \h </w:instrText>
+              <w:instrText xml:space="preserve"> PAGEREF _Toc243644743 \h </w:instrText>
             </w:r>
             <w:r>
               <w:rPr>
@@ -5695,7 +5811,7 @@
               <w14:ligatures w14:val="standardContextual"/>
             </w:rPr>
           </w:pPr>
-          <w:hyperlink w:anchor="_Toc243516528" w:history="1">
+          <w:hyperlink w:anchor="_Toc243644744" w:history="1">
             <w:r>
               <w:rPr>
                 <w:rStyle w:val="Hyperlink"/>
@@ -5719,7 +5835,7 @@
               <w:rPr>
                 <w:noProof/>
               </w:rPr>
-              <w:instrText xml:space="preserve"> PAGEREF _Toc243516528 \h </w:instrText>
+              <w:instrText xml:space="preserve"> PAGEREF _Toc243644744 \h </w:instrText>
             </w:r>
             <w:r>
               <w:rPr>
@@ -5762,7 +5878,7 @@
               <w14:ligatures w14:val="standardContextual"/>
             </w:rPr>
           </w:pPr>
-          <w:hyperlink w:anchor="_Toc243516529" w:history="1">
+          <w:hyperlink w:anchor="_Toc243644745" w:history="1">
             <w:r>
               <w:rPr>
                 <w:rStyle w:val="Hyperlink"/>
@@ -5786,7 +5902,7 @@
               <w:rPr>
                 <w:noProof/>
               </w:rPr>
-              <w:instrText xml:space="preserve"> PAGEREF _Toc243516529 \h </w:instrText>
+              <w:instrText xml:space="preserve"> PAGEREF _Toc243644745 \h </w:instrText>
             </w:r>
             <w:r>
               <w:rPr>
@@ -5829,7 +5945,7 @@
               <w14:ligatures w14:val="standardContextual"/>
             </w:rPr>
           </w:pPr>
-          <w:hyperlink w:anchor="_Toc243516530" w:history="1">
+          <w:hyperlink w:anchor="_Toc243644746" w:history="1">
             <w:r>
               <w:rPr>
                 <w:rStyle w:val="Hyperlink"/>
@@ -5853,7 +5969,7 @@
               <w:rPr>
                 <w:noProof/>
               </w:rPr>
-              <w:instrText xml:space="preserve"> PAGEREF _Toc243516530 \h </w:instrText>
+              <w:instrText xml:space="preserve"> PAGEREF _Toc243644746 \h </w:instrText>
             </w:r>
             <w:r>
               <w:rPr>
@@ -5896,7 +6012,7 @@
               <w14:ligatures w14:val="standardContextual"/>
             </w:rPr>
           </w:pPr>
-          <w:hyperlink w:anchor="_Toc243516531" w:history="1">
+          <w:hyperlink w:anchor="_Toc243644747" w:history="1">
             <w:r>
               <w:rPr>
                 <w:rStyle w:val="Hyperlink"/>
@@ -5920,7 +6036,7 @@
               <w:rPr>
                 <w:noProof/>
               </w:rPr>
-              <w:instrText xml:space="preserve"> PAGEREF _Toc243516531 \h </w:instrText>
+              <w:instrText xml:space="preserve"> PAGEREF _Toc243644747 \h </w:instrText>
             </w:r>
             <w:r>
               <w:rPr>
@@ -5937,7 +6053,7 @@
               <w:rPr>
                 <w:noProof/>
               </w:rPr>
-              <w:t>17</w:t>
+              <w:t>18</w:t>
             </w:r>
             <w:r>
               <w:rPr>
@@ -5963,7 +6079,7 @@
               <w14:ligatures w14:val="standardContextual"/>
             </w:rPr>
           </w:pPr>
-          <w:hyperlink w:anchor="_Toc243516532" w:history="1">
+          <w:hyperlink w:anchor="_Toc243644748" w:history="1">
             <w:r>
               <w:rPr>
                 <w:rStyle w:val="Hyperlink"/>
@@ -5987,7 +6103,7 @@
               <w:rPr>
                 <w:noProof/>
               </w:rPr>
-              <w:instrText xml:space="preserve"> PAGEREF _Toc243516532 \h </w:instrText>
+              <w:instrText xml:space="preserve"> PAGEREF _Toc243644748 \h </w:instrText>
             </w:r>
             <w:r>
               <w:rPr>
@@ -6030,7 +6146,7 @@
               <w14:ligatures w14:val="standardContextual"/>
             </w:rPr>
           </w:pPr>
-          <w:hyperlink w:anchor="_Toc243516533" w:history="1">
+          <w:hyperlink w:anchor="_Toc243644749" w:history="1">
             <w:r>
               <w:rPr>
                 <w:rStyle w:val="Hyperlink"/>
@@ -6054,7 +6170,7 @@
               <w:rPr>
                 <w:noProof/>
               </w:rPr>
-              <w:instrText xml:space="preserve"> PAGEREF _Toc243516533 \h </w:instrText>
+              <w:instrText xml:space="preserve"> PAGEREF _Toc243644749 \h </w:instrText>
             </w:r>
             <w:r>
               <w:rPr>
@@ -6097,7 +6213,7 @@
               <w14:ligatures w14:val="standardContextual"/>
             </w:rPr>
           </w:pPr>
-          <w:hyperlink w:anchor="_Toc243516534" w:history="1">
+          <w:hyperlink w:anchor="_Toc243644750" w:history="1">
             <w:r>
               <w:rPr>
                 <w:rStyle w:val="Hyperlink"/>
@@ -6121,7 +6237,7 @@
               <w:rPr>
                 <w:noProof/>
               </w:rPr>
-              <w:instrText xml:space="preserve"> PAGEREF _Toc243516534 \h </w:instrText>
+              <w:instrText xml:space="preserve"> PAGEREF _Toc243644750 \h </w:instrText>
             </w:r>
             <w:r>
               <w:rPr>
@@ -6164,7 +6280,7 @@
               <w14:ligatures w14:val="standardContextual"/>
             </w:rPr>
           </w:pPr>
-          <w:hyperlink w:anchor="_Toc243516535" w:history="1">
+          <w:hyperlink w:anchor="_Toc243644751" w:history="1">
             <w:r>
               <w:rPr>
                 <w:rStyle w:val="Hyperlink"/>
@@ -6188,7 +6304,7 @@
               <w:rPr>
                 <w:noProof/>
               </w:rPr>
-              <w:instrText xml:space="preserve"> PAGEREF _Toc243516535 \h </w:instrText>
+              <w:instrText xml:space="preserve"> PAGEREF _Toc243644751 \h </w:instrText>
             </w:r>
             <w:r>
               <w:rPr>
@@ -6231,7 +6347,7 @@
               <w14:ligatures w14:val="standardContextual"/>
             </w:rPr>
           </w:pPr>
-          <w:hyperlink w:anchor="_Toc243516536" w:history="1">
+          <w:hyperlink w:anchor="_Toc243644752" w:history="1">
             <w:r>
               <w:rPr>
                 <w:rStyle w:val="Hyperlink"/>
@@ -6255,7 +6371,7 @@
               <w:rPr>
                 <w:noProof/>
               </w:rPr>
-              <w:instrText xml:space="preserve"> PAGEREF _Toc243516536 \h </w:instrText>
+              <w:instrText xml:space="preserve"> PAGEREF _Toc243644752 \h </w:instrText>
             </w:r>
             <w:r>
               <w:rPr>
@@ -6298,7 +6414,7 @@
               <w14:ligatures w14:val="standardContextual"/>
             </w:rPr>
           </w:pPr>
-          <w:hyperlink w:anchor="_Toc243516537" w:history="1">
+          <w:hyperlink w:anchor="_Toc243644753" w:history="1">
             <w:r>
               <w:rPr>
                 <w:rStyle w:val="Hyperlink"/>
@@ -6322,7 +6438,7 @@
               <w:rPr>
                 <w:noProof/>
               </w:rPr>
-              <w:instrText xml:space="preserve"> PAGEREF _Toc243516537 \h </w:instrText>
+              <w:instrText xml:space="preserve"> PAGEREF _Toc243644753 \h </w:instrText>
             </w:r>
             <w:r>
               <w:rPr>
@@ -6365,7 +6481,7 @@
               <w14:ligatures w14:val="standardContextual"/>
             </w:rPr>
           </w:pPr>
-          <w:hyperlink w:anchor="_Toc243516538" w:history="1">
+          <w:hyperlink w:anchor="_Toc243644754" w:history="1">
             <w:r>
               <w:rPr>
                 <w:rStyle w:val="Hyperlink"/>
@@ -6389,7 +6505,7 @@
               <w:rPr>
                 <w:noProof/>
               </w:rPr>
-              <w:instrText xml:space="preserve"> PAGEREF _Toc243516538 \h </w:instrText>
+              <w:instrText xml:space="preserve"> PAGEREF _Toc243644754 \h </w:instrText>
             </w:r>
             <w:r>
               <w:rPr>
@@ -6432,7 +6548,7 @@
               <w14:ligatures w14:val="standardContextual"/>
             </w:rPr>
           </w:pPr>
-          <w:hyperlink w:anchor="_Toc243516539" w:history="1">
+          <w:hyperlink w:anchor="_Toc243644755" w:history="1">
             <w:r>
               <w:rPr>
                 <w:rStyle w:val="Hyperlink"/>
@@ -6456,7 +6572,7 @@
               <w:rPr>
                 <w:noProof/>
               </w:rPr>
-              <w:instrText xml:space="preserve"> PAGEREF _Toc243516539 \h </w:instrText>
+              <w:instrText xml:space="preserve"> PAGEREF _Toc243644755 \h </w:instrText>
             </w:r>
             <w:r>
               <w:rPr>
@@ -6497,7 +6613,7 @@
         <w:keepLines/>
         <w:pageBreakBefore/>
       </w:pPr>
-      <w:bookmarkStart w:id="0" w:name="_Toc243516475"/>
+      <w:bookmarkStart w:id="0" w:name="_Toc243644691"/>
       <w:r>
         <w:lastRenderedPageBreak/>
         <w:t>1 Introduction</w:t>
@@ -6510,7 +6626,7 @@
         <w:keepNext/>
         <w:keepLines/>
       </w:pPr>
-      <w:bookmarkStart w:id="1" w:name="_Toc243516476"/>
+      <w:bookmarkStart w:id="1" w:name="_Toc243644692"/>
       <w:r>
         <w:t>1.1 Purpose</w:t>
       </w:r>
@@ -6521,10 +6637,7 @@
         <w:spacing w:after="120"/>
       </w:pPr>
       <w:r>
-        <w:t xml:space="preserve">This document specifies what a ZedPath user sees and how they move through the app: the principles behind the </w:t>
-      </w:r>
-      <w:r>
-        <w:t xml:space="preserve">design, the navigation structure, the design system (colour, type, shape, components), each main screen with its states, the shared interaction patterns, the language and content rules, accessibility, and the performance budget for low-end Android phones on 3G. It records the design </w:t>
+        <w:t xml:space="preserve">This document specifies what a ZedPath user sees and how they move through the app: the principles behind the design, the navigation structure, the design system (colour, type, shape, components), each main screen with its states, the shared interaction patterns, the language and content rules, accessibility, and the performance budget for low-end Android phones on 3G. It records the design </w:t>
       </w:r>
       <w:r>
         <w:rPr>
@@ -6534,7 +6647,10 @@
         <w:t>as built</w:t>
       </w:r>
       <w:r>
-        <w:t xml:space="preserve"> on 11 October 2026, so a reviewer can check every statement against the code.</w:t>
+        <w:t xml:space="preserve"> on 11 October 2026, so a reviewer can check</w:t>
+      </w:r>
+      <w:r>
+        <w:t xml:space="preserve"> every statement against the code.</w:t>
       </w:r>
     </w:p>
     <w:p>
@@ -6543,7 +6659,7 @@
         <w:keepNext/>
         <w:keepLines/>
       </w:pPr>
-      <w:bookmarkStart w:id="2" w:name="_Toc243516477"/>
+      <w:bookmarkStart w:id="2" w:name="_Toc243644693"/>
       <w:r>
         <w:t>1.2 Scope</w:t>
       </w:r>
@@ -6554,10 +6670,7 @@
         <w:spacing w:after="120"/>
       </w:pPr>
       <w:r>
-        <w:t xml:space="preserve">The student-facing web app (a Vite + React single-page app installed as a Progressive Web App, also wrapped as an </w:t>
-      </w:r>
-      <w:r>
-        <w:t>Android app) for Releases R1 and R2. The curator tools and the API are out of scope; they are covered by ZP-DOC-05 and ZP-DOC-06.</w:t>
+        <w:t>The student-facing web app (a Vite + React single-page app installed as a Progressive Web App, also wrapped as an Android app) for Releases R1 and R2. The curator tools and the API are out of scope; they are covered by ZP-DOC-05 and ZP-DOC-06.</w:t>
       </w:r>
     </w:p>
     <w:p>
@@ -6566,7 +6679,7 @@
         <w:keepNext/>
         <w:keepLines/>
       </w:pPr>
-      <w:bookmarkStart w:id="3" w:name="_Toc243516478"/>
+      <w:bookmarkStart w:id="3" w:name="_Toc243644694"/>
       <w:r>
         <w:t>1.3 Intended audience</w:t>
       </w:r>
@@ -6586,7 +6699,7 @@
         <w:keepNext/>
         <w:keepLines/>
       </w:pPr>
-      <w:bookmarkStart w:id="4" w:name="_Toc243516479"/>
+      <w:bookmarkStart w:id="4" w:name="_Toc243644695"/>
       <w:r>
         <w:t>1.4 Relationship to other documents</w:t>
       </w:r>
@@ -6597,7 +6710,7 @@
         <w:pStyle w:val="Caption"/>
         <w:keepNext/>
       </w:pPr>
-      <w:bookmarkStart w:id="5" w:name="_Toc243516511"/>
+      <w:bookmarkStart w:id="5" w:name="_Toc243644727"/>
       <w:r>
         <w:t xml:space="preserve">Table </w:t>
       </w:r>
@@ -7358,7 +7471,7 @@
         <w:keepNext/>
         <w:keepLines/>
       </w:pPr>
-      <w:bookmarkStart w:id="6" w:name="_Toc243516480"/>
+      <w:bookmarkStart w:id="6" w:name="_Toc243644696"/>
       <w:r>
         <w:t>1.5 Conventions</w:t>
       </w:r>
@@ -7403,7 +7516,7 @@
         <w:keepLines/>
         <w:pageBreakBefore/>
       </w:pPr>
-      <w:bookmarkStart w:id="7" w:name="_Toc243516481"/>
+      <w:bookmarkStart w:id="7" w:name="_Toc243644697"/>
       <w:r>
         <w:lastRenderedPageBreak/>
         <w:t>2 Design principles</w:t>
@@ -7415,7 +7528,7 @@
         <w:pStyle w:val="Caption"/>
         <w:keepNext/>
       </w:pPr>
-      <w:bookmarkStart w:id="8" w:name="_Toc243516512"/>
+      <w:bookmarkStart w:id="8" w:name="_Toc243644728"/>
       <w:r>
         <w:t xml:space="preserve">Table </w:t>
       </w:r>
@@ -8903,7 +9016,7 @@
         <w:keepLines/>
         <w:pageBreakBefore/>
       </w:pPr>
-      <w:bookmarkStart w:id="9" w:name="_Toc243516482"/>
+      <w:bookmarkStart w:id="9" w:name="_Toc243644698"/>
       <w:r>
         <w:lastRenderedPageBreak/>
         <w:t>3 Personas and key journeys</w:t>
@@ -8923,7 +9036,7 @@
         <w:pStyle w:val="Caption"/>
         <w:keepNext/>
       </w:pPr>
-      <w:bookmarkStart w:id="10" w:name="_Toc243516513"/>
+      <w:bookmarkStart w:id="10" w:name="_Toc243644729"/>
       <w:r>
         <w:t xml:space="preserve">Table </w:t>
       </w:r>
@@ -9712,7 +9825,7 @@
         <w:pStyle w:val="Caption"/>
         <w:keepNext/>
       </w:pPr>
-      <w:bookmarkStart w:id="11" w:name="_Toc243516514"/>
+      <w:bookmarkStart w:id="11" w:name="_Toc243644730"/>
       <w:r>
         <w:t xml:space="preserve">Table </w:t>
       </w:r>
@@ -10724,7 +10837,7 @@
         <w:keepLines/>
         <w:pageBreakBefore/>
       </w:pPr>
-      <w:bookmarkStart w:id="12" w:name="_Toc243516483"/>
+      <w:bookmarkStart w:id="12" w:name="_Toc243644699"/>
       <w:r>
         <w:lastRenderedPageBreak/>
         <w:t>4 Information architecture and navigation</w:t>
@@ -10737,7 +10850,7 @@
         <w:keepNext/>
         <w:keepLines/>
       </w:pPr>
-      <w:bookmarkStart w:id="13" w:name="_Toc243516484"/>
+      <w:bookmarkStart w:id="13" w:name="_Toc243644700"/>
       <w:r>
         <w:t>4.1 Structure</w:t>
       </w:r>
@@ -10786,7 +10899,7 @@
         <w:pStyle w:val="Caption"/>
         <w:keepNext/>
       </w:pPr>
-      <w:bookmarkStart w:id="14" w:name="_Toc243516515"/>
+      <w:bookmarkStart w:id="14" w:name="_Toc243644731"/>
       <w:r>
         <w:t xml:space="preserve">Table </w:t>
       </w:r>
@@ -11669,7 +11782,7 @@
         <w:keepNext/>
         <w:keepLines/>
       </w:pPr>
-      <w:bookmarkStart w:id="15" w:name="_Toc243516485"/>
+      <w:bookmarkStart w:id="15" w:name="_Toc243644701"/>
       <w:r>
         <w:t>4.2 Desktop layout (1024 px and wider)</w:t>
       </w:r>
@@ -11712,7 +11825,7 @@
         <w:pStyle w:val="Caption"/>
         <w:keepNext/>
       </w:pPr>
-      <w:bookmarkStart w:id="16" w:name="_Toc243516516"/>
+      <w:bookmarkStart w:id="16" w:name="_Toc243644732"/>
       <w:r>
         <w:t xml:space="preserve">Table </w:t>
       </w:r>
@@ -12501,7 +12614,7 @@
         <w:keepNext/>
         <w:keepLines/>
       </w:pPr>
-      <w:bookmarkStart w:id="17" w:name="_Toc243516486"/>
+      <w:bookmarkStart w:id="17" w:name="_Toc243644702"/>
       <w:r>
         <w:lastRenderedPageBreak/>
         <w:t>4.3 Route table</w:t>
@@ -12513,7 +12626,7 @@
         <w:pStyle w:val="Caption"/>
         <w:keepNext/>
       </w:pPr>
-      <w:bookmarkStart w:id="18" w:name="_Toc243516517"/>
+      <w:bookmarkStart w:id="18" w:name="_Toc243644733"/>
       <w:r>
         <w:t xml:space="preserve">Table </w:t>
       </w:r>
@@ -15329,7 +15442,7 @@
         <w:keepNext/>
         <w:keepLines/>
       </w:pPr>
-      <w:bookmarkStart w:id="19" w:name="_Toc243516487"/>
+      <w:bookmarkStart w:id="19" w:name="_Toc243644703"/>
       <w:r>
         <w:t>4.4 Guards</w:t>
       </w:r>
@@ -15340,7 +15453,7 @@
         <w:pStyle w:val="Caption"/>
         <w:keepNext/>
       </w:pPr>
-      <w:bookmarkStart w:id="20" w:name="_Toc243516518"/>
+      <w:bookmarkStart w:id="20" w:name="_Toc243644734"/>
       <w:r>
         <w:t xml:space="preserve">Table </w:t>
       </w:r>
@@ -15985,7 +16098,7 @@
         <w:keepLines/>
         <w:pageBreakBefore/>
       </w:pPr>
-      <w:bookmarkStart w:id="21" w:name="_Toc243516488"/>
+      <w:bookmarkStart w:id="21" w:name="_Toc243644704"/>
       <w:r>
         <w:lastRenderedPageBreak/>
         <w:t>5 Design system</w:t>
@@ -15998,7 +16111,7 @@
         <w:keepNext/>
         <w:keepLines/>
       </w:pPr>
-      <w:bookmarkStart w:id="22" w:name="_Toc243516489"/>
+      <w:bookmarkStart w:id="22" w:name="_Toc243644705"/>
       <w:r>
         <w:t>5.1 Colour roles</w:t>
       </w:r>
@@ -16017,7 +16130,7 @@
         <w:pStyle w:val="Caption"/>
         <w:keepNext/>
       </w:pPr>
-      <w:bookmarkStart w:id="23" w:name="_Toc243516519"/>
+      <w:bookmarkStart w:id="23" w:name="_Toc243644735"/>
       <w:r>
         <w:t xml:space="preserve">Table </w:t>
       </w:r>
@@ -18041,7 +18154,7 @@
         <w:keepNext/>
         <w:keepLines/>
       </w:pPr>
-      <w:bookmarkStart w:id="24" w:name="_Toc243516490"/>
+      <w:bookmarkStart w:id="24" w:name="_Toc243644706"/>
       <w:r>
         <w:t>5.2 Typography</w:t>
       </w:r>
@@ -18112,7 +18225,7 @@
         <w:pStyle w:val="Caption"/>
         <w:keepNext/>
       </w:pPr>
-      <w:bookmarkStart w:id="25" w:name="_Toc243516520"/>
+      <w:bookmarkStart w:id="25" w:name="_Toc243644736"/>
       <w:r>
         <w:t xml:space="preserve">Table </w:t>
       </w:r>
@@ -19826,7 +19939,7 @@
         <w:keepNext/>
         <w:keepLines/>
       </w:pPr>
-      <w:bookmarkStart w:id="26" w:name="_Toc243516491"/>
+      <w:bookmarkStart w:id="26" w:name="_Toc243644707"/>
       <w:r>
         <w:t>5.3 Spacing, shape and elevation</w:t>
       </w:r>
@@ -19837,7 +19950,7 @@
         <w:pStyle w:val="Caption"/>
         <w:keepNext/>
       </w:pPr>
-      <w:bookmarkStart w:id="27" w:name="_Toc243516521"/>
+      <w:bookmarkStart w:id="27" w:name="_Toc243644737"/>
       <w:r>
         <w:t xml:space="preserve">Table </w:t>
       </w:r>
@@ -20525,7 +20638,7 @@
         <w:keepNext/>
         <w:keepLines/>
       </w:pPr>
-      <w:bookmarkStart w:id="28" w:name="_Toc243516492"/>
+      <w:bookmarkStart w:id="28" w:name="_Toc243644708"/>
       <w:r>
         <w:t>5.4 Components</w:t>
       </w:r>
@@ -20536,7 +20649,7 @@
         <w:pStyle w:val="Caption"/>
         <w:keepNext/>
       </w:pPr>
-      <w:bookmarkStart w:id="29" w:name="_Toc243516522"/>
+      <w:bookmarkStart w:id="29" w:name="_Toc243644738"/>
       <w:r>
         <w:t xml:space="preserve">Table </w:t>
       </w:r>
@@ -20581,9 +20694,9 @@
         <w:tblLook w:val="04A0" w:firstRow="1" w:lastRow="0" w:firstColumn="1" w:lastColumn="0" w:noHBand="0" w:noVBand="1"/>
       </w:tblPr>
       <w:tblGrid>
-        <w:gridCol w:w="1286"/>
-        <w:gridCol w:w="4375"/>
-        <w:gridCol w:w="3977"/>
+        <w:gridCol w:w="1503"/>
+        <w:gridCol w:w="4261"/>
+        <w:gridCol w:w="3874"/>
       </w:tblGrid>
       <w:tr>
         <w:tblPrEx>
@@ -20598,7 +20711,7 @@
         </w:trPr>
         <w:tc>
           <w:tcPr>
-            <w:tcW w:w="1286" w:type="dxa"/>
+            <w:tcW w:w="1503" w:type="dxa"/>
             <w:tcBorders>
               <w:top w:val="single" w:sz="4" w:space="0" w:color="C9D3D0"/>
               <w:left w:val="single" w:sz="4" w:space="0" w:color="C9D3D0"/>
@@ -20632,7 +20745,7 @@
         </w:tc>
         <w:tc>
           <w:tcPr>
-            <w:tcW w:w="4375" w:type="dxa"/>
+            <w:tcW w:w="4261" w:type="dxa"/>
             <w:tcBorders>
               <w:top w:val="single" w:sz="4" w:space="0" w:color="C9D3D0"/>
               <w:left w:val="single" w:sz="4" w:space="0" w:color="C9D3D0"/>
@@ -20666,7 +20779,7 @@
         </w:tc>
         <w:tc>
           <w:tcPr>
-            <w:tcW w:w="3977" w:type="dxa"/>
+            <w:tcW w:w="3874" w:type="dxa"/>
             <w:tcBorders>
               <w:top w:val="single" w:sz="4" w:space="0" w:color="C9D3D0"/>
               <w:left w:val="single" w:sz="4" w:space="0" w:color="C9D3D0"/>
@@ -20711,7 +20824,7 @@
         </w:trPr>
         <w:tc>
           <w:tcPr>
-            <w:tcW w:w="1286" w:type="dxa"/>
+            <w:tcW w:w="1503" w:type="dxa"/>
             <w:tcBorders>
               <w:top w:val="single" w:sz="4" w:space="0" w:color="C9D3D0"/>
               <w:left w:val="single" w:sz="4" w:space="0" w:color="C9D3D0"/>
@@ -20741,7 +20854,7 @@
         </w:tc>
         <w:tc>
           <w:tcPr>
-            <w:tcW w:w="4375" w:type="dxa"/>
+            <w:tcW w:w="4261" w:type="dxa"/>
             <w:tcBorders>
               <w:top w:val="single" w:sz="4" w:space="0" w:color="C9D3D0"/>
               <w:left w:val="single" w:sz="4" w:space="0" w:color="C9D3D0"/>
@@ -20803,7 +20916,7 @@
         </w:tc>
         <w:tc>
           <w:tcPr>
-            <w:tcW w:w="3977" w:type="dxa"/>
+            <w:tcW w:w="3874" w:type="dxa"/>
             <w:tcBorders>
               <w:top w:val="single" w:sz="4" w:space="0" w:color="C9D3D0"/>
               <w:left w:val="single" w:sz="4" w:space="0" w:color="C9D3D0"/>
@@ -20844,7 +20957,7 @@
         </w:trPr>
         <w:tc>
           <w:tcPr>
-            <w:tcW w:w="1286" w:type="dxa"/>
+            <w:tcW w:w="1503" w:type="dxa"/>
             <w:tcBorders>
               <w:top w:val="single" w:sz="4" w:space="0" w:color="C9D3D0"/>
               <w:left w:val="single" w:sz="4" w:space="0" w:color="C9D3D0"/>
@@ -20875,7 +20988,7 @@
         </w:tc>
         <w:tc>
           <w:tcPr>
-            <w:tcW w:w="4375" w:type="dxa"/>
+            <w:tcW w:w="4261" w:type="dxa"/>
             <w:tcBorders>
               <w:top w:val="single" w:sz="4" w:space="0" w:color="C9D3D0"/>
               <w:left w:val="single" w:sz="4" w:space="0" w:color="C9D3D0"/>
@@ -20922,7 +21035,7 @@
         </w:tc>
         <w:tc>
           <w:tcPr>
-            <w:tcW w:w="3977" w:type="dxa"/>
+            <w:tcW w:w="3874" w:type="dxa"/>
             <w:tcBorders>
               <w:top w:val="single" w:sz="4" w:space="0" w:color="C9D3D0"/>
               <w:left w:val="single" w:sz="4" w:space="0" w:color="C9D3D0"/>
@@ -20964,7 +21077,7 @@
         </w:trPr>
         <w:tc>
           <w:tcPr>
-            <w:tcW w:w="1286" w:type="dxa"/>
+            <w:tcW w:w="1503" w:type="dxa"/>
             <w:tcBorders>
               <w:top w:val="single" w:sz="4" w:space="0" w:color="C9D3D0"/>
               <w:left w:val="single" w:sz="4" w:space="0" w:color="C9D3D0"/>
@@ -20994,7 +21107,7 @@
         </w:tc>
         <w:tc>
           <w:tcPr>
-            <w:tcW w:w="4375" w:type="dxa"/>
+            <w:tcW w:w="4261" w:type="dxa"/>
             <w:tcBorders>
               <w:top w:val="single" w:sz="4" w:space="0" w:color="C9D3D0"/>
               <w:left w:val="single" w:sz="4" w:space="0" w:color="C9D3D0"/>
@@ -21065,7 +21178,7 @@
         </w:tc>
         <w:tc>
           <w:tcPr>
-            <w:tcW w:w="3977" w:type="dxa"/>
+            <w:tcW w:w="3874" w:type="dxa"/>
             <w:tcBorders>
               <w:top w:val="single" w:sz="4" w:space="0" w:color="C9D3D0"/>
               <w:left w:val="single" w:sz="4" w:space="0" w:color="C9D3D0"/>
@@ -21106,7 +21219,7 @@
         </w:trPr>
         <w:tc>
           <w:tcPr>
-            <w:tcW w:w="1286" w:type="dxa"/>
+            <w:tcW w:w="1503" w:type="dxa"/>
             <w:tcBorders>
               <w:top w:val="single" w:sz="4" w:space="0" w:color="C9D3D0"/>
               <w:left w:val="single" w:sz="4" w:space="0" w:color="C9D3D0"/>
@@ -21137,7 +21250,7 @@
         </w:tc>
         <w:tc>
           <w:tcPr>
-            <w:tcW w:w="4375" w:type="dxa"/>
+            <w:tcW w:w="4261" w:type="dxa"/>
             <w:tcBorders>
               <w:top w:val="single" w:sz="4" w:space="0" w:color="C9D3D0"/>
               <w:left w:val="single" w:sz="4" w:space="0" w:color="C9D3D0"/>
@@ -21248,7 +21361,7 @@
         </w:tc>
         <w:tc>
           <w:tcPr>
-            <w:tcW w:w="3977" w:type="dxa"/>
+            <w:tcW w:w="3874" w:type="dxa"/>
             <w:tcBorders>
               <w:top w:val="single" w:sz="4" w:space="0" w:color="C9D3D0"/>
               <w:left w:val="single" w:sz="4" w:space="0" w:color="C9D3D0"/>
@@ -21290,7 +21403,7 @@
         </w:trPr>
         <w:tc>
           <w:tcPr>
-            <w:tcW w:w="1286" w:type="dxa"/>
+            <w:tcW w:w="1503" w:type="dxa"/>
             <w:tcBorders>
               <w:top w:val="single" w:sz="4" w:space="0" w:color="C9D3D0"/>
               <w:left w:val="single" w:sz="4" w:space="0" w:color="C9D3D0"/>
@@ -21320,7 +21433,7 @@
         </w:tc>
         <w:tc>
           <w:tcPr>
-            <w:tcW w:w="4375" w:type="dxa"/>
+            <w:tcW w:w="4261" w:type="dxa"/>
             <w:tcBorders>
               <w:top w:val="single" w:sz="4" w:space="0" w:color="C9D3D0"/>
               <w:left w:val="single" w:sz="4" w:space="0" w:color="C9D3D0"/>
@@ -21350,7 +21463,7 @@
         </w:tc>
         <w:tc>
           <w:tcPr>
-            <w:tcW w:w="3977" w:type="dxa"/>
+            <w:tcW w:w="3874" w:type="dxa"/>
             <w:tcBorders>
               <w:top w:val="single" w:sz="4" w:space="0" w:color="C9D3D0"/>
               <w:left w:val="single" w:sz="4" w:space="0" w:color="C9D3D0"/>
@@ -21391,7 +21504,7 @@
         </w:trPr>
         <w:tc>
           <w:tcPr>
-            <w:tcW w:w="1286" w:type="dxa"/>
+            <w:tcW w:w="1503" w:type="dxa"/>
             <w:tcBorders>
               <w:top w:val="single" w:sz="4" w:space="0" w:color="C9D3D0"/>
               <w:left w:val="single" w:sz="4" w:space="0" w:color="C9D3D0"/>
@@ -21422,7 +21535,7 @@
         </w:tc>
         <w:tc>
           <w:tcPr>
-            <w:tcW w:w="4375" w:type="dxa"/>
+            <w:tcW w:w="4261" w:type="dxa"/>
             <w:tcBorders>
               <w:top w:val="single" w:sz="4" w:space="0" w:color="C9D3D0"/>
               <w:left w:val="single" w:sz="4" w:space="0" w:color="C9D3D0"/>
@@ -21469,7 +21582,7 @@
         </w:tc>
         <w:tc>
           <w:tcPr>
-            <w:tcW w:w="3977" w:type="dxa"/>
+            <w:tcW w:w="3874" w:type="dxa"/>
             <w:tcBorders>
               <w:top w:val="single" w:sz="4" w:space="0" w:color="C9D3D0"/>
               <w:left w:val="single" w:sz="4" w:space="0" w:color="C9D3D0"/>
@@ -21511,7 +21624,7 @@
         </w:trPr>
         <w:tc>
           <w:tcPr>
-            <w:tcW w:w="1286" w:type="dxa"/>
+            <w:tcW w:w="1503" w:type="dxa"/>
             <w:tcBorders>
               <w:top w:val="single" w:sz="4" w:space="0" w:color="C9D3D0"/>
               <w:left w:val="single" w:sz="4" w:space="0" w:color="C9D3D0"/>
@@ -21541,7 +21654,7 @@
         </w:tc>
         <w:tc>
           <w:tcPr>
-            <w:tcW w:w="4375" w:type="dxa"/>
+            <w:tcW w:w="4261" w:type="dxa"/>
             <w:tcBorders>
               <w:top w:val="single" w:sz="4" w:space="0" w:color="C9D3D0"/>
               <w:left w:val="single" w:sz="4" w:space="0" w:color="C9D3D0"/>
@@ -21603,7 +21716,7 @@
         </w:tc>
         <w:tc>
           <w:tcPr>
-            <w:tcW w:w="3977" w:type="dxa"/>
+            <w:tcW w:w="3874" w:type="dxa"/>
             <w:tcBorders>
               <w:top w:val="single" w:sz="4" w:space="0" w:color="C9D3D0"/>
               <w:left w:val="single" w:sz="4" w:space="0" w:color="C9D3D0"/>
@@ -21644,7 +21757,7 @@
         </w:trPr>
         <w:tc>
           <w:tcPr>
-            <w:tcW w:w="1286" w:type="dxa"/>
+            <w:tcW w:w="1503" w:type="dxa"/>
             <w:tcBorders>
               <w:top w:val="single" w:sz="4" w:space="0" w:color="C9D3D0"/>
               <w:left w:val="single" w:sz="4" w:space="0" w:color="C9D3D0"/>
@@ -21675,7 +21788,7 @@
         </w:tc>
         <w:tc>
           <w:tcPr>
-            <w:tcW w:w="4375" w:type="dxa"/>
+            <w:tcW w:w="4261" w:type="dxa"/>
             <w:tcBorders>
               <w:top w:val="single" w:sz="4" w:space="0" w:color="C9D3D0"/>
               <w:left w:val="single" w:sz="4" w:space="0" w:color="C9D3D0"/>
@@ -21706,7 +21819,7 @@
         </w:tc>
         <w:tc>
           <w:tcPr>
-            <w:tcW w:w="3977" w:type="dxa"/>
+            <w:tcW w:w="3874" w:type="dxa"/>
             <w:tcBorders>
               <w:top w:val="single" w:sz="4" w:space="0" w:color="C9D3D0"/>
               <w:left w:val="single" w:sz="4" w:space="0" w:color="C9D3D0"/>
@@ -21748,7 +21861,7 @@
         </w:trPr>
         <w:tc>
           <w:tcPr>
-            <w:tcW w:w="1286" w:type="dxa"/>
+            <w:tcW w:w="1503" w:type="dxa"/>
             <w:tcBorders>
               <w:top w:val="single" w:sz="4" w:space="0" w:color="C9D3D0"/>
               <w:left w:val="single" w:sz="4" w:space="0" w:color="C9D3D0"/>
@@ -21778,7 +21891,7 @@
         </w:tc>
         <w:tc>
           <w:tcPr>
-            <w:tcW w:w="4375" w:type="dxa"/>
+            <w:tcW w:w="4261" w:type="dxa"/>
             <w:tcBorders>
               <w:top w:val="single" w:sz="4" w:space="0" w:color="C9D3D0"/>
               <w:left w:val="single" w:sz="4" w:space="0" w:color="C9D3D0"/>
@@ -21840,7 +21953,7 @@
         </w:tc>
         <w:tc>
           <w:tcPr>
-            <w:tcW w:w="3977" w:type="dxa"/>
+            <w:tcW w:w="3874" w:type="dxa"/>
             <w:tcBorders>
               <w:top w:val="single" w:sz="4" w:space="0" w:color="C9D3D0"/>
               <w:left w:val="single" w:sz="4" w:space="0" w:color="C9D3D0"/>
@@ -21881,7 +21994,7 @@
         </w:trPr>
         <w:tc>
           <w:tcPr>
-            <w:tcW w:w="1286" w:type="dxa"/>
+            <w:tcW w:w="1503" w:type="dxa"/>
             <w:tcBorders>
               <w:top w:val="single" w:sz="4" w:space="0" w:color="C9D3D0"/>
               <w:left w:val="single" w:sz="4" w:space="0" w:color="C9D3D0"/>
@@ -21912,7 +22025,7 @@
         </w:tc>
         <w:tc>
           <w:tcPr>
-            <w:tcW w:w="4375" w:type="dxa"/>
+            <w:tcW w:w="4261" w:type="dxa"/>
             <w:tcBorders>
               <w:top w:val="single" w:sz="4" w:space="0" w:color="C9D3D0"/>
               <w:left w:val="single" w:sz="4" w:space="0" w:color="C9D3D0"/>
@@ -21959,7 +22072,7 @@
         </w:tc>
         <w:tc>
           <w:tcPr>
-            <w:tcW w:w="3977" w:type="dxa"/>
+            <w:tcW w:w="3874" w:type="dxa"/>
             <w:tcBorders>
               <w:top w:val="single" w:sz="4" w:space="0" w:color="C9D3D0"/>
               <w:left w:val="single" w:sz="4" w:space="0" w:color="C9D3D0"/>
@@ -22001,37 +22114,38 @@
         </w:trPr>
         <w:tc>
           <w:tcPr>
-            <w:tcW w:w="1286" w:type="dxa"/>
-            <w:tcBorders>
-              <w:top w:val="single" w:sz="4" w:space="0" w:color="C9D3D0"/>
-              <w:left w:val="single" w:sz="4" w:space="0" w:color="C9D3D0"/>
-              <w:bottom w:val="single" w:sz="4" w:space="0" w:color="C9D3D0"/>
-              <w:right w:val="single" w:sz="4" w:space="0" w:color="C9D3D0"/>
-            </w:tcBorders>
-            <w:tcMar>
-              <w:top w:w="50" w:type="dxa"/>
-              <w:left w:w="100" w:type="dxa"/>
-              <w:bottom w:w="50" w:type="dxa"/>
-              <w:right w:w="100" w:type="dxa"/>
-            </w:tcMar>
-            <w:vAlign w:val="center"/>
-          </w:tcPr>
-          <w:p>
-            <w:pPr>
-              <w:spacing w:line="252" w:lineRule="auto"/>
-            </w:pPr>
-            <w:r>
-              <w:rPr>
-                <w:sz w:val="19"/>
-                <w:szCs w:val="19"/>
-              </w:rPr>
+            <w:tcW w:w="1503" w:type="dxa"/>
+            <w:tcBorders>
+              <w:top w:val="single" w:sz="4" w:space="0" w:color="C9D3D0"/>
+              <w:left w:val="single" w:sz="4" w:space="0" w:color="C9D3D0"/>
+              <w:bottom w:val="single" w:sz="4" w:space="0" w:color="C9D3D0"/>
+              <w:right w:val="single" w:sz="4" w:space="0" w:color="C9D3D0"/>
+            </w:tcBorders>
+            <w:tcMar>
+              <w:top w:w="50" w:type="dxa"/>
+              <w:left w:w="100" w:type="dxa"/>
+              <w:bottom w:w="50" w:type="dxa"/>
+              <w:right w:w="100" w:type="dxa"/>
+            </w:tcMar>
+            <w:vAlign w:val="center"/>
+          </w:tcPr>
+          <w:p>
+            <w:pPr>
+              <w:spacing w:line="252" w:lineRule="auto"/>
+            </w:pPr>
+            <w:r>
+              <w:rPr>
+                <w:sz w:val="19"/>
+                <w:szCs w:val="19"/>
+              </w:rPr>
+              <w:lastRenderedPageBreak/>
               <w:t>Lists</w:t>
             </w:r>
           </w:p>
         </w:tc>
         <w:tc>
           <w:tcPr>
-            <w:tcW w:w="4375" w:type="dxa"/>
+            <w:tcW w:w="4261" w:type="dxa"/>
             <w:tcBorders>
               <w:top w:val="single" w:sz="4" w:space="0" w:color="C9D3D0"/>
               <w:left w:val="single" w:sz="4" w:space="0" w:color="C9D3D0"/>
@@ -22070,7 +22184,7 @@
         </w:tc>
         <w:tc>
           <w:tcPr>
-            <w:tcW w:w="3977" w:type="dxa"/>
+            <w:tcW w:w="3874" w:type="dxa"/>
             <w:tcBorders>
               <w:top w:val="single" w:sz="4" w:space="0" w:color="C9D3D0"/>
               <w:left w:val="single" w:sz="4" w:space="0" w:color="C9D3D0"/>
@@ -22111,7 +22225,7 @@
         </w:trPr>
         <w:tc>
           <w:tcPr>
-            <w:tcW w:w="1286" w:type="dxa"/>
+            <w:tcW w:w="1503" w:type="dxa"/>
             <w:tcBorders>
               <w:top w:val="single" w:sz="4" w:space="0" w:color="C9D3D0"/>
               <w:left w:val="single" w:sz="4" w:space="0" w:color="C9D3D0"/>
@@ -22136,14 +22250,13 @@
                 <w:sz w:val="19"/>
                 <w:szCs w:val="19"/>
               </w:rPr>
-              <w:lastRenderedPageBreak/>
               <w:t>Selection bar</w:t>
             </w:r>
           </w:p>
         </w:tc>
         <w:tc>
           <w:tcPr>
-            <w:tcW w:w="4375" w:type="dxa"/>
+            <w:tcW w:w="4261" w:type="dxa"/>
             <w:tcBorders>
               <w:top w:val="single" w:sz="4" w:space="0" w:color="C9D3D0"/>
               <w:left w:val="single" w:sz="4" w:space="0" w:color="C9D3D0"/>
@@ -22174,7 +22287,7 @@
         </w:tc>
         <w:tc>
           <w:tcPr>
-            <w:tcW w:w="3977" w:type="dxa"/>
+            <w:tcW w:w="3874" w:type="dxa"/>
             <w:tcBorders>
               <w:top w:val="single" w:sz="4" w:space="0" w:color="C9D3D0"/>
               <w:left w:val="single" w:sz="4" w:space="0" w:color="C9D3D0"/>
@@ -22216,7 +22329,7 @@
         </w:trPr>
         <w:tc>
           <w:tcPr>
-            <w:tcW w:w="1286" w:type="dxa"/>
+            <w:tcW w:w="1503" w:type="dxa"/>
             <w:tcBorders>
               <w:top w:val="single" w:sz="4" w:space="0" w:color="C9D3D0"/>
               <w:left w:val="single" w:sz="4" w:space="0" w:color="C9D3D0"/>
@@ -22246,7 +22359,7 @@
         </w:tc>
         <w:tc>
           <w:tcPr>
-            <w:tcW w:w="4375" w:type="dxa"/>
+            <w:tcW w:w="4261" w:type="dxa"/>
             <w:tcBorders>
               <w:top w:val="single" w:sz="4" w:space="0" w:color="C9D3D0"/>
               <w:left w:val="single" w:sz="4" w:space="0" w:color="C9D3D0"/>
@@ -22276,7 +22389,7 @@
         </w:tc>
         <w:tc>
           <w:tcPr>
-            <w:tcW w:w="3977" w:type="dxa"/>
+            <w:tcW w:w="3874" w:type="dxa"/>
             <w:tcBorders>
               <w:top w:val="single" w:sz="4" w:space="0" w:color="C9D3D0"/>
               <w:left w:val="single" w:sz="4" w:space="0" w:color="C9D3D0"/>
@@ -22317,7 +22430,7 @@
         </w:trPr>
         <w:tc>
           <w:tcPr>
-            <w:tcW w:w="1286" w:type="dxa"/>
+            <w:tcW w:w="1503" w:type="dxa"/>
             <w:tcBorders>
               <w:top w:val="single" w:sz="4" w:space="0" w:color="C9D3D0"/>
               <w:left w:val="single" w:sz="4" w:space="0" w:color="C9D3D0"/>
@@ -22342,13 +22455,13 @@
                 <w:sz w:val="19"/>
                 <w:szCs w:val="19"/>
               </w:rPr>
-              <w:t>Menu button</w:t>
-            </w:r>
-          </w:p>
-        </w:tc>
-        <w:tc>
-          <w:tcPr>
-            <w:tcW w:w="4375" w:type="dxa"/>
+              <w:t>Added confirmation</w:t>
+            </w:r>
+          </w:p>
+        </w:tc>
+        <w:tc>
+          <w:tcPr>
+            <w:tcW w:w="4261" w:type="dxa"/>
             <w:tcBorders>
               <w:top w:val="single" w:sz="4" w:space="0" w:color="C9D3D0"/>
               <w:left w:val="single" w:sz="4" w:space="0" w:color="C9D3D0"/>
@@ -22373,13 +22486,13 @@
                 <w:sz w:val="19"/>
                 <w:szCs w:val="19"/>
               </w:rPr>
-              <w:t>Glass 44 px button with the menu icon: opens and collapses the side menu</w:t>
-            </w:r>
-          </w:p>
-        </w:tc>
-        <w:tc>
-          <w:tcPr>
-            <w:tcW w:w="3977" w:type="dxa"/>
+              <w:t>Green pop-up with a tick near the bottom of the screen (white on #0B7A4B, about 5.2:1), announced by a live region, gone after about 2.5 s: "Added 3 courses to My list.", plus how many were already there or a full list</w:t>
+            </w:r>
+          </w:p>
+        </w:tc>
+        <w:tc>
+          <w:tcPr>
+            <w:tcW w:w="3874" w:type="dxa"/>
             <w:tcBorders>
               <w:top w:val="single" w:sz="4" w:space="0" w:color="C9D3D0"/>
               <w:left w:val="single" w:sz="4" w:space="0" w:color="C9D3D0"/>
@@ -22404,7 +22517,7 @@
                 <w:sz w:val="19"/>
                 <w:szCs w:val="19"/>
               </w:rPr>
-              <w:t>Top app bar, 1024 px and wider</w:t>
+              <w:t>Courses, course page, My list</w:t>
             </w:r>
           </w:p>
         </w:tc>
@@ -22421,91 +22534,91 @@
         </w:trPr>
         <w:tc>
           <w:tcPr>
-            <w:tcW w:w="1286" w:type="dxa"/>
-            <w:tcBorders>
-              <w:top w:val="single" w:sz="4" w:space="0" w:color="C9D3D0"/>
-              <w:left w:val="single" w:sz="4" w:space="0" w:color="C9D3D0"/>
-              <w:bottom w:val="single" w:sz="4" w:space="0" w:color="C9D3D0"/>
-              <w:right w:val="single" w:sz="4" w:space="0" w:color="C9D3D0"/>
-            </w:tcBorders>
-            <w:tcMar>
-              <w:top w:w="50" w:type="dxa"/>
-              <w:left w:w="100" w:type="dxa"/>
-              <w:bottom w:w="50" w:type="dxa"/>
-              <w:right w:w="100" w:type="dxa"/>
-            </w:tcMar>
-            <w:vAlign w:val="center"/>
-          </w:tcPr>
-          <w:p>
-            <w:pPr>
-              <w:spacing w:line="252" w:lineRule="auto"/>
-            </w:pPr>
-            <w:r>
-              <w:rPr>
-                <w:sz w:val="19"/>
-                <w:szCs w:val="19"/>
-              </w:rPr>
-              <w:t>Composer</w:t>
-            </w:r>
-          </w:p>
-        </w:tc>
-        <w:tc>
-          <w:tcPr>
-            <w:tcW w:w="4375" w:type="dxa"/>
-            <w:tcBorders>
-              <w:top w:val="single" w:sz="4" w:space="0" w:color="C9D3D0"/>
-              <w:left w:val="single" w:sz="4" w:space="0" w:color="C9D3D0"/>
-              <w:bottom w:val="single" w:sz="4" w:space="0" w:color="C9D3D0"/>
-              <w:right w:val="single" w:sz="4" w:space="0" w:color="C9D3D0"/>
-            </w:tcBorders>
-            <w:tcMar>
-              <w:top w:w="50" w:type="dxa"/>
-              <w:left w:w="100" w:type="dxa"/>
-              <w:bottom w:w="50" w:type="dxa"/>
-              <w:right w:w="100" w:type="dxa"/>
-            </w:tcMar>
-            <w:vAlign w:val="center"/>
-          </w:tcPr>
-          <w:p>
-            <w:pPr>
-              <w:spacing w:line="252" w:lineRule="auto"/>
-            </w:pPr>
-            <w:r>
-              <w:rPr>
-                <w:sz w:val="19"/>
-                <w:szCs w:val="19"/>
-              </w:rPr>
-              <w:t>Sticky above the navigation bar: rounded input (48 px) and round 48 px send button</w:t>
-            </w:r>
-          </w:p>
-        </w:tc>
-        <w:tc>
-          <w:tcPr>
-            <w:tcW w:w="3977" w:type="dxa"/>
-            <w:tcBorders>
-              <w:top w:val="single" w:sz="4" w:space="0" w:color="C9D3D0"/>
-              <w:left w:val="single" w:sz="4" w:space="0" w:color="C9D3D0"/>
-              <w:bottom w:val="single" w:sz="4" w:space="0" w:color="C9D3D0"/>
-              <w:right w:val="single" w:sz="4" w:space="0" w:color="C9D3D0"/>
-            </w:tcBorders>
-            <w:tcMar>
-              <w:top w:w="50" w:type="dxa"/>
-              <w:left w:w="100" w:type="dxa"/>
-              <w:bottom w:w="50" w:type="dxa"/>
-              <w:right w:w="100" w:type="dxa"/>
-            </w:tcMar>
-            <w:vAlign w:val="center"/>
-          </w:tcPr>
-          <w:p>
-            <w:pPr>
-              <w:spacing w:line="252" w:lineRule="auto"/>
-            </w:pPr>
-            <w:r>
-              <w:rPr>
-                <w:sz w:val="19"/>
-                <w:szCs w:val="19"/>
-              </w:rPr>
-              <w:t>Ask, Group room</w:t>
+            <w:tcW w:w="1503" w:type="dxa"/>
+            <w:tcBorders>
+              <w:top w:val="single" w:sz="4" w:space="0" w:color="C9D3D0"/>
+              <w:left w:val="single" w:sz="4" w:space="0" w:color="C9D3D0"/>
+              <w:bottom w:val="single" w:sz="4" w:space="0" w:color="C9D3D0"/>
+              <w:right w:val="single" w:sz="4" w:space="0" w:color="C9D3D0"/>
+            </w:tcBorders>
+            <w:tcMar>
+              <w:top w:w="50" w:type="dxa"/>
+              <w:left w:w="100" w:type="dxa"/>
+              <w:bottom w:w="50" w:type="dxa"/>
+              <w:right w:w="100" w:type="dxa"/>
+            </w:tcMar>
+            <w:vAlign w:val="center"/>
+          </w:tcPr>
+          <w:p>
+            <w:pPr>
+              <w:spacing w:line="252" w:lineRule="auto"/>
+            </w:pPr>
+            <w:r>
+              <w:rPr>
+                <w:sz w:val="19"/>
+                <w:szCs w:val="19"/>
+              </w:rPr>
+              <w:t>Menu button</w:t>
+            </w:r>
+          </w:p>
+        </w:tc>
+        <w:tc>
+          <w:tcPr>
+            <w:tcW w:w="4261" w:type="dxa"/>
+            <w:tcBorders>
+              <w:top w:val="single" w:sz="4" w:space="0" w:color="C9D3D0"/>
+              <w:left w:val="single" w:sz="4" w:space="0" w:color="C9D3D0"/>
+              <w:bottom w:val="single" w:sz="4" w:space="0" w:color="C9D3D0"/>
+              <w:right w:val="single" w:sz="4" w:space="0" w:color="C9D3D0"/>
+            </w:tcBorders>
+            <w:tcMar>
+              <w:top w:w="50" w:type="dxa"/>
+              <w:left w:w="100" w:type="dxa"/>
+              <w:bottom w:w="50" w:type="dxa"/>
+              <w:right w:w="100" w:type="dxa"/>
+            </w:tcMar>
+            <w:vAlign w:val="center"/>
+          </w:tcPr>
+          <w:p>
+            <w:pPr>
+              <w:spacing w:line="252" w:lineRule="auto"/>
+            </w:pPr>
+            <w:r>
+              <w:rPr>
+                <w:sz w:val="19"/>
+                <w:szCs w:val="19"/>
+              </w:rPr>
+              <w:t>Glass 44 px button with the menu icon: opens and collapses the side menu</w:t>
+            </w:r>
+          </w:p>
+        </w:tc>
+        <w:tc>
+          <w:tcPr>
+            <w:tcW w:w="3874" w:type="dxa"/>
+            <w:tcBorders>
+              <w:top w:val="single" w:sz="4" w:space="0" w:color="C9D3D0"/>
+              <w:left w:val="single" w:sz="4" w:space="0" w:color="C9D3D0"/>
+              <w:bottom w:val="single" w:sz="4" w:space="0" w:color="C9D3D0"/>
+              <w:right w:val="single" w:sz="4" w:space="0" w:color="C9D3D0"/>
+            </w:tcBorders>
+            <w:tcMar>
+              <w:top w:w="50" w:type="dxa"/>
+              <w:left w:w="100" w:type="dxa"/>
+              <w:bottom w:w="50" w:type="dxa"/>
+              <w:right w:w="100" w:type="dxa"/>
+            </w:tcMar>
+            <w:vAlign w:val="center"/>
+          </w:tcPr>
+          <w:p>
+            <w:pPr>
+              <w:spacing w:line="252" w:lineRule="auto"/>
+            </w:pPr>
+            <w:r>
+              <w:rPr>
+                <w:sz w:val="19"/>
+                <w:szCs w:val="19"/>
+              </w:rPr>
+              <w:t>Top app bar, 1024 px and wider</w:t>
             </w:r>
           </w:p>
         </w:tc>
@@ -22522,7 +22635,7 @@
         </w:trPr>
         <w:tc>
           <w:tcPr>
-            <w:tcW w:w="1286" w:type="dxa"/>
+            <w:tcW w:w="1503" w:type="dxa"/>
             <w:tcBorders>
               <w:top w:val="single" w:sz="4" w:space="0" w:color="C9D3D0"/>
               <w:left w:val="single" w:sz="4" w:space="0" w:color="C9D3D0"/>
@@ -22547,13 +22660,13 @@
                 <w:sz w:val="19"/>
                 <w:szCs w:val="19"/>
               </w:rPr>
-              <w:t>Chat bubbles</w:t>
-            </w:r>
-          </w:p>
-        </w:tc>
-        <w:tc>
-          <w:tcPr>
-            <w:tcW w:w="4375" w:type="dxa"/>
+              <w:t>Composer</w:t>
+            </w:r>
+          </w:p>
+        </w:tc>
+        <w:tc>
+          <w:tcPr>
+            <w:tcW w:w="4261" w:type="dxa"/>
             <w:tcBorders>
               <w:top w:val="single" w:sz="4" w:space="0" w:color="C9D3D0"/>
               <w:left w:val="single" w:sz="4" w:space="0" w:color="C9D3D0"/>
@@ -22578,13 +22691,13 @@
                 <w:sz w:val="19"/>
                 <w:szCs w:val="19"/>
               </w:rPr>
-              <w:t>Question right (brand gradient), answer left; group messages with avatar, name, senior badge</w:t>
-            </w:r>
-          </w:p>
-        </w:tc>
-        <w:tc>
-          <w:tcPr>
-            <w:tcW w:w="3977" w:type="dxa"/>
+              <w:t>Sticky above the navigation bar: rounded input (48 px) and round 48 px send button</w:t>
+            </w:r>
+          </w:p>
+        </w:tc>
+        <w:tc>
+          <w:tcPr>
+            <w:tcW w:w="3874" w:type="dxa"/>
             <w:tcBorders>
               <w:top w:val="single" w:sz="4" w:space="0" w:color="C9D3D0"/>
               <w:left w:val="single" w:sz="4" w:space="0" w:color="C9D3D0"/>
@@ -22609,7 +22722,7 @@
                 <w:sz w:val="19"/>
                 <w:szCs w:val="19"/>
               </w:rPr>
-              <w:t>Ask, Groups</w:t>
+              <w:t>Ask, Group room</w:t>
             </w:r>
           </w:p>
         </w:tc>
@@ -22626,107 +22739,91 @@
         </w:trPr>
         <w:tc>
           <w:tcPr>
-            <w:tcW w:w="1286" w:type="dxa"/>
-            <w:tcBorders>
-              <w:top w:val="single" w:sz="4" w:space="0" w:color="C9D3D0"/>
-              <w:left w:val="single" w:sz="4" w:space="0" w:color="C9D3D0"/>
-              <w:bottom w:val="single" w:sz="4" w:space="0" w:color="C9D3D0"/>
-              <w:right w:val="single" w:sz="4" w:space="0" w:color="C9D3D0"/>
-            </w:tcBorders>
-            <w:tcMar>
-              <w:top w:w="50" w:type="dxa"/>
-              <w:left w:w="100" w:type="dxa"/>
-              <w:bottom w:w="50" w:type="dxa"/>
-              <w:right w:w="100" w:type="dxa"/>
-            </w:tcMar>
-            <w:vAlign w:val="center"/>
-          </w:tcPr>
-          <w:p>
-            <w:pPr>
-              <w:spacing w:line="252" w:lineRule="auto"/>
-            </w:pPr>
-            <w:r>
-              <w:rPr>
-                <w:sz w:val="19"/>
-                <w:szCs w:val="19"/>
-              </w:rPr>
-              <w:t>Avatars</w:t>
-            </w:r>
-          </w:p>
-        </w:tc>
-        <w:tc>
-          <w:tcPr>
-            <w:tcW w:w="4375" w:type="dxa"/>
-            <w:tcBorders>
-              <w:top w:val="single" w:sz="4" w:space="0" w:color="C9D3D0"/>
-              <w:left w:val="single" w:sz="4" w:space="0" w:color="C9D3D0"/>
-              <w:bottom w:val="single" w:sz="4" w:space="0" w:color="C9D3D0"/>
-              <w:right w:val="single" w:sz="4" w:space="0" w:color="C9D3D0"/>
-            </w:tcBorders>
-            <w:tcMar>
-              <w:top w:w="50" w:type="dxa"/>
-              <w:left w:w="100" w:type="dxa"/>
-              <w:bottom w:w="50" w:type="dxa"/>
-              <w:right w:w="100" w:type="dxa"/>
-            </w:tcMar>
-            <w:vAlign w:val="center"/>
-          </w:tcPr>
-          <w:p>
-            <w:pPr>
-              <w:spacing w:line="252" w:lineRule="auto"/>
-            </w:pPr>
-            <w:r>
-              <w:rPr>
-                <w:sz w:val="19"/>
-                <w:szCs w:val="19"/>
-              </w:rPr>
-              <w:t>12 preset plain head-and-shoulders silhouettes, each in its own colour family (own artwork, no licence or credit; VR2), or initials on a steady colour; decorative (</w:t>
-            </w:r>
-            <w:r>
-              <w:rPr>
-                <w:rFonts w:ascii="Consolas" w:eastAsia="Consolas" w:hAnsi="Consolas" w:cs="Consolas"/>
-                <w:sz w:val="17"/>
-                <w:szCs w:val="17"/>
-                <w:shd w:val="clear" w:color="auto" w:fill="F2F4F3"/>
-              </w:rPr>
-              <w:t>aria-hidden</w:t>
-            </w:r>
-            <w:r>
-              <w:rPr>
-                <w:sz w:val="19"/>
-                <w:szCs w:val="19"/>
-              </w:rPr>
-              <w:t>)</w:t>
-            </w:r>
-          </w:p>
-        </w:tc>
-        <w:tc>
-          <w:tcPr>
-            <w:tcW w:w="3977" w:type="dxa"/>
-            <w:tcBorders>
-              <w:top w:val="single" w:sz="4" w:space="0" w:color="C9D3D0"/>
-              <w:left w:val="single" w:sz="4" w:space="0" w:color="C9D3D0"/>
-              <w:bottom w:val="single" w:sz="4" w:space="0" w:color="C9D3D0"/>
-              <w:right w:val="single" w:sz="4" w:space="0" w:color="C9D3D0"/>
-            </w:tcBorders>
-            <w:tcMar>
-              <w:top w:w="50" w:type="dxa"/>
-              <w:left w:w="100" w:type="dxa"/>
-              <w:bottom w:w="50" w:type="dxa"/>
-              <w:right w:w="100" w:type="dxa"/>
-            </w:tcMar>
-            <w:vAlign w:val="center"/>
-          </w:tcPr>
-          <w:p>
-            <w:pPr>
-              <w:spacing w:line="252" w:lineRule="auto"/>
-            </w:pPr>
-            <w:r>
-              <w:rPr>
-                <w:sz w:val="19"/>
-                <w:szCs w:val="19"/>
-              </w:rPr>
-              <w:t>Top bar, Me, Groups</w:t>
+            <w:tcW w:w="1503" w:type="dxa"/>
+            <w:tcBorders>
+              <w:top w:val="single" w:sz="4" w:space="0" w:color="C9D3D0"/>
+              <w:left w:val="single" w:sz="4" w:space="0" w:color="C9D3D0"/>
+              <w:bottom w:val="single" w:sz="4" w:space="0" w:color="C9D3D0"/>
+              <w:right w:val="single" w:sz="4" w:space="0" w:color="C9D3D0"/>
+            </w:tcBorders>
+            <w:tcMar>
+              <w:top w:w="50" w:type="dxa"/>
+              <w:left w:w="100" w:type="dxa"/>
+              <w:bottom w:w="50" w:type="dxa"/>
+              <w:right w:w="100" w:type="dxa"/>
+            </w:tcMar>
+            <w:vAlign w:val="center"/>
+          </w:tcPr>
+          <w:p>
+            <w:pPr>
+              <w:spacing w:line="252" w:lineRule="auto"/>
+            </w:pPr>
+            <w:r>
+              <w:rPr>
+                <w:sz w:val="19"/>
+                <w:szCs w:val="19"/>
+              </w:rPr>
+              <w:t>Chat bubbles</w:t>
+            </w:r>
+          </w:p>
+        </w:tc>
+        <w:tc>
+          <w:tcPr>
+            <w:tcW w:w="4261" w:type="dxa"/>
+            <w:tcBorders>
+              <w:top w:val="single" w:sz="4" w:space="0" w:color="C9D3D0"/>
+              <w:left w:val="single" w:sz="4" w:space="0" w:color="C9D3D0"/>
+              <w:bottom w:val="single" w:sz="4" w:space="0" w:color="C9D3D0"/>
+              <w:right w:val="single" w:sz="4" w:space="0" w:color="C9D3D0"/>
+            </w:tcBorders>
+            <w:tcMar>
+              <w:top w:w="50" w:type="dxa"/>
+              <w:left w:w="100" w:type="dxa"/>
+              <w:bottom w:w="50" w:type="dxa"/>
+              <w:right w:w="100" w:type="dxa"/>
+            </w:tcMar>
+            <w:vAlign w:val="center"/>
+          </w:tcPr>
+          <w:p>
+            <w:pPr>
+              <w:spacing w:line="252" w:lineRule="auto"/>
+            </w:pPr>
+            <w:r>
+              <w:rPr>
+                <w:sz w:val="19"/>
+                <w:szCs w:val="19"/>
+              </w:rPr>
+              <w:t>Question right (brand gradient), answer left; group messages with avatar, name, senior badge</w:t>
+            </w:r>
+          </w:p>
+        </w:tc>
+        <w:tc>
+          <w:tcPr>
+            <w:tcW w:w="3874" w:type="dxa"/>
+            <w:tcBorders>
+              <w:top w:val="single" w:sz="4" w:space="0" w:color="C9D3D0"/>
+              <w:left w:val="single" w:sz="4" w:space="0" w:color="C9D3D0"/>
+              <w:bottom w:val="single" w:sz="4" w:space="0" w:color="C9D3D0"/>
+              <w:right w:val="single" w:sz="4" w:space="0" w:color="C9D3D0"/>
+            </w:tcBorders>
+            <w:tcMar>
+              <w:top w:w="50" w:type="dxa"/>
+              <w:left w:w="100" w:type="dxa"/>
+              <w:bottom w:w="50" w:type="dxa"/>
+              <w:right w:w="100" w:type="dxa"/>
+            </w:tcMar>
+            <w:vAlign w:val="center"/>
+          </w:tcPr>
+          <w:p>
+            <w:pPr>
+              <w:spacing w:line="252" w:lineRule="auto"/>
+            </w:pPr>
+            <w:r>
+              <w:rPr>
+                <w:sz w:val="19"/>
+                <w:szCs w:val="19"/>
+              </w:rPr>
+              <w:t>Ask, Groups</w:t>
             </w:r>
           </w:p>
         </w:tc>
@@ -22743,7 +22840,7 @@
         </w:trPr>
         <w:tc>
           <w:tcPr>
-            <w:tcW w:w="1286" w:type="dxa"/>
+            <w:tcW w:w="1503" w:type="dxa"/>
             <w:tcBorders>
               <w:top w:val="single" w:sz="4" w:space="0" w:color="C9D3D0"/>
               <w:left w:val="single" w:sz="4" w:space="0" w:color="C9D3D0"/>
@@ -22768,13 +22865,13 @@
                 <w:sz w:val="19"/>
                 <w:szCs w:val="19"/>
               </w:rPr>
-              <w:t>Skeleton</w:t>
-            </w:r>
-          </w:p>
-        </w:tc>
-        <w:tc>
-          <w:tcPr>
-            <w:tcW w:w="4375" w:type="dxa"/>
+              <w:t>Avatars</w:t>
+            </w:r>
+          </w:p>
+        </w:tc>
+        <w:tc>
+          <w:tcPr>
+            <w:tcW w:w="4261" w:type="dxa"/>
             <w:tcBorders>
               <w:top w:val="single" w:sz="4" w:space="0" w:color="C9D3D0"/>
               <w:left w:val="single" w:sz="4" w:space="0" w:color="C9D3D0"/>
@@ -22799,13 +22896,29 @@
                 <w:sz w:val="19"/>
                 <w:szCs w:val="19"/>
               </w:rPr>
-              <w:t>Grey placeholder blocks while loading</w:t>
-            </w:r>
-          </w:p>
-        </w:tc>
-        <w:tc>
-          <w:tcPr>
-            <w:tcW w:w="3977" w:type="dxa"/>
+              <w:t>12 preset plain head-and-shoulders silhouettes, each in its own colour family (own artwork, no licence or credit; VR2), or initials on a steady colour; decorative (</w:t>
+            </w:r>
+            <w:r>
+              <w:rPr>
+                <w:rFonts w:ascii="Consolas" w:eastAsia="Consolas" w:hAnsi="Consolas" w:cs="Consolas"/>
+                <w:sz w:val="17"/>
+                <w:szCs w:val="17"/>
+                <w:shd w:val="clear" w:color="auto" w:fill="F2F4F3"/>
+              </w:rPr>
+              <w:t>aria-hidden</w:t>
+            </w:r>
+            <w:r>
+              <w:rPr>
+                <w:sz w:val="19"/>
+                <w:szCs w:val="19"/>
+              </w:rPr>
+              <w:t>)</w:t>
+            </w:r>
+          </w:p>
+        </w:tc>
+        <w:tc>
+          <w:tcPr>
+            <w:tcW w:w="3874" w:type="dxa"/>
             <w:tcBorders>
               <w:top w:val="single" w:sz="4" w:space="0" w:color="C9D3D0"/>
               <w:left w:val="single" w:sz="4" w:space="0" w:color="C9D3D0"/>
@@ -22830,7 +22943,7 @@
                 <w:sz w:val="19"/>
                 <w:szCs w:val="19"/>
               </w:rPr>
-              <w:t>Lists, Compare, Groups, Journey</w:t>
+              <w:t>Top bar, Me, Groups</w:t>
             </w:r>
           </w:p>
         </w:tc>
@@ -22847,13 +22960,115 @@
         </w:trPr>
         <w:tc>
           <w:tcPr>
-            <w:tcW w:w="1286" w:type="dxa"/>
-            <w:tcBorders>
-              <w:top w:val="single" w:sz="4" w:space="0" w:color="C9D3D0"/>
-              <w:left w:val="single" w:sz="4" w:space="0" w:color="C9D3D0"/>
-              <w:bottom w:val="single" w:sz="4" w:space="0" w:color="C9D3D0"/>
-              <w:right w:val="single" w:sz="4" w:space="0" w:color="C9D3D0"/>
-            </w:tcBorders>
+            <w:tcW w:w="1503" w:type="dxa"/>
+            <w:tcBorders>
+              <w:top w:val="single" w:sz="4" w:space="0" w:color="C9D3D0"/>
+              <w:left w:val="single" w:sz="4" w:space="0" w:color="C9D3D0"/>
+              <w:bottom w:val="single" w:sz="4" w:space="0" w:color="C9D3D0"/>
+              <w:right w:val="single" w:sz="4" w:space="0" w:color="C9D3D0"/>
+            </w:tcBorders>
+            <w:tcMar>
+              <w:top w:w="50" w:type="dxa"/>
+              <w:left w:w="100" w:type="dxa"/>
+              <w:bottom w:w="50" w:type="dxa"/>
+              <w:right w:w="100" w:type="dxa"/>
+            </w:tcMar>
+            <w:vAlign w:val="center"/>
+          </w:tcPr>
+          <w:p>
+            <w:pPr>
+              <w:spacing w:line="252" w:lineRule="auto"/>
+            </w:pPr>
+            <w:r>
+              <w:rPr>
+                <w:sz w:val="19"/>
+                <w:szCs w:val="19"/>
+              </w:rPr>
+              <w:t>Skeleton</w:t>
+            </w:r>
+          </w:p>
+        </w:tc>
+        <w:tc>
+          <w:tcPr>
+            <w:tcW w:w="4261" w:type="dxa"/>
+            <w:tcBorders>
+              <w:top w:val="single" w:sz="4" w:space="0" w:color="C9D3D0"/>
+              <w:left w:val="single" w:sz="4" w:space="0" w:color="C9D3D0"/>
+              <w:bottom w:val="single" w:sz="4" w:space="0" w:color="C9D3D0"/>
+              <w:right w:val="single" w:sz="4" w:space="0" w:color="C9D3D0"/>
+            </w:tcBorders>
+            <w:tcMar>
+              <w:top w:w="50" w:type="dxa"/>
+              <w:left w:w="100" w:type="dxa"/>
+              <w:bottom w:w="50" w:type="dxa"/>
+              <w:right w:w="100" w:type="dxa"/>
+            </w:tcMar>
+            <w:vAlign w:val="center"/>
+          </w:tcPr>
+          <w:p>
+            <w:pPr>
+              <w:spacing w:line="252" w:lineRule="auto"/>
+            </w:pPr>
+            <w:r>
+              <w:rPr>
+                <w:sz w:val="19"/>
+                <w:szCs w:val="19"/>
+              </w:rPr>
+              <w:t>Grey placeholder blocks while loading</w:t>
+            </w:r>
+          </w:p>
+        </w:tc>
+        <w:tc>
+          <w:tcPr>
+            <w:tcW w:w="3874" w:type="dxa"/>
+            <w:tcBorders>
+              <w:top w:val="single" w:sz="4" w:space="0" w:color="C9D3D0"/>
+              <w:left w:val="single" w:sz="4" w:space="0" w:color="C9D3D0"/>
+              <w:bottom w:val="single" w:sz="4" w:space="0" w:color="C9D3D0"/>
+              <w:right w:val="single" w:sz="4" w:space="0" w:color="C9D3D0"/>
+            </w:tcBorders>
+            <w:tcMar>
+              <w:top w:w="50" w:type="dxa"/>
+              <w:left w:w="100" w:type="dxa"/>
+              <w:bottom w:w="50" w:type="dxa"/>
+              <w:right w:w="100" w:type="dxa"/>
+            </w:tcMar>
+            <w:vAlign w:val="center"/>
+          </w:tcPr>
+          <w:p>
+            <w:pPr>
+              <w:spacing w:line="252" w:lineRule="auto"/>
+            </w:pPr>
+            <w:r>
+              <w:rPr>
+                <w:sz w:val="19"/>
+                <w:szCs w:val="19"/>
+              </w:rPr>
+              <w:t>Lists, Compare, Groups, Journey</w:t>
+            </w:r>
+          </w:p>
+        </w:tc>
+      </w:tr>
+      <w:tr>
+        <w:tblPrEx>
+          <w:tblCellMar>
+            <w:top w:w="0" w:type="dxa"/>
+            <w:bottom w:w="0" w:type="dxa"/>
+          </w:tblCellMar>
+        </w:tblPrEx>
+        <w:trPr>
+          <w:cantSplit/>
+        </w:trPr>
+        <w:tc>
+          <w:tcPr>
+            <w:tcW w:w="1503" w:type="dxa"/>
+            <w:tcBorders>
+              <w:top w:val="single" w:sz="4" w:space="0" w:color="C9D3D0"/>
+              <w:left w:val="single" w:sz="4" w:space="0" w:color="C9D3D0"/>
+              <w:bottom w:val="single" w:sz="4" w:space="0" w:color="C9D3D0"/>
+              <w:right w:val="single" w:sz="4" w:space="0" w:color="C9D3D0"/>
+            </w:tcBorders>
+            <w:shd w:val="clear" w:color="auto" w:fill="F3F8F6"/>
             <w:tcMar>
               <w:top w:w="50" w:type="dxa"/>
               <w:left w:w="100" w:type="dxa"/>
@@ -22877,13 +23092,14 @@
         </w:tc>
         <w:tc>
           <w:tcPr>
-            <w:tcW w:w="4375" w:type="dxa"/>
-            <w:tcBorders>
-              <w:top w:val="single" w:sz="4" w:space="0" w:color="C9D3D0"/>
-              <w:left w:val="single" w:sz="4" w:space="0" w:color="C9D3D0"/>
-              <w:bottom w:val="single" w:sz="4" w:space="0" w:color="C9D3D0"/>
-              <w:right w:val="single" w:sz="4" w:space="0" w:color="C9D3D0"/>
-            </w:tcBorders>
+            <w:tcW w:w="4261" w:type="dxa"/>
+            <w:tcBorders>
+              <w:top w:val="single" w:sz="4" w:space="0" w:color="C9D3D0"/>
+              <w:left w:val="single" w:sz="4" w:space="0" w:color="C9D3D0"/>
+              <w:bottom w:val="single" w:sz="4" w:space="0" w:color="C9D3D0"/>
+              <w:right w:val="single" w:sz="4" w:space="0" w:color="C9D3D0"/>
+            </w:tcBorders>
+            <w:shd w:val="clear" w:color="auto" w:fill="F3F8F6"/>
             <w:tcMar>
               <w:top w:w="50" w:type="dxa"/>
               <w:left w:w="100" w:type="dxa"/>
@@ -22989,13 +23205,14 @@
         </w:tc>
         <w:tc>
           <w:tcPr>
-            <w:tcW w:w="3977" w:type="dxa"/>
-            <w:tcBorders>
-              <w:top w:val="single" w:sz="4" w:space="0" w:color="C9D3D0"/>
-              <w:left w:val="single" w:sz="4" w:space="0" w:color="C9D3D0"/>
-              <w:bottom w:val="single" w:sz="4" w:space="0" w:color="C9D3D0"/>
-              <w:right w:val="single" w:sz="4" w:space="0" w:color="C9D3D0"/>
-            </w:tcBorders>
+            <w:tcW w:w="3874" w:type="dxa"/>
+            <w:tcBorders>
+              <w:top w:val="single" w:sz="4" w:space="0" w:color="C9D3D0"/>
+              <w:left w:val="single" w:sz="4" w:space="0" w:color="C9D3D0"/>
+              <w:bottom w:val="single" w:sz="4" w:space="0" w:color="C9D3D0"/>
+              <w:right w:val="single" w:sz="4" w:space="0" w:color="C9D3D0"/>
+            </w:tcBorders>
+            <w:shd w:val="clear" w:color="auto" w:fill="F3F8F6"/>
             <w:tcMar>
               <w:top w:w="50" w:type="dxa"/>
               <w:left w:w="100" w:type="dxa"/>
@@ -23031,10 +23248,13 @@
         <w:keepLines/>
         <w:pageBreakBefore/>
       </w:pPr>
-      <w:bookmarkStart w:id="30" w:name="_Toc243516493"/>
+      <w:bookmarkStart w:id="30" w:name="_Toc243644709"/>
       <w:r>
         <w:lastRenderedPageBreak/>
-        <w:t>6 Screen specifications</w:t>
+        <w:t>6 </w:t>
+      </w:r>
+      <w:r>
+        <w:t>Screen specifications</w:t>
       </w:r>
       <w:bookmarkEnd w:id="30"/>
     </w:p>
@@ -23073,10 +23293,7 @@
         <w:t>Error</w:t>
       </w:r>
       <w:r>
-        <w:t xml:space="preserve">: a </w:t>
-      </w:r>
-      <w:r>
-        <w:t xml:space="preserve">request failed. </w:t>
+        <w:t xml:space="preserve">: a request failed. </w:t>
       </w:r>
       <w:r>
         <w:rPr>
@@ -23095,7 +23312,7 @@
         <w:keepNext/>
         <w:keepLines/>
       </w:pPr>
-      <w:bookmarkStart w:id="31" w:name="_Toc243516494"/>
+      <w:bookmarkStart w:id="31" w:name="_Toc243644710"/>
       <w:r>
         <w:t>6.1 Welcome, Intro and About you (onboarding)</w:t>
       </w:r>
@@ -23106,7 +23323,7 @@
         <w:pStyle w:val="Caption"/>
         <w:keepNext/>
       </w:pPr>
-      <w:bookmarkStart w:id="32" w:name="_Toc243516523"/>
+      <w:bookmarkStart w:id="32" w:name="_Toc243644739"/>
       <w:r>
         <w:t xml:space="preserve">Table </w:t>
       </w:r>
@@ -23642,7 +23859,7 @@
         <w:keepNext/>
         <w:keepLines/>
       </w:pPr>
-      <w:bookmarkStart w:id="33" w:name="_Toc243516495"/>
+      <w:bookmarkStart w:id="33" w:name="_Toc243644711"/>
       <w:r>
         <w:t>6.2 Account (sign up, log in, recover, recovery code, complete your account)</w:t>
       </w:r>
@@ -23653,7 +23870,7 @@
         <w:pStyle w:val="Caption"/>
         <w:keepNext/>
       </w:pPr>
-      <w:bookmarkStart w:id="34" w:name="_Toc243516524"/>
+      <w:bookmarkStart w:id="34" w:name="_Toc243644740"/>
       <w:r>
         <w:t xml:space="preserve">Table </w:t>
       </w:r>
@@ -24113,7 +24330,7 @@
         <w:keepNext/>
         <w:keepLines/>
       </w:pPr>
-      <w:bookmarkStart w:id="35" w:name="_Toc243516496"/>
+      <w:bookmarkStart w:id="35" w:name="_Toc243644712"/>
       <w:r>
         <w:t>6.3 Paths (home)</w:t>
       </w:r>
@@ -24124,7 +24341,7 @@
         <w:pStyle w:val="Caption"/>
         <w:keepNext/>
       </w:pPr>
-      <w:bookmarkStart w:id="36" w:name="_Toc243516525"/>
+      <w:bookmarkStart w:id="36" w:name="_Toc243644741"/>
       <w:r>
         <w:t xml:space="preserve">Table </w:t>
       </w:r>
@@ -24553,7 +24770,7 @@
         <w:keepNext/>
         <w:keepLines/>
       </w:pPr>
-      <w:bookmarkStart w:id="37" w:name="_Toc243516497"/>
+      <w:bookmarkStart w:id="37" w:name="_Toc243644713"/>
       <w:r>
         <w:t>6.4 Courses</w:t>
       </w:r>
@@ -24564,7 +24781,7 @@
         <w:pStyle w:val="Caption"/>
         <w:keepNext/>
       </w:pPr>
-      <w:bookmarkStart w:id="38" w:name="_Toc243516526"/>
+      <w:bookmarkStart w:id="38" w:name="_Toc243644742"/>
       <w:r>
         <w:t xml:space="preserve">Table </w:t>
       </w:r>
@@ -25040,7 +25257,7 @@
         <w:keepNext/>
         <w:keepLines/>
       </w:pPr>
-      <w:bookmarkStart w:id="39" w:name="_Toc243516498"/>
+      <w:bookmarkStart w:id="39" w:name="_Toc243644714"/>
       <w:r>
         <w:t>6.5 Course detail</w:t>
       </w:r>
@@ -25051,7 +25268,7 @@
         <w:pStyle w:val="Caption"/>
         <w:keepNext/>
       </w:pPr>
-      <w:bookmarkStart w:id="40" w:name="_Toc243516527"/>
+      <w:bookmarkStart w:id="40" w:name="_Toc243644743"/>
       <w:r>
         <w:t xml:space="preserve">Table </w:t>
       </w:r>
@@ -25646,7 +25863,7 @@
         <w:keepNext/>
         <w:keepLines/>
       </w:pPr>
-      <w:bookmarkStart w:id="41" w:name="_Toc243516499"/>
+      <w:bookmarkStart w:id="41" w:name="_Toc243644715"/>
       <w:r>
         <w:lastRenderedPageBreak/>
         <w:t>6.6 Compare</w:t>
@@ -25658,7 +25875,7 @@
         <w:pStyle w:val="Caption"/>
         <w:keepNext/>
       </w:pPr>
-      <w:bookmarkStart w:id="42" w:name="_Toc243516528"/>
+      <w:bookmarkStart w:id="42" w:name="_Toc243644744"/>
       <w:r>
         <w:t xml:space="preserve">Table </w:t>
       </w:r>
@@ -26086,7 +26303,7 @@
         <w:keepNext/>
         <w:keepLines/>
       </w:pPr>
-      <w:bookmarkStart w:id="43" w:name="_Toc243516500"/>
+      <w:bookmarkStart w:id="43" w:name="_Toc243644716"/>
       <w:r>
         <w:t>6.7 My list</w:t>
       </w:r>
@@ -26097,7 +26314,7 @@
         <w:pStyle w:val="Caption"/>
         <w:keepNext/>
       </w:pPr>
-      <w:bookmarkStart w:id="44" w:name="_Toc243516529"/>
+      <w:bookmarkStart w:id="44" w:name="_Toc243644745"/>
       <w:r>
         <w:t xml:space="preserve">Table </w:t>
       </w:r>
@@ -26364,7 +26581,23 @@
                 <w:sz w:val="19"/>
                 <w:szCs w:val="19"/>
               </w:rPr>
-              <w:t>Numbered rows with band pills; how many eligible courses are still left out; order warnings (BR-041, BR-042); Fix the order; Copy Uni-Codes</w:t>
+              <w:t xml:space="preserve">Numbered rows with band pills; how many eligible courses are still left out; order warnings (BR-041, BR-042); Fix the order; Copy Uni-Codes; a dashed </w:t>
+            </w:r>
+            <w:r>
+              <w:rPr>
+                <w:b/>
+                <w:bCs/>
+                <w:sz w:val="19"/>
+                <w:szCs w:val="19"/>
+              </w:rPr>
+              <w:t>+ Add a course</w:t>
+            </w:r>
+            <w:r>
+              <w:rPr>
+                <w:sz w:val="19"/>
+                <w:szCs w:val="19"/>
+              </w:rPr>
+              <w:t xml:space="preserve"> box below the last course opens the same course picker as Compare (your own courses, searchable), so courses can be added without leaving My list (23 October)</w:t>
             </w:r>
           </w:p>
         </w:tc>
@@ -26550,7 +26783,7 @@
         <w:keepNext/>
         <w:keepLines/>
       </w:pPr>
-      <w:bookmarkStart w:id="45" w:name="_Toc243516501"/>
+      <w:bookmarkStart w:id="45" w:name="_Toc243644717"/>
       <w:r>
         <w:t>6.8 Journey</w:t>
       </w:r>
@@ -26561,7 +26794,7 @@
         <w:pStyle w:val="Caption"/>
         <w:keepNext/>
       </w:pPr>
-      <w:bookmarkStart w:id="46" w:name="_Toc243516530"/>
+      <w:bookmarkStart w:id="46" w:name="_Toc243644746"/>
       <w:r>
         <w:t xml:space="preserve">Table </w:t>
       </w:r>
@@ -27037,8 +27270,9 @@
         <w:keepNext/>
         <w:keepLines/>
       </w:pPr>
-      <w:bookmarkStart w:id="47" w:name="_Toc243516502"/>
+      <w:bookmarkStart w:id="47" w:name="_Toc243644718"/>
       <w:r>
+        <w:lastRenderedPageBreak/>
         <w:t>6.9 Ask ZedPath</w:t>
       </w:r>
       <w:bookmarkEnd w:id="47"/>
@@ -27048,7 +27282,7 @@
         <w:pStyle w:val="Caption"/>
         <w:keepNext/>
       </w:pPr>
-      <w:bookmarkStart w:id="48" w:name="_Toc243516531"/>
+      <w:bookmarkStart w:id="48" w:name="_Toc243644747"/>
       <w:r>
         <w:t xml:space="preserve">Table </w:t>
       </w:r>
@@ -27284,7 +27518,6 @@
                 <w:sz w:val="19"/>
                 <w:szCs w:val="19"/>
               </w:rPr>
-              <w:lastRenderedPageBreak/>
               <w:t>Content</w:t>
             </w:r>
           </w:p>
@@ -27573,7 +27806,7 @@
         <w:keepNext/>
         <w:keepLines/>
       </w:pPr>
-      <w:bookmarkStart w:id="49" w:name="_Toc243516503"/>
+      <w:bookmarkStart w:id="49" w:name="_Toc243644719"/>
       <w:r>
         <w:t>6.10 Groups, Group room and Group info</w:t>
       </w:r>
@@ -27584,7 +27817,7 @@
         <w:pStyle w:val="Caption"/>
         <w:keepNext/>
       </w:pPr>
-      <w:bookmarkStart w:id="50" w:name="_Toc243516532"/>
+      <w:bookmarkStart w:id="50" w:name="_Toc243644748"/>
       <w:r>
         <w:t xml:space="preserve">Table </w:t>
       </w:r>
@@ -28053,7 +28286,7 @@
         <w:keepNext/>
         <w:keepLines/>
       </w:pPr>
-      <w:bookmarkStart w:id="51" w:name="_Toc243516504"/>
+      <w:bookmarkStart w:id="51" w:name="_Toc243644720"/>
       <w:r>
         <w:t>6.11 Me</w:t>
       </w:r>
@@ -28064,7 +28297,7 @@
         <w:pStyle w:val="Caption"/>
         <w:keepNext/>
       </w:pPr>
-      <w:bookmarkStart w:id="52" w:name="_Toc243516533"/>
+      <w:bookmarkStart w:id="52" w:name="_Toc243644749"/>
       <w:r>
         <w:t xml:space="preserve">Table </w:t>
       </w:r>
@@ -28500,7 +28733,7 @@
         <w:keepLines/>
         <w:pageBreakBefore/>
       </w:pPr>
-      <w:bookmarkStart w:id="53" w:name="_Toc243516505"/>
+      <w:bookmarkStart w:id="53" w:name="_Toc243644721"/>
       <w:r>
         <w:lastRenderedPageBreak/>
         <w:t>7 Interaction patterns</w:t>
@@ -28512,7 +28745,7 @@
         <w:pStyle w:val="Caption"/>
         <w:keepNext/>
       </w:pPr>
-      <w:bookmarkStart w:id="54" w:name="_Toc243516534"/>
+      <w:bookmarkStart w:id="54" w:name="_Toc243644750"/>
       <w:r>
         <w:t xml:space="preserve">Table </w:t>
       </w:r>
@@ -29691,7 +29924,7 @@
         <w:keepLines/>
         <w:pageBreakBefore/>
       </w:pPr>
-      <w:bookmarkStart w:id="55" w:name="_Toc243516506"/>
+      <w:bookmarkStart w:id="55" w:name="_Toc243644722"/>
       <w:r>
         <w:lastRenderedPageBreak/>
         <w:t>8 Content and language</w:t>
@@ -29703,7 +29936,7 @@
         <w:pStyle w:val="Caption"/>
         <w:keepNext/>
       </w:pPr>
-      <w:bookmarkStart w:id="56" w:name="_Toc243516535"/>
+      <w:bookmarkStart w:id="56" w:name="_Toc243644751"/>
       <w:r>
         <w:t xml:space="preserve">Table </w:t>
       </w:r>
@@ -30477,7 +30710,7 @@
         <w:keepLines/>
         <w:pageBreakBefore/>
       </w:pPr>
-      <w:bookmarkStart w:id="57" w:name="_Toc243516507"/>
+      <w:bookmarkStart w:id="57" w:name="_Toc243644723"/>
       <w:r>
         <w:lastRenderedPageBreak/>
         <w:t>9 Accessibility checklist (WCAG 2.2 AA)</w:t>
@@ -30497,7 +30730,7 @@
         <w:pStyle w:val="Caption"/>
         <w:keepNext/>
       </w:pPr>
-      <w:bookmarkStart w:id="58" w:name="_Toc243516536"/>
+      <w:bookmarkStart w:id="58" w:name="_Toc243644752"/>
       <w:r>
         <w:t xml:space="preserve">Table </w:t>
       </w:r>
@@ -32251,7 +32484,7 @@
         <w:keepLines/>
         <w:pageBreakBefore/>
       </w:pPr>
-      <w:bookmarkStart w:id="59" w:name="_Toc243516508"/>
+      <w:bookmarkStart w:id="59" w:name="_Toc243644724"/>
       <w:r>
         <w:lastRenderedPageBreak/>
         <w:t>10 Performance budget for 3G</w:t>
@@ -32263,7 +32496,7 @@
         <w:pStyle w:val="Caption"/>
         <w:keepNext/>
       </w:pPr>
-      <w:bookmarkStart w:id="60" w:name="_Toc243516537"/>
+      <w:bookmarkStart w:id="60" w:name="_Toc243644753"/>
       <w:r>
         <w:t xml:space="preserve">Table </w:t>
       </w:r>
@@ -33095,7 +33328,7 @@
         <w:keepLines/>
         <w:pageBreakBefore/>
       </w:pPr>
-      <w:bookmarkStart w:id="61" w:name="_Toc243516509"/>
+      <w:bookmarkStart w:id="61" w:name="_Toc243644725"/>
       <w:r>
         <w:lastRenderedPageBreak/>
         <w:t>11 Usability evidence</w:t>
@@ -33115,7 +33348,7 @@
         <w:pStyle w:val="Caption"/>
         <w:keepNext/>
       </w:pPr>
-      <w:bookmarkStart w:id="62" w:name="_Toc243516538"/>
+      <w:bookmarkStart w:id="62" w:name="_Toc243644754"/>
       <w:r>
         <w:t xml:space="preserve">Table </w:t>
       </w:r>
@@ -34466,6 +34699,109 @@
                 <w:sz w:val="19"/>
                 <w:szCs w:val="19"/>
               </w:rPr>
+              <w:t>VR4</w:t>
+            </w:r>
+          </w:p>
+        </w:tc>
+        <w:tc>
+          <w:tcPr>
+            <w:tcW w:w="4141" w:type="dxa"/>
+            <w:tcBorders>
+              <w:top w:val="single" w:sz="4" w:space="0" w:color="C9D3D0"/>
+              <w:left w:val="single" w:sz="4" w:space="0" w:color="C9D3D0"/>
+              <w:bottom w:val="single" w:sz="4" w:space="0" w:color="C9D3D0"/>
+              <w:right w:val="single" w:sz="4" w:space="0" w:color="C9D3D0"/>
+            </w:tcBorders>
+            <w:shd w:val="clear" w:color="auto" w:fill="F3F8F6"/>
+            <w:tcMar>
+              <w:top w:w="50" w:type="dxa"/>
+              <w:left w:w="100" w:type="dxa"/>
+              <w:bottom w:w="50" w:type="dxa"/>
+              <w:right w:w="100" w:type="dxa"/>
+            </w:tcMar>
+            <w:vAlign w:val="center"/>
+          </w:tcPr>
+          <w:p>
+            <w:pPr>
+              <w:spacing w:line="252" w:lineRule="auto"/>
+            </w:pPr>
+            <w:r>
+              <w:rPr>
+                <w:sz w:val="19"/>
+                <w:szCs w:val="19"/>
+              </w:rPr>
+              <w:t>Product owner's screen recording, 23 Oct: "we need a rectangle with a plus below the last one", "a green thing with a tick mark that they have been added"</w:t>
+            </w:r>
+          </w:p>
+        </w:tc>
+        <w:tc>
+          <w:tcPr>
+            <w:tcW w:w="4142" w:type="dxa"/>
+            <w:tcBorders>
+              <w:top w:val="single" w:sz="4" w:space="0" w:color="C9D3D0"/>
+              <w:left w:val="single" w:sz="4" w:space="0" w:color="C9D3D0"/>
+              <w:bottom w:val="single" w:sz="4" w:space="0" w:color="C9D3D0"/>
+              <w:right w:val="single" w:sz="4" w:space="0" w:color="C9D3D0"/>
+            </w:tcBorders>
+            <w:shd w:val="clear" w:color="auto" w:fill="F3F8F6"/>
+            <w:tcMar>
+              <w:top w:w="50" w:type="dxa"/>
+              <w:left w:w="100" w:type="dxa"/>
+              <w:bottom w:w="50" w:type="dxa"/>
+              <w:right w:w="100" w:type="dxa"/>
+            </w:tcMar>
+            <w:vAlign w:val="center"/>
+          </w:tcPr>
+          <w:p>
+            <w:pPr>
+              <w:spacing w:line="252" w:lineRule="auto"/>
+            </w:pPr>
+            <w:r>
+              <w:rPr>
+                <w:sz w:val="19"/>
+                <w:szCs w:val="19"/>
+              </w:rPr>
+              <w:t>+ Add a course box on My list; added confirmation</w:t>
+            </w:r>
+          </w:p>
+        </w:tc>
+      </w:tr>
+      <w:tr>
+        <w:tblPrEx>
+          <w:tblCellMar>
+            <w:top w:w="0" w:type="dxa"/>
+            <w:bottom w:w="0" w:type="dxa"/>
+          </w:tblCellMar>
+        </w:tblPrEx>
+        <w:trPr>
+          <w:cantSplit/>
+        </w:trPr>
+        <w:tc>
+          <w:tcPr>
+            <w:tcW w:w="1355" w:type="dxa"/>
+            <w:tcBorders>
+              <w:top w:val="single" w:sz="4" w:space="0" w:color="C9D3D0"/>
+              <w:left w:val="single" w:sz="4" w:space="0" w:color="C9D3D0"/>
+              <w:bottom w:val="single" w:sz="4" w:space="0" w:color="C9D3D0"/>
+              <w:right w:val="single" w:sz="4" w:space="0" w:color="C9D3D0"/>
+            </w:tcBorders>
+            <w:tcMar>
+              <w:top w:w="50" w:type="dxa"/>
+              <w:left w:w="100" w:type="dxa"/>
+              <w:bottom w:w="50" w:type="dxa"/>
+              <w:right w:w="100" w:type="dxa"/>
+            </w:tcMar>
+            <w:vAlign w:val="center"/>
+          </w:tcPr>
+          <w:p>
+            <w:pPr>
+              <w:spacing w:line="252" w:lineRule="auto"/>
+            </w:pPr>
+            <w:r>
+              <w:rPr>
+                <w:sz w:val="19"/>
+                <w:szCs w:val="19"/>
+              </w:rPr>
               <w:lastRenderedPageBreak/>
               <w:t>VR3</w:t>
             </w:r>
@@ -34480,7 +34816,6 @@
               <w:bottom w:val="single" w:sz="4" w:space="0" w:color="C9D3D0"/>
               <w:right w:val="single" w:sz="4" w:space="0" w:color="C9D3D0"/>
             </w:tcBorders>
-            <w:shd w:val="clear" w:color="auto" w:fill="F3F8F6"/>
             <w:tcMar>
               <w:top w:w="50" w:type="dxa"/>
               <w:left w:w="100" w:type="dxa"/>
@@ -34511,7 +34846,6 @@
               <w:bottom w:val="single" w:sz="4" w:space="0" w:color="C9D3D0"/>
               <w:right w:val="single" w:sz="4" w:space="0" w:color="C9D3D0"/>
             </w:tcBorders>
-            <w:shd w:val="clear" w:color="auto" w:fill="F3F8F6"/>
             <w:tcMar>
               <w:top w:w="50" w:type="dxa"/>
               <w:left w:w="100" w:type="dxa"/>
@@ -34547,7 +34881,7 @@
         <w:keepLines/>
         <w:pageBreakBefore/>
       </w:pPr>
-      <w:bookmarkStart w:id="63" w:name="_Toc243516510"/>
+      <w:bookmarkStart w:id="63" w:name="_Toc243644726"/>
       <w:r>
         <w:lastRenderedPageBreak/>
         <w:t>12 Traceability</w:t>
@@ -34559,7 +34893,7 @@
         <w:pStyle w:val="Caption"/>
         <w:keepNext/>
       </w:pPr>
-      <w:bookmarkStart w:id="64" w:name="_Toc243516539"/>
+      <w:bookmarkStart w:id="64" w:name="_Toc243644755"/>
       <w:r>
         <w:t xml:space="preserve">Table </w:t>
       </w:r>
@@ -36025,10 +36359,10 @@
 <file path=word/numbering.xml><?xml version="1.0" encoding="utf-8"?>
 <w:numbering xmlns:wpc="http://schemas.microsoft.com/office/word/2010/wordprocessingCanvas" xmlns:cx="http://schemas.microsoft.com/office/drawing/2014/chartex" xmlns:cx1="http://schemas.microsoft.com/office/drawing/2015/9/8/chartex" xmlns:cx2="http://schemas.microsoft.com/office/drawing/2015/10/21/chartex" xmlns:cx3="http://schemas.microsoft.com/office/drawing/2016/5/9/chartex" xmlns:cx4="http://schemas.microsoft.com/office/drawing/2016/5/10/chartex" xmlns:cx5="http://schemas.microsoft.com/office/drawing/2016/5/11/chartex" xmlns:cx6="http://schemas.microsoft.com/office/drawing/2016/5/12/chartex" xmlns:cx7="http://schemas.microsoft.com/office/drawing/2016/5/13/chartex" xmlns:cx8="http://schemas.microsoft.com/office/drawing/2016/5/14/chartex" xmlns:mc="http://schemas.openxmlformats.org/markup-compatibility/2006" xmlns:aink="http://schemas.microsoft.com/office/drawing/2016/ink" xmlns:am3d="http://schemas.microsoft.com/office/drawing/2017/model3d" xmlns:o="urn:schemas-microsoft-com:office:office" xmlns:oel="http://schemas.microsoft.com/office/2019/extlst" xmlns:r="http://schemas.openxmlformats.org/officeDocument/2006/relationships" xmlns:m="http://schemas.openxmlformats.org/officeDocument/2006/math" xmlns:v="urn:schemas-microsoft-com:vml" xmlns:wp14="http://schemas.microsoft.com/office/word/2010/wordprocessingDrawing" xmlns:wp="http://schemas.openxmlformats.org/drawingml/2006/wordprocessingDrawing" xmlns:w10="urn:schemas-microsoft-com:office:word" xmlns:w="http://schemas.openxmlformats.org/wordprocessingml/2006/main" xmlns:w14="http://schemas.microsoft.com/office/word/2010/wordml" xmlns:w15="http://schemas.microsoft.com/office/word/2012/wordml" xmlns:w16cex="http://schemas.microsoft.com/office/word/2018/wordml/cex" xmlns:w16cid="http://schemas.microsoft.com/office/word/2016/wordml/cid" xmlns:w16="http://schemas.microsoft.com/office/word/2018/wordml" xmlns:w16du="http://schemas.microsoft.com/office/word/2023/wordml/word16du" xmlns:w16sdtdh="http://schemas.microsoft.com/office/word/2020/wordml/sdtdatahash" xmlns:w16sdtfl="http://schemas.microsoft.com/office/word/2024/wordml/sdtformatlock" xmlns:w16se="http://schemas.microsoft.com/office/word/2015/wordml/symex" xmlns:wpg="http://schemas.microsoft.com/office/word/2010/wordprocessingGroup" xmlns:wpi="http://schemas.microsoft.com/office/word/2010/wordprocessingInk" xmlns:wne="http://schemas.microsoft.com/office/word/2006/wordml" xmlns:wps="http://schemas.microsoft.com/office/word/2010/wordprocessingShape" mc:Ignorable="w14 w15 w16se w16cid w16 w16cex w16sdtdh w16sdtfl w16du wp14">
   <w:abstractNum w:abstractNumId="0" w15:restartNumberingAfterBreak="0">
-    <w:nsid w:val="50686404"/>
+    <w:nsid w:val="08A0007F"/>
     <w:multiLevelType w:val="hybridMultilevel"/>
-    <w:tmpl w:val="98C4FFC2"/>
-    <w:lvl w:ilvl="0" w:tplc="3C0C20EC" w:tentative="1">
+    <w:tmpl w:val="CC5A38AA"/>
+    <w:lvl w:ilvl="0" w:tplc="4C32A5A6" w:tentative="1">
       <w:start w:val="1"/>
       <w:numFmt w:val="bullet"/>
       <w:lvlText w:val="●"/>
@@ -36037,7 +36371,7 @@
         <w:ind w:left="720" w:hanging="360"/>
       </w:pPr>
     </w:lvl>
-    <w:lvl w:ilvl="1" w:tplc="511281B8" w:tentative="1">
+    <w:lvl w:ilvl="1" w:tplc="56E2AC1E" w:tentative="1">
       <w:start w:val="1"/>
       <w:numFmt w:val="bullet"/>
       <w:lvlText w:val="○"/>
@@ -36046,7 +36380,7 @@
         <w:ind w:left="1440" w:hanging="360"/>
       </w:pPr>
     </w:lvl>
-    <w:lvl w:ilvl="2" w:tplc="F828E20E" w:tentative="1">
+    <w:lvl w:ilvl="2" w:tplc="9D88FBE4" w:tentative="1">
       <w:start w:val="1"/>
       <w:numFmt w:val="bullet"/>
       <w:lvlText w:val="■"/>
@@ -36055,7 +36389,7 @@
         <w:ind w:left="2160" w:hanging="360"/>
       </w:pPr>
     </w:lvl>
-    <w:lvl w:ilvl="3" w:tplc="DA8CE394" w:tentative="1">
+    <w:lvl w:ilvl="3" w:tplc="E88ABE2A" w:tentative="1">
       <w:start w:val="1"/>
       <w:numFmt w:val="bullet"/>
       <w:lvlText w:val="●"/>
@@ -36064,7 +36398,7 @@
         <w:ind w:left="2880" w:hanging="360"/>
       </w:pPr>
     </w:lvl>
-    <w:lvl w:ilvl="4" w:tplc="29B69CF2" w:tentative="1">
+    <w:lvl w:ilvl="4" w:tplc="D17ABE36" w:tentative="1">
       <w:start w:val="1"/>
       <w:numFmt w:val="bullet"/>
       <w:lvlText w:val="○"/>
@@ -36073,7 +36407,7 @@
         <w:ind w:left="3600" w:hanging="360"/>
       </w:pPr>
     </w:lvl>
-    <w:lvl w:ilvl="5" w:tplc="74A2CFC0" w:tentative="1">
+    <w:lvl w:ilvl="5" w:tplc="D8A6F7E4" w:tentative="1">
       <w:start w:val="1"/>
       <w:numFmt w:val="bullet"/>
       <w:lvlText w:val="■"/>
@@ -36082,7 +36416,7 @@
         <w:ind w:left="4320" w:hanging="360"/>
       </w:pPr>
     </w:lvl>
-    <w:lvl w:ilvl="6" w:tplc="A17A4DB0" w:tentative="1">
+    <w:lvl w:ilvl="6" w:tplc="9CC6EA22" w:tentative="1">
       <w:start w:val="1"/>
       <w:numFmt w:val="bullet"/>
       <w:lvlText w:val="●"/>
@@ -36091,7 +36425,7 @@
         <w:ind w:left="5040" w:hanging="360"/>
       </w:pPr>
     </w:lvl>
-    <w:lvl w:ilvl="7" w:tplc="A8A8A8F4" w:tentative="1">
+    <w:lvl w:ilvl="7" w:tplc="BDE201AA" w:tentative="1">
       <w:start w:val="1"/>
       <w:numFmt w:val="bullet"/>
       <w:lvlText w:val="●"/>
@@ -36100,7 +36434,7 @@
         <w:ind w:left="5760" w:hanging="360"/>
       </w:pPr>
     </w:lvl>
-    <w:lvl w:ilvl="8" w:tplc="0CC42472" w:tentative="1">
+    <w:lvl w:ilvl="8" w:tplc="1AD23F36" w:tentative="1">
       <w:start w:val="1"/>
       <w:numFmt w:val="bullet"/>
       <w:lvlText w:val="●"/>
@@ -36111,10 +36445,72 @@
     </w:lvl>
   </w:abstractNum>
   <w:abstractNum w:abstractNumId="1" w15:restartNumberingAfterBreak="0">
-    <w:nsid w:val="63A33A4D"/>
+    <w:nsid w:val="28214473"/>
     <w:multiLevelType w:val="hybridMultilevel"/>
-    <w:tmpl w:val="D3223852"/>
-    <w:lvl w:ilvl="0" w:tplc="04684510" w:tentative="1">
+    <w:tmpl w:val="52282C68"/>
+    <w:lvl w:ilvl="0" w:tplc="092049B0" w:tentative="1">
+      <w:start w:val="1"/>
+      <w:numFmt w:val="decimal"/>
+      <w:lvlText w:val="%1."/>
+      <w:lvlJc w:val="left"/>
+      <w:pPr>
+        <w:ind w:left="720" w:hanging="360"/>
+      </w:pPr>
+    </w:lvl>
+    <w:lvl w:ilvl="1" w:tplc="5EE0485A" w:tentative="1">
+      <w:start w:val="1"/>
+      <w:numFmt w:val="lowerLetter"/>
+      <w:lvlText w:val="%2."/>
+      <w:lvlJc w:val="left"/>
+      <w:pPr>
+        <w:ind w:left="1080" w:hanging="360"/>
+      </w:pPr>
+    </w:lvl>
+    <w:lvl w:ilvl="2" w:tplc="0AD623BC" w:tentative="1">
+      <w:start w:val="1"/>
+      <w:numFmt w:val="lowerRoman"/>
+      <w:lvlText w:val="%3."/>
+      <w:lvlJc w:val="left"/>
+      <w:pPr>
+        <w:ind w:left="1440" w:hanging="360"/>
+      </w:pPr>
+    </w:lvl>
+    <w:lvl w:ilvl="3" w:tplc="5608C3AA">
+      <w:numFmt w:val="decimal"/>
+      <w:lvlText w:val=""/>
+      <w:lvlJc w:val="left"/>
+    </w:lvl>
+    <w:lvl w:ilvl="4" w:tplc="CB66BA72">
+      <w:numFmt w:val="decimal"/>
+      <w:lvlText w:val=""/>
+      <w:lvlJc w:val="left"/>
+    </w:lvl>
+    <w:lvl w:ilvl="5" w:tplc="19BCA928">
+      <w:numFmt w:val="decimal"/>
+      <w:lvlText w:val=""/>
+      <w:lvlJc w:val="left"/>
+    </w:lvl>
+    <w:lvl w:ilvl="6" w:tplc="04C66FFE">
+      <w:numFmt w:val="decimal"/>
+      <w:lvlText w:val=""/>
+      <w:lvlJc w:val="left"/>
+    </w:lvl>
+    <w:lvl w:ilvl="7" w:tplc="0140540E">
+      <w:numFmt w:val="decimal"/>
+      <w:lvlText w:val=""/>
+      <w:lvlJc w:val="left"/>
+    </w:lvl>
+    <w:lvl w:ilvl="8" w:tplc="375C508C">
+      <w:numFmt w:val="decimal"/>
+      <w:lvlText w:val=""/>
+      <w:lvlJc w:val="left"/>
+    </w:lvl>
+  </w:abstractNum>
+  <w:abstractNum w:abstractNumId="2" w15:restartNumberingAfterBreak="0">
+    <w:nsid w:val="5C84058F"/>
+    <w:multiLevelType w:val="hybridMultilevel"/>
+    <w:tmpl w:val="C6A2D9A6"/>
+    <w:lvl w:ilvl="0" w:tplc="719034CC" w:tentative="1">
       <w:start w:val="1"/>
       <w:numFmt w:val="bullet"/>
       <w:lvlText w:val="•"/>
@@ -36123,7 +36519,7 @@
         <w:ind w:left="720" w:hanging="280"/>
       </w:pPr>
     </w:lvl>
-    <w:lvl w:ilvl="1" w:tplc="DEC6E0BC" w:tentative="1">
+    <w:lvl w:ilvl="1" w:tplc="D9E4BD30" w:tentative="1">
       <w:start w:val="1"/>
       <w:numFmt w:val="bullet"/>
       <w:lvlText w:val="–"/>
@@ -36132,7 +36528,7 @@
         <w:ind w:left="1080" w:hanging="280"/>
       </w:pPr>
     </w:lvl>
-    <w:lvl w:ilvl="2" w:tplc="116EF2F0" w:tentative="1">
+    <w:lvl w:ilvl="2" w:tplc="744E543A" w:tentative="1">
       <w:start w:val="1"/>
       <w:numFmt w:val="bullet"/>
       <w:lvlText w:val="▪"/>
@@ -36141,100 +36537,38 @@
         <w:ind w:left="1440" w:hanging="280"/>
       </w:pPr>
     </w:lvl>
-    <w:lvl w:ilvl="3" w:tplc="8A28AAC4">
+    <w:lvl w:ilvl="3" w:tplc="CA802BAE">
       <w:numFmt w:val="decimal"/>
       <w:lvlText w:val=""/>
       <w:lvlJc w:val="left"/>
     </w:lvl>
-    <w:lvl w:ilvl="4" w:tplc="A6D49BFE">
+    <w:lvl w:ilvl="4" w:tplc="2166CAE0">
       <w:numFmt w:val="decimal"/>
       <w:lvlText w:val=""/>
       <w:lvlJc w:val="left"/>
     </w:lvl>
-    <w:lvl w:ilvl="5" w:tplc="DF905A3A">
+    <w:lvl w:ilvl="5" w:tplc="AF48D462">
       <w:numFmt w:val="decimal"/>
       <w:lvlText w:val=""/>
       <w:lvlJc w:val="left"/>
     </w:lvl>
-    <w:lvl w:ilvl="6" w:tplc="FA7E3D0E">
+    <w:lvl w:ilvl="6" w:tplc="5EC417F0">
       <w:numFmt w:val="decimal"/>
       <w:lvlText w:val=""/>
       <w:lvlJc w:val="left"/>
     </w:lvl>
-    <w:lvl w:ilvl="7" w:tplc="9FECB0C6">
+    <w:lvl w:ilvl="7" w:tplc="ABF8F6C4">
       <w:numFmt w:val="decimal"/>
       <w:lvlText w:val=""/>
       <w:lvlJc w:val="left"/>
     </w:lvl>
-    <w:lvl w:ilvl="8" w:tplc="2C5C258C">
+    <w:lvl w:ilvl="8" w:tplc="573865EC">
       <w:numFmt w:val="decimal"/>
       <w:lvlText w:val=""/>
       <w:lvlJc w:val="left"/>
     </w:lvl>
   </w:abstractNum>
-  <w:abstractNum w:abstractNumId="2" w15:restartNumberingAfterBreak="0">
-    <w:nsid w:val="7C370B1B"/>
-    <w:multiLevelType w:val="hybridMultilevel"/>
-    <w:tmpl w:val="89561DAA"/>
-    <w:lvl w:ilvl="0" w:tplc="4D10C246" w:tentative="1">
-      <w:start w:val="1"/>
-      <w:numFmt w:val="decimal"/>
-      <w:lvlText w:val="%1."/>
-      <w:lvlJc w:val="left"/>
-      <w:pPr>
-        <w:ind w:left="720" w:hanging="360"/>
-      </w:pPr>
-    </w:lvl>
-    <w:lvl w:ilvl="1" w:tplc="73FE6F1A" w:tentative="1">
-      <w:start w:val="1"/>
-      <w:numFmt w:val="lowerLetter"/>
-      <w:lvlText w:val="%2."/>
-      <w:lvlJc w:val="left"/>
-      <w:pPr>
-        <w:ind w:left="1080" w:hanging="360"/>
-      </w:pPr>
-    </w:lvl>
-    <w:lvl w:ilvl="2" w:tplc="C7BC0DC2" w:tentative="1">
-      <w:start w:val="1"/>
-      <w:numFmt w:val="lowerRoman"/>
-      <w:lvlText w:val="%3."/>
-      <w:lvlJc w:val="left"/>
-      <w:pPr>
-        <w:ind w:left="1440" w:hanging="360"/>
-      </w:pPr>
-    </w:lvl>
-    <w:lvl w:ilvl="3" w:tplc="39C820EC">
-      <w:numFmt w:val="decimal"/>
-      <w:lvlText w:val=""/>
-      <w:lvlJc w:val="left"/>
-    </w:lvl>
-    <w:lvl w:ilvl="4" w:tplc="549082E8">
-      <w:numFmt w:val="decimal"/>
-      <w:lvlText w:val=""/>
-      <w:lvlJc w:val="left"/>
-    </w:lvl>
-    <w:lvl w:ilvl="5" w:tplc="80248086">
-      <w:numFmt w:val="decimal"/>
-      <w:lvlText w:val=""/>
-      <w:lvlJc w:val="left"/>
-    </w:lvl>
-    <w:lvl w:ilvl="6" w:tplc="0C7C58E6">
-      <w:numFmt w:val="decimal"/>
-      <w:lvlText w:val=""/>
-      <w:lvlJc w:val="left"/>
-    </w:lvl>
-    <w:lvl w:ilvl="7" w:tplc="FBCEB03A">
-      <w:numFmt w:val="decimal"/>
-      <w:lvlText w:val=""/>
-      <w:lvlJc w:val="left"/>
-    </w:lvl>
-    <w:lvl w:ilvl="8" w:tplc="53F2C080">
-      <w:numFmt w:val="decimal"/>
-      <w:lvlText w:val=""/>
-      <w:lvlJc w:val="left"/>
-    </w:lvl>
-  </w:abstractNum>
-  <w:num w:numId="1" w16cid:durableId="2110588658">
+  <w:num w:numId="1" w16cid:durableId="1113358182">
     <w:abstractNumId w:val="0"/>
     <w:lvlOverride w:ilvl="0">
       <w:startOverride w:val="1"/>
@@ -36939,7 +37273,7 @@
     <w:autoRedefine/>
     <w:uiPriority w:val="39"/>
     <w:unhideWhenUsed/>
-    <w:rsid w:val="00120D28"/>
+    <w:rsid w:val="00D47E55"/>
     <w:pPr>
       <w:spacing w:after="100"/>
     </w:pPr>
@@ -36951,7 +37285,7 @@
     <w:autoRedefine/>
     <w:uiPriority w:val="39"/>
     <w:unhideWhenUsed/>
-    <w:rsid w:val="00120D28"/>
+    <w:rsid w:val="00D47E55"/>
     <w:pPr>
       <w:spacing w:after="100"/>
       <w:ind w:left="210"/>
@@ -36963,7 +37297,7 @@
     <w:next w:val="Normal"/>
     <w:uiPriority w:val="99"/>
     <w:unhideWhenUsed/>
-    <w:rsid w:val="00120D28"/>
+    <w:rsid w:val="00D47E55"/>
   </w:style>
 </w:styles>
 </file>

</xml_diff>

<commit_message>
Search inside each group of other paths (Praveen: "Make all those options searchable too", "Inside each path", "With a search icon left to profile icon")
- A search icon in the top bar, left of the profile picture, on every group list: opens a focused search
  field (Escape closes) that matches every typed word against the path's name, institute and its short
  name (SLIIT, NSBM, OUSL from the provider's initials), group words and programme titles. Paths found
  through programmes show which ones ("law" shows each institute's law degrees). Live count; en/si/ta.
- Kept when a path is opened and the student comes back; reset for another group.
- shared/route-search.ts (pure) + TC-146 (6); 570 passed. ZP-DOC-07/08, README.

Co-Authored-By: Claude Opus 5.5 (1M context) <noreply@anthropic.com>
</commit_message>
<xml_diff>
--- a/docs/07-ui-ux/ZP-DOC-07_UI-UX-Design.docx
+++ b/docs/07-ui-ux/ZP-DOC-07_UI-UX-Design.docx
@@ -2663,7 +2663,7 @@
     <w:sdt>
       <w:sdtPr>
         <w:alias w:val="Contents"/>
-        <w:id w:val="498009707"/>
+        <w:id w:val="-1347016004"/>
       </w:sdtPr>
       <w:sdtEndPr/>
       <w:sdtContent>
@@ -2692,7 +2692,7 @@
           <w:r>
             <w:fldChar w:fldCharType="separate"/>
           </w:r>
-          <w:hyperlink w:anchor="_Toc243662383" w:history="1">
+          <w:hyperlink w:anchor="_Toc243666842" w:history="1">
             <w:r>
               <w:rPr>
                 <w:rStyle w:val="Hyperlink"/>
@@ -2716,7 +2716,7 @@
               <w:rPr>
                 <w:noProof/>
               </w:rPr>
-              <w:instrText xml:space="preserve"> PAGEREF _Toc243662383 \h </w:instrText>
+              <w:instrText xml:space="preserve"> PAGEREF _Toc243666842 \h </w:instrText>
             </w:r>
             <w:r>
               <w:rPr>
@@ -2759,7 +2759,7 @@
               <w14:ligatures w14:val="standardContextual"/>
             </w:rPr>
           </w:pPr>
-          <w:hyperlink w:anchor="_Toc243662384" w:history="1">
+          <w:hyperlink w:anchor="_Toc243666843" w:history="1">
             <w:r>
               <w:rPr>
                 <w:rStyle w:val="Hyperlink"/>
@@ -2783,7 +2783,7 @@
               <w:rPr>
                 <w:noProof/>
               </w:rPr>
-              <w:instrText xml:space="preserve"> PAGEREF _Toc243662384 \h </w:instrText>
+              <w:instrText xml:space="preserve"> PAGEREF _Toc243666843 \h </w:instrText>
             </w:r>
             <w:r>
               <w:rPr>
@@ -2826,7 +2826,7 @@
               <w14:ligatures w14:val="standardContextual"/>
             </w:rPr>
           </w:pPr>
-          <w:hyperlink w:anchor="_Toc243662385" w:history="1">
+          <w:hyperlink w:anchor="_Toc243666844" w:history="1">
             <w:r>
               <w:rPr>
                 <w:rStyle w:val="Hyperlink"/>
@@ -2850,7 +2850,7 @@
               <w:rPr>
                 <w:noProof/>
               </w:rPr>
-              <w:instrText xml:space="preserve"> PAGEREF _Toc243662385 \h </w:instrText>
+              <w:instrText xml:space="preserve"> PAGEREF _Toc243666844 \h </w:instrText>
             </w:r>
             <w:r>
               <w:rPr>
@@ -2893,7 +2893,7 @@
               <w14:ligatures w14:val="standardContextual"/>
             </w:rPr>
           </w:pPr>
-          <w:hyperlink w:anchor="_Toc243662386" w:history="1">
+          <w:hyperlink w:anchor="_Toc243666845" w:history="1">
             <w:r>
               <w:rPr>
                 <w:rStyle w:val="Hyperlink"/>
@@ -2917,7 +2917,7 @@
               <w:rPr>
                 <w:noProof/>
               </w:rPr>
-              <w:instrText xml:space="preserve"> PAGEREF _Toc243662386 \h </w:instrText>
+              <w:instrText xml:space="preserve"> PAGEREF _Toc243666845 \h </w:instrText>
             </w:r>
             <w:r>
               <w:rPr>
@@ -2960,7 +2960,7 @@
               <w14:ligatures w14:val="standardContextual"/>
             </w:rPr>
           </w:pPr>
-          <w:hyperlink w:anchor="_Toc243662387" w:history="1">
+          <w:hyperlink w:anchor="_Toc243666846" w:history="1">
             <w:r>
               <w:rPr>
                 <w:rStyle w:val="Hyperlink"/>
@@ -2984,7 +2984,7 @@
               <w:rPr>
                 <w:noProof/>
               </w:rPr>
-              <w:instrText xml:space="preserve"> PAGEREF _Toc243662387 \h </w:instrText>
+              <w:instrText xml:space="preserve"> PAGEREF _Toc243666846 \h </w:instrText>
             </w:r>
             <w:r>
               <w:rPr>
@@ -3027,7 +3027,7 @@
               <w14:ligatures w14:val="standardContextual"/>
             </w:rPr>
           </w:pPr>
-          <w:hyperlink w:anchor="_Toc243662388" w:history="1">
+          <w:hyperlink w:anchor="_Toc243666847" w:history="1">
             <w:r>
               <w:rPr>
                 <w:rStyle w:val="Hyperlink"/>
@@ -3051,7 +3051,7 @@
               <w:rPr>
                 <w:noProof/>
               </w:rPr>
-              <w:instrText xml:space="preserve"> PAGEREF _Toc243662388 \h </w:instrText>
+              <w:instrText xml:space="preserve"> PAGEREF _Toc243666847 \h </w:instrText>
             </w:r>
             <w:r>
               <w:rPr>
@@ -3094,7 +3094,7 @@
               <w14:ligatures w14:val="standardContextual"/>
             </w:rPr>
           </w:pPr>
-          <w:hyperlink w:anchor="_Toc243662389" w:history="1">
+          <w:hyperlink w:anchor="_Toc243666848" w:history="1">
             <w:r>
               <w:rPr>
                 <w:rStyle w:val="Hyperlink"/>
@@ -3118,7 +3118,7 @@
               <w:rPr>
                 <w:noProof/>
               </w:rPr>
-              <w:instrText xml:space="preserve"> PAGEREF _Toc243662389 \h </w:instrText>
+              <w:instrText xml:space="preserve"> PAGEREF _Toc243666848 \h </w:instrText>
             </w:r>
             <w:r>
               <w:rPr>
@@ -3161,7 +3161,7 @@
               <w14:ligatures w14:val="standardContextual"/>
             </w:rPr>
           </w:pPr>
-          <w:hyperlink w:anchor="_Toc243662390" w:history="1">
+          <w:hyperlink w:anchor="_Toc243666849" w:history="1">
             <w:r>
               <w:rPr>
                 <w:rStyle w:val="Hyperlink"/>
@@ -3185,7 +3185,7 @@
               <w:rPr>
                 <w:noProof/>
               </w:rPr>
-              <w:instrText xml:space="preserve"> PAGEREF _Toc243662390 \h </w:instrText>
+              <w:instrText xml:space="preserve"> PAGEREF _Toc243666849 \h </w:instrText>
             </w:r>
             <w:r>
               <w:rPr>
@@ -3228,7 +3228,7 @@
               <w14:ligatures w14:val="standardContextual"/>
             </w:rPr>
           </w:pPr>
-          <w:hyperlink w:anchor="_Toc243662391" w:history="1">
+          <w:hyperlink w:anchor="_Toc243666850" w:history="1">
             <w:r>
               <w:rPr>
                 <w:rStyle w:val="Hyperlink"/>
@@ -3252,7 +3252,7 @@
               <w:rPr>
                 <w:noProof/>
               </w:rPr>
-              <w:instrText xml:space="preserve"> PAGEREF _Toc243662391 \h </w:instrText>
+              <w:instrText xml:space="preserve"> PAGEREF _Toc243666850 \h </w:instrText>
             </w:r>
             <w:r>
               <w:rPr>
@@ -3295,7 +3295,7 @@
               <w14:ligatures w14:val="standardContextual"/>
             </w:rPr>
           </w:pPr>
-          <w:hyperlink w:anchor="_Toc243662392" w:history="1">
+          <w:hyperlink w:anchor="_Toc243666851" w:history="1">
             <w:r>
               <w:rPr>
                 <w:rStyle w:val="Hyperlink"/>
@@ -3319,7 +3319,7 @@
               <w:rPr>
                 <w:noProof/>
               </w:rPr>
-              <w:instrText xml:space="preserve"> PAGEREF _Toc243662392 \h </w:instrText>
+              <w:instrText xml:space="preserve"> PAGEREF _Toc243666851 \h </w:instrText>
             </w:r>
             <w:r>
               <w:rPr>
@@ -3362,7 +3362,7 @@
               <w14:ligatures w14:val="standardContextual"/>
             </w:rPr>
           </w:pPr>
-          <w:hyperlink w:anchor="_Toc243662393" w:history="1">
+          <w:hyperlink w:anchor="_Toc243666852" w:history="1">
             <w:r>
               <w:rPr>
                 <w:rStyle w:val="Hyperlink"/>
@@ -3386,7 +3386,7 @@
               <w:rPr>
                 <w:noProof/>
               </w:rPr>
-              <w:instrText xml:space="preserve"> PAGEREF _Toc243662393 \h </w:instrText>
+              <w:instrText xml:space="preserve"> PAGEREF _Toc243666852 \h </w:instrText>
             </w:r>
             <w:r>
               <w:rPr>
@@ -3429,7 +3429,7 @@
               <w14:ligatures w14:val="standardContextual"/>
             </w:rPr>
           </w:pPr>
-          <w:hyperlink w:anchor="_Toc243662394" w:history="1">
+          <w:hyperlink w:anchor="_Toc243666853" w:history="1">
             <w:r>
               <w:rPr>
                 <w:rStyle w:val="Hyperlink"/>
@@ -3453,7 +3453,7 @@
               <w:rPr>
                 <w:noProof/>
               </w:rPr>
-              <w:instrText xml:space="preserve"> PAGEREF _Toc243662394 \h </w:instrText>
+              <w:instrText xml:space="preserve"> PAGEREF _Toc243666853 \h </w:instrText>
             </w:r>
             <w:r>
               <w:rPr>
@@ -3496,7 +3496,7 @@
               <w14:ligatures w14:val="standardContextual"/>
             </w:rPr>
           </w:pPr>
-          <w:hyperlink w:anchor="_Toc243662395" w:history="1">
+          <w:hyperlink w:anchor="_Toc243666854" w:history="1">
             <w:r>
               <w:rPr>
                 <w:rStyle w:val="Hyperlink"/>
@@ -3520,7 +3520,7 @@
               <w:rPr>
                 <w:noProof/>
               </w:rPr>
-              <w:instrText xml:space="preserve"> PAGEREF _Toc243662395 \h </w:instrText>
+              <w:instrText xml:space="preserve"> PAGEREF _Toc243666854 \h </w:instrText>
             </w:r>
             <w:r>
               <w:rPr>
@@ -3563,7 +3563,7 @@
               <w14:ligatures w14:val="standardContextual"/>
             </w:rPr>
           </w:pPr>
-          <w:hyperlink w:anchor="_Toc243662396" w:history="1">
+          <w:hyperlink w:anchor="_Toc243666855" w:history="1">
             <w:r>
               <w:rPr>
                 <w:rStyle w:val="Hyperlink"/>
@@ -3587,7 +3587,7 @@
               <w:rPr>
                 <w:noProof/>
               </w:rPr>
-              <w:instrText xml:space="preserve"> PAGEREF _Toc243662396 \h </w:instrText>
+              <w:instrText xml:space="preserve"> PAGEREF _Toc243666855 \h </w:instrText>
             </w:r>
             <w:r>
               <w:rPr>
@@ -3630,7 +3630,7 @@
               <w14:ligatures w14:val="standardContextual"/>
             </w:rPr>
           </w:pPr>
-          <w:hyperlink w:anchor="_Toc243662397" w:history="1">
+          <w:hyperlink w:anchor="_Toc243666856" w:history="1">
             <w:r>
               <w:rPr>
                 <w:rStyle w:val="Hyperlink"/>
@@ -3654,7 +3654,7 @@
               <w:rPr>
                 <w:noProof/>
               </w:rPr>
-              <w:instrText xml:space="preserve"> PAGEREF _Toc243662397 \h </w:instrText>
+              <w:instrText xml:space="preserve"> PAGEREF _Toc243666856 \h </w:instrText>
             </w:r>
             <w:r>
               <w:rPr>
@@ -3697,7 +3697,7 @@
               <w14:ligatures w14:val="standardContextual"/>
             </w:rPr>
           </w:pPr>
-          <w:hyperlink w:anchor="_Toc243662398" w:history="1">
+          <w:hyperlink w:anchor="_Toc243666857" w:history="1">
             <w:r>
               <w:rPr>
                 <w:rStyle w:val="Hyperlink"/>
@@ -3721,7 +3721,7 @@
               <w:rPr>
                 <w:noProof/>
               </w:rPr>
-              <w:instrText xml:space="preserve"> PAGEREF _Toc243662398 \h </w:instrText>
+              <w:instrText xml:space="preserve"> PAGEREF _Toc243666857 \h </w:instrText>
             </w:r>
             <w:r>
               <w:rPr>
@@ -3764,7 +3764,7 @@
               <w14:ligatures w14:val="standardContextual"/>
             </w:rPr>
           </w:pPr>
-          <w:hyperlink w:anchor="_Toc243662399" w:history="1">
+          <w:hyperlink w:anchor="_Toc243666858" w:history="1">
             <w:r>
               <w:rPr>
                 <w:rStyle w:val="Hyperlink"/>
@@ -3788,7 +3788,7 @@
               <w:rPr>
                 <w:noProof/>
               </w:rPr>
-              <w:instrText xml:space="preserve"> PAGEREF _Toc243662399 \h </w:instrText>
+              <w:instrText xml:space="preserve"> PAGEREF _Toc243666858 \h </w:instrText>
             </w:r>
             <w:r>
               <w:rPr>
@@ -3831,7 +3831,7 @@
               <w14:ligatures w14:val="standardContextual"/>
             </w:rPr>
           </w:pPr>
-          <w:hyperlink w:anchor="_Toc243662400" w:history="1">
+          <w:hyperlink w:anchor="_Toc243666859" w:history="1">
             <w:r>
               <w:rPr>
                 <w:rStyle w:val="Hyperlink"/>
@@ -3855,7 +3855,7 @@
               <w:rPr>
                 <w:noProof/>
               </w:rPr>
-              <w:instrText xml:space="preserve"> PAGEREF _Toc243662400 \h </w:instrText>
+              <w:instrText xml:space="preserve"> PAGEREF _Toc243666859 \h </w:instrText>
             </w:r>
             <w:r>
               <w:rPr>
@@ -3898,7 +3898,7 @@
               <w14:ligatures w14:val="standardContextual"/>
             </w:rPr>
           </w:pPr>
-          <w:hyperlink w:anchor="_Toc243662401" w:history="1">
+          <w:hyperlink w:anchor="_Toc243666860" w:history="1">
             <w:r>
               <w:rPr>
                 <w:rStyle w:val="Hyperlink"/>
@@ -3922,7 +3922,7 @@
               <w:rPr>
                 <w:noProof/>
               </w:rPr>
-              <w:instrText xml:space="preserve"> PAGEREF _Toc243662401 \h </w:instrText>
+              <w:instrText xml:space="preserve"> PAGEREF _Toc243666860 \h </w:instrText>
             </w:r>
             <w:r>
               <w:rPr>
@@ -3965,7 +3965,7 @@
               <w14:ligatures w14:val="standardContextual"/>
             </w:rPr>
           </w:pPr>
-          <w:hyperlink w:anchor="_Toc243662402" w:history="1">
+          <w:hyperlink w:anchor="_Toc243666861" w:history="1">
             <w:r>
               <w:rPr>
                 <w:rStyle w:val="Hyperlink"/>
@@ -3989,7 +3989,7 @@
               <w:rPr>
                 <w:noProof/>
               </w:rPr>
-              <w:instrText xml:space="preserve"> PAGEREF _Toc243662402 \h </w:instrText>
+              <w:instrText xml:space="preserve"> PAGEREF _Toc243666861 \h </w:instrText>
             </w:r>
             <w:r>
               <w:rPr>
@@ -4032,7 +4032,7 @@
               <w14:ligatures w14:val="standardContextual"/>
             </w:rPr>
           </w:pPr>
-          <w:hyperlink w:anchor="_Toc243662403" w:history="1">
+          <w:hyperlink w:anchor="_Toc243666862" w:history="1">
             <w:r>
               <w:rPr>
                 <w:rStyle w:val="Hyperlink"/>
@@ -4056,7 +4056,7 @@
               <w:rPr>
                 <w:noProof/>
               </w:rPr>
-              <w:instrText xml:space="preserve"> PAGEREF _Toc243662403 \h </w:instrText>
+              <w:instrText xml:space="preserve"> PAGEREF _Toc243666862 \h </w:instrText>
             </w:r>
             <w:r>
               <w:rPr>
@@ -4099,7 +4099,7 @@
               <w14:ligatures w14:val="standardContextual"/>
             </w:rPr>
           </w:pPr>
-          <w:hyperlink w:anchor="_Toc243662404" w:history="1">
+          <w:hyperlink w:anchor="_Toc243666863" w:history="1">
             <w:r>
               <w:rPr>
                 <w:rStyle w:val="Hyperlink"/>
@@ -4123,7 +4123,7 @@
               <w:rPr>
                 <w:noProof/>
               </w:rPr>
-              <w:instrText xml:space="preserve"> PAGEREF _Toc243662404 \h </w:instrText>
+              <w:instrText xml:space="preserve"> PAGEREF _Toc243666863 \h </w:instrText>
             </w:r>
             <w:r>
               <w:rPr>
@@ -4166,7 +4166,7 @@
               <w14:ligatures w14:val="standardContextual"/>
             </w:rPr>
           </w:pPr>
-          <w:hyperlink w:anchor="_Toc243662405" w:history="1">
+          <w:hyperlink w:anchor="_Toc243666864" w:history="1">
             <w:r>
               <w:rPr>
                 <w:rStyle w:val="Hyperlink"/>
@@ -4190,7 +4190,7 @@
               <w:rPr>
                 <w:noProof/>
               </w:rPr>
-              <w:instrText xml:space="preserve"> PAGEREF _Toc243662405 \h </w:instrText>
+              <w:instrText xml:space="preserve"> PAGEREF _Toc243666864 \h </w:instrText>
             </w:r>
             <w:r>
               <w:rPr>
@@ -4233,7 +4233,7 @@
               <w14:ligatures w14:val="standardContextual"/>
             </w:rPr>
           </w:pPr>
-          <w:hyperlink w:anchor="_Toc243662406" w:history="1">
+          <w:hyperlink w:anchor="_Toc243666865" w:history="1">
             <w:r>
               <w:rPr>
                 <w:rStyle w:val="Hyperlink"/>
@@ -4257,7 +4257,7 @@
               <w:rPr>
                 <w:noProof/>
               </w:rPr>
-              <w:instrText xml:space="preserve"> PAGEREF _Toc243662406 \h </w:instrText>
+              <w:instrText xml:space="preserve"> PAGEREF _Toc243666865 \h </w:instrText>
             </w:r>
             <w:r>
               <w:rPr>
@@ -4300,7 +4300,7 @@
               <w14:ligatures w14:val="standardContextual"/>
             </w:rPr>
           </w:pPr>
-          <w:hyperlink w:anchor="_Toc243662407" w:history="1">
+          <w:hyperlink w:anchor="_Toc243666866" w:history="1">
             <w:r>
               <w:rPr>
                 <w:rStyle w:val="Hyperlink"/>
@@ -4324,7 +4324,7 @@
               <w:rPr>
                 <w:noProof/>
               </w:rPr>
-              <w:instrText xml:space="preserve"> PAGEREF _Toc243662407 \h </w:instrText>
+              <w:instrText xml:space="preserve"> PAGEREF _Toc243666866 \h </w:instrText>
             </w:r>
             <w:r>
               <w:rPr>
@@ -4367,7 +4367,7 @@
               <w14:ligatures w14:val="standardContextual"/>
             </w:rPr>
           </w:pPr>
-          <w:hyperlink w:anchor="_Toc243662408" w:history="1">
+          <w:hyperlink w:anchor="_Toc243666867" w:history="1">
             <w:r>
               <w:rPr>
                 <w:rStyle w:val="Hyperlink"/>
@@ -4391,7 +4391,7 @@
               <w:rPr>
                 <w:noProof/>
               </w:rPr>
-              <w:instrText xml:space="preserve"> PAGEREF _Toc243662408 \h </w:instrText>
+              <w:instrText xml:space="preserve"> PAGEREF _Toc243666867 \h </w:instrText>
             </w:r>
             <w:r>
               <w:rPr>
@@ -4434,7 +4434,7 @@
               <w14:ligatures w14:val="standardContextual"/>
             </w:rPr>
           </w:pPr>
-          <w:hyperlink w:anchor="_Toc243662409" w:history="1">
+          <w:hyperlink w:anchor="_Toc243666868" w:history="1">
             <w:r>
               <w:rPr>
                 <w:rStyle w:val="Hyperlink"/>
@@ -4458,7 +4458,7 @@
               <w:rPr>
                 <w:noProof/>
               </w:rPr>
-              <w:instrText xml:space="preserve"> PAGEREF _Toc243662409 \h </w:instrText>
+              <w:instrText xml:space="preserve"> PAGEREF _Toc243666868 \h </w:instrText>
             </w:r>
             <w:r>
               <w:rPr>
@@ -4501,7 +4501,7 @@
               <w14:ligatures w14:val="standardContextual"/>
             </w:rPr>
           </w:pPr>
-          <w:hyperlink w:anchor="_Toc243662410" w:history="1">
+          <w:hyperlink w:anchor="_Toc243666869" w:history="1">
             <w:r>
               <w:rPr>
                 <w:rStyle w:val="Hyperlink"/>
@@ -4525,7 +4525,7 @@
               <w:rPr>
                 <w:noProof/>
               </w:rPr>
-              <w:instrText xml:space="preserve"> PAGEREF _Toc243662410 \h </w:instrText>
+              <w:instrText xml:space="preserve"> PAGEREF _Toc243666869 \h </w:instrText>
             </w:r>
             <w:r>
               <w:rPr>
@@ -4568,7 +4568,7 @@
               <w14:ligatures w14:val="standardContextual"/>
             </w:rPr>
           </w:pPr>
-          <w:hyperlink w:anchor="_Toc243662411" w:history="1">
+          <w:hyperlink w:anchor="_Toc243666870" w:history="1">
             <w:r>
               <w:rPr>
                 <w:rStyle w:val="Hyperlink"/>
@@ -4592,7 +4592,7 @@
               <w:rPr>
                 <w:noProof/>
               </w:rPr>
-              <w:instrText xml:space="preserve"> PAGEREF _Toc243662411 \h </w:instrText>
+              <w:instrText xml:space="preserve"> PAGEREF _Toc243666870 \h </w:instrText>
             </w:r>
             <w:r>
               <w:rPr>
@@ -4635,7 +4635,7 @@
               <w14:ligatures w14:val="standardContextual"/>
             </w:rPr>
           </w:pPr>
-          <w:hyperlink w:anchor="_Toc243662412" w:history="1">
+          <w:hyperlink w:anchor="_Toc243666871" w:history="1">
             <w:r>
               <w:rPr>
                 <w:rStyle w:val="Hyperlink"/>
@@ -4659,7 +4659,7 @@
               <w:rPr>
                 <w:noProof/>
               </w:rPr>
-              <w:instrText xml:space="preserve"> PAGEREF _Toc243662412 \h </w:instrText>
+              <w:instrText xml:space="preserve"> PAGEREF _Toc243666871 \h </w:instrText>
             </w:r>
             <w:r>
               <w:rPr>
@@ -4702,7 +4702,7 @@
               <w14:ligatures w14:val="standardContextual"/>
             </w:rPr>
           </w:pPr>
-          <w:hyperlink w:anchor="_Toc243662413" w:history="1">
+          <w:hyperlink w:anchor="_Toc243666872" w:history="1">
             <w:r>
               <w:rPr>
                 <w:rStyle w:val="Hyperlink"/>
@@ -4726,7 +4726,7 @@
               <w:rPr>
                 <w:noProof/>
               </w:rPr>
-              <w:instrText xml:space="preserve"> PAGEREF _Toc243662413 \h </w:instrText>
+              <w:instrText xml:space="preserve"> PAGEREF _Toc243666872 \h </w:instrText>
             </w:r>
             <w:r>
               <w:rPr>
@@ -4769,7 +4769,7 @@
               <w14:ligatures w14:val="standardContextual"/>
             </w:rPr>
           </w:pPr>
-          <w:hyperlink w:anchor="_Toc243662414" w:history="1">
+          <w:hyperlink w:anchor="_Toc243666873" w:history="1">
             <w:r>
               <w:rPr>
                 <w:rStyle w:val="Hyperlink"/>
@@ -4793,7 +4793,7 @@
               <w:rPr>
                 <w:noProof/>
               </w:rPr>
-              <w:instrText xml:space="preserve"> PAGEREF _Toc243662414 \h </w:instrText>
+              <w:instrText xml:space="preserve"> PAGEREF _Toc243666873 \h </w:instrText>
             </w:r>
             <w:r>
               <w:rPr>
@@ -4836,7 +4836,7 @@
               <w14:ligatures w14:val="standardContextual"/>
             </w:rPr>
           </w:pPr>
-          <w:hyperlink w:anchor="_Toc243662415" w:history="1">
+          <w:hyperlink w:anchor="_Toc243666874" w:history="1">
             <w:r>
               <w:rPr>
                 <w:rStyle w:val="Hyperlink"/>
@@ -4860,7 +4860,7 @@
               <w:rPr>
                 <w:noProof/>
               </w:rPr>
-              <w:instrText xml:space="preserve"> PAGEREF _Toc243662415 \h </w:instrText>
+              <w:instrText xml:space="preserve"> PAGEREF _Toc243666874 \h </w:instrText>
             </w:r>
             <w:r>
               <w:rPr>
@@ -4903,7 +4903,7 @@
               <w14:ligatures w14:val="standardContextual"/>
             </w:rPr>
           </w:pPr>
-          <w:hyperlink w:anchor="_Toc243662416" w:history="1">
+          <w:hyperlink w:anchor="_Toc243666875" w:history="1">
             <w:r>
               <w:rPr>
                 <w:rStyle w:val="Hyperlink"/>
@@ -4927,7 +4927,7 @@
               <w:rPr>
                 <w:noProof/>
               </w:rPr>
-              <w:instrText xml:space="preserve"> PAGEREF _Toc243662416 \h </w:instrText>
+              <w:instrText xml:space="preserve"> PAGEREF _Toc243666875 \h </w:instrText>
             </w:r>
             <w:r>
               <w:rPr>
@@ -4970,7 +4970,7 @@
               <w14:ligatures w14:val="standardContextual"/>
             </w:rPr>
           </w:pPr>
-          <w:hyperlink w:anchor="_Toc243662417" w:history="1">
+          <w:hyperlink w:anchor="_Toc243666876" w:history="1">
             <w:r>
               <w:rPr>
                 <w:rStyle w:val="Hyperlink"/>
@@ -4994,7 +4994,7 @@
               <w:rPr>
                 <w:noProof/>
               </w:rPr>
-              <w:instrText xml:space="preserve"> PAGEREF _Toc243662417 \h </w:instrText>
+              <w:instrText xml:space="preserve"> PAGEREF _Toc243666876 \h </w:instrText>
             </w:r>
             <w:r>
               <w:rPr>
@@ -5037,7 +5037,7 @@
               <w14:ligatures w14:val="standardContextual"/>
             </w:rPr>
           </w:pPr>
-          <w:hyperlink w:anchor="_Toc243662418" w:history="1">
+          <w:hyperlink w:anchor="_Toc243666877" w:history="1">
             <w:r>
               <w:rPr>
                 <w:rStyle w:val="Hyperlink"/>
@@ -5061,7 +5061,7 @@
               <w:rPr>
                 <w:noProof/>
               </w:rPr>
-              <w:instrText xml:space="preserve"> PAGEREF _Toc243662418 \h </w:instrText>
+              <w:instrText xml:space="preserve"> PAGEREF _Toc243666877 \h </w:instrText>
             </w:r>
             <w:r>
               <w:rPr>
@@ -5104,7 +5104,7 @@
               <w14:ligatures w14:val="standardContextual"/>
             </w:rPr>
           </w:pPr>
-          <w:hyperlink w:anchor="_Toc243662419" w:history="1">
+          <w:hyperlink w:anchor="_Toc243666878" w:history="1">
             <w:r>
               <w:rPr>
                 <w:rStyle w:val="Hyperlink"/>
@@ -5128,7 +5128,7 @@
               <w:rPr>
                 <w:noProof/>
               </w:rPr>
-              <w:instrText xml:space="preserve"> PAGEREF _Toc243662419 \h </w:instrText>
+              <w:instrText xml:space="preserve"> PAGEREF _Toc243666878 \h </w:instrText>
             </w:r>
             <w:r>
               <w:rPr>
@@ -5174,7 +5174,7 @@
     <w:sdt>
       <w:sdtPr>
         <w:alias w:val="Tables"/>
-        <w:id w:val="-2001572270"/>
+        <w:id w:val="-991566442"/>
       </w:sdtPr>
       <w:sdtEndPr/>
       <w:sdtContent>
@@ -5203,7 +5203,7 @@
           <w:r>
             <w:fldChar w:fldCharType="separate"/>
           </w:r>
-          <w:hyperlink w:anchor="_Toc243662420" w:history="1">
+          <w:hyperlink w:anchor="_Toc243666879" w:history="1">
             <w:r>
               <w:rPr>
                 <w:rStyle w:val="Hyperlink"/>
@@ -5227,7 +5227,7 @@
               <w:rPr>
                 <w:noProof/>
               </w:rPr>
-              <w:instrText xml:space="preserve"> PAGEREF _Toc243662420 \h </w:instrText>
+              <w:instrText xml:space="preserve"> PAGEREF _Toc243666879 \h </w:instrText>
             </w:r>
             <w:r>
               <w:rPr>
@@ -5270,7 +5270,7 @@
               <w14:ligatures w14:val="standardContextual"/>
             </w:rPr>
           </w:pPr>
-          <w:hyperlink w:anchor="_Toc243662421" w:history="1">
+          <w:hyperlink w:anchor="_Toc243666880" w:history="1">
             <w:r>
               <w:rPr>
                 <w:rStyle w:val="Hyperlink"/>
@@ -5294,7 +5294,7 @@
               <w:rPr>
                 <w:noProof/>
               </w:rPr>
-              <w:instrText xml:space="preserve"> PAGEREF _Toc243662421 \h </w:instrText>
+              <w:instrText xml:space="preserve"> PAGEREF _Toc243666880 \h </w:instrText>
             </w:r>
             <w:r>
               <w:rPr>
@@ -5337,7 +5337,7 @@
               <w14:ligatures w14:val="standardContextual"/>
             </w:rPr>
           </w:pPr>
-          <w:hyperlink w:anchor="_Toc243662422" w:history="1">
+          <w:hyperlink w:anchor="_Toc243666881" w:history="1">
             <w:r>
               <w:rPr>
                 <w:rStyle w:val="Hyperlink"/>
@@ -5361,7 +5361,7 @@
               <w:rPr>
                 <w:noProof/>
               </w:rPr>
-              <w:instrText xml:space="preserve"> PAGEREF _Toc243662422 \h </w:instrText>
+              <w:instrText xml:space="preserve"> PAGEREF _Toc243666881 \h </w:instrText>
             </w:r>
             <w:r>
               <w:rPr>
@@ -5404,7 +5404,7 @@
               <w14:ligatures w14:val="standardContextual"/>
             </w:rPr>
           </w:pPr>
-          <w:hyperlink w:anchor="_Toc243662423" w:history="1">
+          <w:hyperlink w:anchor="_Toc243666882" w:history="1">
             <w:r>
               <w:rPr>
                 <w:rStyle w:val="Hyperlink"/>
@@ -5428,7 +5428,7 @@
               <w:rPr>
                 <w:noProof/>
               </w:rPr>
-              <w:instrText xml:space="preserve"> PAGEREF _Toc243662423 \h </w:instrText>
+              <w:instrText xml:space="preserve"> PAGEREF _Toc243666882 \h </w:instrText>
             </w:r>
             <w:r>
               <w:rPr>
@@ -5471,7 +5471,7 @@
               <w14:ligatures w14:val="standardContextual"/>
             </w:rPr>
           </w:pPr>
-          <w:hyperlink w:anchor="_Toc243662424" w:history="1">
+          <w:hyperlink w:anchor="_Toc243666883" w:history="1">
             <w:r>
               <w:rPr>
                 <w:rStyle w:val="Hyperlink"/>
@@ -5495,7 +5495,7 @@
               <w:rPr>
                 <w:noProof/>
               </w:rPr>
-              <w:instrText xml:space="preserve"> PAGEREF _Toc243662424 \h </w:instrText>
+              <w:instrText xml:space="preserve"> PAGEREF _Toc243666883 \h </w:instrText>
             </w:r>
             <w:r>
               <w:rPr>
@@ -5538,7 +5538,7 @@
               <w14:ligatures w14:val="standardContextual"/>
             </w:rPr>
           </w:pPr>
-          <w:hyperlink w:anchor="_Toc243662425" w:history="1">
+          <w:hyperlink w:anchor="_Toc243666884" w:history="1">
             <w:r>
               <w:rPr>
                 <w:rStyle w:val="Hyperlink"/>
@@ -5562,7 +5562,7 @@
               <w:rPr>
                 <w:noProof/>
               </w:rPr>
-              <w:instrText xml:space="preserve"> PAGEREF _Toc243662425 \h </w:instrText>
+              <w:instrText xml:space="preserve"> PAGEREF _Toc243666884 \h </w:instrText>
             </w:r>
             <w:r>
               <w:rPr>
@@ -5605,7 +5605,7 @@
               <w14:ligatures w14:val="standardContextual"/>
             </w:rPr>
           </w:pPr>
-          <w:hyperlink w:anchor="_Toc243662426" w:history="1">
+          <w:hyperlink w:anchor="_Toc243666885" w:history="1">
             <w:r>
               <w:rPr>
                 <w:rStyle w:val="Hyperlink"/>
@@ -5629,7 +5629,7 @@
               <w:rPr>
                 <w:noProof/>
               </w:rPr>
-              <w:instrText xml:space="preserve"> PAGEREF _Toc243662426 \h </w:instrText>
+              <w:instrText xml:space="preserve"> PAGEREF _Toc243666885 \h </w:instrText>
             </w:r>
             <w:r>
               <w:rPr>
@@ -5672,7 +5672,7 @@
               <w14:ligatures w14:val="standardContextual"/>
             </w:rPr>
           </w:pPr>
-          <w:hyperlink w:anchor="_Toc243662427" w:history="1">
+          <w:hyperlink w:anchor="_Toc243666886" w:history="1">
             <w:r>
               <w:rPr>
                 <w:rStyle w:val="Hyperlink"/>
@@ -5696,7 +5696,7 @@
               <w:rPr>
                 <w:noProof/>
               </w:rPr>
-              <w:instrText xml:space="preserve"> PAGEREF _Toc243662427 \h </w:instrText>
+              <w:instrText xml:space="preserve"> PAGEREF _Toc243666886 \h </w:instrText>
             </w:r>
             <w:r>
               <w:rPr>
@@ -5739,7 +5739,7 @@
               <w14:ligatures w14:val="standardContextual"/>
             </w:rPr>
           </w:pPr>
-          <w:hyperlink w:anchor="_Toc243662428" w:history="1">
+          <w:hyperlink w:anchor="_Toc243666887" w:history="1">
             <w:r>
               <w:rPr>
                 <w:rStyle w:val="Hyperlink"/>
@@ -5763,7 +5763,7 @@
               <w:rPr>
                 <w:noProof/>
               </w:rPr>
-              <w:instrText xml:space="preserve"> PAGEREF _Toc243662428 \h </w:instrText>
+              <w:instrText xml:space="preserve"> PAGEREF _Toc243666887 \h </w:instrText>
             </w:r>
             <w:r>
               <w:rPr>
@@ -5806,7 +5806,7 @@
               <w14:ligatures w14:val="standardContextual"/>
             </w:rPr>
           </w:pPr>
-          <w:hyperlink w:anchor="_Toc243662429" w:history="1">
+          <w:hyperlink w:anchor="_Toc243666888" w:history="1">
             <w:r>
               <w:rPr>
                 <w:rStyle w:val="Hyperlink"/>
@@ -5830,7 +5830,7 @@
               <w:rPr>
                 <w:noProof/>
               </w:rPr>
-              <w:instrText xml:space="preserve"> PAGEREF _Toc243662429 \h </w:instrText>
+              <w:instrText xml:space="preserve"> PAGEREF _Toc243666888 \h </w:instrText>
             </w:r>
             <w:r>
               <w:rPr>
@@ -5873,7 +5873,7 @@
               <w14:ligatures w14:val="standardContextual"/>
             </w:rPr>
           </w:pPr>
-          <w:hyperlink w:anchor="_Toc243662430" w:history="1">
+          <w:hyperlink w:anchor="_Toc243666889" w:history="1">
             <w:r>
               <w:rPr>
                 <w:rStyle w:val="Hyperlink"/>
@@ -5897,7 +5897,7 @@
               <w:rPr>
                 <w:noProof/>
               </w:rPr>
-              <w:instrText xml:space="preserve"> PAGEREF _Toc243662430 \h </w:instrText>
+              <w:instrText xml:space="preserve"> PAGEREF _Toc243666889 \h </w:instrText>
             </w:r>
             <w:r>
               <w:rPr>
@@ -5940,7 +5940,7 @@
               <w14:ligatures w14:val="standardContextual"/>
             </w:rPr>
           </w:pPr>
-          <w:hyperlink w:anchor="_Toc243662431" w:history="1">
+          <w:hyperlink w:anchor="_Toc243666890" w:history="1">
             <w:r>
               <w:rPr>
                 <w:rStyle w:val="Hyperlink"/>
@@ -5964,7 +5964,7 @@
               <w:rPr>
                 <w:noProof/>
               </w:rPr>
-              <w:instrText xml:space="preserve"> PAGEREF _Toc243662431 \h </w:instrText>
+              <w:instrText xml:space="preserve"> PAGEREF _Toc243666890 \h </w:instrText>
             </w:r>
             <w:r>
               <w:rPr>
@@ -6007,7 +6007,7 @@
               <w14:ligatures w14:val="standardContextual"/>
             </w:rPr>
           </w:pPr>
-          <w:hyperlink w:anchor="_Toc243662432" w:history="1">
+          <w:hyperlink w:anchor="_Toc243666891" w:history="1">
             <w:r>
               <w:rPr>
                 <w:rStyle w:val="Hyperlink"/>
@@ -6031,7 +6031,7 @@
               <w:rPr>
                 <w:noProof/>
               </w:rPr>
-              <w:instrText xml:space="preserve"> PAGEREF _Toc243662432 \h </w:instrText>
+              <w:instrText xml:space="preserve"> PAGEREF _Toc243666891 \h </w:instrText>
             </w:r>
             <w:r>
               <w:rPr>
@@ -6074,7 +6074,7 @@
               <w14:ligatures w14:val="standardContextual"/>
             </w:rPr>
           </w:pPr>
-          <w:hyperlink w:anchor="_Toc243662433" w:history="1">
+          <w:hyperlink w:anchor="_Toc243666892" w:history="1">
             <w:r>
               <w:rPr>
                 <w:rStyle w:val="Hyperlink"/>
@@ -6098,7 +6098,7 @@
               <w:rPr>
                 <w:noProof/>
               </w:rPr>
-              <w:instrText xml:space="preserve"> PAGEREF _Toc243662433 \h </w:instrText>
+              <w:instrText xml:space="preserve"> PAGEREF _Toc243666892 \h </w:instrText>
             </w:r>
             <w:r>
               <w:rPr>
@@ -6141,7 +6141,7 @@
               <w14:ligatures w14:val="standardContextual"/>
             </w:rPr>
           </w:pPr>
-          <w:hyperlink w:anchor="_Toc243662434" w:history="1">
+          <w:hyperlink w:anchor="_Toc243666893" w:history="1">
             <w:r>
               <w:rPr>
                 <w:rStyle w:val="Hyperlink"/>
@@ -6165,7 +6165,7 @@
               <w:rPr>
                 <w:noProof/>
               </w:rPr>
-              <w:instrText xml:space="preserve"> PAGEREF _Toc243662434 \h </w:instrText>
+              <w:instrText xml:space="preserve"> PAGEREF _Toc243666893 \h </w:instrText>
             </w:r>
             <w:r>
               <w:rPr>
@@ -6208,7 +6208,7 @@
               <w14:ligatures w14:val="standardContextual"/>
             </w:rPr>
           </w:pPr>
-          <w:hyperlink w:anchor="_Toc243662435" w:history="1">
+          <w:hyperlink w:anchor="_Toc243666894" w:history="1">
             <w:r>
               <w:rPr>
                 <w:rStyle w:val="Hyperlink"/>
@@ -6232,7 +6232,7 @@
               <w:rPr>
                 <w:noProof/>
               </w:rPr>
-              <w:instrText xml:space="preserve"> PAGEREF _Toc243662435 \h </w:instrText>
+              <w:instrText xml:space="preserve"> PAGEREF _Toc243666894 \h </w:instrText>
             </w:r>
             <w:r>
               <w:rPr>
@@ -6275,7 +6275,7 @@
               <w14:ligatures w14:val="standardContextual"/>
             </w:rPr>
           </w:pPr>
-          <w:hyperlink w:anchor="_Toc243662436" w:history="1">
+          <w:hyperlink w:anchor="_Toc243666895" w:history="1">
             <w:r>
               <w:rPr>
                 <w:rStyle w:val="Hyperlink"/>
@@ -6299,7 +6299,7 @@
               <w:rPr>
                 <w:noProof/>
               </w:rPr>
-              <w:instrText xml:space="preserve"> PAGEREF _Toc243662436 \h </w:instrText>
+              <w:instrText xml:space="preserve"> PAGEREF _Toc243666895 \h </w:instrText>
             </w:r>
             <w:r>
               <w:rPr>
@@ -6342,7 +6342,7 @@
               <w14:ligatures w14:val="standardContextual"/>
             </w:rPr>
           </w:pPr>
-          <w:hyperlink w:anchor="_Toc243662437" w:history="1">
+          <w:hyperlink w:anchor="_Toc243666896" w:history="1">
             <w:r>
               <w:rPr>
                 <w:rStyle w:val="Hyperlink"/>
@@ -6366,7 +6366,7 @@
               <w:rPr>
                 <w:noProof/>
               </w:rPr>
-              <w:instrText xml:space="preserve"> PAGEREF _Toc243662437 \h </w:instrText>
+              <w:instrText xml:space="preserve"> PAGEREF _Toc243666896 \h </w:instrText>
             </w:r>
             <w:r>
               <w:rPr>
@@ -6409,7 +6409,7 @@
               <w14:ligatures w14:val="standardContextual"/>
             </w:rPr>
           </w:pPr>
-          <w:hyperlink w:anchor="_Toc243662438" w:history="1">
+          <w:hyperlink w:anchor="_Toc243666897" w:history="1">
             <w:r>
               <w:rPr>
                 <w:rStyle w:val="Hyperlink"/>
@@ -6433,7 +6433,7 @@
               <w:rPr>
                 <w:noProof/>
               </w:rPr>
-              <w:instrText xml:space="preserve"> PAGEREF _Toc243662438 \h </w:instrText>
+              <w:instrText xml:space="preserve"> PAGEREF _Toc243666897 \h </w:instrText>
             </w:r>
             <w:r>
               <w:rPr>
@@ -6476,7 +6476,7 @@
               <w14:ligatures w14:val="standardContextual"/>
             </w:rPr>
           </w:pPr>
-          <w:hyperlink w:anchor="_Toc243662439" w:history="1">
+          <w:hyperlink w:anchor="_Toc243666898" w:history="1">
             <w:r>
               <w:rPr>
                 <w:rStyle w:val="Hyperlink"/>
@@ -6500,7 +6500,7 @@
               <w:rPr>
                 <w:noProof/>
               </w:rPr>
-              <w:instrText xml:space="preserve"> PAGEREF _Toc243662439 \h </w:instrText>
+              <w:instrText xml:space="preserve"> PAGEREF _Toc243666898 \h </w:instrText>
             </w:r>
             <w:r>
               <w:rPr>
@@ -6543,7 +6543,7 @@
               <w14:ligatures w14:val="standardContextual"/>
             </w:rPr>
           </w:pPr>
-          <w:hyperlink w:anchor="_Toc243662440" w:history="1">
+          <w:hyperlink w:anchor="_Toc243666899" w:history="1">
             <w:r>
               <w:rPr>
                 <w:rStyle w:val="Hyperlink"/>
@@ -6567,7 +6567,7 @@
               <w:rPr>
                 <w:noProof/>
               </w:rPr>
-              <w:instrText xml:space="preserve"> PAGEREF _Toc243662440 \h </w:instrText>
+              <w:instrText xml:space="preserve"> PAGEREF _Toc243666899 \h </w:instrText>
             </w:r>
             <w:r>
               <w:rPr>
@@ -6610,7 +6610,7 @@
               <w14:ligatures w14:val="standardContextual"/>
             </w:rPr>
           </w:pPr>
-          <w:hyperlink w:anchor="_Toc243662441" w:history="1">
+          <w:hyperlink w:anchor="_Toc243666900" w:history="1">
             <w:r>
               <w:rPr>
                 <w:rStyle w:val="Hyperlink"/>
@@ -6634,7 +6634,7 @@
               <w:rPr>
                 <w:noProof/>
               </w:rPr>
-              <w:instrText xml:space="preserve"> PAGEREF _Toc243662441 \h </w:instrText>
+              <w:instrText xml:space="preserve"> PAGEREF _Toc243666900 \h </w:instrText>
             </w:r>
             <w:r>
               <w:rPr>
@@ -6677,7 +6677,7 @@
               <w14:ligatures w14:val="standardContextual"/>
             </w:rPr>
           </w:pPr>
-          <w:hyperlink w:anchor="_Toc243662442" w:history="1">
+          <w:hyperlink w:anchor="_Toc243666901" w:history="1">
             <w:r>
               <w:rPr>
                 <w:rStyle w:val="Hyperlink"/>
@@ -6701,7 +6701,7 @@
               <w:rPr>
                 <w:noProof/>
               </w:rPr>
-              <w:instrText xml:space="preserve"> PAGEREF _Toc243662442 \h </w:instrText>
+              <w:instrText xml:space="preserve"> PAGEREF _Toc243666901 \h </w:instrText>
             </w:r>
             <w:r>
               <w:rPr>
@@ -6744,7 +6744,7 @@
               <w14:ligatures w14:val="standardContextual"/>
             </w:rPr>
           </w:pPr>
-          <w:hyperlink w:anchor="_Toc243662443" w:history="1">
+          <w:hyperlink w:anchor="_Toc243666902" w:history="1">
             <w:r>
               <w:rPr>
                 <w:rStyle w:val="Hyperlink"/>
@@ -6768,7 +6768,7 @@
               <w:rPr>
                 <w:noProof/>
               </w:rPr>
-              <w:instrText xml:space="preserve"> PAGEREF _Toc243662443 \h </w:instrText>
+              <w:instrText xml:space="preserve"> PAGEREF _Toc243666902 \h </w:instrText>
             </w:r>
             <w:r>
               <w:rPr>
@@ -6811,7 +6811,7 @@
               <w14:ligatures w14:val="standardContextual"/>
             </w:rPr>
           </w:pPr>
-          <w:hyperlink w:anchor="_Toc243662444" w:history="1">
+          <w:hyperlink w:anchor="_Toc243666903" w:history="1">
             <w:r>
               <w:rPr>
                 <w:rStyle w:val="Hyperlink"/>
@@ -6835,7 +6835,7 @@
               <w:rPr>
                 <w:noProof/>
               </w:rPr>
-              <w:instrText xml:space="preserve"> PAGEREF _Toc243662444 \h </w:instrText>
+              <w:instrText xml:space="preserve"> PAGEREF _Toc243666903 \h </w:instrText>
             </w:r>
             <w:r>
               <w:rPr>
@@ -6878,7 +6878,7 @@
               <w14:ligatures w14:val="standardContextual"/>
             </w:rPr>
           </w:pPr>
-          <w:hyperlink w:anchor="_Toc243662445" w:history="1">
+          <w:hyperlink w:anchor="_Toc243666904" w:history="1">
             <w:r>
               <w:rPr>
                 <w:rStyle w:val="Hyperlink"/>
@@ -6902,7 +6902,7 @@
               <w:rPr>
                 <w:noProof/>
               </w:rPr>
-              <w:instrText xml:space="preserve"> PAGEREF _Toc243662445 \h </w:instrText>
+              <w:instrText xml:space="preserve"> PAGEREF _Toc243666904 \h </w:instrText>
             </w:r>
             <w:r>
               <w:rPr>
@@ -6945,7 +6945,7 @@
               <w14:ligatures w14:val="standardContextual"/>
             </w:rPr>
           </w:pPr>
-          <w:hyperlink w:anchor="_Toc243662446" w:history="1">
+          <w:hyperlink w:anchor="_Toc243666905" w:history="1">
             <w:r>
               <w:rPr>
                 <w:rStyle w:val="Hyperlink"/>
@@ -6969,7 +6969,7 @@
               <w:rPr>
                 <w:noProof/>
               </w:rPr>
-              <w:instrText xml:space="preserve"> PAGEREF _Toc243662446 \h </w:instrText>
+              <w:instrText xml:space="preserve"> PAGEREF _Toc243666905 \h </w:instrText>
             </w:r>
             <w:r>
               <w:rPr>
@@ -7012,7 +7012,7 @@
               <w14:ligatures w14:val="standardContextual"/>
             </w:rPr>
           </w:pPr>
-          <w:hyperlink w:anchor="_Toc243662447" w:history="1">
+          <w:hyperlink w:anchor="_Toc243666906" w:history="1">
             <w:r>
               <w:rPr>
                 <w:rStyle w:val="Hyperlink"/>
@@ -7036,7 +7036,7 @@
               <w:rPr>
                 <w:noProof/>
               </w:rPr>
-              <w:instrText xml:space="preserve"> PAGEREF _Toc243662447 \h </w:instrText>
+              <w:instrText xml:space="preserve"> PAGEREF _Toc243666906 \h </w:instrText>
             </w:r>
             <w:r>
               <w:rPr>
@@ -7079,7 +7079,7 @@
               <w14:ligatures w14:val="standardContextual"/>
             </w:rPr>
           </w:pPr>
-          <w:hyperlink w:anchor="_Toc243662448" w:history="1">
+          <w:hyperlink w:anchor="_Toc243666907" w:history="1">
             <w:r>
               <w:rPr>
                 <w:rStyle w:val="Hyperlink"/>
@@ -7103,7 +7103,7 @@
               <w:rPr>
                 <w:noProof/>
               </w:rPr>
-              <w:instrText xml:space="preserve"> PAGEREF _Toc243662448 \h </w:instrText>
+              <w:instrText xml:space="preserve"> PAGEREF _Toc243666907 \h </w:instrText>
             </w:r>
             <w:r>
               <w:rPr>
@@ -7146,7 +7146,7 @@
               <w14:ligatures w14:val="standardContextual"/>
             </w:rPr>
           </w:pPr>
-          <w:hyperlink w:anchor="_Toc243662449" w:history="1">
+          <w:hyperlink w:anchor="_Toc243666908" w:history="1">
             <w:r>
               <w:rPr>
                 <w:rStyle w:val="Hyperlink"/>
@@ -7170,7 +7170,7 @@
               <w:rPr>
                 <w:noProof/>
               </w:rPr>
-              <w:instrText xml:space="preserve"> PAGEREF _Toc243662449 \h </w:instrText>
+              <w:instrText xml:space="preserve"> PAGEREF _Toc243666908 \h </w:instrText>
             </w:r>
             <w:r>
               <w:rPr>
@@ -7211,7 +7211,7 @@
         <w:keepLines/>
         <w:pageBreakBefore/>
       </w:pPr>
-      <w:bookmarkStart w:id="0" w:name="_Toc243662383"/>
+      <w:bookmarkStart w:id="0" w:name="_Toc243666842"/>
       <w:r>
         <w:lastRenderedPageBreak/>
         <w:t>1 Introduction</w:t>
@@ -7224,7 +7224,7 @@
         <w:keepNext/>
         <w:keepLines/>
       </w:pPr>
-      <w:bookmarkStart w:id="1" w:name="_Toc243662384"/>
+      <w:bookmarkStart w:id="1" w:name="_Toc243666843"/>
       <w:r>
         <w:t>1.1 Purpose</w:t>
       </w:r>
@@ -7257,7 +7257,7 @@
         <w:keepNext/>
         <w:keepLines/>
       </w:pPr>
-      <w:bookmarkStart w:id="2" w:name="_Toc243662385"/>
+      <w:bookmarkStart w:id="2" w:name="_Toc243666844"/>
       <w:r>
         <w:t>1.2 Scope</w:t>
       </w:r>
@@ -7277,7 +7277,7 @@
         <w:keepNext/>
         <w:keepLines/>
       </w:pPr>
-      <w:bookmarkStart w:id="3" w:name="_Toc243662386"/>
+      <w:bookmarkStart w:id="3" w:name="_Toc243666845"/>
       <w:r>
         <w:t>1.3 Intended audience</w:t>
       </w:r>
@@ -7297,7 +7297,7 @@
         <w:keepNext/>
         <w:keepLines/>
       </w:pPr>
-      <w:bookmarkStart w:id="4" w:name="_Toc243662387"/>
+      <w:bookmarkStart w:id="4" w:name="_Toc243666846"/>
       <w:r>
         <w:t>1.4 Relationship to other documents</w:t>
       </w:r>
@@ -7308,7 +7308,7 @@
         <w:pStyle w:val="Caption"/>
         <w:keepNext/>
       </w:pPr>
-      <w:bookmarkStart w:id="5" w:name="_Toc243662420"/>
+      <w:bookmarkStart w:id="5" w:name="_Toc243666879"/>
       <w:r>
         <w:t xml:space="preserve">Table </w:t>
       </w:r>
@@ -8069,7 +8069,7 @@
         <w:keepNext/>
         <w:keepLines/>
       </w:pPr>
-      <w:bookmarkStart w:id="6" w:name="_Toc243662388"/>
+      <w:bookmarkStart w:id="6" w:name="_Toc243666847"/>
       <w:r>
         <w:t>1.5 Conventions</w:t>
       </w:r>
@@ -8117,7 +8117,7 @@
         <w:keepLines/>
         <w:pageBreakBefore/>
       </w:pPr>
-      <w:bookmarkStart w:id="7" w:name="_Toc243662389"/>
+      <w:bookmarkStart w:id="7" w:name="_Toc243666848"/>
       <w:r>
         <w:lastRenderedPageBreak/>
         <w:t>2 Design principles</w:t>
@@ -8129,7 +8129,7 @@
         <w:pStyle w:val="Caption"/>
         <w:keepNext/>
       </w:pPr>
-      <w:bookmarkStart w:id="8" w:name="_Toc243662421"/>
+      <w:bookmarkStart w:id="8" w:name="_Toc243666880"/>
       <w:r>
         <w:t xml:space="preserve">Table </w:t>
       </w:r>
@@ -9617,7 +9617,7 @@
         <w:keepLines/>
         <w:pageBreakBefore/>
       </w:pPr>
-      <w:bookmarkStart w:id="9" w:name="_Toc243662390"/>
+      <w:bookmarkStart w:id="9" w:name="_Toc243666849"/>
       <w:r>
         <w:lastRenderedPageBreak/>
         <w:t>3 Personas and key journeys</w:t>
@@ -9637,7 +9637,7 @@
         <w:pStyle w:val="Caption"/>
         <w:keepNext/>
       </w:pPr>
-      <w:bookmarkStart w:id="10" w:name="_Toc243662422"/>
+      <w:bookmarkStart w:id="10" w:name="_Toc243666881"/>
       <w:r>
         <w:t xml:space="preserve">Table </w:t>
       </w:r>
@@ -10426,7 +10426,7 @@
         <w:pStyle w:val="Caption"/>
         <w:keepNext/>
       </w:pPr>
-      <w:bookmarkStart w:id="11" w:name="_Toc243662423"/>
+      <w:bookmarkStart w:id="11" w:name="_Toc243666882"/>
       <w:r>
         <w:t xml:space="preserve">Table </w:t>
       </w:r>
@@ -11438,7 +11438,7 @@
         <w:keepLines/>
         <w:pageBreakBefore/>
       </w:pPr>
-      <w:bookmarkStart w:id="12" w:name="_Toc243662391"/>
+      <w:bookmarkStart w:id="12" w:name="_Toc243666850"/>
       <w:r>
         <w:lastRenderedPageBreak/>
         <w:t>4 Information architecture and navigation</w:t>
@@ -11451,7 +11451,7 @@
         <w:keepNext/>
         <w:keepLines/>
       </w:pPr>
-      <w:bookmarkStart w:id="13" w:name="_Toc243662392"/>
+      <w:bookmarkStart w:id="13" w:name="_Toc243666851"/>
       <w:r>
         <w:t>4.1 Structure</w:t>
       </w:r>
@@ -11503,7 +11503,7 @@
         <w:pStyle w:val="Caption"/>
         <w:keepNext/>
       </w:pPr>
-      <w:bookmarkStart w:id="14" w:name="_Toc243662424"/>
+      <w:bookmarkStart w:id="14" w:name="_Toc243666883"/>
       <w:r>
         <w:t xml:space="preserve">Table </w:t>
       </w:r>
@@ -12386,7 +12386,7 @@
         <w:keepNext/>
         <w:keepLines/>
       </w:pPr>
-      <w:bookmarkStart w:id="15" w:name="_Toc243662393"/>
+      <w:bookmarkStart w:id="15" w:name="_Toc243666852"/>
       <w:r>
         <w:t>4.2 </w:t>
       </w:r>
@@ -12432,7 +12432,7 @@
         <w:pStyle w:val="Caption"/>
         <w:keepNext/>
       </w:pPr>
-      <w:bookmarkStart w:id="16" w:name="_Toc243662425"/>
+      <w:bookmarkStart w:id="16" w:name="_Toc243666884"/>
       <w:r>
         <w:t xml:space="preserve">Table </w:t>
       </w:r>
@@ -13221,7 +13221,7 @@
         <w:keepNext/>
         <w:keepLines/>
       </w:pPr>
-      <w:bookmarkStart w:id="17" w:name="_Toc243662394"/>
+      <w:bookmarkStart w:id="17" w:name="_Toc243666853"/>
       <w:r>
         <w:lastRenderedPageBreak/>
         <w:t>4.3 Route table</w:t>
@@ -13233,7 +13233,7 @@
         <w:pStyle w:val="Caption"/>
         <w:keepNext/>
       </w:pPr>
-      <w:bookmarkStart w:id="18" w:name="_Toc243662426"/>
+      <w:bookmarkStart w:id="18" w:name="_Toc243666885"/>
       <w:r>
         <w:t xml:space="preserve">Table </w:t>
       </w:r>
@@ -16189,7 +16189,7 @@
         <w:keepNext/>
         <w:keepLines/>
       </w:pPr>
-      <w:bookmarkStart w:id="19" w:name="_Toc243662395"/>
+      <w:bookmarkStart w:id="19" w:name="_Toc243666854"/>
       <w:r>
         <w:t>4.4 Guards</w:t>
       </w:r>
@@ -16200,7 +16200,7 @@
         <w:pStyle w:val="Caption"/>
         <w:keepNext/>
       </w:pPr>
-      <w:bookmarkStart w:id="20" w:name="_Toc243662427"/>
+      <w:bookmarkStart w:id="20" w:name="_Toc243666886"/>
       <w:r>
         <w:t xml:space="preserve">Table </w:t>
       </w:r>
@@ -16844,7 +16844,7 @@
         <w:keepLines/>
         <w:pageBreakBefore/>
       </w:pPr>
-      <w:bookmarkStart w:id="21" w:name="_Toc243662396"/>
+      <w:bookmarkStart w:id="21" w:name="_Toc243666855"/>
       <w:r>
         <w:lastRenderedPageBreak/>
         <w:t>5 Design system</w:t>
@@ -16857,7 +16857,7 @@
         <w:keepNext/>
         <w:keepLines/>
       </w:pPr>
-      <w:bookmarkStart w:id="22" w:name="_Toc243662397"/>
+      <w:bookmarkStart w:id="22" w:name="_Toc243666856"/>
       <w:r>
         <w:t>5.1 Colour roles</w:t>
       </w:r>
@@ -16876,7 +16876,7 @@
         <w:pStyle w:val="Caption"/>
         <w:keepNext/>
       </w:pPr>
-      <w:bookmarkStart w:id="23" w:name="_Toc243662428"/>
+      <w:bookmarkStart w:id="23" w:name="_Toc243666887"/>
       <w:r>
         <w:t xml:space="preserve">Table </w:t>
       </w:r>
@@ -18900,7 +18900,7 @@
         <w:keepNext/>
         <w:keepLines/>
       </w:pPr>
-      <w:bookmarkStart w:id="24" w:name="_Toc243662398"/>
+      <w:bookmarkStart w:id="24" w:name="_Toc243666857"/>
       <w:r>
         <w:t>5.2 Typography</w:t>
       </w:r>
@@ -18971,7 +18971,7 @@
         <w:pStyle w:val="Caption"/>
         <w:keepNext/>
       </w:pPr>
-      <w:bookmarkStart w:id="25" w:name="_Toc243662429"/>
+      <w:bookmarkStart w:id="25" w:name="_Toc243666888"/>
       <w:r>
         <w:t xml:space="preserve">Table </w:t>
       </w:r>
@@ -20685,7 +20685,7 @@
         <w:keepNext/>
         <w:keepLines/>
       </w:pPr>
-      <w:bookmarkStart w:id="26" w:name="_Toc243662399"/>
+      <w:bookmarkStart w:id="26" w:name="_Toc243666858"/>
       <w:r>
         <w:t>5.3 Spacing, shape and elevation</w:t>
       </w:r>
@@ -20696,7 +20696,7 @@
         <w:pStyle w:val="Caption"/>
         <w:keepNext/>
       </w:pPr>
-      <w:bookmarkStart w:id="27" w:name="_Toc243662430"/>
+      <w:bookmarkStart w:id="27" w:name="_Toc243666889"/>
       <w:r>
         <w:t xml:space="preserve">Table </w:t>
       </w:r>
@@ -21384,7 +21384,7 @@
         <w:keepNext/>
         <w:keepLines/>
       </w:pPr>
-      <w:bookmarkStart w:id="28" w:name="_Toc243662400"/>
+      <w:bookmarkStart w:id="28" w:name="_Toc243666859"/>
       <w:r>
         <w:t>5.4 Components</w:t>
       </w:r>
@@ -21395,7 +21395,7 @@
         <w:pStyle w:val="Caption"/>
         <w:keepNext/>
       </w:pPr>
-      <w:bookmarkStart w:id="29" w:name="_Toc243662431"/>
+      <w:bookmarkStart w:id="29" w:name="_Toc243666890"/>
       <w:r>
         <w:t xml:space="preserve">Table </w:t>
       </w:r>
@@ -23994,7 +23994,7 @@
         <w:keepLines/>
         <w:pageBreakBefore/>
       </w:pPr>
-      <w:bookmarkStart w:id="30" w:name="_Toc243662401"/>
+      <w:bookmarkStart w:id="30" w:name="_Toc243666860"/>
       <w:r>
         <w:lastRenderedPageBreak/>
         <w:t>6 </w:t>
@@ -24058,7 +24058,7 @@
         <w:keepNext/>
         <w:keepLines/>
       </w:pPr>
-      <w:bookmarkStart w:id="31" w:name="_Toc243662402"/>
+      <w:bookmarkStart w:id="31" w:name="_Toc243666861"/>
       <w:r>
         <w:t>6.1 Welcome, Intro and About you (onboarding)</w:t>
       </w:r>
@@ -24069,7 +24069,7 @@
         <w:pStyle w:val="Caption"/>
         <w:keepNext/>
       </w:pPr>
-      <w:bookmarkStart w:id="32" w:name="_Toc243662432"/>
+      <w:bookmarkStart w:id="32" w:name="_Toc243666891"/>
       <w:r>
         <w:t xml:space="preserve">Table </w:t>
       </w:r>
@@ -24605,7 +24605,7 @@
         <w:keepNext/>
         <w:keepLines/>
       </w:pPr>
-      <w:bookmarkStart w:id="33" w:name="_Toc243662403"/>
+      <w:bookmarkStart w:id="33" w:name="_Toc243666862"/>
       <w:r>
         <w:t>6.2 Account (sign up, log in, recover, recovery code, complete your account)</w:t>
       </w:r>
@@ -24616,7 +24616,7 @@
         <w:pStyle w:val="Caption"/>
         <w:keepNext/>
       </w:pPr>
-      <w:bookmarkStart w:id="34" w:name="_Toc243662433"/>
+      <w:bookmarkStart w:id="34" w:name="_Toc243666892"/>
       <w:r>
         <w:t xml:space="preserve">Table </w:t>
       </w:r>
@@ -25076,7 +25076,7 @@
         <w:keepNext/>
         <w:keepLines/>
       </w:pPr>
-      <w:bookmarkStart w:id="35" w:name="_Toc243662404"/>
+      <w:bookmarkStart w:id="35" w:name="_Toc243666863"/>
       <w:r>
         <w:t>6.3 Paths (home)</w:t>
       </w:r>
@@ -25087,7 +25087,7 @@
         <w:pStyle w:val="Caption"/>
         <w:keepNext/>
       </w:pPr>
-      <w:bookmarkStart w:id="36" w:name="_Toc243662434"/>
+      <w:bookmarkStart w:id="36" w:name="_Toc243666893"/>
       <w:r>
         <w:t xml:space="preserve">Table </w:t>
       </w:r>
@@ -25516,7 +25516,7 @@
         <w:keepNext/>
         <w:keepLines/>
       </w:pPr>
-      <w:bookmarkStart w:id="37" w:name="_Toc243662405"/>
+      <w:bookmarkStart w:id="37" w:name="_Toc243666864"/>
       <w:r>
         <w:t>6.4 Courses</w:t>
       </w:r>
@@ -25527,7 +25527,7 @@
         <w:pStyle w:val="Caption"/>
         <w:keepNext/>
       </w:pPr>
-      <w:bookmarkStart w:id="38" w:name="_Toc243662435"/>
+      <w:bookmarkStart w:id="38" w:name="_Toc243666894"/>
       <w:r>
         <w:t xml:space="preserve">Table </w:t>
       </w:r>
@@ -26003,7 +26003,7 @@
         <w:keepNext/>
         <w:keepLines/>
       </w:pPr>
-      <w:bookmarkStart w:id="39" w:name="_Toc243662406"/>
+      <w:bookmarkStart w:id="39" w:name="_Toc243666865"/>
       <w:r>
         <w:t>6.5 Course detail</w:t>
       </w:r>
@@ -26014,7 +26014,7 @@
         <w:pStyle w:val="Caption"/>
         <w:keepNext/>
       </w:pPr>
-      <w:bookmarkStart w:id="40" w:name="_Toc243662436"/>
+      <w:bookmarkStart w:id="40" w:name="_Toc243666895"/>
       <w:r>
         <w:t xml:space="preserve">Table </w:t>
       </w:r>
@@ -26609,7 +26609,7 @@
         <w:keepNext/>
         <w:keepLines/>
       </w:pPr>
-      <w:bookmarkStart w:id="41" w:name="_Toc243662407"/>
+      <w:bookmarkStart w:id="41" w:name="_Toc243666866"/>
       <w:r>
         <w:lastRenderedPageBreak/>
         <w:t>6.6 Compare</w:t>
@@ -26621,7 +26621,7 @@
         <w:pStyle w:val="Caption"/>
         <w:keepNext/>
       </w:pPr>
-      <w:bookmarkStart w:id="42" w:name="_Toc243662437"/>
+      <w:bookmarkStart w:id="42" w:name="_Toc243666896"/>
       <w:r>
         <w:t xml:space="preserve">Table </w:t>
       </w:r>
@@ -27049,7 +27049,7 @@
         <w:keepNext/>
         <w:keepLines/>
       </w:pPr>
-      <w:bookmarkStart w:id="43" w:name="_Toc243662408"/>
+      <w:bookmarkStart w:id="43" w:name="_Toc243666867"/>
       <w:r>
         <w:t>6.7 My list</w:t>
       </w:r>
@@ -27060,7 +27060,7 @@
         <w:pStyle w:val="Caption"/>
         <w:keepNext/>
       </w:pPr>
-      <w:bookmarkStart w:id="44" w:name="_Toc243662438"/>
+      <w:bookmarkStart w:id="44" w:name="_Toc243666897"/>
       <w:r>
         <w:t xml:space="preserve">Table </w:t>
       </w:r>
@@ -27545,7 +27545,7 @@
         <w:keepNext/>
         <w:keepLines/>
       </w:pPr>
-      <w:bookmarkStart w:id="45" w:name="_Toc243662409"/>
+      <w:bookmarkStart w:id="45" w:name="_Toc243666868"/>
       <w:r>
         <w:t>6.8 Guide to applying to the UGC (CR-012)</w:t>
       </w:r>
@@ -27556,7 +27556,7 @@
         <w:pStyle w:val="Caption"/>
         <w:keepNext/>
       </w:pPr>
-      <w:bookmarkStart w:id="46" w:name="_Toc243662439"/>
+      <w:bookmarkStart w:id="46" w:name="_Toc243666898"/>
       <w:r>
         <w:t xml:space="preserve">Table </w:t>
       </w:r>
@@ -28145,7 +28145,7 @@
         <w:keepNext/>
         <w:keepLines/>
       </w:pPr>
-      <w:bookmarkStart w:id="47" w:name="_Toc243662410"/>
+      <w:bookmarkStart w:id="47" w:name="_Toc243666869"/>
       <w:r>
         <w:t>6.9 Journey</w:t>
       </w:r>
@@ -28156,7 +28156,7 @@
         <w:pStyle w:val="Caption"/>
         <w:keepNext/>
       </w:pPr>
-      <w:bookmarkStart w:id="48" w:name="_Toc243662440"/>
+      <w:bookmarkStart w:id="48" w:name="_Toc243666899"/>
       <w:r>
         <w:t xml:space="preserve">Table </w:t>
       </w:r>
@@ -28632,7 +28632,7 @@
         <w:keepNext/>
         <w:keepLines/>
       </w:pPr>
-      <w:bookmarkStart w:id="49" w:name="_Toc243662411"/>
+      <w:bookmarkStart w:id="49" w:name="_Toc243666870"/>
       <w:r>
         <w:t>6.10 Ask ZedPath</w:t>
       </w:r>
@@ -28643,7 +28643,7 @@
         <w:pStyle w:val="Caption"/>
         <w:keepNext/>
       </w:pPr>
-      <w:bookmarkStart w:id="50" w:name="_Toc243662441"/>
+      <w:bookmarkStart w:id="50" w:name="_Toc243666900"/>
       <w:r>
         <w:t xml:space="preserve">Table </w:t>
       </w:r>
@@ -29167,7 +29167,7 @@
         <w:keepNext/>
         <w:keepLines/>
       </w:pPr>
-      <w:bookmarkStart w:id="51" w:name="_Toc243662412"/>
+      <w:bookmarkStart w:id="51" w:name="_Toc243666871"/>
       <w:r>
         <w:t>6.11 Groups, Group room and Group info</w:t>
       </w:r>
@@ -29178,7 +29178,7 @@
         <w:pStyle w:val="Caption"/>
         <w:keepNext/>
       </w:pPr>
-      <w:bookmarkStart w:id="52" w:name="_Toc243662442"/>
+      <w:bookmarkStart w:id="52" w:name="_Toc243666901"/>
       <w:r>
         <w:t xml:space="preserve">Table </w:t>
       </w:r>
@@ -29647,7 +29647,7 @@
         <w:keepNext/>
         <w:keepLines/>
       </w:pPr>
-      <w:bookmarkStart w:id="53" w:name="_Toc243662413"/>
+      <w:bookmarkStart w:id="53" w:name="_Toc243666872"/>
       <w:r>
         <w:lastRenderedPageBreak/>
         <w:t>6.12 Me</w:t>
@@ -29659,7 +29659,7 @@
         <w:pStyle w:val="Caption"/>
         <w:keepNext/>
       </w:pPr>
-      <w:bookmarkStart w:id="54" w:name="_Toc243662443"/>
+      <w:bookmarkStart w:id="54" w:name="_Toc243666902"/>
       <w:r>
         <w:t xml:space="preserve">Table </w:t>
       </w:r>
@@ -30095,7 +30095,7 @@
         <w:keepLines/>
         <w:pageBreakBefore/>
       </w:pPr>
-      <w:bookmarkStart w:id="55" w:name="_Toc243662414"/>
+      <w:bookmarkStart w:id="55" w:name="_Toc243666873"/>
       <w:r>
         <w:lastRenderedPageBreak/>
         <w:t>7 Interaction patterns</w:t>
@@ -30107,7 +30107,7 @@
         <w:pStyle w:val="Caption"/>
         <w:keepNext/>
       </w:pPr>
-      <w:bookmarkStart w:id="56" w:name="_Toc243662444"/>
+      <w:bookmarkStart w:id="56" w:name="_Toc243666903"/>
       <w:r>
         <w:t xml:space="preserve">Table </w:t>
       </w:r>
@@ -31286,7 +31286,7 @@
         <w:keepLines/>
         <w:pageBreakBefore/>
       </w:pPr>
-      <w:bookmarkStart w:id="57" w:name="_Toc243662415"/>
+      <w:bookmarkStart w:id="57" w:name="_Toc243666874"/>
       <w:r>
         <w:lastRenderedPageBreak/>
         <w:t>8 Content and language</w:t>
@@ -31298,7 +31298,7 @@
         <w:pStyle w:val="Caption"/>
         <w:keepNext/>
       </w:pPr>
-      <w:bookmarkStart w:id="58" w:name="_Toc243662445"/>
+      <w:bookmarkStart w:id="58" w:name="_Toc243666904"/>
       <w:r>
         <w:t xml:space="preserve">Table </w:t>
       </w:r>
@@ -32072,7 +32072,7 @@
         <w:keepLines/>
         <w:pageBreakBefore/>
       </w:pPr>
-      <w:bookmarkStart w:id="59" w:name="_Toc243662416"/>
+      <w:bookmarkStart w:id="59" w:name="_Toc243666875"/>
       <w:r>
         <w:lastRenderedPageBreak/>
         <w:t>9 Accessibility checklist (WCAG 2.2 AA)</w:t>
@@ -32092,7 +32092,7 @@
         <w:pStyle w:val="Caption"/>
         <w:keepNext/>
       </w:pPr>
-      <w:bookmarkStart w:id="60" w:name="_Toc243662446"/>
+      <w:bookmarkStart w:id="60" w:name="_Toc243666905"/>
       <w:r>
         <w:t xml:space="preserve">Table </w:t>
       </w:r>
@@ -33846,7 +33846,7 @@
         <w:keepLines/>
         <w:pageBreakBefore/>
       </w:pPr>
-      <w:bookmarkStart w:id="61" w:name="_Toc243662417"/>
+      <w:bookmarkStart w:id="61" w:name="_Toc243666876"/>
       <w:r>
         <w:lastRenderedPageBreak/>
         <w:t>10 Performance budget for 3G</w:t>
@@ -33858,7 +33858,7 @@
         <w:pStyle w:val="Caption"/>
         <w:keepNext/>
       </w:pPr>
-      <w:bookmarkStart w:id="62" w:name="_Toc243662447"/>
+      <w:bookmarkStart w:id="62" w:name="_Toc243666906"/>
       <w:r>
         <w:t xml:space="preserve">Table </w:t>
       </w:r>
@@ -34690,7 +34690,7 @@
         <w:keepLines/>
         <w:pageBreakBefore/>
       </w:pPr>
-      <w:bookmarkStart w:id="63" w:name="_Toc243662418"/>
+      <w:bookmarkStart w:id="63" w:name="_Toc243666877"/>
       <w:r>
         <w:lastRenderedPageBreak/>
         <w:t>11 Usability evidence</w:t>
@@ -34710,7 +34710,7 @@
         <w:pStyle w:val="Caption"/>
         <w:keepNext/>
       </w:pPr>
-      <w:bookmarkStart w:id="64" w:name="_Toc243662448"/>
+      <w:bookmarkStart w:id="64" w:name="_Toc243666907"/>
       <w:r>
         <w:t xml:space="preserve">Table </w:t>
       </w:r>
@@ -36448,7 +36448,7 @@
         <w:keepLines/>
         <w:pageBreakBefore/>
       </w:pPr>
-      <w:bookmarkStart w:id="65" w:name="_Toc243662419"/>
+      <w:bookmarkStart w:id="65" w:name="_Toc243666878"/>
       <w:r>
         <w:lastRenderedPageBreak/>
         <w:t>12 Traceability</w:t>
@@ -36460,7 +36460,7 @@
         <w:pStyle w:val="Caption"/>
         <w:keepNext/>
       </w:pPr>
-      <w:bookmarkStart w:id="66" w:name="_Toc243662449"/>
+      <w:bookmarkStart w:id="66" w:name="_Toc243666908"/>
       <w:r>
         <w:t xml:space="preserve">Table </w:t>
       </w:r>
@@ -37926,134 +37926,10 @@
 <file path=word/numbering.xml><?xml version="1.0" encoding="utf-8"?>
 <w:numbering xmlns:wpc="http://schemas.microsoft.com/office/word/2010/wordprocessingCanvas" xmlns:cx="http://schemas.microsoft.com/office/drawing/2014/chartex" xmlns:cx1="http://schemas.microsoft.com/office/drawing/2015/9/8/chartex" xmlns:cx2="http://schemas.microsoft.com/office/drawing/2015/10/21/chartex" xmlns:cx3="http://schemas.microsoft.com/office/drawing/2016/5/9/chartex" xmlns:cx4="http://schemas.microsoft.com/office/drawing/2016/5/10/chartex" xmlns:cx5="http://schemas.microsoft.com/office/drawing/2016/5/11/chartex" xmlns:cx6="http://schemas.microsoft.com/office/drawing/2016/5/12/chartex" xmlns:cx7="http://schemas.microsoft.com/office/drawing/2016/5/13/chartex" xmlns:cx8="http://schemas.microsoft.com/office/drawing/2016/5/14/chartex" xmlns:mc="http://schemas.openxmlformats.org/markup-compatibility/2006" xmlns:aink="http://schemas.microsoft.com/office/drawing/2016/ink" xmlns:am3d="http://schemas.microsoft.com/office/drawing/2017/model3d" xmlns:o="urn:schemas-microsoft-com:office:office" xmlns:oel="http://schemas.microsoft.com/office/2019/extlst" xmlns:r="http://schemas.openxmlformats.org/officeDocument/2006/relationships" xmlns:m="http://schemas.openxmlformats.org/officeDocument/2006/math" xmlns:v="urn:schemas-microsoft-com:vml" xmlns:wp14="http://schemas.microsoft.com/office/word/2010/wordprocessingDrawing" xmlns:wp="http://schemas.openxmlformats.org/drawingml/2006/wordprocessingDrawing" xmlns:w10="urn:schemas-microsoft-com:office:word" xmlns:w="http://schemas.openxmlformats.org/wordprocessingml/2006/main" xmlns:w14="http://schemas.microsoft.com/office/word/2010/wordml" xmlns:w15="http://schemas.microsoft.com/office/word/2012/wordml" xmlns:w16cex="http://schemas.microsoft.com/office/word/2018/wordml/cex" xmlns:w16cid="http://schemas.microsoft.com/office/word/2016/wordml/cid" xmlns:w16="http://schemas.microsoft.com/office/word/2018/wordml" xmlns:w16du="http://schemas.microsoft.com/office/word/2023/wordml/word16du" xmlns:w16sdtdh="http://schemas.microsoft.com/office/word/2020/wordml/sdtdatahash" xmlns:w16sdtfl="http://schemas.microsoft.com/office/word/2024/wordml/sdtformatlock" xmlns:w16se="http://schemas.microsoft.com/office/word/2015/wordml/symex" xmlns:wpg="http://schemas.microsoft.com/office/word/2010/wordprocessingGroup" xmlns:wpi="http://schemas.microsoft.com/office/word/2010/wordprocessingInk" xmlns:wne="http://schemas.microsoft.com/office/word/2006/wordml" xmlns:wps="http://schemas.microsoft.com/office/word/2010/wordprocessingShape" mc:Ignorable="w14 w15 w16se w16cid w16 w16cex w16sdtdh w16sdtfl w16du wp14">
   <w:abstractNum w:abstractNumId="0" w15:restartNumberingAfterBreak="0">
-    <w:nsid w:val="2A874A03"/>
+    <w:nsid w:val="0A43559D"/>
     <w:multiLevelType w:val="hybridMultilevel"/>
-    <w:tmpl w:val="1FD45638"/>
-    <w:lvl w:ilvl="0" w:tplc="048A6F46" w:tentative="1">
-      <w:start w:val="1"/>
-      <w:numFmt w:val="bullet"/>
-      <w:lvlText w:val="•"/>
-      <w:lvlJc w:val="left"/>
-      <w:pPr>
-        <w:ind w:left="720" w:hanging="280"/>
-      </w:pPr>
-    </w:lvl>
-    <w:lvl w:ilvl="1" w:tplc="5926836A" w:tentative="1">
-      <w:start w:val="1"/>
-      <w:numFmt w:val="bullet"/>
-      <w:lvlText w:val="–"/>
-      <w:lvlJc w:val="left"/>
-      <w:pPr>
-        <w:ind w:left="1080" w:hanging="280"/>
-      </w:pPr>
-    </w:lvl>
-    <w:lvl w:ilvl="2" w:tplc="F9B8A494" w:tentative="1">
-      <w:start w:val="1"/>
-      <w:numFmt w:val="bullet"/>
-      <w:lvlText w:val="▪"/>
-      <w:lvlJc w:val="left"/>
-      <w:pPr>
-        <w:ind w:left="1440" w:hanging="280"/>
-      </w:pPr>
-    </w:lvl>
-    <w:lvl w:ilvl="3" w:tplc="757C7D00">
-      <w:numFmt w:val="decimal"/>
-      <w:lvlText w:val=""/>
-      <w:lvlJc w:val="left"/>
-    </w:lvl>
-    <w:lvl w:ilvl="4" w:tplc="EAAC7C54">
-      <w:numFmt w:val="decimal"/>
-      <w:lvlText w:val=""/>
-      <w:lvlJc w:val="left"/>
-    </w:lvl>
-    <w:lvl w:ilvl="5" w:tplc="10BC5F00">
-      <w:numFmt w:val="decimal"/>
-      <w:lvlText w:val=""/>
-      <w:lvlJc w:val="left"/>
-    </w:lvl>
-    <w:lvl w:ilvl="6" w:tplc="F55427D0">
-      <w:numFmt w:val="decimal"/>
-      <w:lvlText w:val=""/>
-      <w:lvlJc w:val="left"/>
-    </w:lvl>
-    <w:lvl w:ilvl="7" w:tplc="BD72564A">
-      <w:numFmt w:val="decimal"/>
-      <w:lvlText w:val=""/>
-      <w:lvlJc w:val="left"/>
-    </w:lvl>
-    <w:lvl w:ilvl="8" w:tplc="C83E9DE0">
-      <w:numFmt w:val="decimal"/>
-      <w:lvlText w:val=""/>
-      <w:lvlJc w:val="left"/>
-    </w:lvl>
-  </w:abstractNum>
-  <w:abstractNum w:abstractNumId="1" w15:restartNumberingAfterBreak="0">
-    <w:nsid w:val="2C6A2B8C"/>
-    <w:multiLevelType w:val="hybridMultilevel"/>
-    <w:tmpl w:val="9F2CD256"/>
-    <w:lvl w:ilvl="0" w:tplc="AC10750C" w:tentative="1">
-      <w:start w:val="1"/>
-      <w:numFmt w:val="decimal"/>
-      <w:lvlText w:val="%1."/>
-      <w:lvlJc w:val="left"/>
-      <w:pPr>
-        <w:ind w:left="720" w:hanging="360"/>
-      </w:pPr>
-    </w:lvl>
-    <w:lvl w:ilvl="1" w:tplc="E95C02EA" w:tentative="1">
-      <w:start w:val="1"/>
-      <w:numFmt w:val="lowerLetter"/>
-      <w:lvlText w:val="%2."/>
-      <w:lvlJc w:val="left"/>
-      <w:pPr>
-        <w:ind w:left="1080" w:hanging="360"/>
-      </w:pPr>
-    </w:lvl>
-    <w:lvl w:ilvl="2" w:tplc="24368F98" w:tentative="1">
-      <w:start w:val="1"/>
-      <w:numFmt w:val="lowerRoman"/>
-      <w:lvlText w:val="%3."/>
-      <w:lvlJc w:val="left"/>
-      <w:pPr>
-        <w:ind w:left="1440" w:hanging="360"/>
-      </w:pPr>
-    </w:lvl>
-    <w:lvl w:ilvl="3" w:tplc="5E52CD4C">
-      <w:numFmt w:val="decimal"/>
-      <w:lvlText w:val=""/>
-      <w:lvlJc w:val="left"/>
-    </w:lvl>
-    <w:lvl w:ilvl="4" w:tplc="87B22260">
-      <w:numFmt w:val="decimal"/>
-      <w:lvlText w:val=""/>
-      <w:lvlJc w:val="left"/>
-    </w:lvl>
-    <w:lvl w:ilvl="5" w:tplc="495013B4">
-      <w:numFmt w:val="decimal"/>
-      <w:lvlText w:val=""/>
-      <w:lvlJc w:val="left"/>
-    </w:lvl>
-    <w:lvl w:ilvl="6" w:tplc="1C96E54E">
-      <w:numFmt w:val="decimal"/>
-      <w:lvlText w:val=""/>
-      <w:lvlJc w:val="left"/>
-    </w:lvl>
-    <w:lvl w:ilvl="7" w:tplc="821CD090">
-      <w:numFmt w:val="decimal"/>
-      <w:lvlText w:val=""/>
-      <w:lvlJc w:val="left"/>
-    </w:lvl>
-    <w:lvl w:ilvl="8" w:tplc="9A38E510">
-      <w:numFmt w:val="decimal"/>
-      <w:lvlText w:val=""/>
-      <w:lvlJc w:val="left"/>
-    </w:lvl>
-  </w:abstractNum>
-  <w:abstractNum w:abstractNumId="2" w15:restartNumberingAfterBreak="0">
-    <w:nsid w:val="74AB069E"/>
-    <w:multiLevelType w:val="hybridMultilevel"/>
-    <w:tmpl w:val="ED660938"/>
-    <w:lvl w:ilvl="0" w:tplc="17580454" w:tentative="1">
+    <w:tmpl w:val="AC0CCCF0"/>
+    <w:lvl w:ilvl="0" w:tplc="B4165FDE" w:tentative="1">
       <w:start w:val="1"/>
       <w:numFmt w:val="bullet"/>
       <w:lvlText w:val="●"/>
@@ -38062,7 +37938,7 @@
         <w:ind w:left="720" w:hanging="360"/>
       </w:pPr>
     </w:lvl>
-    <w:lvl w:ilvl="1" w:tplc="6EE6F844" w:tentative="1">
+    <w:lvl w:ilvl="1" w:tplc="55647756" w:tentative="1">
       <w:start w:val="1"/>
       <w:numFmt w:val="bullet"/>
       <w:lvlText w:val="○"/>
@@ -38071,7 +37947,7 @@
         <w:ind w:left="1440" w:hanging="360"/>
       </w:pPr>
     </w:lvl>
-    <w:lvl w:ilvl="2" w:tplc="FE64F92C" w:tentative="1">
+    <w:lvl w:ilvl="2" w:tplc="7C9CFD34" w:tentative="1">
       <w:start w:val="1"/>
       <w:numFmt w:val="bullet"/>
       <w:lvlText w:val="■"/>
@@ -38080,7 +37956,7 @@
         <w:ind w:left="2160" w:hanging="360"/>
       </w:pPr>
     </w:lvl>
-    <w:lvl w:ilvl="3" w:tplc="BECE7366" w:tentative="1">
+    <w:lvl w:ilvl="3" w:tplc="7D908B6E" w:tentative="1">
       <w:start w:val="1"/>
       <w:numFmt w:val="bullet"/>
       <w:lvlText w:val="●"/>
@@ -38089,7 +37965,7 @@
         <w:ind w:left="2880" w:hanging="360"/>
       </w:pPr>
     </w:lvl>
-    <w:lvl w:ilvl="4" w:tplc="A6EAE126" w:tentative="1">
+    <w:lvl w:ilvl="4" w:tplc="8BC23B5E" w:tentative="1">
       <w:start w:val="1"/>
       <w:numFmt w:val="bullet"/>
       <w:lvlText w:val="○"/>
@@ -38098,7 +37974,7 @@
         <w:ind w:left="3600" w:hanging="360"/>
       </w:pPr>
     </w:lvl>
-    <w:lvl w:ilvl="5" w:tplc="F7645870" w:tentative="1">
+    <w:lvl w:ilvl="5" w:tplc="E5B4CE48" w:tentative="1">
       <w:start w:val="1"/>
       <w:numFmt w:val="bullet"/>
       <w:lvlText w:val="■"/>
@@ -38107,7 +37983,7 @@
         <w:ind w:left="4320" w:hanging="360"/>
       </w:pPr>
     </w:lvl>
-    <w:lvl w:ilvl="6" w:tplc="1ED88E12" w:tentative="1">
+    <w:lvl w:ilvl="6" w:tplc="46386324" w:tentative="1">
       <w:start w:val="1"/>
       <w:numFmt w:val="bullet"/>
       <w:lvlText w:val="●"/>
@@ -38116,7 +37992,7 @@
         <w:ind w:left="5040" w:hanging="360"/>
       </w:pPr>
     </w:lvl>
-    <w:lvl w:ilvl="7" w:tplc="CB0E7C3C" w:tentative="1">
+    <w:lvl w:ilvl="7" w:tplc="F87C7196" w:tentative="1">
       <w:start w:val="1"/>
       <w:numFmt w:val="bullet"/>
       <w:lvlText w:val="●"/>
@@ -38125,7 +38001,7 @@
         <w:ind w:left="5760" w:hanging="360"/>
       </w:pPr>
     </w:lvl>
-    <w:lvl w:ilvl="8" w:tplc="870428A6" w:tentative="1">
+    <w:lvl w:ilvl="8" w:tplc="1D7C7948" w:tentative="1">
       <w:start w:val="1"/>
       <w:numFmt w:val="bullet"/>
       <w:lvlText w:val="●"/>
@@ -38135,8 +38011,132 @@
       </w:pPr>
     </w:lvl>
   </w:abstractNum>
-  <w:num w:numId="1" w16cid:durableId="2139756602">
-    <w:abstractNumId w:val="2"/>
+  <w:abstractNum w:abstractNumId="1" w15:restartNumberingAfterBreak="0">
+    <w:nsid w:val="21225D6C"/>
+    <w:multiLevelType w:val="hybridMultilevel"/>
+    <w:tmpl w:val="88DA7D88"/>
+    <w:lvl w:ilvl="0" w:tplc="46D4C16E" w:tentative="1">
+      <w:start w:val="1"/>
+      <w:numFmt w:val="decimal"/>
+      <w:lvlText w:val="%1."/>
+      <w:lvlJc w:val="left"/>
+      <w:pPr>
+        <w:ind w:left="720" w:hanging="360"/>
+      </w:pPr>
+    </w:lvl>
+    <w:lvl w:ilvl="1" w:tplc="2A881548" w:tentative="1">
+      <w:start w:val="1"/>
+      <w:numFmt w:val="lowerLetter"/>
+      <w:lvlText w:val="%2."/>
+      <w:lvlJc w:val="left"/>
+      <w:pPr>
+        <w:ind w:left="1080" w:hanging="360"/>
+      </w:pPr>
+    </w:lvl>
+    <w:lvl w:ilvl="2" w:tplc="B96CEF08" w:tentative="1">
+      <w:start w:val="1"/>
+      <w:numFmt w:val="lowerRoman"/>
+      <w:lvlText w:val="%3."/>
+      <w:lvlJc w:val="left"/>
+      <w:pPr>
+        <w:ind w:left="1440" w:hanging="360"/>
+      </w:pPr>
+    </w:lvl>
+    <w:lvl w:ilvl="3" w:tplc="853244A6">
+      <w:numFmt w:val="decimal"/>
+      <w:lvlText w:val=""/>
+      <w:lvlJc w:val="left"/>
+    </w:lvl>
+    <w:lvl w:ilvl="4" w:tplc="F59AC8F0">
+      <w:numFmt w:val="decimal"/>
+      <w:lvlText w:val=""/>
+      <w:lvlJc w:val="left"/>
+    </w:lvl>
+    <w:lvl w:ilvl="5" w:tplc="3EFC966C">
+      <w:numFmt w:val="decimal"/>
+      <w:lvlText w:val=""/>
+      <w:lvlJc w:val="left"/>
+    </w:lvl>
+    <w:lvl w:ilvl="6" w:tplc="4BA8E478">
+      <w:numFmt w:val="decimal"/>
+      <w:lvlText w:val=""/>
+      <w:lvlJc w:val="left"/>
+    </w:lvl>
+    <w:lvl w:ilvl="7" w:tplc="4B20A098">
+      <w:numFmt w:val="decimal"/>
+      <w:lvlText w:val=""/>
+      <w:lvlJc w:val="left"/>
+    </w:lvl>
+    <w:lvl w:ilvl="8" w:tplc="7FFC65E4">
+      <w:numFmt w:val="decimal"/>
+      <w:lvlText w:val=""/>
+      <w:lvlJc w:val="left"/>
+    </w:lvl>
+  </w:abstractNum>
+  <w:abstractNum w:abstractNumId="2" w15:restartNumberingAfterBreak="0">
+    <w:nsid w:val="3D4700B4"/>
+    <w:multiLevelType w:val="hybridMultilevel"/>
+    <w:tmpl w:val="2D0807D8"/>
+    <w:lvl w:ilvl="0" w:tplc="35B01940" w:tentative="1">
+      <w:start w:val="1"/>
+      <w:numFmt w:val="bullet"/>
+      <w:lvlText w:val="•"/>
+      <w:lvlJc w:val="left"/>
+      <w:pPr>
+        <w:ind w:left="720" w:hanging="280"/>
+      </w:pPr>
+    </w:lvl>
+    <w:lvl w:ilvl="1" w:tplc="13B0C08E" w:tentative="1">
+      <w:start w:val="1"/>
+      <w:numFmt w:val="bullet"/>
+      <w:lvlText w:val="–"/>
+      <w:lvlJc w:val="left"/>
+      <w:pPr>
+        <w:ind w:left="1080" w:hanging="280"/>
+      </w:pPr>
+    </w:lvl>
+    <w:lvl w:ilvl="2" w:tplc="B074F4F2" w:tentative="1">
+      <w:start w:val="1"/>
+      <w:numFmt w:val="bullet"/>
+      <w:lvlText w:val="▪"/>
+      <w:lvlJc w:val="left"/>
+      <w:pPr>
+        <w:ind w:left="1440" w:hanging="280"/>
+      </w:pPr>
+    </w:lvl>
+    <w:lvl w:ilvl="3" w:tplc="997003FE">
+      <w:numFmt w:val="decimal"/>
+      <w:lvlText w:val=""/>
+      <w:lvlJc w:val="left"/>
+    </w:lvl>
+    <w:lvl w:ilvl="4" w:tplc="625E0D0E">
+      <w:numFmt w:val="decimal"/>
+      <w:lvlText w:val=""/>
+      <w:lvlJc w:val="left"/>
+    </w:lvl>
+    <w:lvl w:ilvl="5" w:tplc="17D495F2">
+      <w:numFmt w:val="decimal"/>
+      <w:lvlText w:val=""/>
+      <w:lvlJc w:val="left"/>
+    </w:lvl>
+    <w:lvl w:ilvl="6" w:tplc="0CE2C056">
+      <w:numFmt w:val="decimal"/>
+      <w:lvlText w:val=""/>
+      <w:lvlJc w:val="left"/>
+    </w:lvl>
+    <w:lvl w:ilvl="7" w:tplc="2092E54A">
+      <w:numFmt w:val="decimal"/>
+      <w:lvlText w:val=""/>
+      <w:lvlJc w:val="left"/>
+    </w:lvl>
+    <w:lvl w:ilvl="8" w:tplc="C4F80268">
+      <w:numFmt w:val="decimal"/>
+      <w:lvlText w:val=""/>
+      <w:lvlJc w:val="left"/>
+    </w:lvl>
+  </w:abstractNum>
+  <w:num w:numId="1" w16cid:durableId="1208031984">
+    <w:abstractNumId w:val="0"/>
     <w:lvlOverride w:ilvl="0">
       <w:startOverride w:val="1"/>
     </w:lvlOverride>
@@ -38840,7 +38840,7 @@
     <w:autoRedefine/>
     <w:uiPriority w:val="39"/>
     <w:unhideWhenUsed/>
-    <w:rsid w:val="00A57FAC"/>
+    <w:rsid w:val="008D7DD1"/>
     <w:pPr>
       <w:spacing w:after="100"/>
     </w:pPr>
@@ -38852,7 +38852,7 @@
     <w:autoRedefine/>
     <w:uiPriority w:val="39"/>
     <w:unhideWhenUsed/>
-    <w:rsid w:val="00A57FAC"/>
+    <w:rsid w:val="008D7DD1"/>
     <w:pPr>
       <w:spacing w:after="100"/>
       <w:ind w:left="210"/>
@@ -38864,7 +38864,7 @@
     <w:next w:val="Normal"/>
     <w:uiPriority w:val="99"/>
     <w:unhideWhenUsed/>
-    <w:rsid w:val="00A57FAC"/>
+    <w:rsid w:val="008D7DD1"/>
   </w:style>
 </w:styles>
 </file>

</xml_diff>

<commit_message>
Docs for the search inside other paths: ZP-DOC-07 route screen, ZP-DOC-08 TC-146 (570 passed), README
Co-Authored-By: Claude Opus 5.5 (1M context) <noreply@anthropic.com>
</commit_message>
<xml_diff>
--- a/docs/07-ui-ux/ZP-DOC-07_UI-UX-Design.docx
+++ b/docs/07-ui-ux/ZP-DOC-07_UI-UX-Design.docx
@@ -2264,6 +2264,122 @@
           </w:p>
         </w:tc>
       </w:tr>
+      <w:tr>
+        <w:tblPrEx>
+          <w:tblCellMar>
+            <w:top w:w="0" w:type="dxa"/>
+            <w:bottom w:w="0" w:type="dxa"/>
+          </w:tblCellMar>
+        </w:tblPrEx>
+        <w:trPr>
+          <w:cantSplit/>
+          <w:trHeight w:val="420"/>
+        </w:trPr>
+        <w:tc>
+          <w:tcPr>
+            <w:tcW w:w="964" w:type="dxa"/>
+            <w:tcBorders>
+              <w:top w:val="single" w:sz="4" w:space="0" w:color="C9D3D0"/>
+              <w:left w:val="single" w:sz="4" w:space="0" w:color="C9D3D0"/>
+              <w:bottom w:val="single" w:sz="4" w:space="0" w:color="C9D3D0"/>
+              <w:right w:val="single" w:sz="4" w:space="0" w:color="C9D3D0"/>
+            </w:tcBorders>
+            <w:tcMar>
+              <w:top w:w="50" w:type="dxa"/>
+              <w:left w:w="100" w:type="dxa"/>
+              <w:bottom w:w="50" w:type="dxa"/>
+              <w:right w:w="100" w:type="dxa"/>
+            </w:tcMar>
+          </w:tcPr>
+          <w:p>
+            <w:r>
+              <w:rPr>
+                <w:sz w:val="19"/>
+                <w:szCs w:val="19"/>
+              </w:rPr>
+              <w:t>0.9</w:t>
+            </w:r>
+          </w:p>
+        </w:tc>
+        <w:tc>
+          <w:tcPr>
+            <w:tcW w:w="1542" w:type="dxa"/>
+            <w:tcBorders>
+              <w:top w:val="single" w:sz="4" w:space="0" w:color="C9D3D0"/>
+              <w:left w:val="single" w:sz="4" w:space="0" w:color="C9D3D0"/>
+              <w:bottom w:val="single" w:sz="4" w:space="0" w:color="C9D3D0"/>
+              <w:right w:val="single" w:sz="4" w:space="0" w:color="C9D3D0"/>
+            </w:tcBorders>
+            <w:tcMar>
+              <w:top w:w="50" w:type="dxa"/>
+              <w:left w:w="100" w:type="dxa"/>
+              <w:bottom w:w="50" w:type="dxa"/>
+              <w:right w:w="100" w:type="dxa"/>
+            </w:tcMar>
+          </w:tcPr>
+          <w:p>
+            <w:r>
+              <w:rPr>
+                <w:sz w:val="19"/>
+                <w:szCs w:val="19"/>
+              </w:rPr>
+              <w:t>23 Oct 2026</w:t>
+            </w:r>
+          </w:p>
+        </w:tc>
+        <w:tc>
+          <w:tcPr>
+            <w:tcW w:w="1928" w:type="dxa"/>
+            <w:tcBorders>
+              <w:top w:val="single" w:sz="4" w:space="0" w:color="C9D3D0"/>
+              <w:left w:val="single" w:sz="4" w:space="0" w:color="C9D3D0"/>
+              <w:bottom w:val="single" w:sz="4" w:space="0" w:color="C9D3D0"/>
+              <w:right w:val="single" w:sz="4" w:space="0" w:color="C9D3D0"/>
+            </w:tcBorders>
+            <w:tcMar>
+              <w:top w:w="50" w:type="dxa"/>
+              <w:left w:w="100" w:type="dxa"/>
+              <w:bottom w:w="50" w:type="dxa"/>
+              <w:right w:w="100" w:type="dxa"/>
+            </w:tcMar>
+          </w:tcPr>
+          <w:p>
+            <w:r>
+              <w:rPr>
+                <w:sz w:val="19"/>
+                <w:szCs w:val="19"/>
+              </w:rPr>
+              <w:t>Team Kestrel</w:t>
+            </w:r>
+          </w:p>
+        </w:tc>
+        <w:tc>
+          <w:tcPr>
+            <w:tcW w:w="5204" w:type="dxa"/>
+            <w:tcBorders>
+              <w:top w:val="single" w:sz="4" w:space="0" w:color="C9D3D0"/>
+              <w:left w:val="single" w:sz="4" w:space="0" w:color="C9D3D0"/>
+              <w:bottom w:val="single" w:sz="4" w:space="0" w:color="C9D3D0"/>
+              <w:right w:val="single" w:sz="4" w:space="0" w:color="C9D3D0"/>
+            </w:tcBorders>
+            <w:tcMar>
+              <w:top w:w="50" w:type="dxa"/>
+              <w:left w:w="100" w:type="dxa"/>
+              <w:bottom w:w="50" w:type="dxa"/>
+              <w:right w:w="100" w:type="dxa"/>
+            </w:tcMar>
+          </w:tcPr>
+          <w:p>
+            <w:r>
+              <w:rPr>
+                <w:sz w:val="19"/>
+                <w:szCs w:val="19"/>
+              </w:rPr>
+              <w:t>Other paths: search inside each group from a search icon in the top bar, left of the profile picture (name, institute and its short name, group, programmes)</w:t>
+            </w:r>
+          </w:p>
+        </w:tc>
+      </w:tr>
     </w:tbl>
     <w:p>
       <w:pPr>
@@ -2663,7 +2779,7 @@
     <w:sdt>
       <w:sdtPr>
         <w:alias w:val="Contents"/>
-        <w:id w:val="-1347016004"/>
+        <w:id w:val="1178696805"/>
       </w:sdtPr>
       <w:sdtEndPr/>
       <w:sdtContent>
@@ -2692,7 +2808,7 @@
           <w:r>
             <w:fldChar w:fldCharType="separate"/>
           </w:r>
-          <w:hyperlink w:anchor="_Toc243666842" w:history="1">
+          <w:hyperlink w:anchor="_Toc243666962" w:history="1">
             <w:r>
               <w:rPr>
                 <w:rStyle w:val="Hyperlink"/>
@@ -2716,7 +2832,7 @@
               <w:rPr>
                 <w:noProof/>
               </w:rPr>
-              <w:instrText xml:space="preserve"> PAGEREF _Toc243666842 \h </w:instrText>
+              <w:instrText xml:space="preserve"> PAGEREF _Toc243666962 \h </w:instrText>
             </w:r>
             <w:r>
               <w:rPr>
@@ -2759,7 +2875,7 @@
               <w14:ligatures w14:val="standardContextual"/>
             </w:rPr>
           </w:pPr>
-          <w:hyperlink w:anchor="_Toc243666843" w:history="1">
+          <w:hyperlink w:anchor="_Toc243666963" w:history="1">
             <w:r>
               <w:rPr>
                 <w:rStyle w:val="Hyperlink"/>
@@ -2783,7 +2899,7 @@
               <w:rPr>
                 <w:noProof/>
               </w:rPr>
-              <w:instrText xml:space="preserve"> PAGEREF _Toc243666843 \h </w:instrText>
+              <w:instrText xml:space="preserve"> PAGEREF _Toc243666963 \h </w:instrText>
             </w:r>
             <w:r>
               <w:rPr>
@@ -2826,7 +2942,7 @@
               <w14:ligatures w14:val="standardContextual"/>
             </w:rPr>
           </w:pPr>
-          <w:hyperlink w:anchor="_Toc243666844" w:history="1">
+          <w:hyperlink w:anchor="_Toc243666964" w:history="1">
             <w:r>
               <w:rPr>
                 <w:rStyle w:val="Hyperlink"/>
@@ -2850,7 +2966,7 @@
               <w:rPr>
                 <w:noProof/>
               </w:rPr>
-              <w:instrText xml:space="preserve"> PAGEREF _Toc243666844 \h </w:instrText>
+              <w:instrText xml:space="preserve"> PAGEREF _Toc243666964 \h </w:instrText>
             </w:r>
             <w:r>
               <w:rPr>
@@ -2893,7 +3009,7 @@
               <w14:ligatures w14:val="standardContextual"/>
             </w:rPr>
           </w:pPr>
-          <w:hyperlink w:anchor="_Toc243666845" w:history="1">
+          <w:hyperlink w:anchor="_Toc243666965" w:history="1">
             <w:r>
               <w:rPr>
                 <w:rStyle w:val="Hyperlink"/>
@@ -2917,7 +3033,7 @@
               <w:rPr>
                 <w:noProof/>
               </w:rPr>
-              <w:instrText xml:space="preserve"> PAGEREF _Toc243666845 \h </w:instrText>
+              <w:instrText xml:space="preserve"> PAGEREF _Toc243666965 \h </w:instrText>
             </w:r>
             <w:r>
               <w:rPr>
@@ -2960,7 +3076,7 @@
               <w14:ligatures w14:val="standardContextual"/>
             </w:rPr>
           </w:pPr>
-          <w:hyperlink w:anchor="_Toc243666846" w:history="1">
+          <w:hyperlink w:anchor="_Toc243666966" w:history="1">
             <w:r>
               <w:rPr>
                 <w:rStyle w:val="Hyperlink"/>
@@ -2984,7 +3100,7 @@
               <w:rPr>
                 <w:noProof/>
               </w:rPr>
-              <w:instrText xml:space="preserve"> PAGEREF _Toc243666846 \h </w:instrText>
+              <w:instrText xml:space="preserve"> PAGEREF _Toc243666966 \h </w:instrText>
             </w:r>
             <w:r>
               <w:rPr>
@@ -3027,7 +3143,7 @@
               <w14:ligatures w14:val="standardContextual"/>
             </w:rPr>
           </w:pPr>
-          <w:hyperlink w:anchor="_Toc243666847" w:history="1">
+          <w:hyperlink w:anchor="_Toc243666967" w:history="1">
             <w:r>
               <w:rPr>
                 <w:rStyle w:val="Hyperlink"/>
@@ -3051,7 +3167,7 @@
               <w:rPr>
                 <w:noProof/>
               </w:rPr>
-              <w:instrText xml:space="preserve"> PAGEREF _Toc243666847 \h </w:instrText>
+              <w:instrText xml:space="preserve"> PAGEREF _Toc243666967 \h </w:instrText>
             </w:r>
             <w:r>
               <w:rPr>
@@ -3094,7 +3210,7 @@
               <w14:ligatures w14:val="standardContextual"/>
             </w:rPr>
           </w:pPr>
-          <w:hyperlink w:anchor="_Toc243666848" w:history="1">
+          <w:hyperlink w:anchor="_Toc243666968" w:history="1">
             <w:r>
               <w:rPr>
                 <w:rStyle w:val="Hyperlink"/>
@@ -3118,7 +3234,7 @@
               <w:rPr>
                 <w:noProof/>
               </w:rPr>
-              <w:instrText xml:space="preserve"> PAGEREF _Toc243666848 \h </w:instrText>
+              <w:instrText xml:space="preserve"> PAGEREF _Toc243666968 \h </w:instrText>
             </w:r>
             <w:r>
               <w:rPr>
@@ -3161,7 +3277,7 @@
               <w14:ligatures w14:val="standardContextual"/>
             </w:rPr>
           </w:pPr>
-          <w:hyperlink w:anchor="_Toc243666849" w:history="1">
+          <w:hyperlink w:anchor="_Toc243666969" w:history="1">
             <w:r>
               <w:rPr>
                 <w:rStyle w:val="Hyperlink"/>
@@ -3185,7 +3301,7 @@
               <w:rPr>
                 <w:noProof/>
               </w:rPr>
-              <w:instrText xml:space="preserve"> PAGEREF _Toc243666849 \h </w:instrText>
+              <w:instrText xml:space="preserve"> PAGEREF _Toc243666969 \h </w:instrText>
             </w:r>
             <w:r>
               <w:rPr>
@@ -3228,7 +3344,7 @@
               <w14:ligatures w14:val="standardContextual"/>
             </w:rPr>
           </w:pPr>
-          <w:hyperlink w:anchor="_Toc243666850" w:history="1">
+          <w:hyperlink w:anchor="_Toc243666970" w:history="1">
             <w:r>
               <w:rPr>
                 <w:rStyle w:val="Hyperlink"/>
@@ -3252,7 +3368,7 @@
               <w:rPr>
                 <w:noProof/>
               </w:rPr>
-              <w:instrText xml:space="preserve"> PAGEREF _Toc243666850 \h </w:instrText>
+              <w:instrText xml:space="preserve"> PAGEREF _Toc243666970 \h </w:instrText>
             </w:r>
             <w:r>
               <w:rPr>
@@ -3295,7 +3411,7 @@
               <w14:ligatures w14:val="standardContextual"/>
             </w:rPr>
           </w:pPr>
-          <w:hyperlink w:anchor="_Toc243666851" w:history="1">
+          <w:hyperlink w:anchor="_Toc243666971" w:history="1">
             <w:r>
               <w:rPr>
                 <w:rStyle w:val="Hyperlink"/>
@@ -3319,7 +3435,7 @@
               <w:rPr>
                 <w:noProof/>
               </w:rPr>
-              <w:instrText xml:space="preserve"> PAGEREF _Toc243666851 \h </w:instrText>
+              <w:instrText xml:space="preserve"> PAGEREF _Toc243666971 \h </w:instrText>
             </w:r>
             <w:r>
               <w:rPr>
@@ -3362,7 +3478,7 @@
               <w14:ligatures w14:val="standardContextual"/>
             </w:rPr>
           </w:pPr>
-          <w:hyperlink w:anchor="_Toc243666852" w:history="1">
+          <w:hyperlink w:anchor="_Toc243666972" w:history="1">
             <w:r>
               <w:rPr>
                 <w:rStyle w:val="Hyperlink"/>
@@ -3386,7 +3502,7 @@
               <w:rPr>
                 <w:noProof/>
               </w:rPr>
-              <w:instrText xml:space="preserve"> PAGEREF _Toc243666852 \h </w:instrText>
+              <w:instrText xml:space="preserve"> PAGEREF _Toc243666972 \h </w:instrText>
             </w:r>
             <w:r>
               <w:rPr>
@@ -3429,7 +3545,7 @@
               <w14:ligatures w14:val="standardContextual"/>
             </w:rPr>
           </w:pPr>
-          <w:hyperlink w:anchor="_Toc243666853" w:history="1">
+          <w:hyperlink w:anchor="_Toc243666973" w:history="1">
             <w:r>
               <w:rPr>
                 <w:rStyle w:val="Hyperlink"/>
@@ -3453,7 +3569,7 @@
               <w:rPr>
                 <w:noProof/>
               </w:rPr>
-              <w:instrText xml:space="preserve"> PAGEREF _Toc243666853 \h </w:instrText>
+              <w:instrText xml:space="preserve"> PAGEREF _Toc243666973 \h </w:instrText>
             </w:r>
             <w:r>
               <w:rPr>
@@ -3496,7 +3612,7 @@
               <w14:ligatures w14:val="standardContextual"/>
             </w:rPr>
           </w:pPr>
-          <w:hyperlink w:anchor="_Toc243666854" w:history="1">
+          <w:hyperlink w:anchor="_Toc243666974" w:history="1">
             <w:r>
               <w:rPr>
                 <w:rStyle w:val="Hyperlink"/>
@@ -3520,7 +3636,7 @@
               <w:rPr>
                 <w:noProof/>
               </w:rPr>
-              <w:instrText xml:space="preserve"> PAGEREF _Toc243666854 \h </w:instrText>
+              <w:instrText xml:space="preserve"> PAGEREF _Toc243666974 \h </w:instrText>
             </w:r>
             <w:r>
               <w:rPr>
@@ -3563,7 +3679,7 @@
               <w14:ligatures w14:val="standardContextual"/>
             </w:rPr>
           </w:pPr>
-          <w:hyperlink w:anchor="_Toc243666855" w:history="1">
+          <w:hyperlink w:anchor="_Toc243666975" w:history="1">
             <w:r>
               <w:rPr>
                 <w:rStyle w:val="Hyperlink"/>
@@ -3587,7 +3703,7 @@
               <w:rPr>
                 <w:noProof/>
               </w:rPr>
-              <w:instrText xml:space="preserve"> PAGEREF _Toc243666855 \h </w:instrText>
+              <w:instrText xml:space="preserve"> PAGEREF _Toc243666975 \h </w:instrText>
             </w:r>
             <w:r>
               <w:rPr>
@@ -3630,7 +3746,7 @@
               <w14:ligatures w14:val="standardContextual"/>
             </w:rPr>
           </w:pPr>
-          <w:hyperlink w:anchor="_Toc243666856" w:history="1">
+          <w:hyperlink w:anchor="_Toc243666976" w:history="1">
             <w:r>
               <w:rPr>
                 <w:rStyle w:val="Hyperlink"/>
@@ -3654,7 +3770,7 @@
               <w:rPr>
                 <w:noProof/>
               </w:rPr>
-              <w:instrText xml:space="preserve"> PAGEREF _Toc243666856 \h </w:instrText>
+              <w:instrText xml:space="preserve"> PAGEREF _Toc243666976 \h </w:instrText>
             </w:r>
             <w:r>
               <w:rPr>
@@ -3697,7 +3813,7 @@
               <w14:ligatures w14:val="standardContextual"/>
             </w:rPr>
           </w:pPr>
-          <w:hyperlink w:anchor="_Toc243666857" w:history="1">
+          <w:hyperlink w:anchor="_Toc243666977" w:history="1">
             <w:r>
               <w:rPr>
                 <w:rStyle w:val="Hyperlink"/>
@@ -3721,7 +3837,7 @@
               <w:rPr>
                 <w:noProof/>
               </w:rPr>
-              <w:instrText xml:space="preserve"> PAGEREF _Toc243666857 \h </w:instrText>
+              <w:instrText xml:space="preserve"> PAGEREF _Toc243666977 \h </w:instrText>
             </w:r>
             <w:r>
               <w:rPr>
@@ -3764,7 +3880,7 @@
               <w14:ligatures w14:val="standardContextual"/>
             </w:rPr>
           </w:pPr>
-          <w:hyperlink w:anchor="_Toc243666858" w:history="1">
+          <w:hyperlink w:anchor="_Toc243666978" w:history="1">
             <w:r>
               <w:rPr>
                 <w:rStyle w:val="Hyperlink"/>
@@ -3788,7 +3904,7 @@
               <w:rPr>
                 <w:noProof/>
               </w:rPr>
-              <w:instrText xml:space="preserve"> PAGEREF _Toc243666858 \h </w:instrText>
+              <w:instrText xml:space="preserve"> PAGEREF _Toc243666978 \h </w:instrText>
             </w:r>
             <w:r>
               <w:rPr>
@@ -3831,7 +3947,7 @@
               <w14:ligatures w14:val="standardContextual"/>
             </w:rPr>
           </w:pPr>
-          <w:hyperlink w:anchor="_Toc243666859" w:history="1">
+          <w:hyperlink w:anchor="_Toc243666979" w:history="1">
             <w:r>
               <w:rPr>
                 <w:rStyle w:val="Hyperlink"/>
@@ -3855,7 +3971,7 @@
               <w:rPr>
                 <w:noProof/>
               </w:rPr>
-              <w:instrText xml:space="preserve"> PAGEREF _Toc243666859 \h </w:instrText>
+              <w:instrText xml:space="preserve"> PAGEREF _Toc243666979 \h </w:instrText>
             </w:r>
             <w:r>
               <w:rPr>
@@ -3898,7 +4014,7 @@
               <w14:ligatures w14:val="standardContextual"/>
             </w:rPr>
           </w:pPr>
-          <w:hyperlink w:anchor="_Toc243666860" w:history="1">
+          <w:hyperlink w:anchor="_Toc243666980" w:history="1">
             <w:r>
               <w:rPr>
                 <w:rStyle w:val="Hyperlink"/>
@@ -3922,7 +4038,7 @@
               <w:rPr>
                 <w:noProof/>
               </w:rPr>
-              <w:instrText xml:space="preserve"> PAGEREF _Toc243666860 \h </w:instrText>
+              <w:instrText xml:space="preserve"> PAGEREF _Toc243666980 \h </w:instrText>
             </w:r>
             <w:r>
               <w:rPr>
@@ -3965,7 +4081,7 @@
               <w14:ligatures w14:val="standardContextual"/>
             </w:rPr>
           </w:pPr>
-          <w:hyperlink w:anchor="_Toc243666861" w:history="1">
+          <w:hyperlink w:anchor="_Toc243666981" w:history="1">
             <w:r>
               <w:rPr>
                 <w:rStyle w:val="Hyperlink"/>
@@ -3989,7 +4105,7 @@
               <w:rPr>
                 <w:noProof/>
               </w:rPr>
-              <w:instrText xml:space="preserve"> PAGEREF _Toc243666861 \h </w:instrText>
+              <w:instrText xml:space="preserve"> PAGEREF _Toc243666981 \h </w:instrText>
             </w:r>
             <w:r>
               <w:rPr>
@@ -4032,7 +4148,7 @@
               <w14:ligatures w14:val="standardContextual"/>
             </w:rPr>
           </w:pPr>
-          <w:hyperlink w:anchor="_Toc243666862" w:history="1">
+          <w:hyperlink w:anchor="_Toc243666982" w:history="1">
             <w:r>
               <w:rPr>
                 <w:rStyle w:val="Hyperlink"/>
@@ -4056,7 +4172,7 @@
               <w:rPr>
                 <w:noProof/>
               </w:rPr>
-              <w:instrText xml:space="preserve"> PAGEREF _Toc243666862 \h </w:instrText>
+              <w:instrText xml:space="preserve"> PAGEREF _Toc243666982 \h </w:instrText>
             </w:r>
             <w:r>
               <w:rPr>
@@ -4099,7 +4215,7 @@
               <w14:ligatures w14:val="standardContextual"/>
             </w:rPr>
           </w:pPr>
-          <w:hyperlink w:anchor="_Toc243666863" w:history="1">
+          <w:hyperlink w:anchor="_Toc243666983" w:history="1">
             <w:r>
               <w:rPr>
                 <w:rStyle w:val="Hyperlink"/>
@@ -4123,7 +4239,7 @@
               <w:rPr>
                 <w:noProof/>
               </w:rPr>
-              <w:instrText xml:space="preserve"> PAGEREF _Toc243666863 \h </w:instrText>
+              <w:instrText xml:space="preserve"> PAGEREF _Toc243666983 \h </w:instrText>
             </w:r>
             <w:r>
               <w:rPr>
@@ -4166,7 +4282,7 @@
               <w14:ligatures w14:val="standardContextual"/>
             </w:rPr>
           </w:pPr>
-          <w:hyperlink w:anchor="_Toc243666864" w:history="1">
+          <w:hyperlink w:anchor="_Toc243666984" w:history="1">
             <w:r>
               <w:rPr>
                 <w:rStyle w:val="Hyperlink"/>
@@ -4190,7 +4306,7 @@
               <w:rPr>
                 <w:noProof/>
               </w:rPr>
-              <w:instrText xml:space="preserve"> PAGEREF _Toc243666864 \h </w:instrText>
+              <w:instrText xml:space="preserve"> PAGEREF _Toc243666984 \h </w:instrText>
             </w:r>
             <w:r>
               <w:rPr>
@@ -4233,7 +4349,7 @@
               <w14:ligatures w14:val="standardContextual"/>
             </w:rPr>
           </w:pPr>
-          <w:hyperlink w:anchor="_Toc243666865" w:history="1">
+          <w:hyperlink w:anchor="_Toc243666985" w:history="1">
             <w:r>
               <w:rPr>
                 <w:rStyle w:val="Hyperlink"/>
@@ -4257,7 +4373,7 @@
               <w:rPr>
                 <w:noProof/>
               </w:rPr>
-              <w:instrText xml:space="preserve"> PAGEREF _Toc243666865 \h </w:instrText>
+              <w:instrText xml:space="preserve"> PAGEREF _Toc243666985 \h </w:instrText>
             </w:r>
             <w:r>
               <w:rPr>
@@ -4300,7 +4416,7 @@
               <w14:ligatures w14:val="standardContextual"/>
             </w:rPr>
           </w:pPr>
-          <w:hyperlink w:anchor="_Toc243666866" w:history="1">
+          <w:hyperlink w:anchor="_Toc243666986" w:history="1">
             <w:r>
               <w:rPr>
                 <w:rStyle w:val="Hyperlink"/>
@@ -4324,7 +4440,7 @@
               <w:rPr>
                 <w:noProof/>
               </w:rPr>
-              <w:instrText xml:space="preserve"> PAGEREF _Toc243666866 \h </w:instrText>
+              <w:instrText xml:space="preserve"> PAGEREF _Toc243666986 \h </w:instrText>
             </w:r>
             <w:r>
               <w:rPr>
@@ -4367,7 +4483,7 @@
               <w14:ligatures w14:val="standardContextual"/>
             </w:rPr>
           </w:pPr>
-          <w:hyperlink w:anchor="_Toc243666867" w:history="1">
+          <w:hyperlink w:anchor="_Toc243666987" w:history="1">
             <w:r>
               <w:rPr>
                 <w:rStyle w:val="Hyperlink"/>
@@ -4391,7 +4507,7 @@
               <w:rPr>
                 <w:noProof/>
               </w:rPr>
-              <w:instrText xml:space="preserve"> PAGEREF _Toc243666867 \h </w:instrText>
+              <w:instrText xml:space="preserve"> PAGEREF _Toc243666987 \h </w:instrText>
             </w:r>
             <w:r>
               <w:rPr>
@@ -4434,7 +4550,7 @@
               <w14:ligatures w14:val="standardContextual"/>
             </w:rPr>
           </w:pPr>
-          <w:hyperlink w:anchor="_Toc243666868" w:history="1">
+          <w:hyperlink w:anchor="_Toc243666988" w:history="1">
             <w:r>
               <w:rPr>
                 <w:rStyle w:val="Hyperlink"/>
@@ -4458,7 +4574,7 @@
               <w:rPr>
                 <w:noProof/>
               </w:rPr>
-              <w:instrText xml:space="preserve"> PAGEREF _Toc243666868 \h </w:instrText>
+              <w:instrText xml:space="preserve"> PAGEREF _Toc243666988 \h </w:instrText>
             </w:r>
             <w:r>
               <w:rPr>
@@ -4501,7 +4617,7 @@
               <w14:ligatures w14:val="standardContextual"/>
             </w:rPr>
           </w:pPr>
-          <w:hyperlink w:anchor="_Toc243666869" w:history="1">
+          <w:hyperlink w:anchor="_Toc243666989" w:history="1">
             <w:r>
               <w:rPr>
                 <w:rStyle w:val="Hyperlink"/>
@@ -4525,7 +4641,7 @@
               <w:rPr>
                 <w:noProof/>
               </w:rPr>
-              <w:instrText xml:space="preserve"> PAGEREF _Toc243666869 \h </w:instrText>
+              <w:instrText xml:space="preserve"> PAGEREF _Toc243666989 \h </w:instrText>
             </w:r>
             <w:r>
               <w:rPr>
@@ -4568,7 +4684,7 @@
               <w14:ligatures w14:val="standardContextual"/>
             </w:rPr>
           </w:pPr>
-          <w:hyperlink w:anchor="_Toc243666870" w:history="1">
+          <w:hyperlink w:anchor="_Toc243666990" w:history="1">
             <w:r>
               <w:rPr>
                 <w:rStyle w:val="Hyperlink"/>
@@ -4592,7 +4708,7 @@
               <w:rPr>
                 <w:noProof/>
               </w:rPr>
-              <w:instrText xml:space="preserve"> PAGEREF _Toc243666870 \h </w:instrText>
+              <w:instrText xml:space="preserve"> PAGEREF _Toc243666990 \h </w:instrText>
             </w:r>
             <w:r>
               <w:rPr>
@@ -4635,7 +4751,7 @@
               <w14:ligatures w14:val="standardContextual"/>
             </w:rPr>
           </w:pPr>
-          <w:hyperlink w:anchor="_Toc243666871" w:history="1">
+          <w:hyperlink w:anchor="_Toc243666991" w:history="1">
             <w:r>
               <w:rPr>
                 <w:rStyle w:val="Hyperlink"/>
@@ -4659,7 +4775,7 @@
               <w:rPr>
                 <w:noProof/>
               </w:rPr>
-              <w:instrText xml:space="preserve"> PAGEREF _Toc243666871 \h </w:instrText>
+              <w:instrText xml:space="preserve"> PAGEREF _Toc243666991 \h </w:instrText>
             </w:r>
             <w:r>
               <w:rPr>
@@ -4702,7 +4818,7 @@
               <w14:ligatures w14:val="standardContextual"/>
             </w:rPr>
           </w:pPr>
-          <w:hyperlink w:anchor="_Toc243666872" w:history="1">
+          <w:hyperlink w:anchor="_Toc243666992" w:history="1">
             <w:r>
               <w:rPr>
                 <w:rStyle w:val="Hyperlink"/>
@@ -4726,7 +4842,7 @@
               <w:rPr>
                 <w:noProof/>
               </w:rPr>
-              <w:instrText xml:space="preserve"> PAGEREF _Toc243666872 \h </w:instrText>
+              <w:instrText xml:space="preserve"> PAGEREF _Toc243666992 \h </w:instrText>
             </w:r>
             <w:r>
               <w:rPr>
@@ -4769,7 +4885,7 @@
               <w14:ligatures w14:val="standardContextual"/>
             </w:rPr>
           </w:pPr>
-          <w:hyperlink w:anchor="_Toc243666873" w:history="1">
+          <w:hyperlink w:anchor="_Toc243666993" w:history="1">
             <w:r>
               <w:rPr>
                 <w:rStyle w:val="Hyperlink"/>
@@ -4793,7 +4909,7 @@
               <w:rPr>
                 <w:noProof/>
               </w:rPr>
-              <w:instrText xml:space="preserve"> PAGEREF _Toc243666873 \h </w:instrText>
+              <w:instrText xml:space="preserve"> PAGEREF _Toc243666993 \h </w:instrText>
             </w:r>
             <w:r>
               <w:rPr>
@@ -4836,7 +4952,7 @@
               <w14:ligatures w14:val="standardContextual"/>
             </w:rPr>
           </w:pPr>
-          <w:hyperlink w:anchor="_Toc243666874" w:history="1">
+          <w:hyperlink w:anchor="_Toc243666994" w:history="1">
             <w:r>
               <w:rPr>
                 <w:rStyle w:val="Hyperlink"/>
@@ -4860,7 +4976,7 @@
               <w:rPr>
                 <w:noProof/>
               </w:rPr>
-              <w:instrText xml:space="preserve"> PAGEREF _Toc243666874 \h </w:instrText>
+              <w:instrText xml:space="preserve"> PAGEREF _Toc243666994 \h </w:instrText>
             </w:r>
             <w:r>
               <w:rPr>
@@ -4903,7 +5019,7 @@
               <w14:ligatures w14:val="standardContextual"/>
             </w:rPr>
           </w:pPr>
-          <w:hyperlink w:anchor="_Toc243666875" w:history="1">
+          <w:hyperlink w:anchor="_Toc243666995" w:history="1">
             <w:r>
               <w:rPr>
                 <w:rStyle w:val="Hyperlink"/>
@@ -4927,7 +5043,7 @@
               <w:rPr>
                 <w:noProof/>
               </w:rPr>
-              <w:instrText xml:space="preserve"> PAGEREF _Toc243666875 \h </w:instrText>
+              <w:instrText xml:space="preserve"> PAGEREF _Toc243666995 \h </w:instrText>
             </w:r>
             <w:r>
               <w:rPr>
@@ -4970,7 +5086,7 @@
               <w14:ligatures w14:val="standardContextual"/>
             </w:rPr>
           </w:pPr>
-          <w:hyperlink w:anchor="_Toc243666876" w:history="1">
+          <w:hyperlink w:anchor="_Toc243666996" w:history="1">
             <w:r>
               <w:rPr>
                 <w:rStyle w:val="Hyperlink"/>
@@ -4994,7 +5110,7 @@
               <w:rPr>
                 <w:noProof/>
               </w:rPr>
-              <w:instrText xml:space="preserve"> PAGEREF _Toc243666876 \h </w:instrText>
+              <w:instrText xml:space="preserve"> PAGEREF _Toc243666996 \h </w:instrText>
             </w:r>
             <w:r>
               <w:rPr>
@@ -5037,7 +5153,7 @@
               <w14:ligatures w14:val="standardContextual"/>
             </w:rPr>
           </w:pPr>
-          <w:hyperlink w:anchor="_Toc243666877" w:history="1">
+          <w:hyperlink w:anchor="_Toc243666997" w:history="1">
             <w:r>
               <w:rPr>
                 <w:rStyle w:val="Hyperlink"/>
@@ -5061,7 +5177,7 @@
               <w:rPr>
                 <w:noProof/>
               </w:rPr>
-              <w:instrText xml:space="preserve"> PAGEREF _Toc243666877 \h </w:instrText>
+              <w:instrText xml:space="preserve"> PAGEREF _Toc243666997 \h </w:instrText>
             </w:r>
             <w:r>
               <w:rPr>
@@ -5104,7 +5220,7 @@
               <w14:ligatures w14:val="standardContextual"/>
             </w:rPr>
           </w:pPr>
-          <w:hyperlink w:anchor="_Toc243666878" w:history="1">
+          <w:hyperlink w:anchor="_Toc243666998" w:history="1">
             <w:r>
               <w:rPr>
                 <w:rStyle w:val="Hyperlink"/>
@@ -5128,7 +5244,7 @@
               <w:rPr>
                 <w:noProof/>
               </w:rPr>
-              <w:instrText xml:space="preserve"> PAGEREF _Toc243666878 \h </w:instrText>
+              <w:instrText xml:space="preserve"> PAGEREF _Toc243666998 \h </w:instrText>
             </w:r>
             <w:r>
               <w:rPr>
@@ -5174,7 +5290,7 @@
     <w:sdt>
       <w:sdtPr>
         <w:alias w:val="Tables"/>
-        <w:id w:val="-991566442"/>
+        <w:id w:val="-1862665571"/>
       </w:sdtPr>
       <w:sdtEndPr/>
       <w:sdtContent>
@@ -5203,7 +5319,7 @@
           <w:r>
             <w:fldChar w:fldCharType="separate"/>
           </w:r>
-          <w:hyperlink w:anchor="_Toc243666879" w:history="1">
+          <w:hyperlink w:anchor="_Toc243666999" w:history="1">
             <w:r>
               <w:rPr>
                 <w:rStyle w:val="Hyperlink"/>
@@ -5227,7 +5343,7 @@
               <w:rPr>
                 <w:noProof/>
               </w:rPr>
-              <w:instrText xml:space="preserve"> PAGEREF _Toc243666879 \h </w:instrText>
+              <w:instrText xml:space="preserve"> PAGEREF _Toc243666999 \h </w:instrText>
             </w:r>
             <w:r>
               <w:rPr>
@@ -5270,7 +5386,7 @@
               <w14:ligatures w14:val="standardContextual"/>
             </w:rPr>
           </w:pPr>
-          <w:hyperlink w:anchor="_Toc243666880" w:history="1">
+          <w:hyperlink w:anchor="_Toc243667000" w:history="1">
             <w:r>
               <w:rPr>
                 <w:rStyle w:val="Hyperlink"/>
@@ -5294,7 +5410,7 @@
               <w:rPr>
                 <w:noProof/>
               </w:rPr>
-              <w:instrText xml:space="preserve"> PAGEREF _Toc243666880 \h </w:instrText>
+              <w:instrText xml:space="preserve"> PAGEREF _Toc243667000 \h </w:instrText>
             </w:r>
             <w:r>
               <w:rPr>
@@ -5337,7 +5453,7 @@
               <w14:ligatures w14:val="standardContextual"/>
             </w:rPr>
           </w:pPr>
-          <w:hyperlink w:anchor="_Toc243666881" w:history="1">
+          <w:hyperlink w:anchor="_Toc243667001" w:history="1">
             <w:r>
               <w:rPr>
                 <w:rStyle w:val="Hyperlink"/>
@@ -5361,7 +5477,7 @@
               <w:rPr>
                 <w:noProof/>
               </w:rPr>
-              <w:instrText xml:space="preserve"> PAGEREF _Toc243666881 \h </w:instrText>
+              <w:instrText xml:space="preserve"> PAGEREF _Toc243667001 \h </w:instrText>
             </w:r>
             <w:r>
               <w:rPr>
@@ -5404,7 +5520,7 @@
               <w14:ligatures w14:val="standardContextual"/>
             </w:rPr>
           </w:pPr>
-          <w:hyperlink w:anchor="_Toc243666882" w:history="1">
+          <w:hyperlink w:anchor="_Toc243667002" w:history="1">
             <w:r>
               <w:rPr>
                 <w:rStyle w:val="Hyperlink"/>
@@ -5428,7 +5544,7 @@
               <w:rPr>
                 <w:noProof/>
               </w:rPr>
-              <w:instrText xml:space="preserve"> PAGEREF _Toc243666882 \h </w:instrText>
+              <w:instrText xml:space="preserve"> PAGEREF _Toc243667002 \h </w:instrText>
             </w:r>
             <w:r>
               <w:rPr>
@@ -5471,7 +5587,7 @@
               <w14:ligatures w14:val="standardContextual"/>
             </w:rPr>
           </w:pPr>
-          <w:hyperlink w:anchor="_Toc243666883" w:history="1">
+          <w:hyperlink w:anchor="_Toc243667003" w:history="1">
             <w:r>
               <w:rPr>
                 <w:rStyle w:val="Hyperlink"/>
@@ -5495,7 +5611,7 @@
               <w:rPr>
                 <w:noProof/>
               </w:rPr>
-              <w:instrText xml:space="preserve"> PAGEREF _Toc243666883 \h </w:instrText>
+              <w:instrText xml:space="preserve"> PAGEREF _Toc243667003 \h </w:instrText>
             </w:r>
             <w:r>
               <w:rPr>
@@ -5538,7 +5654,7 @@
               <w14:ligatures w14:val="standardContextual"/>
             </w:rPr>
           </w:pPr>
-          <w:hyperlink w:anchor="_Toc243666884" w:history="1">
+          <w:hyperlink w:anchor="_Toc243667004" w:history="1">
             <w:r>
               <w:rPr>
                 <w:rStyle w:val="Hyperlink"/>
@@ -5562,7 +5678,7 @@
               <w:rPr>
                 <w:noProof/>
               </w:rPr>
-              <w:instrText xml:space="preserve"> PAGEREF _Toc243666884 \h </w:instrText>
+              <w:instrText xml:space="preserve"> PAGEREF _Toc243667004 \h </w:instrText>
             </w:r>
             <w:r>
               <w:rPr>
@@ -5605,7 +5721,7 @@
               <w14:ligatures w14:val="standardContextual"/>
             </w:rPr>
           </w:pPr>
-          <w:hyperlink w:anchor="_Toc243666885" w:history="1">
+          <w:hyperlink w:anchor="_Toc243667005" w:history="1">
             <w:r>
               <w:rPr>
                 <w:rStyle w:val="Hyperlink"/>
@@ -5629,7 +5745,7 @@
               <w:rPr>
                 <w:noProof/>
               </w:rPr>
-              <w:instrText xml:space="preserve"> PAGEREF _Toc243666885 \h </w:instrText>
+              <w:instrText xml:space="preserve"> PAGEREF _Toc243667005 \h </w:instrText>
             </w:r>
             <w:r>
               <w:rPr>
@@ -5672,7 +5788,7 @@
               <w14:ligatures w14:val="standardContextual"/>
             </w:rPr>
           </w:pPr>
-          <w:hyperlink w:anchor="_Toc243666886" w:history="1">
+          <w:hyperlink w:anchor="_Toc243667006" w:history="1">
             <w:r>
               <w:rPr>
                 <w:rStyle w:val="Hyperlink"/>
@@ -5696,7 +5812,7 @@
               <w:rPr>
                 <w:noProof/>
               </w:rPr>
-              <w:instrText xml:space="preserve"> PAGEREF _Toc243666886 \h </w:instrText>
+              <w:instrText xml:space="preserve"> PAGEREF _Toc243667006 \h </w:instrText>
             </w:r>
             <w:r>
               <w:rPr>
@@ -5739,7 +5855,7 @@
               <w14:ligatures w14:val="standardContextual"/>
             </w:rPr>
           </w:pPr>
-          <w:hyperlink w:anchor="_Toc243666887" w:history="1">
+          <w:hyperlink w:anchor="_Toc243667007" w:history="1">
             <w:r>
               <w:rPr>
                 <w:rStyle w:val="Hyperlink"/>
@@ -5763,7 +5879,7 @@
               <w:rPr>
                 <w:noProof/>
               </w:rPr>
-              <w:instrText xml:space="preserve"> PAGEREF _Toc243666887 \h </w:instrText>
+              <w:instrText xml:space="preserve"> PAGEREF _Toc243667007 \h </w:instrText>
             </w:r>
             <w:r>
               <w:rPr>
@@ -5806,7 +5922,7 @@
               <w14:ligatures w14:val="standardContextual"/>
             </w:rPr>
           </w:pPr>
-          <w:hyperlink w:anchor="_Toc243666888" w:history="1">
+          <w:hyperlink w:anchor="_Toc243667008" w:history="1">
             <w:r>
               <w:rPr>
                 <w:rStyle w:val="Hyperlink"/>
@@ -5830,7 +5946,7 @@
               <w:rPr>
                 <w:noProof/>
               </w:rPr>
-              <w:instrText xml:space="preserve"> PAGEREF _Toc243666888 \h </w:instrText>
+              <w:instrText xml:space="preserve"> PAGEREF _Toc243667008 \h </w:instrText>
             </w:r>
             <w:r>
               <w:rPr>
@@ -5873,7 +5989,7 @@
               <w14:ligatures w14:val="standardContextual"/>
             </w:rPr>
           </w:pPr>
-          <w:hyperlink w:anchor="_Toc243666889" w:history="1">
+          <w:hyperlink w:anchor="_Toc243667009" w:history="1">
             <w:r>
               <w:rPr>
                 <w:rStyle w:val="Hyperlink"/>
@@ -5897,7 +6013,7 @@
               <w:rPr>
                 <w:noProof/>
               </w:rPr>
-              <w:instrText xml:space="preserve"> PAGEREF _Toc243666889 \h </w:instrText>
+              <w:instrText xml:space="preserve"> PAGEREF _Toc243667009 \h </w:instrText>
             </w:r>
             <w:r>
               <w:rPr>
@@ -5940,7 +6056,7 @@
               <w14:ligatures w14:val="standardContextual"/>
             </w:rPr>
           </w:pPr>
-          <w:hyperlink w:anchor="_Toc243666890" w:history="1">
+          <w:hyperlink w:anchor="_Toc243667010" w:history="1">
             <w:r>
               <w:rPr>
                 <w:rStyle w:val="Hyperlink"/>
@@ -5964,7 +6080,7 @@
               <w:rPr>
                 <w:noProof/>
               </w:rPr>
-              <w:instrText xml:space="preserve"> PAGEREF _Toc243666890 \h </w:instrText>
+              <w:instrText xml:space="preserve"> PAGEREF _Toc243667010 \h </w:instrText>
             </w:r>
             <w:r>
               <w:rPr>
@@ -6007,7 +6123,7 @@
               <w14:ligatures w14:val="standardContextual"/>
             </w:rPr>
           </w:pPr>
-          <w:hyperlink w:anchor="_Toc243666891" w:history="1">
+          <w:hyperlink w:anchor="_Toc243667011" w:history="1">
             <w:r>
               <w:rPr>
                 <w:rStyle w:val="Hyperlink"/>
@@ -6031,7 +6147,7 @@
               <w:rPr>
                 <w:noProof/>
               </w:rPr>
-              <w:instrText xml:space="preserve"> PAGEREF _Toc243666891 \h </w:instrText>
+              <w:instrText xml:space="preserve"> PAGEREF _Toc243667011 \h </w:instrText>
             </w:r>
             <w:r>
               <w:rPr>
@@ -6074,7 +6190,7 @@
               <w14:ligatures w14:val="standardContextual"/>
             </w:rPr>
           </w:pPr>
-          <w:hyperlink w:anchor="_Toc243666892" w:history="1">
+          <w:hyperlink w:anchor="_Toc243667012" w:history="1">
             <w:r>
               <w:rPr>
                 <w:rStyle w:val="Hyperlink"/>
@@ -6098,7 +6214,7 @@
               <w:rPr>
                 <w:noProof/>
               </w:rPr>
-              <w:instrText xml:space="preserve"> PAGEREF _Toc243666892 \h </w:instrText>
+              <w:instrText xml:space="preserve"> PAGEREF _Toc243667012 \h </w:instrText>
             </w:r>
             <w:r>
               <w:rPr>
@@ -6141,7 +6257,7 @@
               <w14:ligatures w14:val="standardContextual"/>
             </w:rPr>
           </w:pPr>
-          <w:hyperlink w:anchor="_Toc243666893" w:history="1">
+          <w:hyperlink w:anchor="_Toc243667013" w:history="1">
             <w:r>
               <w:rPr>
                 <w:rStyle w:val="Hyperlink"/>
@@ -6165,7 +6281,7 @@
               <w:rPr>
                 <w:noProof/>
               </w:rPr>
-              <w:instrText xml:space="preserve"> PAGEREF _Toc243666893 \h </w:instrText>
+              <w:instrText xml:space="preserve"> PAGEREF _Toc243667013 \h </w:instrText>
             </w:r>
             <w:r>
               <w:rPr>
@@ -6208,7 +6324,7 @@
               <w14:ligatures w14:val="standardContextual"/>
             </w:rPr>
           </w:pPr>
-          <w:hyperlink w:anchor="_Toc243666894" w:history="1">
+          <w:hyperlink w:anchor="_Toc243667014" w:history="1">
             <w:r>
               <w:rPr>
                 <w:rStyle w:val="Hyperlink"/>
@@ -6232,7 +6348,7 @@
               <w:rPr>
                 <w:noProof/>
               </w:rPr>
-              <w:instrText xml:space="preserve"> PAGEREF _Toc243666894 \h </w:instrText>
+              <w:instrText xml:space="preserve"> PAGEREF _Toc243667014 \h </w:instrText>
             </w:r>
             <w:r>
               <w:rPr>
@@ -6275,7 +6391,7 @@
               <w14:ligatures w14:val="standardContextual"/>
             </w:rPr>
           </w:pPr>
-          <w:hyperlink w:anchor="_Toc243666895" w:history="1">
+          <w:hyperlink w:anchor="_Toc243667015" w:history="1">
             <w:r>
               <w:rPr>
                 <w:rStyle w:val="Hyperlink"/>
@@ -6299,7 +6415,7 @@
               <w:rPr>
                 <w:noProof/>
               </w:rPr>
-              <w:instrText xml:space="preserve"> PAGEREF _Toc243666895 \h </w:instrText>
+              <w:instrText xml:space="preserve"> PAGEREF _Toc243667015 \h </w:instrText>
             </w:r>
             <w:r>
               <w:rPr>
@@ -6342,7 +6458,7 @@
               <w14:ligatures w14:val="standardContextual"/>
             </w:rPr>
           </w:pPr>
-          <w:hyperlink w:anchor="_Toc243666896" w:history="1">
+          <w:hyperlink w:anchor="_Toc243667016" w:history="1">
             <w:r>
               <w:rPr>
                 <w:rStyle w:val="Hyperlink"/>
@@ -6366,7 +6482,7 @@
               <w:rPr>
                 <w:noProof/>
               </w:rPr>
-              <w:instrText xml:space="preserve"> PAGEREF _Toc243666896 \h </w:instrText>
+              <w:instrText xml:space="preserve"> PAGEREF _Toc243667016 \h </w:instrText>
             </w:r>
             <w:r>
               <w:rPr>
@@ -6409,7 +6525,7 @@
               <w14:ligatures w14:val="standardContextual"/>
             </w:rPr>
           </w:pPr>
-          <w:hyperlink w:anchor="_Toc243666897" w:history="1">
+          <w:hyperlink w:anchor="_Toc243667017" w:history="1">
             <w:r>
               <w:rPr>
                 <w:rStyle w:val="Hyperlink"/>
@@ -6433,7 +6549,7 @@
               <w:rPr>
                 <w:noProof/>
               </w:rPr>
-              <w:instrText xml:space="preserve"> PAGEREF _Toc243666897 \h </w:instrText>
+              <w:instrText xml:space="preserve"> PAGEREF _Toc243667017 \h </w:instrText>
             </w:r>
             <w:r>
               <w:rPr>
@@ -6476,7 +6592,7 @@
               <w14:ligatures w14:val="standardContextual"/>
             </w:rPr>
           </w:pPr>
-          <w:hyperlink w:anchor="_Toc243666898" w:history="1">
+          <w:hyperlink w:anchor="_Toc243667018" w:history="1">
             <w:r>
               <w:rPr>
                 <w:rStyle w:val="Hyperlink"/>
@@ -6500,7 +6616,7 @@
               <w:rPr>
                 <w:noProof/>
               </w:rPr>
-              <w:instrText xml:space="preserve"> PAGEREF _Toc243666898 \h </w:instrText>
+              <w:instrText xml:space="preserve"> PAGEREF _Toc243667018 \h </w:instrText>
             </w:r>
             <w:r>
               <w:rPr>
@@ -6543,7 +6659,7 @@
               <w14:ligatures w14:val="standardContextual"/>
             </w:rPr>
           </w:pPr>
-          <w:hyperlink w:anchor="_Toc243666899" w:history="1">
+          <w:hyperlink w:anchor="_Toc243667019" w:history="1">
             <w:r>
               <w:rPr>
                 <w:rStyle w:val="Hyperlink"/>
@@ -6567,7 +6683,7 @@
               <w:rPr>
                 <w:noProof/>
               </w:rPr>
-              <w:instrText xml:space="preserve"> PAGEREF _Toc243666899 \h </w:instrText>
+              <w:instrText xml:space="preserve"> PAGEREF _Toc243667019 \h </w:instrText>
             </w:r>
             <w:r>
               <w:rPr>
@@ -6610,7 +6726,7 @@
               <w14:ligatures w14:val="standardContextual"/>
             </w:rPr>
           </w:pPr>
-          <w:hyperlink w:anchor="_Toc243666900" w:history="1">
+          <w:hyperlink w:anchor="_Toc243667020" w:history="1">
             <w:r>
               <w:rPr>
                 <w:rStyle w:val="Hyperlink"/>
@@ -6634,7 +6750,7 @@
               <w:rPr>
                 <w:noProof/>
               </w:rPr>
-              <w:instrText xml:space="preserve"> PAGEREF _Toc243666900 \h </w:instrText>
+              <w:instrText xml:space="preserve"> PAGEREF _Toc243667020 \h </w:instrText>
             </w:r>
             <w:r>
               <w:rPr>
@@ -6677,7 +6793,7 @@
               <w14:ligatures w14:val="standardContextual"/>
             </w:rPr>
           </w:pPr>
-          <w:hyperlink w:anchor="_Toc243666901" w:history="1">
+          <w:hyperlink w:anchor="_Toc243667021" w:history="1">
             <w:r>
               <w:rPr>
                 <w:rStyle w:val="Hyperlink"/>
@@ -6701,7 +6817,7 @@
               <w:rPr>
                 <w:noProof/>
               </w:rPr>
-              <w:instrText xml:space="preserve"> PAGEREF _Toc243666901 \h </w:instrText>
+              <w:instrText xml:space="preserve"> PAGEREF _Toc243667021 \h </w:instrText>
             </w:r>
             <w:r>
               <w:rPr>
@@ -6744,7 +6860,7 @@
               <w14:ligatures w14:val="standardContextual"/>
             </w:rPr>
           </w:pPr>
-          <w:hyperlink w:anchor="_Toc243666902" w:history="1">
+          <w:hyperlink w:anchor="_Toc243667022" w:history="1">
             <w:r>
               <w:rPr>
                 <w:rStyle w:val="Hyperlink"/>
@@ -6768,7 +6884,7 @@
               <w:rPr>
                 <w:noProof/>
               </w:rPr>
-              <w:instrText xml:space="preserve"> PAGEREF _Toc243666902 \h </w:instrText>
+              <w:instrText xml:space="preserve"> PAGEREF _Toc243667022 \h </w:instrText>
             </w:r>
             <w:r>
               <w:rPr>
@@ -6811,7 +6927,7 @@
               <w14:ligatures w14:val="standardContextual"/>
             </w:rPr>
           </w:pPr>
-          <w:hyperlink w:anchor="_Toc243666903" w:history="1">
+          <w:hyperlink w:anchor="_Toc243667023" w:history="1">
             <w:r>
               <w:rPr>
                 <w:rStyle w:val="Hyperlink"/>
@@ -6835,7 +6951,7 @@
               <w:rPr>
                 <w:noProof/>
               </w:rPr>
-              <w:instrText xml:space="preserve"> PAGEREF _Toc243666903 \h </w:instrText>
+              <w:instrText xml:space="preserve"> PAGEREF _Toc243667023 \h </w:instrText>
             </w:r>
             <w:r>
               <w:rPr>
@@ -6878,7 +6994,7 @@
               <w14:ligatures w14:val="standardContextual"/>
             </w:rPr>
           </w:pPr>
-          <w:hyperlink w:anchor="_Toc243666904" w:history="1">
+          <w:hyperlink w:anchor="_Toc243667024" w:history="1">
             <w:r>
               <w:rPr>
                 <w:rStyle w:val="Hyperlink"/>
@@ -6902,7 +7018,7 @@
               <w:rPr>
                 <w:noProof/>
               </w:rPr>
-              <w:instrText xml:space="preserve"> PAGEREF _Toc243666904 \h </w:instrText>
+              <w:instrText xml:space="preserve"> PAGEREF _Toc243667024 \h </w:instrText>
             </w:r>
             <w:r>
               <w:rPr>
@@ -6945,7 +7061,7 @@
               <w14:ligatures w14:val="standardContextual"/>
             </w:rPr>
           </w:pPr>
-          <w:hyperlink w:anchor="_Toc243666905" w:history="1">
+          <w:hyperlink w:anchor="_Toc243667025" w:history="1">
             <w:r>
               <w:rPr>
                 <w:rStyle w:val="Hyperlink"/>
@@ -6969,7 +7085,7 @@
               <w:rPr>
                 <w:noProof/>
               </w:rPr>
-              <w:instrText xml:space="preserve"> PAGEREF _Toc243666905 \h </w:instrText>
+              <w:instrText xml:space="preserve"> PAGEREF _Toc243667025 \h </w:instrText>
             </w:r>
             <w:r>
               <w:rPr>
@@ -7012,7 +7128,7 @@
               <w14:ligatures w14:val="standardContextual"/>
             </w:rPr>
           </w:pPr>
-          <w:hyperlink w:anchor="_Toc243666906" w:history="1">
+          <w:hyperlink w:anchor="_Toc243667026" w:history="1">
             <w:r>
               <w:rPr>
                 <w:rStyle w:val="Hyperlink"/>
@@ -7036,7 +7152,7 @@
               <w:rPr>
                 <w:noProof/>
               </w:rPr>
-              <w:instrText xml:space="preserve"> PAGEREF _Toc243666906 \h </w:instrText>
+              <w:instrText xml:space="preserve"> PAGEREF _Toc243667026 \h </w:instrText>
             </w:r>
             <w:r>
               <w:rPr>
@@ -7079,7 +7195,7 @@
               <w14:ligatures w14:val="standardContextual"/>
             </w:rPr>
           </w:pPr>
-          <w:hyperlink w:anchor="_Toc243666907" w:history="1">
+          <w:hyperlink w:anchor="_Toc243667027" w:history="1">
             <w:r>
               <w:rPr>
                 <w:rStyle w:val="Hyperlink"/>
@@ -7103,7 +7219,7 @@
               <w:rPr>
                 <w:noProof/>
               </w:rPr>
-              <w:instrText xml:space="preserve"> PAGEREF _Toc243666907 \h </w:instrText>
+              <w:instrText xml:space="preserve"> PAGEREF _Toc243667027 \h </w:instrText>
             </w:r>
             <w:r>
               <w:rPr>
@@ -7146,7 +7262,7 @@
               <w14:ligatures w14:val="standardContextual"/>
             </w:rPr>
           </w:pPr>
-          <w:hyperlink w:anchor="_Toc243666908" w:history="1">
+          <w:hyperlink w:anchor="_Toc243667028" w:history="1">
             <w:r>
               <w:rPr>
                 <w:rStyle w:val="Hyperlink"/>
@@ -7170,7 +7286,7 @@
               <w:rPr>
                 <w:noProof/>
               </w:rPr>
-              <w:instrText xml:space="preserve"> PAGEREF _Toc243666908 \h </w:instrText>
+              <w:instrText xml:space="preserve"> PAGEREF _Toc243667028 \h </w:instrText>
             </w:r>
             <w:r>
               <w:rPr>
@@ -7211,7 +7327,7 @@
         <w:keepLines/>
         <w:pageBreakBefore/>
       </w:pPr>
-      <w:bookmarkStart w:id="0" w:name="_Toc243666842"/>
+      <w:bookmarkStart w:id="0" w:name="_Toc243666962"/>
       <w:r>
         <w:lastRenderedPageBreak/>
         <w:t>1 Introduction</w:t>
@@ -7224,7 +7340,7 @@
         <w:keepNext/>
         <w:keepLines/>
       </w:pPr>
-      <w:bookmarkStart w:id="1" w:name="_Toc243666843"/>
+      <w:bookmarkStart w:id="1" w:name="_Toc243666963"/>
       <w:r>
         <w:t>1.1 Purpose</w:t>
       </w:r>
@@ -7235,10 +7351,10 @@
         <w:spacing w:after="120"/>
       </w:pPr>
       <w:r>
-        <w:t xml:space="preserve">This document specifies what a ZedPath user sees and how they move through the app: the principles behind the design, the navigation structure, the design system (colour, type, shape, components), each main screen with its </w:t>
+        <w:t xml:space="preserve">This document specifies what a ZedPath user sees and how they move through the app: the principles behind the </w:t>
       </w:r>
       <w:r>
-        <w:t xml:space="preserve">states, the shared interaction patterns, the language and content rules, accessibility, and the performance budget for low-end Android phones on 3G. It records the design </w:t>
+        <w:t xml:space="preserve">design, the navigation structure, the design system (colour, type, shape, components), each main screen with its states, the shared interaction patterns, the language and content rules, accessibility, and the performance budget for low-end Android phones on 3G. It records the design </w:t>
       </w:r>
       <w:r>
         <w:rPr>
@@ -7257,7 +7373,7 @@
         <w:keepNext/>
         <w:keepLines/>
       </w:pPr>
-      <w:bookmarkStart w:id="2" w:name="_Toc243666844"/>
+      <w:bookmarkStart w:id="2" w:name="_Toc243666964"/>
       <w:r>
         <w:t>1.2 Scope</w:t>
       </w:r>
@@ -7268,7 +7384,10 @@
         <w:spacing w:after="120"/>
       </w:pPr>
       <w:r>
-        <w:t>The student-facing web app (a Vite + React single-page app installed as a Progressive Web App, also wrapped as an Android app) for Releases R1 and R2. The curator tools and the API are out of scope; they are covered by ZP-DOC-05 and ZP-DOC-06.</w:t>
+        <w:t xml:space="preserve">The student-facing web app (a Vite + React single-page app installed as a Progressive Web App, also wrapped as an </w:t>
+      </w:r>
+      <w:r>
+        <w:t>Android app) for Releases R1 and R2. The curator tools and the API are out of scope; they are covered by ZP-DOC-05 and ZP-DOC-06.</w:t>
       </w:r>
     </w:p>
     <w:p>
@@ -7277,7 +7396,7 @@
         <w:keepNext/>
         <w:keepLines/>
       </w:pPr>
-      <w:bookmarkStart w:id="3" w:name="_Toc243666845"/>
+      <w:bookmarkStart w:id="3" w:name="_Toc243666965"/>
       <w:r>
         <w:t>1.3 Intended audience</w:t>
       </w:r>
@@ -7297,7 +7416,7 @@
         <w:keepNext/>
         <w:keepLines/>
       </w:pPr>
-      <w:bookmarkStart w:id="4" w:name="_Toc243666846"/>
+      <w:bookmarkStart w:id="4" w:name="_Toc243666966"/>
       <w:r>
         <w:t>1.4 Relationship to other documents</w:t>
       </w:r>
@@ -7308,7 +7427,7 @@
         <w:pStyle w:val="Caption"/>
         <w:keepNext/>
       </w:pPr>
-      <w:bookmarkStart w:id="5" w:name="_Toc243666879"/>
+      <w:bookmarkStart w:id="5" w:name="_Toc243666999"/>
       <w:r>
         <w:t xml:space="preserve">Table </w:t>
       </w:r>
@@ -8069,7 +8188,7 @@
         <w:keepNext/>
         <w:keepLines/>
       </w:pPr>
-      <w:bookmarkStart w:id="6" w:name="_Toc243666847"/>
+      <w:bookmarkStart w:id="6" w:name="_Toc243666967"/>
       <w:r>
         <w:t>1.5 Conventions</w:t>
       </w:r>
@@ -8092,10 +8211,7 @@
         <w:t>src/styles.css</w:t>
       </w:r>
       <w:r>
-        <w:t xml:space="preserve">; components use tokens only, </w:t>
-      </w:r>
-      <w:r>
-        <w:t>never raw colours. Routes are written as hash routes (</w:t>
+        <w:t>; components use tokens only, never raw colours. Routes are written as hash routes (</w:t>
       </w:r>
       <w:r>
         <w:rPr>
@@ -8117,7 +8233,7 @@
         <w:keepLines/>
         <w:pageBreakBefore/>
       </w:pPr>
-      <w:bookmarkStart w:id="7" w:name="_Toc243666848"/>
+      <w:bookmarkStart w:id="7" w:name="_Toc243666968"/>
       <w:r>
         <w:lastRenderedPageBreak/>
         <w:t>2 Design principles</w:t>
@@ -8129,7 +8245,7 @@
         <w:pStyle w:val="Caption"/>
         <w:keepNext/>
       </w:pPr>
-      <w:bookmarkStart w:id="8" w:name="_Toc243666880"/>
+      <w:bookmarkStart w:id="8" w:name="_Toc243667000"/>
       <w:r>
         <w:t xml:space="preserve">Table </w:t>
       </w:r>
@@ -9617,7 +9733,7 @@
         <w:keepLines/>
         <w:pageBreakBefore/>
       </w:pPr>
-      <w:bookmarkStart w:id="9" w:name="_Toc243666849"/>
+      <w:bookmarkStart w:id="9" w:name="_Toc243666969"/>
       <w:r>
         <w:lastRenderedPageBreak/>
         <w:t>3 Personas and key journeys</w:t>
@@ -9637,7 +9753,7 @@
         <w:pStyle w:val="Caption"/>
         <w:keepNext/>
       </w:pPr>
-      <w:bookmarkStart w:id="10" w:name="_Toc243666881"/>
+      <w:bookmarkStart w:id="10" w:name="_Toc243667001"/>
       <w:r>
         <w:t xml:space="preserve">Table </w:t>
       </w:r>
@@ -10426,7 +10542,7 @@
         <w:pStyle w:val="Caption"/>
         <w:keepNext/>
       </w:pPr>
-      <w:bookmarkStart w:id="11" w:name="_Toc243666882"/>
+      <w:bookmarkStart w:id="11" w:name="_Toc243667002"/>
       <w:r>
         <w:t xml:space="preserve">Table </w:t>
       </w:r>
@@ -11438,7 +11554,7 @@
         <w:keepLines/>
         <w:pageBreakBefore/>
       </w:pPr>
-      <w:bookmarkStart w:id="12" w:name="_Toc243666850"/>
+      <w:bookmarkStart w:id="12" w:name="_Toc243666970"/>
       <w:r>
         <w:lastRenderedPageBreak/>
         <w:t>4 Information architecture and navigation</w:t>
@@ -11451,7 +11567,7 @@
         <w:keepNext/>
         <w:keepLines/>
       </w:pPr>
-      <w:bookmarkStart w:id="13" w:name="_Toc243666851"/>
+      <w:bookmarkStart w:id="13" w:name="_Toc243666971"/>
       <w:r>
         <w:t>4.1 Structure</w:t>
       </w:r>
@@ -11482,10 +11598,7 @@
         <w:t>main app</w:t>
       </w:r>
       <w:r>
-        <w:t xml:space="preserve"> with a top app bar and a five-tab bottom navigation bar. Me opens from the avatar in the top app bar. Routing uses the URL hash so the phone's Back button </w:t>
-      </w:r>
-      <w:r>
-        <w:t xml:space="preserve">and deep links work. From 1024 px wide (laptops, desktops, projectors) the same five destinations move into a </w:t>
+        <w:t xml:space="preserve"> with a top app bar and a five-tab bottom navigation bar. Me opens from the avatar in the top app bar. Routing uses the URL hash so the phone's Back button and deep links work. From 1024 px wide (laptops, desktops, projectors) the same five destinations move into a </w:t>
       </w:r>
       <w:r>
         <w:rPr>
@@ -11503,7 +11616,7 @@
         <w:pStyle w:val="Caption"/>
         <w:keepNext/>
       </w:pPr>
-      <w:bookmarkStart w:id="14" w:name="_Toc243666883"/>
+      <w:bookmarkStart w:id="14" w:name="_Toc243667003"/>
       <w:r>
         <w:t xml:space="preserve">Table </w:t>
       </w:r>
@@ -12386,12 +12499,9 @@
         <w:keepNext/>
         <w:keepLines/>
       </w:pPr>
-      <w:bookmarkStart w:id="15" w:name="_Toc243666852"/>
+      <w:bookmarkStart w:id="15" w:name="_Toc243666972"/>
       <w:r>
-        <w:t>4.2 </w:t>
-      </w:r>
-      <w:r>
-        <w:t>Desktop layout (1024 px and wider)</w:t>
+        <w:t>4.2 Desktop layout (1024 px and wider)</w:t>
       </w:r>
       <w:bookmarkEnd w:id="15"/>
     </w:p>
@@ -12432,7 +12542,7 @@
         <w:pStyle w:val="Caption"/>
         <w:keepNext/>
       </w:pPr>
-      <w:bookmarkStart w:id="16" w:name="_Toc243666884"/>
+      <w:bookmarkStart w:id="16" w:name="_Toc243667004"/>
       <w:r>
         <w:t xml:space="preserve">Table </w:t>
       </w:r>
@@ -13221,7 +13331,7 @@
         <w:keepNext/>
         <w:keepLines/>
       </w:pPr>
-      <w:bookmarkStart w:id="17" w:name="_Toc243666853"/>
+      <w:bookmarkStart w:id="17" w:name="_Toc243666973"/>
       <w:r>
         <w:lastRenderedPageBreak/>
         <w:t>4.3 Route table</w:t>
@@ -13233,7 +13343,7 @@
         <w:pStyle w:val="Caption"/>
         <w:keepNext/>
       </w:pPr>
-      <w:bookmarkStart w:id="18" w:name="_Toc243666885"/>
+      <w:bookmarkStart w:id="18" w:name="_Toc243667005"/>
       <w:r>
         <w:t xml:space="preserve">Table </w:t>
       </w:r>
@@ -15600,7 +15710,7 @@
                 <w:sz w:val="19"/>
                 <w:szCs w:val="19"/>
               </w:rPr>
-              <w:t>urce</w:t>
+              <w:t>urce. Each group list has a search icon in the top bar, left of the profile picture: it opens a search field (focused; Escape closes) that matches every typed word against the path's name, institute (and its short name, e.g. SLIIT), group and programmes; rows found through programmes show which ones (up to three, "+n more"), with a live count</w:t>
             </w:r>
           </w:p>
         </w:tc>
@@ -15644,6 +15754,7 @@
                 <w:szCs w:val="17"/>
                 <w:shd w:val="clear" w:color="auto" w:fill="F2F4F3"/>
               </w:rPr>
+              <w:lastRenderedPageBreak/>
               <w:t>#/groups</w:t>
             </w:r>
           </w:p>
@@ -16189,7 +16300,7 @@
         <w:keepNext/>
         <w:keepLines/>
       </w:pPr>
-      <w:bookmarkStart w:id="19" w:name="_Toc243666854"/>
+      <w:bookmarkStart w:id="19" w:name="_Toc243666974"/>
       <w:r>
         <w:t>4.4 Guards</w:t>
       </w:r>
@@ -16200,7 +16311,7 @@
         <w:pStyle w:val="Caption"/>
         <w:keepNext/>
       </w:pPr>
-      <w:bookmarkStart w:id="20" w:name="_Toc243666886"/>
+      <w:bookmarkStart w:id="20" w:name="_Toc243667006"/>
       <w:r>
         <w:t xml:space="preserve">Table </w:t>
       </w:r>
@@ -16844,7 +16955,7 @@
         <w:keepLines/>
         <w:pageBreakBefore/>
       </w:pPr>
-      <w:bookmarkStart w:id="21" w:name="_Toc243666855"/>
+      <w:bookmarkStart w:id="21" w:name="_Toc243666975"/>
       <w:r>
         <w:lastRenderedPageBreak/>
         <w:t>5 Design system</w:t>
@@ -16857,7 +16968,7 @@
         <w:keepNext/>
         <w:keepLines/>
       </w:pPr>
-      <w:bookmarkStart w:id="22" w:name="_Toc243666856"/>
+      <w:bookmarkStart w:id="22" w:name="_Toc243666976"/>
       <w:r>
         <w:t>5.1 Colour roles</w:t>
       </w:r>
@@ -16876,7 +16987,7 @@
         <w:pStyle w:val="Caption"/>
         <w:keepNext/>
       </w:pPr>
-      <w:bookmarkStart w:id="23" w:name="_Toc243666887"/>
+      <w:bookmarkStart w:id="23" w:name="_Toc243667007"/>
       <w:r>
         <w:t xml:space="preserve">Table </w:t>
       </w:r>
@@ -18900,7 +19011,7 @@
         <w:keepNext/>
         <w:keepLines/>
       </w:pPr>
-      <w:bookmarkStart w:id="24" w:name="_Toc243666857"/>
+      <w:bookmarkStart w:id="24" w:name="_Toc243666977"/>
       <w:r>
         <w:t>5.2 Typography</w:t>
       </w:r>
@@ -18971,7 +19082,7 @@
         <w:pStyle w:val="Caption"/>
         <w:keepNext/>
       </w:pPr>
-      <w:bookmarkStart w:id="25" w:name="_Toc243666888"/>
+      <w:bookmarkStart w:id="25" w:name="_Toc243667008"/>
       <w:r>
         <w:t xml:space="preserve">Table </w:t>
       </w:r>
@@ -20685,7 +20796,7 @@
         <w:keepNext/>
         <w:keepLines/>
       </w:pPr>
-      <w:bookmarkStart w:id="26" w:name="_Toc243666858"/>
+      <w:bookmarkStart w:id="26" w:name="_Toc243666978"/>
       <w:r>
         <w:t>5.3 Spacing, shape and elevation</w:t>
       </w:r>
@@ -20696,7 +20807,7 @@
         <w:pStyle w:val="Caption"/>
         <w:keepNext/>
       </w:pPr>
-      <w:bookmarkStart w:id="27" w:name="_Toc243666889"/>
+      <w:bookmarkStart w:id="27" w:name="_Toc243667009"/>
       <w:r>
         <w:t xml:space="preserve">Table </w:t>
       </w:r>
@@ -21384,7 +21495,7 @@
         <w:keepNext/>
         <w:keepLines/>
       </w:pPr>
-      <w:bookmarkStart w:id="28" w:name="_Toc243666859"/>
+      <w:bookmarkStart w:id="28" w:name="_Toc243666979"/>
       <w:r>
         <w:t>5.4 Components</w:t>
       </w:r>
@@ -21395,7 +21506,7 @@
         <w:pStyle w:val="Caption"/>
         <w:keepNext/>
       </w:pPr>
-      <w:bookmarkStart w:id="29" w:name="_Toc243666890"/>
+      <w:bookmarkStart w:id="29" w:name="_Toc243667010"/>
       <w:r>
         <w:t xml:space="preserve">Table </w:t>
       </w:r>
@@ -23994,7 +24105,7 @@
         <w:keepLines/>
         <w:pageBreakBefore/>
       </w:pPr>
-      <w:bookmarkStart w:id="30" w:name="_Toc243666860"/>
+      <w:bookmarkStart w:id="30" w:name="_Toc243666980"/>
       <w:r>
         <w:lastRenderedPageBreak/>
         <w:t>6 </w:t>
@@ -24058,7 +24169,7 @@
         <w:keepNext/>
         <w:keepLines/>
       </w:pPr>
-      <w:bookmarkStart w:id="31" w:name="_Toc243666861"/>
+      <w:bookmarkStart w:id="31" w:name="_Toc243666981"/>
       <w:r>
         <w:t>6.1 Welcome, Intro and About you (onboarding)</w:t>
       </w:r>
@@ -24069,7 +24180,7 @@
         <w:pStyle w:val="Caption"/>
         <w:keepNext/>
       </w:pPr>
-      <w:bookmarkStart w:id="32" w:name="_Toc243666891"/>
+      <w:bookmarkStart w:id="32" w:name="_Toc243667011"/>
       <w:r>
         <w:t xml:space="preserve">Table </w:t>
       </w:r>
@@ -24605,7 +24716,7 @@
         <w:keepNext/>
         <w:keepLines/>
       </w:pPr>
-      <w:bookmarkStart w:id="33" w:name="_Toc243666862"/>
+      <w:bookmarkStart w:id="33" w:name="_Toc243666982"/>
       <w:r>
         <w:t>6.2 Account (sign up, log in, recover, recovery code, complete your account)</w:t>
       </w:r>
@@ -24616,7 +24727,7 @@
         <w:pStyle w:val="Caption"/>
         <w:keepNext/>
       </w:pPr>
-      <w:bookmarkStart w:id="34" w:name="_Toc243666892"/>
+      <w:bookmarkStart w:id="34" w:name="_Toc243667012"/>
       <w:r>
         <w:t xml:space="preserve">Table </w:t>
       </w:r>
@@ -25076,7 +25187,7 @@
         <w:keepNext/>
         <w:keepLines/>
       </w:pPr>
-      <w:bookmarkStart w:id="35" w:name="_Toc243666863"/>
+      <w:bookmarkStart w:id="35" w:name="_Toc243666983"/>
       <w:r>
         <w:t>6.3 Paths (home)</w:t>
       </w:r>
@@ -25087,7 +25198,7 @@
         <w:pStyle w:val="Caption"/>
         <w:keepNext/>
       </w:pPr>
-      <w:bookmarkStart w:id="36" w:name="_Toc243666893"/>
+      <w:bookmarkStart w:id="36" w:name="_Toc243667013"/>
       <w:r>
         <w:t xml:space="preserve">Table </w:t>
       </w:r>
@@ -25516,7 +25627,7 @@
         <w:keepNext/>
         <w:keepLines/>
       </w:pPr>
-      <w:bookmarkStart w:id="37" w:name="_Toc243666864"/>
+      <w:bookmarkStart w:id="37" w:name="_Toc243666984"/>
       <w:r>
         <w:t>6.4 Courses</w:t>
       </w:r>
@@ -25527,7 +25638,7 @@
         <w:pStyle w:val="Caption"/>
         <w:keepNext/>
       </w:pPr>
-      <w:bookmarkStart w:id="38" w:name="_Toc243666894"/>
+      <w:bookmarkStart w:id="38" w:name="_Toc243667014"/>
       <w:r>
         <w:t xml:space="preserve">Table </w:t>
       </w:r>
@@ -26003,7 +26114,7 @@
         <w:keepNext/>
         <w:keepLines/>
       </w:pPr>
-      <w:bookmarkStart w:id="39" w:name="_Toc243666865"/>
+      <w:bookmarkStart w:id="39" w:name="_Toc243666985"/>
       <w:r>
         <w:t>6.5 Course detail</w:t>
       </w:r>
@@ -26014,7 +26125,7 @@
         <w:pStyle w:val="Caption"/>
         <w:keepNext/>
       </w:pPr>
-      <w:bookmarkStart w:id="40" w:name="_Toc243666895"/>
+      <w:bookmarkStart w:id="40" w:name="_Toc243667015"/>
       <w:r>
         <w:t xml:space="preserve">Table </w:t>
       </w:r>
@@ -26609,7 +26720,7 @@
         <w:keepNext/>
         <w:keepLines/>
       </w:pPr>
-      <w:bookmarkStart w:id="41" w:name="_Toc243666866"/>
+      <w:bookmarkStart w:id="41" w:name="_Toc243666986"/>
       <w:r>
         <w:lastRenderedPageBreak/>
         <w:t>6.6 Compare</w:t>
@@ -26621,7 +26732,7 @@
         <w:pStyle w:val="Caption"/>
         <w:keepNext/>
       </w:pPr>
-      <w:bookmarkStart w:id="42" w:name="_Toc243666896"/>
+      <w:bookmarkStart w:id="42" w:name="_Toc243667016"/>
       <w:r>
         <w:t xml:space="preserve">Table </w:t>
       </w:r>
@@ -27049,7 +27160,7 @@
         <w:keepNext/>
         <w:keepLines/>
       </w:pPr>
-      <w:bookmarkStart w:id="43" w:name="_Toc243666867"/>
+      <w:bookmarkStart w:id="43" w:name="_Toc243666987"/>
       <w:r>
         <w:t>6.7 My list</w:t>
       </w:r>
@@ -27060,7 +27171,7 @@
         <w:pStyle w:val="Caption"/>
         <w:keepNext/>
       </w:pPr>
-      <w:bookmarkStart w:id="44" w:name="_Toc243666897"/>
+      <w:bookmarkStart w:id="44" w:name="_Toc243667017"/>
       <w:r>
         <w:t xml:space="preserve">Table </w:t>
       </w:r>
@@ -27545,7 +27656,7 @@
         <w:keepNext/>
         <w:keepLines/>
       </w:pPr>
-      <w:bookmarkStart w:id="45" w:name="_Toc243666868"/>
+      <w:bookmarkStart w:id="45" w:name="_Toc243666988"/>
       <w:r>
         <w:t>6.8 Guide to applying to the UGC (CR-012)</w:t>
       </w:r>
@@ -27556,7 +27667,7 @@
         <w:pStyle w:val="Caption"/>
         <w:keepNext/>
       </w:pPr>
-      <w:bookmarkStart w:id="46" w:name="_Toc243666898"/>
+      <w:bookmarkStart w:id="46" w:name="_Toc243667018"/>
       <w:r>
         <w:t xml:space="preserve">Table </w:t>
       </w:r>
@@ -28145,7 +28256,7 @@
         <w:keepNext/>
         <w:keepLines/>
       </w:pPr>
-      <w:bookmarkStart w:id="47" w:name="_Toc243666869"/>
+      <w:bookmarkStart w:id="47" w:name="_Toc243666989"/>
       <w:r>
         <w:t>6.9 Journey</w:t>
       </w:r>
@@ -28156,7 +28267,7 @@
         <w:pStyle w:val="Caption"/>
         <w:keepNext/>
       </w:pPr>
-      <w:bookmarkStart w:id="48" w:name="_Toc243666899"/>
+      <w:bookmarkStart w:id="48" w:name="_Toc243667019"/>
       <w:r>
         <w:t xml:space="preserve">Table </w:t>
       </w:r>
@@ -28632,7 +28743,7 @@
         <w:keepNext/>
         <w:keepLines/>
       </w:pPr>
-      <w:bookmarkStart w:id="49" w:name="_Toc243666870"/>
+      <w:bookmarkStart w:id="49" w:name="_Toc243666990"/>
       <w:r>
         <w:t>6.10 Ask ZedPath</w:t>
       </w:r>
@@ -28643,7 +28754,7 @@
         <w:pStyle w:val="Caption"/>
         <w:keepNext/>
       </w:pPr>
-      <w:bookmarkStart w:id="50" w:name="_Toc243666900"/>
+      <w:bookmarkStart w:id="50" w:name="_Toc243667020"/>
       <w:r>
         <w:t xml:space="preserve">Table </w:t>
       </w:r>
@@ -29167,7 +29278,7 @@
         <w:keepNext/>
         <w:keepLines/>
       </w:pPr>
-      <w:bookmarkStart w:id="51" w:name="_Toc243666871"/>
+      <w:bookmarkStart w:id="51" w:name="_Toc243666991"/>
       <w:r>
         <w:t>6.11 Groups, Group room and Group info</w:t>
       </w:r>
@@ -29178,7 +29289,7 @@
         <w:pStyle w:val="Caption"/>
         <w:keepNext/>
       </w:pPr>
-      <w:bookmarkStart w:id="52" w:name="_Toc243666901"/>
+      <w:bookmarkStart w:id="52" w:name="_Toc243667021"/>
       <w:r>
         <w:t xml:space="preserve">Table </w:t>
       </w:r>
@@ -29647,7 +29758,7 @@
         <w:keepNext/>
         <w:keepLines/>
       </w:pPr>
-      <w:bookmarkStart w:id="53" w:name="_Toc243666872"/>
+      <w:bookmarkStart w:id="53" w:name="_Toc243666992"/>
       <w:r>
         <w:lastRenderedPageBreak/>
         <w:t>6.12 Me</w:t>
@@ -29659,7 +29770,7 @@
         <w:pStyle w:val="Caption"/>
         <w:keepNext/>
       </w:pPr>
-      <w:bookmarkStart w:id="54" w:name="_Toc243666902"/>
+      <w:bookmarkStart w:id="54" w:name="_Toc243667022"/>
       <w:r>
         <w:t xml:space="preserve">Table </w:t>
       </w:r>
@@ -30095,7 +30206,7 @@
         <w:keepLines/>
         <w:pageBreakBefore/>
       </w:pPr>
-      <w:bookmarkStart w:id="55" w:name="_Toc243666873"/>
+      <w:bookmarkStart w:id="55" w:name="_Toc243666993"/>
       <w:r>
         <w:lastRenderedPageBreak/>
         <w:t>7 Interaction patterns</w:t>
@@ -30107,7 +30218,7 @@
         <w:pStyle w:val="Caption"/>
         <w:keepNext/>
       </w:pPr>
-      <w:bookmarkStart w:id="56" w:name="_Toc243666903"/>
+      <w:bookmarkStart w:id="56" w:name="_Toc243667023"/>
       <w:r>
         <w:t xml:space="preserve">Table </w:t>
       </w:r>
@@ -31286,7 +31397,7 @@
         <w:keepLines/>
         <w:pageBreakBefore/>
       </w:pPr>
-      <w:bookmarkStart w:id="57" w:name="_Toc243666874"/>
+      <w:bookmarkStart w:id="57" w:name="_Toc243666994"/>
       <w:r>
         <w:lastRenderedPageBreak/>
         <w:t>8 Content and language</w:t>
@@ -31298,7 +31409,7 @@
         <w:pStyle w:val="Caption"/>
         <w:keepNext/>
       </w:pPr>
-      <w:bookmarkStart w:id="58" w:name="_Toc243666904"/>
+      <w:bookmarkStart w:id="58" w:name="_Toc243667024"/>
       <w:r>
         <w:t xml:space="preserve">Table </w:t>
       </w:r>
@@ -32072,7 +32183,7 @@
         <w:keepLines/>
         <w:pageBreakBefore/>
       </w:pPr>
-      <w:bookmarkStart w:id="59" w:name="_Toc243666875"/>
+      <w:bookmarkStart w:id="59" w:name="_Toc243666995"/>
       <w:r>
         <w:lastRenderedPageBreak/>
         <w:t>9 Accessibility checklist (WCAG 2.2 AA)</w:t>
@@ -32092,7 +32203,7 @@
         <w:pStyle w:val="Caption"/>
         <w:keepNext/>
       </w:pPr>
-      <w:bookmarkStart w:id="60" w:name="_Toc243666905"/>
+      <w:bookmarkStart w:id="60" w:name="_Toc243667025"/>
       <w:r>
         <w:t xml:space="preserve">Table </w:t>
       </w:r>
@@ -33846,7 +33957,7 @@
         <w:keepLines/>
         <w:pageBreakBefore/>
       </w:pPr>
-      <w:bookmarkStart w:id="61" w:name="_Toc243666876"/>
+      <w:bookmarkStart w:id="61" w:name="_Toc243666996"/>
       <w:r>
         <w:lastRenderedPageBreak/>
         <w:t>10 Performance budget for 3G</w:t>
@@ -33858,7 +33969,7 @@
         <w:pStyle w:val="Caption"/>
         <w:keepNext/>
       </w:pPr>
-      <w:bookmarkStart w:id="62" w:name="_Toc243666906"/>
+      <w:bookmarkStart w:id="62" w:name="_Toc243667026"/>
       <w:r>
         <w:t xml:space="preserve">Table </w:t>
       </w:r>
@@ -34690,7 +34801,7 @@
         <w:keepLines/>
         <w:pageBreakBefore/>
       </w:pPr>
-      <w:bookmarkStart w:id="63" w:name="_Toc243666877"/>
+      <w:bookmarkStart w:id="63" w:name="_Toc243666997"/>
       <w:r>
         <w:lastRenderedPageBreak/>
         <w:t>11 Usability evidence</w:t>
@@ -34710,7 +34821,7 @@
         <w:pStyle w:val="Caption"/>
         <w:keepNext/>
       </w:pPr>
-      <w:bookmarkStart w:id="64" w:name="_Toc243666907"/>
+      <w:bookmarkStart w:id="64" w:name="_Toc243667027"/>
       <w:r>
         <w:t xml:space="preserve">Table </w:t>
       </w:r>
@@ -36448,7 +36559,7 @@
         <w:keepLines/>
         <w:pageBreakBefore/>
       </w:pPr>
-      <w:bookmarkStart w:id="65" w:name="_Toc243666878"/>
+      <w:bookmarkStart w:id="65" w:name="_Toc243666998"/>
       <w:r>
         <w:lastRenderedPageBreak/>
         <w:t>12 Traceability</w:t>
@@ -36460,7 +36571,7 @@
         <w:pStyle w:val="Caption"/>
         <w:keepNext/>
       </w:pPr>
-      <w:bookmarkStart w:id="66" w:name="_Toc243666908"/>
+      <w:bookmarkStart w:id="66" w:name="_Toc243667028"/>
       <w:r>
         <w:t xml:space="preserve">Table </w:t>
       </w:r>
@@ -37926,10 +38037,72 @@
 <file path=word/numbering.xml><?xml version="1.0" encoding="utf-8"?>
 <w:numbering xmlns:wpc="http://schemas.microsoft.com/office/word/2010/wordprocessingCanvas" xmlns:cx="http://schemas.microsoft.com/office/drawing/2014/chartex" xmlns:cx1="http://schemas.microsoft.com/office/drawing/2015/9/8/chartex" xmlns:cx2="http://schemas.microsoft.com/office/drawing/2015/10/21/chartex" xmlns:cx3="http://schemas.microsoft.com/office/drawing/2016/5/9/chartex" xmlns:cx4="http://schemas.microsoft.com/office/drawing/2016/5/10/chartex" xmlns:cx5="http://schemas.microsoft.com/office/drawing/2016/5/11/chartex" xmlns:cx6="http://schemas.microsoft.com/office/drawing/2016/5/12/chartex" xmlns:cx7="http://schemas.microsoft.com/office/drawing/2016/5/13/chartex" xmlns:cx8="http://schemas.microsoft.com/office/drawing/2016/5/14/chartex" xmlns:mc="http://schemas.openxmlformats.org/markup-compatibility/2006" xmlns:aink="http://schemas.microsoft.com/office/drawing/2016/ink" xmlns:am3d="http://schemas.microsoft.com/office/drawing/2017/model3d" xmlns:o="urn:schemas-microsoft-com:office:office" xmlns:oel="http://schemas.microsoft.com/office/2019/extlst" xmlns:r="http://schemas.openxmlformats.org/officeDocument/2006/relationships" xmlns:m="http://schemas.openxmlformats.org/officeDocument/2006/math" xmlns:v="urn:schemas-microsoft-com:vml" xmlns:wp14="http://schemas.microsoft.com/office/word/2010/wordprocessingDrawing" xmlns:wp="http://schemas.openxmlformats.org/drawingml/2006/wordprocessingDrawing" xmlns:w10="urn:schemas-microsoft-com:office:word" xmlns:w="http://schemas.openxmlformats.org/wordprocessingml/2006/main" xmlns:w14="http://schemas.microsoft.com/office/word/2010/wordml" xmlns:w15="http://schemas.microsoft.com/office/word/2012/wordml" xmlns:w16cex="http://schemas.microsoft.com/office/word/2018/wordml/cex" xmlns:w16cid="http://schemas.microsoft.com/office/word/2016/wordml/cid" xmlns:w16="http://schemas.microsoft.com/office/word/2018/wordml" xmlns:w16du="http://schemas.microsoft.com/office/word/2023/wordml/word16du" xmlns:w16sdtdh="http://schemas.microsoft.com/office/word/2020/wordml/sdtdatahash" xmlns:w16sdtfl="http://schemas.microsoft.com/office/word/2024/wordml/sdtformatlock" xmlns:w16se="http://schemas.microsoft.com/office/word/2015/wordml/symex" xmlns:wpg="http://schemas.microsoft.com/office/word/2010/wordprocessingGroup" xmlns:wpi="http://schemas.microsoft.com/office/word/2010/wordprocessingInk" xmlns:wne="http://schemas.microsoft.com/office/word/2006/wordml" xmlns:wps="http://schemas.microsoft.com/office/word/2010/wordprocessingShape" mc:Ignorable="w14 w15 w16se w16cid w16 w16cex w16sdtdh w16sdtfl w16du wp14">
   <w:abstractNum w:abstractNumId="0" w15:restartNumberingAfterBreak="0">
-    <w:nsid w:val="0A43559D"/>
+    <w:nsid w:val="3F6843DE"/>
     <w:multiLevelType w:val="hybridMultilevel"/>
-    <w:tmpl w:val="AC0CCCF0"/>
-    <w:lvl w:ilvl="0" w:tplc="B4165FDE" w:tentative="1">
+    <w:tmpl w:val="CE7AA056"/>
+    <w:lvl w:ilvl="0" w:tplc="813EC706" w:tentative="1">
+      <w:start w:val="1"/>
+      <w:numFmt w:val="decimal"/>
+      <w:lvlText w:val="%1."/>
+      <w:lvlJc w:val="left"/>
+      <w:pPr>
+        <w:ind w:left="720" w:hanging="360"/>
+      </w:pPr>
+    </w:lvl>
+    <w:lvl w:ilvl="1" w:tplc="ACDABEB8" w:tentative="1">
+      <w:start w:val="1"/>
+      <w:numFmt w:val="lowerLetter"/>
+      <w:lvlText w:val="%2."/>
+      <w:lvlJc w:val="left"/>
+      <w:pPr>
+        <w:ind w:left="1080" w:hanging="360"/>
+      </w:pPr>
+    </w:lvl>
+    <w:lvl w:ilvl="2" w:tplc="29B203F8" w:tentative="1">
+      <w:start w:val="1"/>
+      <w:numFmt w:val="lowerRoman"/>
+      <w:lvlText w:val="%3."/>
+      <w:lvlJc w:val="left"/>
+      <w:pPr>
+        <w:ind w:left="1440" w:hanging="360"/>
+      </w:pPr>
+    </w:lvl>
+    <w:lvl w:ilvl="3" w:tplc="A4FCE8C4">
+      <w:numFmt w:val="decimal"/>
+      <w:lvlText w:val=""/>
+      <w:lvlJc w:val="left"/>
+    </w:lvl>
+    <w:lvl w:ilvl="4" w:tplc="63E605D2">
+      <w:numFmt w:val="decimal"/>
+      <w:lvlText w:val=""/>
+      <w:lvlJc w:val="left"/>
+    </w:lvl>
+    <w:lvl w:ilvl="5" w:tplc="ADD4166E">
+      <w:numFmt w:val="decimal"/>
+      <w:lvlText w:val=""/>
+      <w:lvlJc w:val="left"/>
+    </w:lvl>
+    <w:lvl w:ilvl="6" w:tplc="F7668E84">
+      <w:numFmt w:val="decimal"/>
+      <w:lvlText w:val=""/>
+      <w:lvlJc w:val="left"/>
+    </w:lvl>
+    <w:lvl w:ilvl="7" w:tplc="EC6A4418">
+      <w:numFmt w:val="decimal"/>
+      <w:lvlText w:val=""/>
+      <w:lvlJc w:val="left"/>
+    </w:lvl>
+    <w:lvl w:ilvl="8" w:tplc="D70A3B6C">
+      <w:numFmt w:val="decimal"/>
+      <w:lvlText w:val=""/>
+      <w:lvlJc w:val="left"/>
+    </w:lvl>
+  </w:abstractNum>
+  <w:abstractNum w:abstractNumId="1" w15:restartNumberingAfterBreak="0">
+    <w:nsid w:val="5D967C26"/>
+    <w:multiLevelType w:val="hybridMultilevel"/>
+    <w:tmpl w:val="CA86F686"/>
+    <w:lvl w:ilvl="0" w:tplc="32427224" w:tentative="1">
       <w:start w:val="1"/>
       <w:numFmt w:val="bullet"/>
       <w:lvlText w:val="●"/>
@@ -37938,7 +38111,7 @@
         <w:ind w:left="720" w:hanging="360"/>
       </w:pPr>
     </w:lvl>
-    <w:lvl w:ilvl="1" w:tplc="55647756" w:tentative="1">
+    <w:lvl w:ilvl="1" w:tplc="34225F94" w:tentative="1">
       <w:start w:val="1"/>
       <w:numFmt w:val="bullet"/>
       <w:lvlText w:val="○"/>
@@ -37947,7 +38120,7 @@
         <w:ind w:left="1440" w:hanging="360"/>
       </w:pPr>
     </w:lvl>
-    <w:lvl w:ilvl="2" w:tplc="7C9CFD34" w:tentative="1">
+    <w:lvl w:ilvl="2" w:tplc="0C86D9EE" w:tentative="1">
       <w:start w:val="1"/>
       <w:numFmt w:val="bullet"/>
       <w:lvlText w:val="■"/>
@@ -37956,7 +38129,7 @@
         <w:ind w:left="2160" w:hanging="360"/>
       </w:pPr>
     </w:lvl>
-    <w:lvl w:ilvl="3" w:tplc="7D908B6E" w:tentative="1">
+    <w:lvl w:ilvl="3" w:tplc="0554D564" w:tentative="1">
       <w:start w:val="1"/>
       <w:numFmt w:val="bullet"/>
       <w:lvlText w:val="●"/>
@@ -37965,7 +38138,7 @@
         <w:ind w:left="2880" w:hanging="360"/>
       </w:pPr>
     </w:lvl>
-    <w:lvl w:ilvl="4" w:tplc="8BC23B5E" w:tentative="1">
+    <w:lvl w:ilvl="4" w:tplc="0BFE6D46" w:tentative="1">
       <w:start w:val="1"/>
       <w:numFmt w:val="bullet"/>
       <w:lvlText w:val="○"/>
@@ -37974,7 +38147,7 @@
         <w:ind w:left="3600" w:hanging="360"/>
       </w:pPr>
     </w:lvl>
-    <w:lvl w:ilvl="5" w:tplc="E5B4CE48" w:tentative="1">
+    <w:lvl w:ilvl="5" w:tplc="B5A89482" w:tentative="1">
       <w:start w:val="1"/>
       <w:numFmt w:val="bullet"/>
       <w:lvlText w:val="■"/>
@@ -37983,7 +38156,7 @@
         <w:ind w:left="4320" w:hanging="360"/>
       </w:pPr>
     </w:lvl>
-    <w:lvl w:ilvl="6" w:tplc="46386324" w:tentative="1">
+    <w:lvl w:ilvl="6" w:tplc="C91604AE" w:tentative="1">
       <w:start w:val="1"/>
       <w:numFmt w:val="bullet"/>
       <w:lvlText w:val="●"/>
@@ -37992,7 +38165,7 @@
         <w:ind w:left="5040" w:hanging="360"/>
       </w:pPr>
     </w:lvl>
-    <w:lvl w:ilvl="7" w:tplc="F87C7196" w:tentative="1">
+    <w:lvl w:ilvl="7" w:tplc="C832C53A" w:tentative="1">
       <w:start w:val="1"/>
       <w:numFmt w:val="bullet"/>
       <w:lvlText w:val="●"/>
@@ -38001,7 +38174,7 @@
         <w:ind w:left="5760" w:hanging="360"/>
       </w:pPr>
     </w:lvl>
-    <w:lvl w:ilvl="8" w:tplc="1D7C7948" w:tentative="1">
+    <w:lvl w:ilvl="8" w:tplc="E6A61ECC" w:tentative="1">
       <w:start w:val="1"/>
       <w:numFmt w:val="bullet"/>
       <w:lvlText w:val="●"/>
@@ -38011,73 +38184,11 @@
       </w:pPr>
     </w:lvl>
   </w:abstractNum>
-  <w:abstractNum w:abstractNumId="1" w15:restartNumberingAfterBreak="0">
-    <w:nsid w:val="21225D6C"/>
+  <w:abstractNum w:abstractNumId="2" w15:restartNumberingAfterBreak="0">
+    <w:nsid w:val="76002C5E"/>
     <w:multiLevelType w:val="hybridMultilevel"/>
-    <w:tmpl w:val="88DA7D88"/>
-    <w:lvl w:ilvl="0" w:tplc="46D4C16E" w:tentative="1">
-      <w:start w:val="1"/>
-      <w:numFmt w:val="decimal"/>
-      <w:lvlText w:val="%1."/>
-      <w:lvlJc w:val="left"/>
-      <w:pPr>
-        <w:ind w:left="720" w:hanging="360"/>
-      </w:pPr>
-    </w:lvl>
-    <w:lvl w:ilvl="1" w:tplc="2A881548" w:tentative="1">
-      <w:start w:val="1"/>
-      <w:numFmt w:val="lowerLetter"/>
-      <w:lvlText w:val="%2."/>
-      <w:lvlJc w:val="left"/>
-      <w:pPr>
-        <w:ind w:left="1080" w:hanging="360"/>
-      </w:pPr>
-    </w:lvl>
-    <w:lvl w:ilvl="2" w:tplc="B96CEF08" w:tentative="1">
-      <w:start w:val="1"/>
-      <w:numFmt w:val="lowerRoman"/>
-      <w:lvlText w:val="%3."/>
-      <w:lvlJc w:val="left"/>
-      <w:pPr>
-        <w:ind w:left="1440" w:hanging="360"/>
-      </w:pPr>
-    </w:lvl>
-    <w:lvl w:ilvl="3" w:tplc="853244A6">
-      <w:numFmt w:val="decimal"/>
-      <w:lvlText w:val=""/>
-      <w:lvlJc w:val="left"/>
-    </w:lvl>
-    <w:lvl w:ilvl="4" w:tplc="F59AC8F0">
-      <w:numFmt w:val="decimal"/>
-      <w:lvlText w:val=""/>
-      <w:lvlJc w:val="left"/>
-    </w:lvl>
-    <w:lvl w:ilvl="5" w:tplc="3EFC966C">
-      <w:numFmt w:val="decimal"/>
-      <w:lvlText w:val=""/>
-      <w:lvlJc w:val="left"/>
-    </w:lvl>
-    <w:lvl w:ilvl="6" w:tplc="4BA8E478">
-      <w:numFmt w:val="decimal"/>
-      <w:lvlText w:val=""/>
-      <w:lvlJc w:val="left"/>
-    </w:lvl>
-    <w:lvl w:ilvl="7" w:tplc="4B20A098">
-      <w:numFmt w:val="decimal"/>
-      <w:lvlText w:val=""/>
-      <w:lvlJc w:val="left"/>
-    </w:lvl>
-    <w:lvl w:ilvl="8" w:tplc="7FFC65E4">
-      <w:numFmt w:val="decimal"/>
-      <w:lvlText w:val=""/>
-      <w:lvlJc w:val="left"/>
-    </w:lvl>
-  </w:abstractNum>
-  <w:abstractNum w:abstractNumId="2" w15:restartNumberingAfterBreak="0">
-    <w:nsid w:val="3D4700B4"/>
-    <w:multiLevelType w:val="hybridMultilevel"/>
-    <w:tmpl w:val="2D0807D8"/>
-    <w:lvl w:ilvl="0" w:tplc="35B01940" w:tentative="1">
+    <w:tmpl w:val="A4561A98"/>
+    <w:lvl w:ilvl="0" w:tplc="890E7B04" w:tentative="1">
       <w:start w:val="1"/>
       <w:numFmt w:val="bullet"/>
       <w:lvlText w:val="•"/>
@@ -38086,7 +38197,7 @@
         <w:ind w:left="720" w:hanging="280"/>
       </w:pPr>
     </w:lvl>
-    <w:lvl w:ilvl="1" w:tplc="13B0C08E" w:tentative="1">
+    <w:lvl w:ilvl="1" w:tplc="AE32530A" w:tentative="1">
       <w:start w:val="1"/>
       <w:numFmt w:val="bullet"/>
       <w:lvlText w:val="–"/>
@@ -38095,7 +38206,7 @@
         <w:ind w:left="1080" w:hanging="280"/>
       </w:pPr>
     </w:lvl>
-    <w:lvl w:ilvl="2" w:tplc="B074F4F2" w:tentative="1">
+    <w:lvl w:ilvl="2" w:tplc="0D909BAC" w:tentative="1">
       <w:start w:val="1"/>
       <w:numFmt w:val="bullet"/>
       <w:lvlText w:val="▪"/>
@@ -38104,39 +38215,39 @@
         <w:ind w:left="1440" w:hanging="280"/>
       </w:pPr>
     </w:lvl>
-    <w:lvl w:ilvl="3" w:tplc="997003FE">
+    <w:lvl w:ilvl="3" w:tplc="8C841854">
       <w:numFmt w:val="decimal"/>
       <w:lvlText w:val=""/>
       <w:lvlJc w:val="left"/>
     </w:lvl>
-    <w:lvl w:ilvl="4" w:tplc="625E0D0E">
+    <w:lvl w:ilvl="4" w:tplc="A84630AE">
       <w:numFmt w:val="decimal"/>
       <w:lvlText w:val=""/>
       <w:lvlJc w:val="left"/>
     </w:lvl>
-    <w:lvl w:ilvl="5" w:tplc="17D495F2">
+    <w:lvl w:ilvl="5" w:tplc="CF2A1026">
       <w:numFmt w:val="decimal"/>
       <w:lvlText w:val=""/>
       <w:lvlJc w:val="left"/>
     </w:lvl>
-    <w:lvl w:ilvl="6" w:tplc="0CE2C056">
+    <w:lvl w:ilvl="6" w:tplc="D996E658">
       <w:numFmt w:val="decimal"/>
       <w:lvlText w:val=""/>
       <w:lvlJc w:val="left"/>
     </w:lvl>
-    <w:lvl w:ilvl="7" w:tplc="2092E54A">
+    <w:lvl w:ilvl="7" w:tplc="3AB0020C">
       <w:numFmt w:val="decimal"/>
       <w:lvlText w:val=""/>
       <w:lvlJc w:val="left"/>
     </w:lvl>
-    <w:lvl w:ilvl="8" w:tplc="C4F80268">
+    <w:lvl w:ilvl="8" w:tplc="D4C06948">
       <w:numFmt w:val="decimal"/>
       <w:lvlText w:val=""/>
       <w:lvlJc w:val="left"/>
     </w:lvl>
   </w:abstractNum>
-  <w:num w:numId="1" w16cid:durableId="1208031984">
-    <w:abstractNumId w:val="0"/>
+  <w:num w:numId="1" w16cid:durableId="532504544">
+    <w:abstractNumId w:val="1"/>
     <w:lvlOverride w:ilvl="0">
       <w:startOverride w:val="1"/>
     </w:lvlOverride>
@@ -38840,7 +38951,7 @@
     <w:autoRedefine/>
     <w:uiPriority w:val="39"/>
     <w:unhideWhenUsed/>
-    <w:rsid w:val="008D7DD1"/>
+    <w:rsid w:val="008805D3"/>
     <w:pPr>
       <w:spacing w:after="100"/>
     </w:pPr>
@@ -38852,7 +38963,7 @@
     <w:autoRedefine/>
     <w:uiPriority w:val="39"/>
     <w:unhideWhenUsed/>
-    <w:rsid w:val="008D7DD1"/>
+    <w:rsid w:val="008805D3"/>
     <w:pPr>
       <w:spacing w:after="100"/>
       <w:ind w:left="210"/>
@@ -38864,7 +38975,7 @@
     <w:next w:val="Normal"/>
     <w:uiPriority w:val="99"/>
     <w:unhideWhenUsed/>
-    <w:rsid w:val="008D7DD1"/>
+    <w:rsid w:val="008805D3"/>
   </w:style>
 </w:styles>
 </file>

</xml_diff>

<commit_message>
VR5 welcome screen and logo (Praveen's desktop screen recording, 23 Oct 18:37)
- "Try the demo, no sign-up" comes first: a large gold button with a one-line promise and a soft pulse (none
  under reduced motion), above "Choose your language".
- Choosing a language only selects it (radio group, "Selected"); the demo, or a new account through the new
  "New here? Create an account" button, opens in that language.
- On screens 1024 px and wider the Welcome screen fills the screen: intro left, actions in a glass card right.
- The logo in the app's top bar links home (#/paths).
- ZP-DOC-02 (AC-112.8, AC-112.9), 03 (FR-131), 07 updated; 582 passed; build green.

Co-Authored-By: Claude Opus 5.5 (1M context) <noreply@anthropic.com>
</commit_message>
<xml_diff>
--- a/docs/07-ui-ux/ZP-DOC-07_UI-UX-Design.docx
+++ b/docs/07-ui-ux/ZP-DOC-07_UI-UX-Design.docx
@@ -2491,6 +2491,122 @@
                 <w:sz w:val="19"/>
                 <w:szCs w:val="19"/>
               </w:rPr>
+              <w:t>VR5: Welcome: Try the demo first (gold, pulsing unless reduced motion); languages select only; Create an account; desktop two-column; logo goes home</w:t>
+            </w:r>
+          </w:p>
+        </w:tc>
+      </w:tr>
+      <w:tr>
+        <w:tblPrEx>
+          <w:tblCellMar>
+            <w:top w:w="0" w:type="dxa"/>
+            <w:bottom w:w="0" w:type="dxa"/>
+          </w:tblCellMar>
+        </w:tblPrEx>
+        <w:trPr>
+          <w:cantSplit/>
+          <w:trHeight w:val="420"/>
+        </w:trPr>
+        <w:tc>
+          <w:tcPr>
+            <w:tcW w:w="964" w:type="dxa"/>
+            <w:tcBorders>
+              <w:top w:val="single" w:sz="4" w:space="0" w:color="C9D3D0"/>
+              <w:left w:val="single" w:sz="4" w:space="0" w:color="C9D3D0"/>
+              <w:bottom w:val="single" w:sz="4" w:space="0" w:color="C9D3D0"/>
+              <w:right w:val="single" w:sz="4" w:space="0" w:color="C9D3D0"/>
+            </w:tcBorders>
+            <w:tcMar>
+              <w:top w:w="50" w:type="dxa"/>
+              <w:left w:w="100" w:type="dxa"/>
+              <w:bottom w:w="50" w:type="dxa"/>
+              <w:right w:w="100" w:type="dxa"/>
+            </w:tcMar>
+          </w:tcPr>
+          <w:p>
+            <w:r>
+              <w:rPr>
+                <w:sz w:val="19"/>
+                <w:szCs w:val="19"/>
+              </w:rPr>
+              <w:t>0.9</w:t>
+            </w:r>
+          </w:p>
+        </w:tc>
+        <w:tc>
+          <w:tcPr>
+            <w:tcW w:w="1542" w:type="dxa"/>
+            <w:tcBorders>
+              <w:top w:val="single" w:sz="4" w:space="0" w:color="C9D3D0"/>
+              <w:left w:val="single" w:sz="4" w:space="0" w:color="C9D3D0"/>
+              <w:bottom w:val="single" w:sz="4" w:space="0" w:color="C9D3D0"/>
+              <w:right w:val="single" w:sz="4" w:space="0" w:color="C9D3D0"/>
+            </w:tcBorders>
+            <w:tcMar>
+              <w:top w:w="50" w:type="dxa"/>
+              <w:left w:w="100" w:type="dxa"/>
+              <w:bottom w:w="50" w:type="dxa"/>
+              <w:right w:w="100" w:type="dxa"/>
+            </w:tcMar>
+          </w:tcPr>
+          <w:p>
+            <w:r>
+              <w:rPr>
+                <w:sz w:val="19"/>
+                <w:szCs w:val="19"/>
+              </w:rPr>
+              <w:t>23 Oct 2026</w:t>
+            </w:r>
+          </w:p>
+        </w:tc>
+        <w:tc>
+          <w:tcPr>
+            <w:tcW w:w="1928" w:type="dxa"/>
+            <w:tcBorders>
+              <w:top w:val="single" w:sz="4" w:space="0" w:color="C9D3D0"/>
+              <w:left w:val="single" w:sz="4" w:space="0" w:color="C9D3D0"/>
+              <w:bottom w:val="single" w:sz="4" w:space="0" w:color="C9D3D0"/>
+              <w:right w:val="single" w:sz="4" w:space="0" w:color="C9D3D0"/>
+            </w:tcBorders>
+            <w:tcMar>
+              <w:top w:w="50" w:type="dxa"/>
+              <w:left w:w="100" w:type="dxa"/>
+              <w:bottom w:w="50" w:type="dxa"/>
+              <w:right w:w="100" w:type="dxa"/>
+            </w:tcMar>
+          </w:tcPr>
+          <w:p>
+            <w:r>
+              <w:rPr>
+                <w:sz w:val="19"/>
+                <w:szCs w:val="19"/>
+              </w:rPr>
+              <w:t>Team Kestrel</w:t>
+            </w:r>
+          </w:p>
+        </w:tc>
+        <w:tc>
+          <w:tcPr>
+            <w:tcW w:w="5204" w:type="dxa"/>
+            <w:tcBorders>
+              <w:top w:val="single" w:sz="4" w:space="0" w:color="C9D3D0"/>
+              <w:left w:val="single" w:sz="4" w:space="0" w:color="C9D3D0"/>
+              <w:bottom w:val="single" w:sz="4" w:space="0" w:color="C9D3D0"/>
+              <w:right w:val="single" w:sz="4" w:space="0" w:color="C9D3D0"/>
+            </w:tcBorders>
+            <w:tcMar>
+              <w:top w:w="50" w:type="dxa"/>
+              <w:left w:w="100" w:type="dxa"/>
+              <w:bottom w:w="50" w:type="dxa"/>
+              <w:right w:w="100" w:type="dxa"/>
+            </w:tcMar>
+          </w:tcPr>
+          <w:p>
+            <w:r>
+              <w:rPr>
+                <w:sz w:val="19"/>
+                <w:szCs w:val="19"/>
+              </w:rPr>
               <w:t>CR-014: Groups for other paths; rules in a small window (Cancel / Agree and join); career card hidden from the home</w:t>
             </w:r>
           </w:p>
@@ -3011,7 +3127,7 @@
     <w:sdt>
       <w:sdtPr>
         <w:alias w:val="Contents"/>
-        <w:id w:val="622660903"/>
+        <w:id w:val="-1102795931"/>
       </w:sdtPr>
       <w:sdtEndPr/>
       <w:sdtContent>
@@ -3040,7 +3156,7 @@
           <w:r>
             <w:fldChar w:fldCharType="separate"/>
           </w:r>
-          <w:hyperlink w:anchor="_Toc243672197" w:history="1">
+          <w:hyperlink w:anchor="_Toc243673661" w:history="1">
             <w:r>
               <w:rPr>
                 <w:rStyle w:val="Hyperlink"/>
@@ -3064,7 +3180,7 @@
               <w:rPr>
                 <w:noProof/>
               </w:rPr>
-              <w:instrText xml:space="preserve"> PAGEREF _Toc243672197 \h </w:instrText>
+              <w:instrText xml:space="preserve"> PAGEREF _Toc243673661 \h </w:instrText>
             </w:r>
             <w:r>
               <w:rPr>
@@ -3107,7 +3223,7 @@
               <w14:ligatures w14:val="standardContextual"/>
             </w:rPr>
           </w:pPr>
-          <w:hyperlink w:anchor="_Toc243672198" w:history="1">
+          <w:hyperlink w:anchor="_Toc243673662" w:history="1">
             <w:r>
               <w:rPr>
                 <w:rStyle w:val="Hyperlink"/>
@@ -3131,7 +3247,7 @@
               <w:rPr>
                 <w:noProof/>
               </w:rPr>
-              <w:instrText xml:space="preserve"> PAGEREF _Toc243672198 \h </w:instrText>
+              <w:instrText xml:space="preserve"> PAGEREF _Toc243673662 \h </w:instrText>
             </w:r>
             <w:r>
               <w:rPr>
@@ -3174,7 +3290,7 @@
               <w14:ligatures w14:val="standardContextual"/>
             </w:rPr>
           </w:pPr>
-          <w:hyperlink w:anchor="_Toc243672199" w:history="1">
+          <w:hyperlink w:anchor="_Toc243673663" w:history="1">
             <w:r>
               <w:rPr>
                 <w:rStyle w:val="Hyperlink"/>
@@ -3198,7 +3314,7 @@
               <w:rPr>
                 <w:noProof/>
               </w:rPr>
-              <w:instrText xml:space="preserve"> PAGEREF _Toc243672199 \h </w:instrText>
+              <w:instrText xml:space="preserve"> PAGEREF _Toc243673663 \h </w:instrText>
             </w:r>
             <w:r>
               <w:rPr>
@@ -3241,7 +3357,7 @@
               <w14:ligatures w14:val="standardContextual"/>
             </w:rPr>
           </w:pPr>
-          <w:hyperlink w:anchor="_Toc243672200" w:history="1">
+          <w:hyperlink w:anchor="_Toc243673664" w:history="1">
             <w:r>
               <w:rPr>
                 <w:rStyle w:val="Hyperlink"/>
@@ -3265,7 +3381,7 @@
               <w:rPr>
                 <w:noProof/>
               </w:rPr>
-              <w:instrText xml:space="preserve"> PAGEREF _Toc243672200 \h </w:instrText>
+              <w:instrText xml:space="preserve"> PAGEREF _Toc243673664 \h </w:instrText>
             </w:r>
             <w:r>
               <w:rPr>
@@ -3308,7 +3424,7 @@
               <w14:ligatures w14:val="standardContextual"/>
             </w:rPr>
           </w:pPr>
-          <w:hyperlink w:anchor="_Toc243672201" w:history="1">
+          <w:hyperlink w:anchor="_Toc243673665" w:history="1">
             <w:r>
               <w:rPr>
                 <w:rStyle w:val="Hyperlink"/>
@@ -3332,7 +3448,7 @@
               <w:rPr>
                 <w:noProof/>
               </w:rPr>
-              <w:instrText xml:space="preserve"> PAGEREF _Toc243672201 \h </w:instrText>
+              <w:instrText xml:space="preserve"> PAGEREF _Toc243673665 \h </w:instrText>
             </w:r>
             <w:r>
               <w:rPr>
@@ -3375,7 +3491,7 @@
               <w14:ligatures w14:val="standardContextual"/>
             </w:rPr>
           </w:pPr>
-          <w:hyperlink w:anchor="_Toc243672202" w:history="1">
+          <w:hyperlink w:anchor="_Toc243673666" w:history="1">
             <w:r>
               <w:rPr>
                 <w:rStyle w:val="Hyperlink"/>
@@ -3399,7 +3515,7 @@
               <w:rPr>
                 <w:noProof/>
               </w:rPr>
-              <w:instrText xml:space="preserve"> PAGEREF _Toc243672202 \h </w:instrText>
+              <w:instrText xml:space="preserve"> PAGEREF _Toc243673666 \h </w:instrText>
             </w:r>
             <w:r>
               <w:rPr>
@@ -3442,7 +3558,7 @@
               <w14:ligatures w14:val="standardContextual"/>
             </w:rPr>
           </w:pPr>
-          <w:hyperlink w:anchor="_Toc243672203" w:history="1">
+          <w:hyperlink w:anchor="_Toc243673667" w:history="1">
             <w:r>
               <w:rPr>
                 <w:rStyle w:val="Hyperlink"/>
@@ -3466,7 +3582,7 @@
               <w:rPr>
                 <w:noProof/>
               </w:rPr>
-              <w:instrText xml:space="preserve"> PAGEREF _Toc243672203 \h </w:instrText>
+              <w:instrText xml:space="preserve"> PAGEREF _Toc243673667 \h </w:instrText>
             </w:r>
             <w:r>
               <w:rPr>
@@ -3509,7 +3625,7 @@
               <w14:ligatures w14:val="standardContextual"/>
             </w:rPr>
           </w:pPr>
-          <w:hyperlink w:anchor="_Toc243672204" w:history="1">
+          <w:hyperlink w:anchor="_Toc243673668" w:history="1">
             <w:r>
               <w:rPr>
                 <w:rStyle w:val="Hyperlink"/>
@@ -3533,7 +3649,7 @@
               <w:rPr>
                 <w:noProof/>
               </w:rPr>
-              <w:instrText xml:space="preserve"> PAGEREF _Toc243672204 \h </w:instrText>
+              <w:instrText xml:space="preserve"> PAGEREF _Toc243673668 \h </w:instrText>
             </w:r>
             <w:r>
               <w:rPr>
@@ -3576,7 +3692,7 @@
               <w14:ligatures w14:val="standardContextual"/>
             </w:rPr>
           </w:pPr>
-          <w:hyperlink w:anchor="_Toc243672205" w:history="1">
+          <w:hyperlink w:anchor="_Toc243673669" w:history="1">
             <w:r>
               <w:rPr>
                 <w:rStyle w:val="Hyperlink"/>
@@ -3600,7 +3716,7 @@
               <w:rPr>
                 <w:noProof/>
               </w:rPr>
-              <w:instrText xml:space="preserve"> PAGEREF _Toc243672205 \h </w:instrText>
+              <w:instrText xml:space="preserve"> PAGEREF _Toc243673669 \h </w:instrText>
             </w:r>
             <w:r>
               <w:rPr>
@@ -3643,7 +3759,7 @@
               <w14:ligatures w14:val="standardContextual"/>
             </w:rPr>
           </w:pPr>
-          <w:hyperlink w:anchor="_Toc243672206" w:history="1">
+          <w:hyperlink w:anchor="_Toc243673670" w:history="1">
             <w:r>
               <w:rPr>
                 <w:rStyle w:val="Hyperlink"/>
@@ -3667,7 +3783,7 @@
               <w:rPr>
                 <w:noProof/>
               </w:rPr>
-              <w:instrText xml:space="preserve"> PAGEREF _Toc243672206 \h </w:instrText>
+              <w:instrText xml:space="preserve"> PAGEREF _Toc243673670 \h </w:instrText>
             </w:r>
             <w:r>
               <w:rPr>
@@ -3710,7 +3826,7 @@
               <w14:ligatures w14:val="standardContextual"/>
             </w:rPr>
           </w:pPr>
-          <w:hyperlink w:anchor="_Toc243672207" w:history="1">
+          <w:hyperlink w:anchor="_Toc243673671" w:history="1">
             <w:r>
               <w:rPr>
                 <w:rStyle w:val="Hyperlink"/>
@@ -3734,7 +3850,7 @@
               <w:rPr>
                 <w:noProof/>
               </w:rPr>
-              <w:instrText xml:space="preserve"> PAGEREF _Toc243672207 \h </w:instrText>
+              <w:instrText xml:space="preserve"> PAGEREF _Toc243673671 \h </w:instrText>
             </w:r>
             <w:r>
               <w:rPr>
@@ -3777,7 +3893,7 @@
               <w14:ligatures w14:val="standardContextual"/>
             </w:rPr>
           </w:pPr>
-          <w:hyperlink w:anchor="_Toc243672208" w:history="1">
+          <w:hyperlink w:anchor="_Toc243673672" w:history="1">
             <w:r>
               <w:rPr>
                 <w:rStyle w:val="Hyperlink"/>
@@ -3801,7 +3917,7 @@
               <w:rPr>
                 <w:noProof/>
               </w:rPr>
-              <w:instrText xml:space="preserve"> PAGEREF _Toc243672208 \h </w:instrText>
+              <w:instrText xml:space="preserve"> PAGEREF _Toc243673672 \h </w:instrText>
             </w:r>
             <w:r>
               <w:rPr>
@@ -3844,7 +3960,7 @@
               <w14:ligatures w14:val="standardContextual"/>
             </w:rPr>
           </w:pPr>
-          <w:hyperlink w:anchor="_Toc243672209" w:history="1">
+          <w:hyperlink w:anchor="_Toc243673673" w:history="1">
             <w:r>
               <w:rPr>
                 <w:rStyle w:val="Hyperlink"/>
@@ -3868,7 +3984,7 @@
               <w:rPr>
                 <w:noProof/>
               </w:rPr>
-              <w:instrText xml:space="preserve"> PAGEREF _Toc243672209 \h </w:instrText>
+              <w:instrText xml:space="preserve"> PAGEREF _Toc243673673 \h </w:instrText>
             </w:r>
             <w:r>
               <w:rPr>
@@ -3911,7 +4027,7 @@
               <w14:ligatures w14:val="standardContextual"/>
             </w:rPr>
           </w:pPr>
-          <w:hyperlink w:anchor="_Toc243672210" w:history="1">
+          <w:hyperlink w:anchor="_Toc243673674" w:history="1">
             <w:r>
               <w:rPr>
                 <w:rStyle w:val="Hyperlink"/>
@@ -3935,7 +4051,7 @@
               <w:rPr>
                 <w:noProof/>
               </w:rPr>
-              <w:instrText xml:space="preserve"> PAGEREF _Toc243672210 \h </w:instrText>
+              <w:instrText xml:space="preserve"> PAGEREF _Toc243673674 \h </w:instrText>
             </w:r>
             <w:r>
               <w:rPr>
@@ -3978,7 +4094,7 @@
               <w14:ligatures w14:val="standardContextual"/>
             </w:rPr>
           </w:pPr>
-          <w:hyperlink w:anchor="_Toc243672211" w:history="1">
+          <w:hyperlink w:anchor="_Toc243673675" w:history="1">
             <w:r>
               <w:rPr>
                 <w:rStyle w:val="Hyperlink"/>
@@ -4002,7 +4118,7 @@
               <w:rPr>
                 <w:noProof/>
               </w:rPr>
-              <w:instrText xml:space="preserve"> PAGEREF _Toc243672211 \h </w:instrText>
+              <w:instrText xml:space="preserve"> PAGEREF _Toc243673675 \h </w:instrText>
             </w:r>
             <w:r>
               <w:rPr>
@@ -4045,7 +4161,7 @@
               <w14:ligatures w14:val="standardContextual"/>
             </w:rPr>
           </w:pPr>
-          <w:hyperlink w:anchor="_Toc243672212" w:history="1">
+          <w:hyperlink w:anchor="_Toc243673676" w:history="1">
             <w:r>
               <w:rPr>
                 <w:rStyle w:val="Hyperlink"/>
@@ -4069,7 +4185,7 @@
               <w:rPr>
                 <w:noProof/>
               </w:rPr>
-              <w:instrText xml:space="preserve"> PAGEREF _Toc243672212 \h </w:instrText>
+              <w:instrText xml:space="preserve"> PAGEREF _Toc243673676 \h </w:instrText>
             </w:r>
             <w:r>
               <w:rPr>
@@ -4112,7 +4228,7 @@
               <w14:ligatures w14:val="standardContextual"/>
             </w:rPr>
           </w:pPr>
-          <w:hyperlink w:anchor="_Toc243672213" w:history="1">
+          <w:hyperlink w:anchor="_Toc243673677" w:history="1">
             <w:r>
               <w:rPr>
                 <w:rStyle w:val="Hyperlink"/>
@@ -4136,7 +4252,7 @@
               <w:rPr>
                 <w:noProof/>
               </w:rPr>
-              <w:instrText xml:space="preserve"> PAGEREF _Toc243672213 \h </w:instrText>
+              <w:instrText xml:space="preserve"> PAGEREF _Toc243673677 \h </w:instrText>
             </w:r>
             <w:r>
               <w:rPr>
@@ -4179,7 +4295,7 @@
               <w14:ligatures w14:val="standardContextual"/>
             </w:rPr>
           </w:pPr>
-          <w:hyperlink w:anchor="_Toc243672214" w:history="1">
+          <w:hyperlink w:anchor="_Toc243673678" w:history="1">
             <w:r>
               <w:rPr>
                 <w:rStyle w:val="Hyperlink"/>
@@ -4203,7 +4319,7 @@
               <w:rPr>
                 <w:noProof/>
               </w:rPr>
-              <w:instrText xml:space="preserve"> PAGEREF _Toc243672214 \h </w:instrText>
+              <w:instrText xml:space="preserve"> PAGEREF _Toc243673678 \h </w:instrText>
             </w:r>
             <w:r>
               <w:rPr>
@@ -4246,7 +4362,7 @@
               <w14:ligatures w14:val="standardContextual"/>
             </w:rPr>
           </w:pPr>
-          <w:hyperlink w:anchor="_Toc243672215" w:history="1">
+          <w:hyperlink w:anchor="_Toc243673679" w:history="1">
             <w:r>
               <w:rPr>
                 <w:rStyle w:val="Hyperlink"/>
@@ -4270,7 +4386,7 @@
               <w:rPr>
                 <w:noProof/>
               </w:rPr>
-              <w:instrText xml:space="preserve"> PAGEREF _Toc243672215 \h </w:instrText>
+              <w:instrText xml:space="preserve"> PAGEREF _Toc243673679 \h </w:instrText>
             </w:r>
             <w:r>
               <w:rPr>
@@ -4313,7 +4429,7 @@
               <w14:ligatures w14:val="standardContextual"/>
             </w:rPr>
           </w:pPr>
-          <w:hyperlink w:anchor="_Toc243672216" w:history="1">
+          <w:hyperlink w:anchor="_Toc243673680" w:history="1">
             <w:r>
               <w:rPr>
                 <w:rStyle w:val="Hyperlink"/>
@@ -4337,7 +4453,7 @@
               <w:rPr>
                 <w:noProof/>
               </w:rPr>
-              <w:instrText xml:space="preserve"> PAGEREF _Toc243672216 \h </w:instrText>
+              <w:instrText xml:space="preserve"> PAGEREF _Toc243673680 \h </w:instrText>
             </w:r>
             <w:r>
               <w:rPr>
@@ -4380,7 +4496,7 @@
               <w14:ligatures w14:val="standardContextual"/>
             </w:rPr>
           </w:pPr>
-          <w:hyperlink w:anchor="_Toc243672217" w:history="1">
+          <w:hyperlink w:anchor="_Toc243673681" w:history="1">
             <w:r>
               <w:rPr>
                 <w:rStyle w:val="Hyperlink"/>
@@ -4404,7 +4520,7 @@
               <w:rPr>
                 <w:noProof/>
               </w:rPr>
-              <w:instrText xml:space="preserve"> PAGEREF _Toc243672217 \h </w:instrText>
+              <w:instrText xml:space="preserve"> PAGEREF _Toc243673681 \h </w:instrText>
             </w:r>
             <w:r>
               <w:rPr>
@@ -4447,7 +4563,7 @@
               <w14:ligatures w14:val="standardContextual"/>
             </w:rPr>
           </w:pPr>
-          <w:hyperlink w:anchor="_Toc243672218" w:history="1">
+          <w:hyperlink w:anchor="_Toc243673682" w:history="1">
             <w:r>
               <w:rPr>
                 <w:rStyle w:val="Hyperlink"/>
@@ -4471,7 +4587,7 @@
               <w:rPr>
                 <w:noProof/>
               </w:rPr>
-              <w:instrText xml:space="preserve"> PAGEREF _Toc243672218 \h </w:instrText>
+              <w:instrText xml:space="preserve"> PAGEREF _Toc243673682 \h </w:instrText>
             </w:r>
             <w:r>
               <w:rPr>
@@ -4514,7 +4630,7 @@
               <w14:ligatures w14:val="standardContextual"/>
             </w:rPr>
           </w:pPr>
-          <w:hyperlink w:anchor="_Toc243672219" w:history="1">
+          <w:hyperlink w:anchor="_Toc243673683" w:history="1">
             <w:r>
               <w:rPr>
                 <w:rStyle w:val="Hyperlink"/>
@@ -4538,7 +4654,7 @@
               <w:rPr>
                 <w:noProof/>
               </w:rPr>
-              <w:instrText xml:space="preserve"> PAGEREF _Toc243672219 \h </w:instrText>
+              <w:instrText xml:space="preserve"> PAGEREF _Toc243673683 \h </w:instrText>
             </w:r>
             <w:r>
               <w:rPr>
@@ -4581,7 +4697,7 @@
               <w14:ligatures w14:val="standardContextual"/>
             </w:rPr>
           </w:pPr>
-          <w:hyperlink w:anchor="_Toc243672220" w:history="1">
+          <w:hyperlink w:anchor="_Toc243673684" w:history="1">
             <w:r>
               <w:rPr>
                 <w:rStyle w:val="Hyperlink"/>
@@ -4605,7 +4721,7 @@
               <w:rPr>
                 <w:noProof/>
               </w:rPr>
-              <w:instrText xml:space="preserve"> PAGEREF _Toc243672220 \h </w:instrText>
+              <w:instrText xml:space="preserve"> PAGEREF _Toc243673684 \h </w:instrText>
             </w:r>
             <w:r>
               <w:rPr>
@@ -4648,7 +4764,7 @@
               <w14:ligatures w14:val="standardContextual"/>
             </w:rPr>
           </w:pPr>
-          <w:hyperlink w:anchor="_Toc243672221" w:history="1">
+          <w:hyperlink w:anchor="_Toc243673685" w:history="1">
             <w:r>
               <w:rPr>
                 <w:rStyle w:val="Hyperlink"/>
@@ -4672,7 +4788,7 @@
               <w:rPr>
                 <w:noProof/>
               </w:rPr>
-              <w:instrText xml:space="preserve"> PAGEREF _Toc243672221 \h </w:instrText>
+              <w:instrText xml:space="preserve"> PAGEREF _Toc243673685 \h </w:instrText>
             </w:r>
             <w:r>
               <w:rPr>
@@ -4715,7 +4831,7 @@
               <w14:ligatures w14:val="standardContextual"/>
             </w:rPr>
           </w:pPr>
-          <w:hyperlink w:anchor="_Toc243672222" w:history="1">
+          <w:hyperlink w:anchor="_Toc243673686" w:history="1">
             <w:r>
               <w:rPr>
                 <w:rStyle w:val="Hyperlink"/>
@@ -4739,7 +4855,7 @@
               <w:rPr>
                 <w:noProof/>
               </w:rPr>
-              <w:instrText xml:space="preserve"> PAGEREF _Toc243672222 \h </w:instrText>
+              <w:instrText xml:space="preserve"> PAGEREF _Toc243673686 \h </w:instrText>
             </w:r>
             <w:r>
               <w:rPr>
@@ -4782,7 +4898,7 @@
               <w14:ligatures w14:val="standardContextual"/>
             </w:rPr>
           </w:pPr>
-          <w:hyperlink w:anchor="_Toc243672223" w:history="1">
+          <w:hyperlink w:anchor="_Toc243673687" w:history="1">
             <w:r>
               <w:rPr>
                 <w:rStyle w:val="Hyperlink"/>
@@ -4806,7 +4922,7 @@
               <w:rPr>
                 <w:noProof/>
               </w:rPr>
-              <w:instrText xml:space="preserve"> PAGEREF _Toc243672223 \h </w:instrText>
+              <w:instrText xml:space="preserve"> PAGEREF _Toc243673687 \h </w:instrText>
             </w:r>
             <w:r>
               <w:rPr>
@@ -4849,7 +4965,7 @@
               <w14:ligatures w14:val="standardContextual"/>
             </w:rPr>
           </w:pPr>
-          <w:hyperlink w:anchor="_Toc243672224" w:history="1">
+          <w:hyperlink w:anchor="_Toc243673688" w:history="1">
             <w:r>
               <w:rPr>
                 <w:rStyle w:val="Hyperlink"/>
@@ -4873,7 +4989,7 @@
               <w:rPr>
                 <w:noProof/>
               </w:rPr>
-              <w:instrText xml:space="preserve"> PAGEREF _Toc243672224 \h </w:instrText>
+              <w:instrText xml:space="preserve"> PAGEREF _Toc243673688 \h </w:instrText>
             </w:r>
             <w:r>
               <w:rPr>
@@ -4916,7 +5032,7 @@
               <w14:ligatures w14:val="standardContextual"/>
             </w:rPr>
           </w:pPr>
-          <w:hyperlink w:anchor="_Toc243672225" w:history="1">
+          <w:hyperlink w:anchor="_Toc243673689" w:history="1">
             <w:r>
               <w:rPr>
                 <w:rStyle w:val="Hyperlink"/>
@@ -4940,7 +5056,7 @@
               <w:rPr>
                 <w:noProof/>
               </w:rPr>
-              <w:instrText xml:space="preserve"> PAGEREF _Toc243672225 \h </w:instrText>
+              <w:instrText xml:space="preserve"> PAGEREF _Toc243673689 \h </w:instrText>
             </w:r>
             <w:r>
               <w:rPr>
@@ -4983,7 +5099,7 @@
               <w14:ligatures w14:val="standardContextual"/>
             </w:rPr>
           </w:pPr>
-          <w:hyperlink w:anchor="_Toc243672226" w:history="1">
+          <w:hyperlink w:anchor="_Toc243673690" w:history="1">
             <w:r>
               <w:rPr>
                 <w:rStyle w:val="Hyperlink"/>
@@ -5007,7 +5123,7 @@
               <w:rPr>
                 <w:noProof/>
               </w:rPr>
-              <w:instrText xml:space="preserve"> PAGEREF _Toc243672226 \h </w:instrText>
+              <w:instrText xml:space="preserve"> PAGEREF _Toc243673690 \h </w:instrText>
             </w:r>
             <w:r>
               <w:rPr>
@@ -5050,7 +5166,7 @@
               <w14:ligatures w14:val="standardContextual"/>
             </w:rPr>
           </w:pPr>
-          <w:hyperlink w:anchor="_Toc243672227" w:history="1">
+          <w:hyperlink w:anchor="_Toc243673691" w:history="1">
             <w:r>
               <w:rPr>
                 <w:rStyle w:val="Hyperlink"/>
@@ -5074,7 +5190,7 @@
               <w:rPr>
                 <w:noProof/>
               </w:rPr>
-              <w:instrText xml:space="preserve"> PAGEREF _Toc243672227 \h </w:instrText>
+              <w:instrText xml:space="preserve"> PAGEREF _Toc243673691 \h </w:instrText>
             </w:r>
             <w:r>
               <w:rPr>
@@ -5117,7 +5233,7 @@
               <w14:ligatures w14:val="standardContextual"/>
             </w:rPr>
           </w:pPr>
-          <w:hyperlink w:anchor="_Toc243672228" w:history="1">
+          <w:hyperlink w:anchor="_Toc243673692" w:history="1">
             <w:r>
               <w:rPr>
                 <w:rStyle w:val="Hyperlink"/>
@@ -5141,7 +5257,7 @@
               <w:rPr>
                 <w:noProof/>
               </w:rPr>
-              <w:instrText xml:space="preserve"> PAGEREF _Toc243672228 \h </w:instrText>
+              <w:instrText xml:space="preserve"> PAGEREF _Toc243673692 \h </w:instrText>
             </w:r>
             <w:r>
               <w:rPr>
@@ -5184,7 +5300,7 @@
               <w14:ligatures w14:val="standardContextual"/>
             </w:rPr>
           </w:pPr>
-          <w:hyperlink w:anchor="_Toc243672229" w:history="1">
+          <w:hyperlink w:anchor="_Toc243673693" w:history="1">
             <w:r>
               <w:rPr>
                 <w:rStyle w:val="Hyperlink"/>
@@ -5208,7 +5324,7 @@
               <w:rPr>
                 <w:noProof/>
               </w:rPr>
-              <w:instrText xml:space="preserve"> PAGEREF _Toc243672229 \h </w:instrText>
+              <w:instrText xml:space="preserve"> PAGEREF _Toc243673693 \h </w:instrText>
             </w:r>
             <w:r>
               <w:rPr>
@@ -5251,7 +5367,7 @@
               <w14:ligatures w14:val="standardContextual"/>
             </w:rPr>
           </w:pPr>
-          <w:hyperlink w:anchor="_Toc243672230" w:history="1">
+          <w:hyperlink w:anchor="_Toc243673694" w:history="1">
             <w:r>
               <w:rPr>
                 <w:rStyle w:val="Hyperlink"/>
@@ -5275,7 +5391,7 @@
               <w:rPr>
                 <w:noProof/>
               </w:rPr>
-              <w:instrText xml:space="preserve"> PAGEREF _Toc243672230 \h </w:instrText>
+              <w:instrText xml:space="preserve"> PAGEREF _Toc243673694 \h </w:instrText>
             </w:r>
             <w:r>
               <w:rPr>
@@ -5318,7 +5434,7 @@
               <w14:ligatures w14:val="standardContextual"/>
             </w:rPr>
           </w:pPr>
-          <w:hyperlink w:anchor="_Toc243672231" w:history="1">
+          <w:hyperlink w:anchor="_Toc243673695" w:history="1">
             <w:r>
               <w:rPr>
                 <w:rStyle w:val="Hyperlink"/>
@@ -5342,7 +5458,7 @@
               <w:rPr>
                 <w:noProof/>
               </w:rPr>
-              <w:instrText xml:space="preserve"> PAGEREF _Toc243672231 \h </w:instrText>
+              <w:instrText xml:space="preserve"> PAGEREF _Toc243673695 \h </w:instrText>
             </w:r>
             <w:r>
               <w:rPr>
@@ -5385,7 +5501,7 @@
               <w14:ligatures w14:val="standardContextual"/>
             </w:rPr>
           </w:pPr>
-          <w:hyperlink w:anchor="_Toc243672232" w:history="1">
+          <w:hyperlink w:anchor="_Toc243673696" w:history="1">
             <w:r>
               <w:rPr>
                 <w:rStyle w:val="Hyperlink"/>
@@ -5409,7 +5525,7 @@
               <w:rPr>
                 <w:noProof/>
               </w:rPr>
-              <w:instrText xml:space="preserve"> PAGEREF _Toc243672232 \h </w:instrText>
+              <w:instrText xml:space="preserve"> PAGEREF _Toc243673696 \h </w:instrText>
             </w:r>
             <w:r>
               <w:rPr>
@@ -5452,7 +5568,7 @@
               <w14:ligatures w14:val="standardContextual"/>
             </w:rPr>
           </w:pPr>
-          <w:hyperlink w:anchor="_Toc243672233" w:history="1">
+          <w:hyperlink w:anchor="_Toc243673697" w:history="1">
             <w:r>
               <w:rPr>
                 <w:rStyle w:val="Hyperlink"/>
@@ -5476,7 +5592,7 @@
               <w:rPr>
                 <w:noProof/>
               </w:rPr>
-              <w:instrText xml:space="preserve"> PAGEREF _Toc243672233 \h </w:instrText>
+              <w:instrText xml:space="preserve"> PAGEREF _Toc243673697 \h </w:instrText>
             </w:r>
             <w:r>
               <w:rPr>
@@ -5519,7 +5635,7 @@
               <w14:ligatures w14:val="standardContextual"/>
             </w:rPr>
           </w:pPr>
-          <w:hyperlink w:anchor="_Toc243672234" w:history="1">
+          <w:hyperlink w:anchor="_Toc243673698" w:history="1">
             <w:r>
               <w:rPr>
                 <w:rStyle w:val="Hyperlink"/>
@@ -5543,7 +5659,7 @@
               <w:rPr>
                 <w:noProof/>
               </w:rPr>
-              <w:instrText xml:space="preserve"> PAGEREF _Toc243672234 \h </w:instrText>
+              <w:instrText xml:space="preserve"> PAGEREF _Toc243673698 \h </w:instrText>
             </w:r>
             <w:r>
               <w:rPr>
@@ -5589,7 +5705,7 @@
     <w:sdt>
       <w:sdtPr>
         <w:alias w:val="Tables"/>
-        <w:id w:val="-579979792"/>
+        <w:id w:val="-1286039019"/>
       </w:sdtPr>
       <w:sdtEndPr/>
       <w:sdtContent>
@@ -5618,7 +5734,7 @@
           <w:r>
             <w:fldChar w:fldCharType="separate"/>
           </w:r>
-          <w:hyperlink w:anchor="_Toc243672235" w:history="1">
+          <w:hyperlink w:anchor="_Toc243673699" w:history="1">
             <w:r>
               <w:rPr>
                 <w:rStyle w:val="Hyperlink"/>
@@ -5642,7 +5758,7 @@
               <w:rPr>
                 <w:noProof/>
               </w:rPr>
-              <w:instrText xml:space="preserve"> PAGEREF _Toc243672235 \h </w:instrText>
+              <w:instrText xml:space="preserve"> PAGEREF _Toc243673699 \h </w:instrText>
             </w:r>
             <w:r>
               <w:rPr>
@@ -5685,7 +5801,7 @@
               <w14:ligatures w14:val="standardContextual"/>
             </w:rPr>
           </w:pPr>
-          <w:hyperlink w:anchor="_Toc243672236" w:history="1">
+          <w:hyperlink w:anchor="_Toc243673700" w:history="1">
             <w:r>
               <w:rPr>
                 <w:rStyle w:val="Hyperlink"/>
@@ -5709,7 +5825,7 @@
               <w:rPr>
                 <w:noProof/>
               </w:rPr>
-              <w:instrText xml:space="preserve"> PAGEREF _Toc243672236 \h </w:instrText>
+              <w:instrText xml:space="preserve"> PAGEREF _Toc243673700 \h </w:instrText>
             </w:r>
             <w:r>
               <w:rPr>
@@ -5752,7 +5868,7 @@
               <w14:ligatures w14:val="standardContextual"/>
             </w:rPr>
           </w:pPr>
-          <w:hyperlink w:anchor="_Toc243672237" w:history="1">
+          <w:hyperlink w:anchor="_Toc243673701" w:history="1">
             <w:r>
               <w:rPr>
                 <w:rStyle w:val="Hyperlink"/>
@@ -5776,7 +5892,7 @@
               <w:rPr>
                 <w:noProof/>
               </w:rPr>
-              <w:instrText xml:space="preserve"> PAGEREF _Toc243672237 \h </w:instrText>
+              <w:instrText xml:space="preserve"> PAGEREF _Toc243673701 \h </w:instrText>
             </w:r>
             <w:r>
               <w:rPr>
@@ -5819,7 +5935,7 @@
               <w14:ligatures w14:val="standardContextual"/>
             </w:rPr>
           </w:pPr>
-          <w:hyperlink w:anchor="_Toc243672238" w:history="1">
+          <w:hyperlink w:anchor="_Toc243673702" w:history="1">
             <w:r>
               <w:rPr>
                 <w:rStyle w:val="Hyperlink"/>
@@ -5843,7 +5959,7 @@
               <w:rPr>
                 <w:noProof/>
               </w:rPr>
-              <w:instrText xml:space="preserve"> PAGEREF _Toc243672238 \h </w:instrText>
+              <w:instrText xml:space="preserve"> PAGEREF _Toc243673702 \h </w:instrText>
             </w:r>
             <w:r>
               <w:rPr>
@@ -5886,7 +6002,7 @@
               <w14:ligatures w14:val="standardContextual"/>
             </w:rPr>
           </w:pPr>
-          <w:hyperlink w:anchor="_Toc243672239" w:history="1">
+          <w:hyperlink w:anchor="_Toc243673703" w:history="1">
             <w:r>
               <w:rPr>
                 <w:rStyle w:val="Hyperlink"/>
@@ -5910,7 +6026,7 @@
               <w:rPr>
                 <w:noProof/>
               </w:rPr>
-              <w:instrText xml:space="preserve"> PAGEREF _Toc243672239 \h </w:instrText>
+              <w:instrText xml:space="preserve"> PAGEREF _Toc243673703 \h </w:instrText>
             </w:r>
             <w:r>
               <w:rPr>
@@ -5953,7 +6069,7 @@
               <w14:ligatures w14:val="standardContextual"/>
             </w:rPr>
           </w:pPr>
-          <w:hyperlink w:anchor="_Toc243672240" w:history="1">
+          <w:hyperlink w:anchor="_Toc243673704" w:history="1">
             <w:r>
               <w:rPr>
                 <w:rStyle w:val="Hyperlink"/>
@@ -5977,7 +6093,7 @@
               <w:rPr>
                 <w:noProof/>
               </w:rPr>
-              <w:instrText xml:space="preserve"> PAGEREF _Toc243672240 \h </w:instrText>
+              <w:instrText xml:space="preserve"> PAGEREF _Toc243673704 \h </w:instrText>
             </w:r>
             <w:r>
               <w:rPr>
@@ -6020,7 +6136,7 @@
               <w14:ligatures w14:val="standardContextual"/>
             </w:rPr>
           </w:pPr>
-          <w:hyperlink w:anchor="_Toc243672241" w:history="1">
+          <w:hyperlink w:anchor="_Toc243673705" w:history="1">
             <w:r>
               <w:rPr>
                 <w:rStyle w:val="Hyperlink"/>
@@ -6044,7 +6160,7 @@
               <w:rPr>
                 <w:noProof/>
               </w:rPr>
-              <w:instrText xml:space="preserve"> PAGEREF _Toc243672241 \h </w:instrText>
+              <w:instrText xml:space="preserve"> PAGEREF _Toc243673705 \h </w:instrText>
             </w:r>
             <w:r>
               <w:rPr>
@@ -6087,7 +6203,7 @@
               <w14:ligatures w14:val="standardContextual"/>
             </w:rPr>
           </w:pPr>
-          <w:hyperlink w:anchor="_Toc243672242" w:history="1">
+          <w:hyperlink w:anchor="_Toc243673706" w:history="1">
             <w:r>
               <w:rPr>
                 <w:rStyle w:val="Hyperlink"/>
@@ -6111,7 +6227,7 @@
               <w:rPr>
                 <w:noProof/>
               </w:rPr>
-              <w:instrText xml:space="preserve"> PAGEREF _Toc243672242 \h </w:instrText>
+              <w:instrText xml:space="preserve"> PAGEREF _Toc243673706 \h </w:instrText>
             </w:r>
             <w:r>
               <w:rPr>
@@ -6154,7 +6270,7 @@
               <w14:ligatures w14:val="standardContextual"/>
             </w:rPr>
           </w:pPr>
-          <w:hyperlink w:anchor="_Toc243672243" w:history="1">
+          <w:hyperlink w:anchor="_Toc243673707" w:history="1">
             <w:r>
               <w:rPr>
                 <w:rStyle w:val="Hyperlink"/>
@@ -6178,7 +6294,7 @@
               <w:rPr>
                 <w:noProof/>
               </w:rPr>
-              <w:instrText xml:space="preserve"> PAGEREF _Toc243672243 \h </w:instrText>
+              <w:instrText xml:space="preserve"> PAGEREF _Toc243673707 \h </w:instrText>
             </w:r>
             <w:r>
               <w:rPr>
@@ -6221,7 +6337,7 @@
               <w14:ligatures w14:val="standardContextual"/>
             </w:rPr>
           </w:pPr>
-          <w:hyperlink w:anchor="_Toc243672244" w:history="1">
+          <w:hyperlink w:anchor="_Toc243673708" w:history="1">
             <w:r>
               <w:rPr>
                 <w:rStyle w:val="Hyperlink"/>
@@ -6245,7 +6361,7 @@
               <w:rPr>
                 <w:noProof/>
               </w:rPr>
-              <w:instrText xml:space="preserve"> PAGEREF _Toc243672244 \h </w:instrText>
+              <w:instrText xml:space="preserve"> PAGEREF _Toc243673708 \h </w:instrText>
             </w:r>
             <w:r>
               <w:rPr>
@@ -6288,7 +6404,7 @@
               <w14:ligatures w14:val="standardContextual"/>
             </w:rPr>
           </w:pPr>
-          <w:hyperlink w:anchor="_Toc243672245" w:history="1">
+          <w:hyperlink w:anchor="_Toc243673709" w:history="1">
             <w:r>
               <w:rPr>
                 <w:rStyle w:val="Hyperlink"/>
@@ -6312,7 +6428,7 @@
               <w:rPr>
                 <w:noProof/>
               </w:rPr>
-              <w:instrText xml:space="preserve"> PAGEREF _Toc243672245 \h </w:instrText>
+              <w:instrText xml:space="preserve"> PAGEREF _Toc243673709 \h </w:instrText>
             </w:r>
             <w:r>
               <w:rPr>
@@ -6355,7 +6471,7 @@
               <w14:ligatures w14:val="standardContextual"/>
             </w:rPr>
           </w:pPr>
-          <w:hyperlink w:anchor="_Toc243672246" w:history="1">
+          <w:hyperlink w:anchor="_Toc243673710" w:history="1">
             <w:r>
               <w:rPr>
                 <w:rStyle w:val="Hyperlink"/>
@@ -6379,7 +6495,7 @@
               <w:rPr>
                 <w:noProof/>
               </w:rPr>
-              <w:instrText xml:space="preserve"> PAGEREF _Toc243672246 \h </w:instrText>
+              <w:instrText xml:space="preserve"> PAGEREF _Toc243673710 \h </w:instrText>
             </w:r>
             <w:r>
               <w:rPr>
@@ -6422,7 +6538,7 @@
               <w14:ligatures w14:val="standardContextual"/>
             </w:rPr>
           </w:pPr>
-          <w:hyperlink w:anchor="_Toc243672247" w:history="1">
+          <w:hyperlink w:anchor="_Toc243673711" w:history="1">
             <w:r>
               <w:rPr>
                 <w:rStyle w:val="Hyperlink"/>
@@ -6446,7 +6562,7 @@
               <w:rPr>
                 <w:noProof/>
               </w:rPr>
-              <w:instrText xml:space="preserve"> PAGEREF _Toc243672247 \h </w:instrText>
+              <w:instrText xml:space="preserve"> PAGEREF _Toc243673711 \h </w:instrText>
             </w:r>
             <w:r>
               <w:rPr>
@@ -6489,7 +6605,7 @@
               <w14:ligatures w14:val="standardContextual"/>
             </w:rPr>
           </w:pPr>
-          <w:hyperlink w:anchor="_Toc243672248" w:history="1">
+          <w:hyperlink w:anchor="_Toc243673712" w:history="1">
             <w:r>
               <w:rPr>
                 <w:rStyle w:val="Hyperlink"/>
@@ -6513,7 +6629,7 @@
               <w:rPr>
                 <w:noProof/>
               </w:rPr>
-              <w:instrText xml:space="preserve"> PAGEREF _Toc243672248 \h </w:instrText>
+              <w:instrText xml:space="preserve"> PAGEREF _Toc243673712 \h </w:instrText>
             </w:r>
             <w:r>
               <w:rPr>
@@ -6556,7 +6672,7 @@
               <w14:ligatures w14:val="standardContextual"/>
             </w:rPr>
           </w:pPr>
-          <w:hyperlink w:anchor="_Toc243672249" w:history="1">
+          <w:hyperlink w:anchor="_Toc243673713" w:history="1">
             <w:r>
               <w:rPr>
                 <w:rStyle w:val="Hyperlink"/>
@@ -6580,7 +6696,7 @@
               <w:rPr>
                 <w:noProof/>
               </w:rPr>
-              <w:instrText xml:space="preserve"> PAGEREF _Toc243672249 \h </w:instrText>
+              <w:instrText xml:space="preserve"> PAGEREF _Toc243673713 \h </w:instrText>
             </w:r>
             <w:r>
               <w:rPr>
@@ -6623,7 +6739,7 @@
               <w14:ligatures w14:val="standardContextual"/>
             </w:rPr>
           </w:pPr>
-          <w:hyperlink w:anchor="_Toc243672250" w:history="1">
+          <w:hyperlink w:anchor="_Toc243673714" w:history="1">
             <w:r>
               <w:rPr>
                 <w:rStyle w:val="Hyperlink"/>
@@ -6647,7 +6763,7 @@
               <w:rPr>
                 <w:noProof/>
               </w:rPr>
-              <w:instrText xml:space="preserve"> PAGEREF _Toc243672250 \h </w:instrText>
+              <w:instrText xml:space="preserve"> PAGEREF _Toc243673714 \h </w:instrText>
             </w:r>
             <w:r>
               <w:rPr>
@@ -6690,7 +6806,7 @@
               <w14:ligatures w14:val="standardContextual"/>
             </w:rPr>
           </w:pPr>
-          <w:hyperlink w:anchor="_Toc243672251" w:history="1">
+          <w:hyperlink w:anchor="_Toc243673715" w:history="1">
             <w:r>
               <w:rPr>
                 <w:rStyle w:val="Hyperlink"/>
@@ -6714,7 +6830,7 @@
               <w:rPr>
                 <w:noProof/>
               </w:rPr>
-              <w:instrText xml:space="preserve"> PAGEREF _Toc243672251 \h </w:instrText>
+              <w:instrText xml:space="preserve"> PAGEREF _Toc243673715 \h </w:instrText>
             </w:r>
             <w:r>
               <w:rPr>
@@ -6757,7 +6873,7 @@
               <w14:ligatures w14:val="standardContextual"/>
             </w:rPr>
           </w:pPr>
-          <w:hyperlink w:anchor="_Toc243672252" w:history="1">
+          <w:hyperlink w:anchor="_Toc243673716" w:history="1">
             <w:r>
               <w:rPr>
                 <w:rStyle w:val="Hyperlink"/>
@@ -6781,7 +6897,7 @@
               <w:rPr>
                 <w:noProof/>
               </w:rPr>
-              <w:instrText xml:space="preserve"> PAGEREF _Toc243672252 \h </w:instrText>
+              <w:instrText xml:space="preserve"> PAGEREF _Toc243673716 \h </w:instrText>
             </w:r>
             <w:r>
               <w:rPr>
@@ -6824,7 +6940,7 @@
               <w14:ligatures w14:val="standardContextual"/>
             </w:rPr>
           </w:pPr>
-          <w:hyperlink w:anchor="_Toc243672253" w:history="1">
+          <w:hyperlink w:anchor="_Toc243673717" w:history="1">
             <w:r>
               <w:rPr>
                 <w:rStyle w:val="Hyperlink"/>
@@ -6848,7 +6964,7 @@
               <w:rPr>
                 <w:noProof/>
               </w:rPr>
-              <w:instrText xml:space="preserve"> PAGEREF _Toc243672253 \h </w:instrText>
+              <w:instrText xml:space="preserve"> PAGEREF _Toc243673717 \h </w:instrText>
             </w:r>
             <w:r>
               <w:rPr>
@@ -6891,7 +7007,7 @@
               <w14:ligatures w14:val="standardContextual"/>
             </w:rPr>
           </w:pPr>
-          <w:hyperlink w:anchor="_Toc243672254" w:history="1">
+          <w:hyperlink w:anchor="_Toc243673718" w:history="1">
             <w:r>
               <w:rPr>
                 <w:rStyle w:val="Hyperlink"/>
@@ -6915,7 +7031,7 @@
               <w:rPr>
                 <w:noProof/>
               </w:rPr>
-              <w:instrText xml:space="preserve"> PAGEREF _Toc243672254 \h </w:instrText>
+              <w:instrText xml:space="preserve"> PAGEREF _Toc243673718 \h </w:instrText>
             </w:r>
             <w:r>
               <w:rPr>
@@ -6958,7 +7074,7 @@
               <w14:ligatures w14:val="standardContextual"/>
             </w:rPr>
           </w:pPr>
-          <w:hyperlink w:anchor="_Toc243672255" w:history="1">
+          <w:hyperlink w:anchor="_Toc243673719" w:history="1">
             <w:r>
               <w:rPr>
                 <w:rStyle w:val="Hyperlink"/>
@@ -6982,7 +7098,7 @@
               <w:rPr>
                 <w:noProof/>
               </w:rPr>
-              <w:instrText xml:space="preserve"> PAGEREF _Toc243672255 \h </w:instrText>
+              <w:instrText xml:space="preserve"> PAGEREF _Toc243673719 \h </w:instrText>
             </w:r>
             <w:r>
               <w:rPr>
@@ -7025,7 +7141,7 @@
               <w14:ligatures w14:val="standardContextual"/>
             </w:rPr>
           </w:pPr>
-          <w:hyperlink w:anchor="_Toc243672256" w:history="1">
+          <w:hyperlink w:anchor="_Toc243673720" w:history="1">
             <w:r>
               <w:rPr>
                 <w:rStyle w:val="Hyperlink"/>
@@ -7049,7 +7165,7 @@
               <w:rPr>
                 <w:noProof/>
               </w:rPr>
-              <w:instrText xml:space="preserve"> PAGEREF _Toc243672256 \h </w:instrText>
+              <w:instrText xml:space="preserve"> PAGEREF _Toc243673720 \h </w:instrText>
             </w:r>
             <w:r>
               <w:rPr>
@@ -7092,7 +7208,7 @@
               <w14:ligatures w14:val="standardContextual"/>
             </w:rPr>
           </w:pPr>
-          <w:hyperlink w:anchor="_Toc243672257" w:history="1">
+          <w:hyperlink w:anchor="_Toc243673721" w:history="1">
             <w:r>
               <w:rPr>
                 <w:rStyle w:val="Hyperlink"/>
@@ -7116,7 +7232,7 @@
               <w:rPr>
                 <w:noProof/>
               </w:rPr>
-              <w:instrText xml:space="preserve"> PAGEREF _Toc243672257 \h </w:instrText>
+              <w:instrText xml:space="preserve"> PAGEREF _Toc243673721 \h </w:instrText>
             </w:r>
             <w:r>
               <w:rPr>
@@ -7159,7 +7275,7 @@
               <w14:ligatures w14:val="standardContextual"/>
             </w:rPr>
           </w:pPr>
-          <w:hyperlink w:anchor="_Toc243672258" w:history="1">
+          <w:hyperlink w:anchor="_Toc243673722" w:history="1">
             <w:r>
               <w:rPr>
                 <w:rStyle w:val="Hyperlink"/>
@@ -7183,7 +7299,7 @@
               <w:rPr>
                 <w:noProof/>
               </w:rPr>
-              <w:instrText xml:space="preserve"> PAGEREF _Toc243672258 \h </w:instrText>
+              <w:instrText xml:space="preserve"> PAGEREF _Toc243673722 \h </w:instrText>
             </w:r>
             <w:r>
               <w:rPr>
@@ -7226,7 +7342,7 @@
               <w14:ligatures w14:val="standardContextual"/>
             </w:rPr>
           </w:pPr>
-          <w:hyperlink w:anchor="_Toc243672259" w:history="1">
+          <w:hyperlink w:anchor="_Toc243673723" w:history="1">
             <w:r>
               <w:rPr>
                 <w:rStyle w:val="Hyperlink"/>
@@ -7250,7 +7366,7 @@
               <w:rPr>
                 <w:noProof/>
               </w:rPr>
-              <w:instrText xml:space="preserve"> PAGEREF _Toc243672259 \h </w:instrText>
+              <w:instrText xml:space="preserve"> PAGEREF _Toc243673723 \h </w:instrText>
             </w:r>
             <w:r>
               <w:rPr>
@@ -7293,7 +7409,7 @@
               <w14:ligatures w14:val="standardContextual"/>
             </w:rPr>
           </w:pPr>
-          <w:hyperlink w:anchor="_Toc243672260" w:history="1">
+          <w:hyperlink w:anchor="_Toc243673724" w:history="1">
             <w:r>
               <w:rPr>
                 <w:rStyle w:val="Hyperlink"/>
@@ -7317,7 +7433,7 @@
               <w:rPr>
                 <w:noProof/>
               </w:rPr>
-              <w:instrText xml:space="preserve"> PAGEREF _Toc243672260 \h </w:instrText>
+              <w:instrText xml:space="preserve"> PAGEREF _Toc243673724 \h </w:instrText>
             </w:r>
             <w:r>
               <w:rPr>
@@ -7360,7 +7476,7 @@
               <w14:ligatures w14:val="standardContextual"/>
             </w:rPr>
           </w:pPr>
-          <w:hyperlink w:anchor="_Toc243672261" w:history="1">
+          <w:hyperlink w:anchor="_Toc243673725" w:history="1">
             <w:r>
               <w:rPr>
                 <w:rStyle w:val="Hyperlink"/>
@@ -7384,7 +7500,7 @@
               <w:rPr>
                 <w:noProof/>
               </w:rPr>
-              <w:instrText xml:space="preserve"> PAGEREF _Toc243672261 \h </w:instrText>
+              <w:instrText xml:space="preserve"> PAGEREF _Toc243673725 \h </w:instrText>
             </w:r>
             <w:r>
               <w:rPr>
@@ -7427,7 +7543,7 @@
               <w14:ligatures w14:val="standardContextual"/>
             </w:rPr>
           </w:pPr>
-          <w:hyperlink w:anchor="_Toc243672262" w:history="1">
+          <w:hyperlink w:anchor="_Toc243673726" w:history="1">
             <w:r>
               <w:rPr>
                 <w:rStyle w:val="Hyperlink"/>
@@ -7451,7 +7567,7 @@
               <w:rPr>
                 <w:noProof/>
               </w:rPr>
-              <w:instrText xml:space="preserve"> PAGEREF _Toc243672262 \h </w:instrText>
+              <w:instrText xml:space="preserve"> PAGEREF _Toc243673726 \h </w:instrText>
             </w:r>
             <w:r>
               <w:rPr>
@@ -7494,7 +7610,7 @@
               <w14:ligatures w14:val="standardContextual"/>
             </w:rPr>
           </w:pPr>
-          <w:hyperlink w:anchor="_Toc243672263" w:history="1">
+          <w:hyperlink w:anchor="_Toc243673727" w:history="1">
             <w:r>
               <w:rPr>
                 <w:rStyle w:val="Hyperlink"/>
@@ -7518,7 +7634,7 @@
               <w:rPr>
                 <w:noProof/>
               </w:rPr>
-              <w:instrText xml:space="preserve"> PAGEREF _Toc243672263 \h </w:instrText>
+              <w:instrText xml:space="preserve"> PAGEREF _Toc243673727 \h </w:instrText>
             </w:r>
             <w:r>
               <w:rPr>
@@ -7561,7 +7677,7 @@
               <w14:ligatures w14:val="standardContextual"/>
             </w:rPr>
           </w:pPr>
-          <w:hyperlink w:anchor="_Toc243672264" w:history="1">
+          <w:hyperlink w:anchor="_Toc243673728" w:history="1">
             <w:r>
               <w:rPr>
                 <w:rStyle w:val="Hyperlink"/>
@@ -7585,7 +7701,7 @@
               <w:rPr>
                 <w:noProof/>
               </w:rPr>
-              <w:instrText xml:space="preserve"> PAGEREF _Toc243672264 \h </w:instrText>
+              <w:instrText xml:space="preserve"> PAGEREF _Toc243673728 \h </w:instrText>
             </w:r>
             <w:r>
               <w:rPr>
@@ -7628,7 +7744,7 @@
               <w14:ligatures w14:val="standardContextual"/>
             </w:rPr>
           </w:pPr>
-          <w:hyperlink w:anchor="_Toc243672265" w:history="1">
+          <w:hyperlink w:anchor="_Toc243673729" w:history="1">
             <w:r>
               <w:rPr>
                 <w:rStyle w:val="Hyperlink"/>
@@ -7652,7 +7768,7 @@
               <w:rPr>
                 <w:noProof/>
               </w:rPr>
-              <w:instrText xml:space="preserve"> PAGEREF _Toc243672265 \h </w:instrText>
+              <w:instrText xml:space="preserve"> PAGEREF _Toc243673729 \h </w:instrText>
             </w:r>
             <w:r>
               <w:rPr>
@@ -7693,7 +7809,7 @@
         <w:keepLines/>
         <w:pageBreakBefore/>
       </w:pPr>
-      <w:bookmarkStart w:id="0" w:name="_Toc243672197"/>
+      <w:bookmarkStart w:id="0" w:name="_Toc243673661"/>
       <w:r>
         <w:lastRenderedPageBreak/>
         <w:t>1 Introduction</w:t>
@@ -7706,7 +7822,7 @@
         <w:keepNext/>
         <w:keepLines/>
       </w:pPr>
-      <w:bookmarkStart w:id="1" w:name="_Toc243672198"/>
+      <w:bookmarkStart w:id="1" w:name="_Toc243673662"/>
       <w:r>
         <w:t>1.1 Purpose</w:t>
       </w:r>
@@ -7717,10 +7833,10 @@
         <w:spacing w:after="120"/>
       </w:pPr>
       <w:r>
-        <w:t xml:space="preserve">This document specifies what a ZedPath user sees and how they move through the app: the principles behind the design, the navigation structure, the design system (colour, type, shape, components), each main screen with its </w:t>
+        <w:t xml:space="preserve">This document specifies what a ZedPath user sees and how they move through the app: the principles behind the </w:t>
       </w:r>
       <w:r>
-        <w:t xml:space="preserve">states, the shared interaction patterns, the language and content rules, accessibility, and the performance budget for low-end Android phones on 3G. It records the design </w:t>
+        <w:t xml:space="preserve">design, the navigation structure, the design system (colour, type, shape, components), each main screen with its states, the shared interaction patterns, the language and content rules, accessibility, and the performance budget for low-end Android phones on 3G. It records the design </w:t>
       </w:r>
       <w:r>
         <w:rPr>
@@ -7739,7 +7855,7 @@
         <w:keepNext/>
         <w:keepLines/>
       </w:pPr>
-      <w:bookmarkStart w:id="2" w:name="_Toc243672199"/>
+      <w:bookmarkStart w:id="2" w:name="_Toc243673663"/>
       <w:r>
         <w:t>1.2 Scope</w:t>
       </w:r>
@@ -7750,7 +7866,10 @@
         <w:spacing w:after="120"/>
       </w:pPr>
       <w:r>
-        <w:t>The student-facing web app (a Vite + React single-page app installed as a Progressive Web App, also wrapped as an Android app) for Releases R1 and R2. The curator tools and the API are out of scope; they are covered by ZP-DOC-05 and ZP-DOC-06.</w:t>
+        <w:t xml:space="preserve">The student-facing web app (a Vite + React single-page app installed as a Progressive Web App, also wrapped as an </w:t>
+      </w:r>
+      <w:r>
+        <w:t>Android app) for Releases R1 and R2. The curator tools and the API are out of scope; they are covered by ZP-DOC-05 and ZP-DOC-06.</w:t>
       </w:r>
     </w:p>
     <w:p>
@@ -7759,7 +7878,7 @@
         <w:keepNext/>
         <w:keepLines/>
       </w:pPr>
-      <w:bookmarkStart w:id="3" w:name="_Toc243672200"/>
+      <w:bookmarkStart w:id="3" w:name="_Toc243673664"/>
       <w:r>
         <w:t>1.3 Intended audience</w:t>
       </w:r>
@@ -7779,7 +7898,7 @@
         <w:keepNext/>
         <w:keepLines/>
       </w:pPr>
-      <w:bookmarkStart w:id="4" w:name="_Toc243672201"/>
+      <w:bookmarkStart w:id="4" w:name="_Toc243673665"/>
       <w:r>
         <w:t>1.4 Relationship to other documents</w:t>
       </w:r>
@@ -7790,7 +7909,7 @@
         <w:pStyle w:val="Caption"/>
         <w:keepNext/>
       </w:pPr>
-      <w:bookmarkStart w:id="5" w:name="_Toc243672235"/>
+      <w:bookmarkStart w:id="5" w:name="_Toc243673699"/>
       <w:r>
         <w:t xml:space="preserve">Table </w:t>
       </w:r>
@@ -8551,7 +8670,7 @@
         <w:keepNext/>
         <w:keepLines/>
       </w:pPr>
-      <w:bookmarkStart w:id="6" w:name="_Toc243672202"/>
+      <w:bookmarkStart w:id="6" w:name="_Toc243673666"/>
       <w:r>
         <w:t>1.5 Conventions</w:t>
       </w:r>
@@ -8574,10 +8693,7 @@
         <w:t>src/styles.css</w:t>
       </w:r>
       <w:r>
-        <w:t xml:space="preserve">; components use tokens only, </w:t>
-      </w:r>
-      <w:r>
-        <w:t>never raw colours. Routes are written as hash routes (</w:t>
+        <w:t>; components use tokens only, never raw colours. Routes are written as hash routes (</w:t>
       </w:r>
       <w:r>
         <w:rPr>
@@ -8599,7 +8715,7 @@
         <w:keepLines/>
         <w:pageBreakBefore/>
       </w:pPr>
-      <w:bookmarkStart w:id="7" w:name="_Toc243672203"/>
+      <w:bookmarkStart w:id="7" w:name="_Toc243673667"/>
       <w:r>
         <w:lastRenderedPageBreak/>
         <w:t>2 Design principles</w:t>
@@ -8611,7 +8727,7 @@
         <w:pStyle w:val="Caption"/>
         <w:keepNext/>
       </w:pPr>
-      <w:bookmarkStart w:id="8" w:name="_Toc243672236"/>
+      <w:bookmarkStart w:id="8" w:name="_Toc243673700"/>
       <w:r>
         <w:t xml:space="preserve">Table </w:t>
       </w:r>
@@ -10099,7 +10215,7 @@
         <w:keepLines/>
         <w:pageBreakBefore/>
       </w:pPr>
-      <w:bookmarkStart w:id="9" w:name="_Toc243672204"/>
+      <w:bookmarkStart w:id="9" w:name="_Toc243673668"/>
       <w:r>
         <w:lastRenderedPageBreak/>
         <w:t>3 Personas and key journeys</w:t>
@@ -10119,7 +10235,7 @@
         <w:pStyle w:val="Caption"/>
         <w:keepNext/>
       </w:pPr>
-      <w:bookmarkStart w:id="10" w:name="_Toc243672237"/>
+      <w:bookmarkStart w:id="10" w:name="_Toc243673701"/>
       <w:r>
         <w:t xml:space="preserve">Table </w:t>
       </w:r>
@@ -10908,7 +11024,7 @@
         <w:pStyle w:val="Caption"/>
         <w:keepNext/>
       </w:pPr>
-      <w:bookmarkStart w:id="11" w:name="_Toc243672238"/>
+      <w:bookmarkStart w:id="11" w:name="_Toc243673702"/>
       <w:r>
         <w:t xml:space="preserve">Table </w:t>
       </w:r>
@@ -11920,7 +12036,7 @@
         <w:keepLines/>
         <w:pageBreakBefore/>
       </w:pPr>
-      <w:bookmarkStart w:id="12" w:name="_Toc243672205"/>
+      <w:bookmarkStart w:id="12" w:name="_Toc243673669"/>
       <w:r>
         <w:lastRenderedPageBreak/>
         <w:t>4 Information architecture and navigation</w:t>
@@ -11933,7 +12049,7 @@
         <w:keepNext/>
         <w:keepLines/>
       </w:pPr>
-      <w:bookmarkStart w:id="13" w:name="_Toc243672206"/>
+      <w:bookmarkStart w:id="13" w:name="_Toc243673670"/>
       <w:r>
         <w:t>4.1 Structure</w:t>
       </w:r>
@@ -11964,10 +12080,7 @@
         <w:t>main app</w:t>
       </w:r>
       <w:r>
-        <w:t xml:space="preserve"> with a top app bar and a five-tab bottom navigation bar. Me opens from the avatar in the top app bar. Routing uses the URL hash so the phone's Back button </w:t>
-      </w:r>
-      <w:r>
-        <w:t xml:space="preserve">and deep links work. From 1024 px wide (laptops, desktops, projectors) the same five destinations move into a </w:t>
+        <w:t xml:space="preserve"> with a top app bar and a five-tab bottom navigation bar. Me opens from the avatar in the top app bar. Routing uses the URL hash so the phone's Back button and deep links work. From 1024 px wide (laptops, desktops, projectors) the same five destinations move into a </w:t>
       </w:r>
       <w:r>
         <w:rPr>
@@ -11985,7 +12098,7 @@
         <w:pStyle w:val="Caption"/>
         <w:keepNext/>
       </w:pPr>
-      <w:bookmarkStart w:id="14" w:name="_Toc243672239"/>
+      <w:bookmarkStart w:id="14" w:name="_Toc243673703"/>
       <w:r>
         <w:t xml:space="preserve">Table </w:t>
       </w:r>
@@ -12868,12 +12981,9 @@
         <w:keepNext/>
         <w:keepLines/>
       </w:pPr>
-      <w:bookmarkStart w:id="15" w:name="_Toc243672207"/>
+      <w:bookmarkStart w:id="15" w:name="_Toc243673671"/>
       <w:r>
-        <w:t>4.2 </w:t>
-      </w:r>
-      <w:r>
-        <w:t>Desktop layout (1024 px and wider)</w:t>
+        <w:t>4.2 Desktop layout (1024 px and wider)</w:t>
       </w:r>
       <w:bookmarkEnd w:id="15"/>
     </w:p>
@@ -12914,7 +13024,7 @@
         <w:pStyle w:val="Caption"/>
         <w:keepNext/>
       </w:pPr>
-      <w:bookmarkStart w:id="16" w:name="_Toc243672240"/>
+      <w:bookmarkStart w:id="16" w:name="_Toc243673704"/>
       <w:r>
         <w:t xml:space="preserve">Table </w:t>
       </w:r>
@@ -13703,7 +13813,7 @@
         <w:keepNext/>
         <w:keepLines/>
       </w:pPr>
-      <w:bookmarkStart w:id="17" w:name="_Toc243672208"/>
+      <w:bookmarkStart w:id="17" w:name="_Toc243673672"/>
       <w:r>
         <w:lastRenderedPageBreak/>
         <w:t>4.3 Route table</w:t>
@@ -13715,7 +13825,7 @@
         <w:pStyle w:val="Caption"/>
         <w:keepNext/>
       </w:pPr>
-      <w:bookmarkStart w:id="18" w:name="_Toc243672241"/>
+      <w:bookmarkStart w:id="18" w:name="_Toc243673705"/>
       <w:r>
         <w:t xml:space="preserve">Table </w:t>
       </w:r>
@@ -14041,7 +14151,23 @@
                 <w:sz w:val="19"/>
                 <w:szCs w:val="19"/>
               </w:rPr>
-              <w:t>Choose language; start or log in</w:t>
+              <w:t xml:space="preserve">Try the demo first; choose language (selects only); create an account or log in. The logo in the app's top bar links to </w:t>
+            </w:r>
+            <w:r>
+              <w:rPr>
+                <w:rFonts w:ascii="Consolas" w:eastAsia="Consolas" w:hAnsi="Consolas" w:cs="Consolas"/>
+                <w:sz w:val="17"/>
+                <w:szCs w:val="17"/>
+                <w:shd w:val="clear" w:color="auto" w:fill="F2F4F3"/>
+              </w:rPr>
+              <w:t>#/paths</w:t>
+            </w:r>
+            <w:r>
+              <w:rPr>
+                <w:sz w:val="19"/>
+                <w:szCs w:val="19"/>
+              </w:rPr>
+              <w:t xml:space="preserve"> (VR5)</w:t>
             </w:r>
           </w:p>
         </w:tc>
@@ -16825,7 +16951,7 @@
         <w:keepNext/>
         <w:keepLines/>
       </w:pPr>
-      <w:bookmarkStart w:id="19" w:name="_Toc243672209"/>
+      <w:bookmarkStart w:id="19" w:name="_Toc243673673"/>
       <w:r>
         <w:t>4.4 Guards</w:t>
       </w:r>
@@ -16836,7 +16962,7 @@
         <w:pStyle w:val="Caption"/>
         <w:keepNext/>
       </w:pPr>
-      <w:bookmarkStart w:id="20" w:name="_Toc243672242"/>
+      <w:bookmarkStart w:id="20" w:name="_Toc243673706"/>
       <w:r>
         <w:t xml:space="preserve">Table </w:t>
       </w:r>
@@ -17480,7 +17606,7 @@
         <w:keepLines/>
         <w:pageBreakBefore/>
       </w:pPr>
-      <w:bookmarkStart w:id="21" w:name="_Toc243672210"/>
+      <w:bookmarkStart w:id="21" w:name="_Toc243673674"/>
       <w:r>
         <w:lastRenderedPageBreak/>
         <w:t>5 Design system</w:t>
@@ -17493,7 +17619,7 @@
         <w:keepNext/>
         <w:keepLines/>
       </w:pPr>
-      <w:bookmarkStart w:id="22" w:name="_Toc243672211"/>
+      <w:bookmarkStart w:id="22" w:name="_Toc243673675"/>
       <w:r>
         <w:t>5.1 Colour roles</w:t>
       </w:r>
@@ -17512,7 +17638,7 @@
         <w:pStyle w:val="Caption"/>
         <w:keepNext/>
       </w:pPr>
-      <w:bookmarkStart w:id="23" w:name="_Toc243672243"/>
+      <w:bookmarkStart w:id="23" w:name="_Toc243673707"/>
       <w:r>
         <w:t xml:space="preserve">Table </w:t>
       </w:r>
@@ -19536,7 +19662,7 @@
         <w:keepNext/>
         <w:keepLines/>
       </w:pPr>
-      <w:bookmarkStart w:id="24" w:name="_Toc243672212"/>
+      <w:bookmarkStart w:id="24" w:name="_Toc243673676"/>
       <w:r>
         <w:t>5.2 Typography</w:t>
       </w:r>
@@ -19607,7 +19733,7 @@
         <w:pStyle w:val="Caption"/>
         <w:keepNext/>
       </w:pPr>
-      <w:bookmarkStart w:id="25" w:name="_Toc243672244"/>
+      <w:bookmarkStart w:id="25" w:name="_Toc243673708"/>
       <w:r>
         <w:t xml:space="preserve">Table </w:t>
       </w:r>
@@ -21321,7 +21447,7 @@
         <w:keepNext/>
         <w:keepLines/>
       </w:pPr>
-      <w:bookmarkStart w:id="26" w:name="_Toc243672213"/>
+      <w:bookmarkStart w:id="26" w:name="_Toc243673677"/>
       <w:r>
         <w:t>5.3 Spacing, shape and elevation</w:t>
       </w:r>
@@ -21332,7 +21458,7 @@
         <w:pStyle w:val="Caption"/>
         <w:keepNext/>
       </w:pPr>
-      <w:bookmarkStart w:id="27" w:name="_Toc243672245"/>
+      <w:bookmarkStart w:id="27" w:name="_Toc243673709"/>
       <w:r>
         <w:t xml:space="preserve">Table </w:t>
       </w:r>
@@ -22020,7 +22146,7 @@
         <w:keepNext/>
         <w:keepLines/>
       </w:pPr>
-      <w:bookmarkStart w:id="28" w:name="_Toc243672214"/>
+      <w:bookmarkStart w:id="28" w:name="_Toc243673678"/>
       <w:r>
         <w:t>5.4 Components</w:t>
       </w:r>
@@ -22031,7 +22157,7 @@
         <w:pStyle w:val="Caption"/>
         <w:keepNext/>
       </w:pPr>
-      <w:bookmarkStart w:id="29" w:name="_Toc243672246"/>
+      <w:bookmarkStart w:id="29" w:name="_Toc243673710"/>
       <w:r>
         <w:t xml:space="preserve">Table </w:t>
       </w:r>
@@ -24630,7 +24756,7 @@
         <w:keepLines/>
         <w:pageBreakBefore/>
       </w:pPr>
-      <w:bookmarkStart w:id="30" w:name="_Toc243672215"/>
+      <w:bookmarkStart w:id="30" w:name="_Toc243673679"/>
       <w:r>
         <w:lastRenderedPageBreak/>
         <w:t>6 </w:t>
@@ -24694,7 +24820,7 @@
         <w:keepNext/>
         <w:keepLines/>
       </w:pPr>
-      <w:bookmarkStart w:id="31" w:name="_Toc243672216"/>
+      <w:bookmarkStart w:id="31" w:name="_Toc243673680"/>
       <w:r>
         <w:t>6.1 Welcome, Intro and About you (onboarding)</w:t>
       </w:r>
@@ -24705,7 +24831,7 @@
         <w:pStyle w:val="Caption"/>
         <w:keepNext/>
       </w:pPr>
-      <w:bookmarkStart w:id="32" w:name="_Toc243672247"/>
+      <w:bookmarkStart w:id="32" w:name="_Toc243673711"/>
       <w:r>
         <w:t xml:space="preserve">Table </w:t>
       </w:r>
@@ -24972,35 +25098,7 @@
                 <w:sz w:val="19"/>
                 <w:szCs w:val="19"/>
               </w:rPr>
-              <w:t>Welcome: aurora background, logo, lead line, three language tiles (</w:t>
-            </w:r>
-            <w:r>
-              <w:rPr>
-                <w:sz w:val="19"/>
-                <w:szCs w:val="19"/>
-              </w:rPr>
-              <w:t>සිංහල</w:t>
-            </w:r>
-            <w:r>
-              <w:rPr>
-                <w:sz w:val="19"/>
-                <w:szCs w:val="19"/>
-              </w:rPr>
-              <w:t xml:space="preserve">, </w:t>
-            </w:r>
-            <w:r>
-              <w:rPr>
-                <w:sz w:val="19"/>
-                <w:szCs w:val="19"/>
-              </w:rPr>
-              <w:t>தமிழ்</w:t>
-            </w:r>
-            <w:r>
-              <w:rPr>
-                <w:sz w:val="19"/>
-                <w:szCs w:val="19"/>
-              </w:rPr>
-              <w:t xml:space="preserve">, English), Start and Log in, and a tonal </w:t>
+              <w:t xml:space="preserve">Welcome (VR5): aurora background, logo, lead line; then </w:t>
             </w:r>
             <w:r>
               <w:rPr>
@@ -25016,7 +25114,67 @@
                 <w:sz w:val="19"/>
                 <w:szCs w:val="19"/>
               </w:rPr>
-              <w:t xml:space="preserve"> button (CR-007), team line. Intro (VR2): seven slides, each an animated scene of the real app marked </w:t>
+              <w:t xml:space="preserve"> first, a large gold button with a one-line promise and a soft pulse (none under reduced motion); three language tiles (</w:t>
+            </w:r>
+            <w:r>
+              <w:rPr>
+                <w:sz w:val="19"/>
+                <w:szCs w:val="19"/>
+              </w:rPr>
+              <w:t>සිංහල</w:t>
+            </w:r>
+            <w:r>
+              <w:rPr>
+                <w:sz w:val="19"/>
+                <w:szCs w:val="19"/>
+              </w:rPr>
+              <w:t xml:space="preserve">, </w:t>
+            </w:r>
+            <w:r>
+              <w:rPr>
+                <w:sz w:val="19"/>
+                <w:szCs w:val="19"/>
+              </w:rPr>
+              <w:t>தமிழ்</w:t>
+            </w:r>
+            <w:r>
+              <w:rPr>
+                <w:sz w:val="19"/>
+                <w:szCs w:val="19"/>
+              </w:rPr>
+              <w:t xml:space="preserve">, English) that only select the language (radio group, "Selected"); </w:t>
+            </w:r>
+            <w:r>
+              <w:rPr>
+                <w:i/>
+                <w:iCs/>
+                <w:sz w:val="19"/>
+                <w:szCs w:val="19"/>
+              </w:rPr>
+              <w:t>New here? Create an account</w:t>
+            </w:r>
+            <w:r>
+              <w:rPr>
+                <w:sz w:val="19"/>
+                <w:szCs w:val="19"/>
+              </w:rPr>
+              <w:t xml:space="preserve">; </w:t>
+            </w:r>
+            <w:r>
+              <w:rPr>
+                <w:i/>
+                <w:iCs/>
+                <w:sz w:val="19"/>
+                <w:szCs w:val="19"/>
+              </w:rPr>
+              <w:t>Log in</w:t>
+            </w:r>
+            <w:r>
+              <w:rPr>
+                <w:sz w:val="19"/>
+                <w:szCs w:val="19"/>
+              </w:rPr>
+              <w:t xml:space="preserve">; team line. On screens 1024 px and wider the aurora fills the screen in two columns (intro left, actions in a glass card right). Intro (VR2): seven slides, each an animated scene of the real app marked </w:t>
             </w:r>
             <w:r>
               <w:rPr>
@@ -25241,7 +25399,7 @@
         <w:keepNext/>
         <w:keepLines/>
       </w:pPr>
-      <w:bookmarkStart w:id="33" w:name="_Toc243672217"/>
+      <w:bookmarkStart w:id="33" w:name="_Toc243673681"/>
       <w:r>
         <w:t>6.2 Account (sign up, log in, recover, recovery code, complete your account)</w:t>
       </w:r>
@@ -25252,7 +25410,7 @@
         <w:pStyle w:val="Caption"/>
         <w:keepNext/>
       </w:pPr>
-      <w:bookmarkStart w:id="34" w:name="_Toc243672248"/>
+      <w:bookmarkStart w:id="34" w:name="_Toc243673712"/>
       <w:r>
         <w:t xml:space="preserve">Table </w:t>
       </w:r>
@@ -25712,7 +25870,7 @@
         <w:keepNext/>
         <w:keepLines/>
       </w:pPr>
-      <w:bookmarkStart w:id="35" w:name="_Toc243672218"/>
+      <w:bookmarkStart w:id="35" w:name="_Toc243673682"/>
       <w:r>
         <w:t>6.3 Paths (home)</w:t>
       </w:r>
@@ -25723,7 +25881,7 @@
         <w:pStyle w:val="Caption"/>
         <w:keepNext/>
       </w:pPr>
-      <w:bookmarkStart w:id="36" w:name="_Toc243672249"/>
+      <w:bookmarkStart w:id="36" w:name="_Toc243673713"/>
       <w:r>
         <w:t xml:space="preserve">Table </w:t>
       </w:r>
@@ -25959,6 +26117,7 @@
                 <w:sz w:val="19"/>
                 <w:szCs w:val="19"/>
               </w:rPr>
+              <w:lastRenderedPageBreak/>
               <w:t>Content</w:t>
             </w:r>
           </w:p>
@@ -26031,7 +26190,6 @@
                 <w:sz w:val="19"/>
                 <w:szCs w:val="19"/>
               </w:rPr>
-              <w:lastRenderedPageBreak/>
               <w:t>States</w:t>
             </w:r>
           </w:p>
@@ -26152,7 +26310,7 @@
         <w:keepNext/>
         <w:keepLines/>
       </w:pPr>
-      <w:bookmarkStart w:id="37" w:name="_Toc243672219"/>
+      <w:bookmarkStart w:id="37" w:name="_Toc243673683"/>
       <w:r>
         <w:t>6.4 Courses</w:t>
       </w:r>
@@ -26163,7 +26321,7 @@
         <w:pStyle w:val="Caption"/>
         <w:keepNext/>
       </w:pPr>
-      <w:bookmarkStart w:id="38" w:name="_Toc243672250"/>
+      <w:bookmarkStart w:id="38" w:name="_Toc243673714"/>
       <w:r>
         <w:t xml:space="preserve">Table </w:t>
       </w:r>
@@ -26639,7 +26797,7 @@
         <w:keepNext/>
         <w:keepLines/>
       </w:pPr>
-      <w:bookmarkStart w:id="39" w:name="_Toc243672220"/>
+      <w:bookmarkStart w:id="39" w:name="_Toc243673684"/>
       <w:r>
         <w:t>6.5 Course detail</w:t>
       </w:r>
@@ -26650,7 +26808,7 @@
         <w:pStyle w:val="Caption"/>
         <w:keepNext/>
       </w:pPr>
-      <w:bookmarkStart w:id="40" w:name="_Toc243672251"/>
+      <w:bookmarkStart w:id="40" w:name="_Toc243673715"/>
       <w:r>
         <w:t xml:space="preserve">Table </w:t>
       </w:r>
@@ -27245,7 +27403,7 @@
         <w:keepNext/>
         <w:keepLines/>
       </w:pPr>
-      <w:bookmarkStart w:id="41" w:name="_Toc243672221"/>
+      <w:bookmarkStart w:id="41" w:name="_Toc243673685"/>
       <w:r>
         <w:lastRenderedPageBreak/>
         <w:t>6.6 Compare</w:t>
@@ -27257,7 +27415,7 @@
         <w:pStyle w:val="Caption"/>
         <w:keepNext/>
       </w:pPr>
-      <w:bookmarkStart w:id="42" w:name="_Toc243672252"/>
+      <w:bookmarkStart w:id="42" w:name="_Toc243673716"/>
       <w:r>
         <w:t xml:space="preserve">Table </w:t>
       </w:r>
@@ -27685,7 +27843,7 @@
         <w:keepNext/>
         <w:keepLines/>
       </w:pPr>
-      <w:bookmarkStart w:id="43" w:name="_Toc243672222"/>
+      <w:bookmarkStart w:id="43" w:name="_Toc243673686"/>
       <w:r>
         <w:t>6.7 My list</w:t>
       </w:r>
@@ -27696,7 +27854,7 @@
         <w:pStyle w:val="Caption"/>
         <w:keepNext/>
       </w:pPr>
-      <w:bookmarkStart w:id="44" w:name="_Toc243672253"/>
+      <w:bookmarkStart w:id="44" w:name="_Toc243673717"/>
       <w:r>
         <w:t xml:space="preserve">Table </w:t>
       </w:r>
@@ -28181,7 +28339,7 @@
         <w:keepNext/>
         <w:keepLines/>
       </w:pPr>
-      <w:bookmarkStart w:id="45" w:name="_Toc243672223"/>
+      <w:bookmarkStart w:id="45" w:name="_Toc243673687"/>
       <w:r>
         <w:t>6.8 Career-first mode (CR-013)</w:t>
       </w:r>
@@ -28192,7 +28350,7 @@
         <w:pStyle w:val="Caption"/>
         <w:keepNext/>
       </w:pPr>
-      <w:bookmarkStart w:id="46" w:name="_Toc243672254"/>
+      <w:bookmarkStart w:id="46" w:name="_Toc243673718"/>
       <w:r>
         <w:t xml:space="preserve">Table </w:t>
       </w:r>
@@ -28796,7 +28954,7 @@
         <w:keepNext/>
         <w:keepLines/>
       </w:pPr>
-      <w:bookmarkStart w:id="47" w:name="_Toc243672224"/>
+      <w:bookmarkStart w:id="47" w:name="_Toc243673688"/>
       <w:r>
         <w:lastRenderedPageBreak/>
         <w:t>6.9 Guide to applying to the UGC (CR-012)</w:t>
@@ -28808,7 +28966,7 @@
         <w:pStyle w:val="Caption"/>
         <w:keepNext/>
       </w:pPr>
-      <w:bookmarkStart w:id="48" w:name="_Toc243672255"/>
+      <w:bookmarkStart w:id="48" w:name="_Toc243673719"/>
       <w:r>
         <w:t xml:space="preserve">Table </w:t>
       </w:r>
@@ -29396,7 +29554,7 @@
         <w:keepNext/>
         <w:keepLines/>
       </w:pPr>
-      <w:bookmarkStart w:id="49" w:name="_Toc243672225"/>
+      <w:bookmarkStart w:id="49" w:name="_Toc243673689"/>
       <w:r>
         <w:t>6.10 Journey</w:t>
       </w:r>
@@ -29407,7 +29565,7 @@
         <w:pStyle w:val="Caption"/>
         <w:keepNext/>
       </w:pPr>
-      <w:bookmarkStart w:id="50" w:name="_Toc243672256"/>
+      <w:bookmarkStart w:id="50" w:name="_Toc243673720"/>
       <w:r>
         <w:t xml:space="preserve">Table </w:t>
       </w:r>
@@ -29883,7 +30041,7 @@
         <w:keepNext/>
         <w:keepLines/>
       </w:pPr>
-      <w:bookmarkStart w:id="51" w:name="_Toc243672226"/>
+      <w:bookmarkStart w:id="51" w:name="_Toc243673690"/>
       <w:r>
         <w:t>6.11 Ask ZedPath</w:t>
       </w:r>
@@ -29894,7 +30052,7 @@
         <w:pStyle w:val="Caption"/>
         <w:keepNext/>
       </w:pPr>
-      <w:bookmarkStart w:id="52" w:name="_Toc243672257"/>
+      <w:bookmarkStart w:id="52" w:name="_Toc243673721"/>
       <w:r>
         <w:t xml:space="preserve">Table </w:t>
       </w:r>
@@ -30419,7 +30577,7 @@
         <w:keepNext/>
         <w:keepLines/>
       </w:pPr>
-      <w:bookmarkStart w:id="53" w:name="_Toc243672227"/>
+      <w:bookmarkStart w:id="53" w:name="_Toc243673691"/>
       <w:r>
         <w:t>6.12 Groups, Group room and Group info</w:t>
       </w:r>
@@ -30430,7 +30588,7 @@
         <w:pStyle w:val="Caption"/>
         <w:keepNext/>
       </w:pPr>
-      <w:bookmarkStart w:id="54" w:name="_Toc243672258"/>
+      <w:bookmarkStart w:id="54" w:name="_Toc243673722"/>
       <w:r>
         <w:t xml:space="preserve">Table </w:t>
       </w:r>
@@ -30947,7 +31105,7 @@
         <w:keepNext/>
         <w:keepLines/>
       </w:pPr>
-      <w:bookmarkStart w:id="55" w:name="_Toc243672228"/>
+      <w:bookmarkStart w:id="55" w:name="_Toc243673692"/>
       <w:r>
         <w:t>6.13 Me</w:t>
       </w:r>
@@ -30958,7 +31116,7 @@
         <w:pStyle w:val="Caption"/>
         <w:keepNext/>
       </w:pPr>
-      <w:bookmarkStart w:id="56" w:name="_Toc243672259"/>
+      <w:bookmarkStart w:id="56" w:name="_Toc243673723"/>
       <w:r>
         <w:t xml:space="preserve">Table </w:t>
       </w:r>
@@ -31394,7 +31552,7 @@
         <w:keepLines/>
         <w:pageBreakBefore/>
       </w:pPr>
-      <w:bookmarkStart w:id="57" w:name="_Toc243672229"/>
+      <w:bookmarkStart w:id="57" w:name="_Toc243673693"/>
       <w:r>
         <w:lastRenderedPageBreak/>
         <w:t>7 Interaction patterns</w:t>
@@ -31406,7 +31564,7 @@
         <w:pStyle w:val="Caption"/>
         <w:keepNext/>
       </w:pPr>
-      <w:bookmarkStart w:id="58" w:name="_Toc243672260"/>
+      <w:bookmarkStart w:id="58" w:name="_Toc243673724"/>
       <w:r>
         <w:t xml:space="preserve">Table </w:t>
       </w:r>
@@ -32585,7 +32743,7 @@
         <w:keepLines/>
         <w:pageBreakBefore/>
       </w:pPr>
-      <w:bookmarkStart w:id="59" w:name="_Toc243672230"/>
+      <w:bookmarkStart w:id="59" w:name="_Toc243673694"/>
       <w:r>
         <w:lastRenderedPageBreak/>
         <w:t>8 Content and language</w:t>
@@ -32597,7 +32755,7 @@
         <w:pStyle w:val="Caption"/>
         <w:keepNext/>
       </w:pPr>
-      <w:bookmarkStart w:id="60" w:name="_Toc243672261"/>
+      <w:bookmarkStart w:id="60" w:name="_Toc243673725"/>
       <w:r>
         <w:t xml:space="preserve">Table </w:t>
       </w:r>
@@ -33371,7 +33529,7 @@
         <w:keepLines/>
         <w:pageBreakBefore/>
       </w:pPr>
-      <w:bookmarkStart w:id="61" w:name="_Toc243672231"/>
+      <w:bookmarkStart w:id="61" w:name="_Toc243673695"/>
       <w:r>
         <w:lastRenderedPageBreak/>
         <w:t>9 Accessibility checklist (WCAG 2.2 AA)</w:t>
@@ -33391,7 +33549,7 @@
         <w:pStyle w:val="Caption"/>
         <w:keepNext/>
       </w:pPr>
-      <w:bookmarkStart w:id="62" w:name="_Toc243672262"/>
+      <w:bookmarkStart w:id="62" w:name="_Toc243673726"/>
       <w:r>
         <w:t xml:space="preserve">Table </w:t>
       </w:r>
@@ -35145,7 +35303,7 @@
         <w:keepLines/>
         <w:pageBreakBefore/>
       </w:pPr>
-      <w:bookmarkStart w:id="63" w:name="_Toc243672232"/>
+      <w:bookmarkStart w:id="63" w:name="_Toc243673696"/>
       <w:r>
         <w:lastRenderedPageBreak/>
         <w:t>10 Performance budget for 3G</w:t>
@@ -35157,7 +35315,7 @@
         <w:pStyle w:val="Caption"/>
         <w:keepNext/>
       </w:pPr>
-      <w:bookmarkStart w:id="64" w:name="_Toc243672263"/>
+      <w:bookmarkStart w:id="64" w:name="_Toc243673727"/>
       <w:r>
         <w:t xml:space="preserve">Table </w:t>
       </w:r>
@@ -35989,7 +36147,7 @@
         <w:keepLines/>
         <w:pageBreakBefore/>
       </w:pPr>
-      <w:bookmarkStart w:id="65" w:name="_Toc243672233"/>
+      <w:bookmarkStart w:id="65" w:name="_Toc243673697"/>
       <w:r>
         <w:lastRenderedPageBreak/>
         <w:t>11 Usability evidence</w:t>
@@ -36012,7 +36170,7 @@
         <w:pStyle w:val="Caption"/>
         <w:keepNext/>
       </w:pPr>
-      <w:bookmarkStart w:id="66" w:name="_Toc243672264"/>
+      <w:bookmarkStart w:id="66" w:name="_Toc243673728"/>
       <w:r>
         <w:t xml:space="preserve">Table </w:t>
       </w:r>
@@ -37774,7 +37932,7 @@
                 <w:sz w:val="19"/>
                 <w:szCs w:val="19"/>
               </w:rPr>
-              <w:t>VR4</w:t>
+              <w:t>VR5</w:t>
             </w:r>
           </w:p>
         </w:tc>
@@ -37805,7 +37963,7 @@
                 <w:sz w:val="19"/>
                 <w:szCs w:val="19"/>
               </w:rPr>
-              <w:t>Product owner's screen recording, 23 Oct: "we need a rectangle with a plus below the last one", "a green thing with a tick mark that they have been added"</w:t>
+              <w:t>Product owner's desktop screen recording (23 Oct): "if we click this icon we should be taken to home"; "can we make it more windows friendly"; "try this demo ... we should put this above choose your language and it should be really attention capturing"; "clicking a language should not take them anywhere"; "if they put Sinhala and try this then they will be taken into the Sinhala version"</w:t>
             </w:r>
           </w:p>
         </w:tc>
@@ -37836,7 +37994,7 @@
                 <w:sz w:val="19"/>
                 <w:szCs w:val="19"/>
               </w:rPr>
-              <w:t>+ Add a course box on My list; added confirmation</w:t>
+              <w:t>Welcome: demo first and prominent, languages select only, Create an account, full-screen desktop layout; logo goes home</w:t>
             </w:r>
           </w:p>
         </w:tc>
@@ -37877,6 +38035,108 @@
                 <w:sz w:val="19"/>
                 <w:szCs w:val="19"/>
               </w:rPr>
+              <w:t>VR4</w:t>
+            </w:r>
+          </w:p>
+        </w:tc>
+        <w:tc>
+          <w:tcPr>
+            <w:tcW w:w="4141" w:type="dxa"/>
+            <w:tcBorders>
+              <w:top w:val="single" w:sz="4" w:space="0" w:color="C9D3D0"/>
+              <w:left w:val="single" w:sz="4" w:space="0" w:color="C9D3D0"/>
+              <w:bottom w:val="single" w:sz="4" w:space="0" w:color="C9D3D0"/>
+              <w:right w:val="single" w:sz="4" w:space="0" w:color="C9D3D0"/>
+            </w:tcBorders>
+            <w:tcMar>
+              <w:top w:w="50" w:type="dxa"/>
+              <w:left w:w="100" w:type="dxa"/>
+              <w:bottom w:w="50" w:type="dxa"/>
+              <w:right w:w="100" w:type="dxa"/>
+            </w:tcMar>
+            <w:vAlign w:val="center"/>
+          </w:tcPr>
+          <w:p>
+            <w:pPr>
+              <w:spacing w:line="252" w:lineRule="auto"/>
+            </w:pPr>
+            <w:r>
+              <w:rPr>
+                <w:sz w:val="19"/>
+                <w:szCs w:val="19"/>
+              </w:rPr>
+              <w:t>Product owner's screen recording, 23 Oct: "we need a rectangle with a plus below the last one", "a green thing with a tick mark that they have been added"</w:t>
+            </w:r>
+          </w:p>
+        </w:tc>
+        <w:tc>
+          <w:tcPr>
+            <w:tcW w:w="4142" w:type="dxa"/>
+            <w:tcBorders>
+              <w:top w:val="single" w:sz="4" w:space="0" w:color="C9D3D0"/>
+              <w:left w:val="single" w:sz="4" w:space="0" w:color="C9D3D0"/>
+              <w:bottom w:val="single" w:sz="4" w:space="0" w:color="C9D3D0"/>
+              <w:right w:val="single" w:sz="4" w:space="0" w:color="C9D3D0"/>
+            </w:tcBorders>
+            <w:tcMar>
+              <w:top w:w="50" w:type="dxa"/>
+              <w:left w:w="100" w:type="dxa"/>
+              <w:bottom w:w="50" w:type="dxa"/>
+              <w:right w:w="100" w:type="dxa"/>
+            </w:tcMar>
+            <w:vAlign w:val="center"/>
+          </w:tcPr>
+          <w:p>
+            <w:pPr>
+              <w:spacing w:line="252" w:lineRule="auto"/>
+            </w:pPr>
+            <w:r>
+              <w:rPr>
+                <w:sz w:val="19"/>
+                <w:szCs w:val="19"/>
+              </w:rPr>
+              <w:t>+ Add a course box on My list; added confirmation</w:t>
+            </w:r>
+          </w:p>
+        </w:tc>
+      </w:tr>
+      <w:tr>
+        <w:tblPrEx>
+          <w:tblCellMar>
+            <w:top w:w="0" w:type="dxa"/>
+            <w:bottom w:w="0" w:type="dxa"/>
+          </w:tblCellMar>
+        </w:tblPrEx>
+        <w:trPr>
+          <w:cantSplit/>
+        </w:trPr>
+        <w:tc>
+          <w:tcPr>
+            <w:tcW w:w="1355" w:type="dxa"/>
+            <w:tcBorders>
+              <w:top w:val="single" w:sz="4" w:space="0" w:color="C9D3D0"/>
+              <w:left w:val="single" w:sz="4" w:space="0" w:color="C9D3D0"/>
+              <w:bottom w:val="single" w:sz="4" w:space="0" w:color="C9D3D0"/>
+              <w:right w:val="single" w:sz="4" w:space="0" w:color="C9D3D0"/>
+            </w:tcBorders>
+            <w:shd w:val="clear" w:color="auto" w:fill="F3F8F6"/>
+            <w:tcMar>
+              <w:top w:w="50" w:type="dxa"/>
+              <w:left w:w="100" w:type="dxa"/>
+              <w:bottom w:w="50" w:type="dxa"/>
+              <w:right w:w="100" w:type="dxa"/>
+            </w:tcMar>
+            <w:vAlign w:val="center"/>
+          </w:tcPr>
+          <w:p>
+            <w:pPr>
+              <w:spacing w:line="252" w:lineRule="auto"/>
+            </w:pPr>
+            <w:r>
+              <w:rPr>
+                <w:sz w:val="19"/>
+                <w:szCs w:val="19"/>
+              </w:rPr>
               <w:t>VR3</w:t>
             </w:r>
           </w:p>
@@ -37890,6 +38150,7 @@
               <w:bottom w:val="single" w:sz="4" w:space="0" w:color="C9D3D0"/>
               <w:right w:val="single" w:sz="4" w:space="0" w:color="C9D3D0"/>
             </w:tcBorders>
+            <w:shd w:val="clear" w:color="auto" w:fill="F3F8F6"/>
             <w:tcMar>
               <w:top w:w="50" w:type="dxa"/>
               <w:left w:w="100" w:type="dxa"/>
@@ -37920,6 +38181,7 @@
               <w:bottom w:val="single" w:sz="4" w:space="0" w:color="C9D3D0"/>
               <w:right w:val="single" w:sz="4" w:space="0" w:color="C9D3D0"/>
             </w:tcBorders>
+            <w:shd w:val="clear" w:color="auto" w:fill="F3F8F6"/>
             <w:tcMar>
               <w:top w:w="50" w:type="dxa"/>
               <w:left w:w="100" w:type="dxa"/>
@@ -37955,7 +38217,7 @@
         <w:keepLines/>
         <w:pageBreakBefore/>
       </w:pPr>
-      <w:bookmarkStart w:id="67" w:name="_Toc243672234"/>
+      <w:bookmarkStart w:id="67" w:name="_Toc243673698"/>
       <w:r>
         <w:lastRenderedPageBreak/>
         <w:t>12 Traceability</w:t>
@@ -37967,7 +38229,7 @@
         <w:pStyle w:val="Caption"/>
         <w:keepNext/>
       </w:pPr>
-      <w:bookmarkStart w:id="68" w:name="_Toc243672265"/>
+      <w:bookmarkStart w:id="68" w:name="_Toc243673729"/>
       <w:r>
         <w:t xml:space="preserve">Table </w:t>
       </w:r>
@@ -39433,10 +39695,134 @@
 <file path=word/numbering.xml><?xml version="1.0" encoding="utf-8"?>
 <w:numbering xmlns:wpc="http://schemas.microsoft.com/office/word/2010/wordprocessingCanvas" xmlns:cx="http://schemas.microsoft.com/office/drawing/2014/chartex" xmlns:cx1="http://schemas.microsoft.com/office/drawing/2015/9/8/chartex" xmlns:cx2="http://schemas.microsoft.com/office/drawing/2015/10/21/chartex" xmlns:cx3="http://schemas.microsoft.com/office/drawing/2016/5/9/chartex" xmlns:cx4="http://schemas.microsoft.com/office/drawing/2016/5/10/chartex" xmlns:cx5="http://schemas.microsoft.com/office/drawing/2016/5/11/chartex" xmlns:cx6="http://schemas.microsoft.com/office/drawing/2016/5/12/chartex" xmlns:cx7="http://schemas.microsoft.com/office/drawing/2016/5/13/chartex" xmlns:cx8="http://schemas.microsoft.com/office/drawing/2016/5/14/chartex" xmlns:mc="http://schemas.openxmlformats.org/markup-compatibility/2006" xmlns:aink="http://schemas.microsoft.com/office/drawing/2016/ink" xmlns:am3d="http://schemas.microsoft.com/office/drawing/2017/model3d" xmlns:o="urn:schemas-microsoft-com:office:office" xmlns:oel="http://schemas.microsoft.com/office/2019/extlst" xmlns:r="http://schemas.openxmlformats.org/officeDocument/2006/relationships" xmlns:m="http://schemas.openxmlformats.org/officeDocument/2006/math" xmlns:v="urn:schemas-microsoft-com:vml" xmlns:wp14="http://schemas.microsoft.com/office/word/2010/wordprocessingDrawing" xmlns:wp="http://schemas.openxmlformats.org/drawingml/2006/wordprocessingDrawing" xmlns:w10="urn:schemas-microsoft-com:office:word" xmlns:w="http://schemas.openxmlformats.org/wordprocessingml/2006/main" xmlns:w14="http://schemas.microsoft.com/office/word/2010/wordml" xmlns:w15="http://schemas.microsoft.com/office/word/2012/wordml" xmlns:w16cex="http://schemas.microsoft.com/office/word/2018/wordml/cex" xmlns:w16cid="http://schemas.microsoft.com/office/word/2016/wordml/cid" xmlns:w16="http://schemas.microsoft.com/office/word/2018/wordml" xmlns:w16du="http://schemas.microsoft.com/office/word/2023/wordml/word16du" xmlns:w16sdtdh="http://schemas.microsoft.com/office/word/2020/wordml/sdtdatahash" xmlns:w16sdtfl="http://schemas.microsoft.com/office/word/2024/wordml/sdtformatlock" xmlns:w16se="http://schemas.microsoft.com/office/word/2015/wordml/symex" xmlns:wpg="http://schemas.microsoft.com/office/word/2010/wordprocessingGroup" xmlns:wpi="http://schemas.microsoft.com/office/word/2010/wordprocessingInk" xmlns:wne="http://schemas.microsoft.com/office/word/2006/wordml" xmlns:wps="http://schemas.microsoft.com/office/word/2010/wordprocessingShape" mc:Ignorable="w14 w15 w16se w16cid w16 w16cex w16sdtdh w16sdtfl w16du wp14">
   <w:abstractNum w:abstractNumId="0" w15:restartNumberingAfterBreak="0">
-    <w:nsid w:val="1F345838"/>
+    <w:nsid w:val="17803430"/>
     <w:multiLevelType w:val="hybridMultilevel"/>
-    <w:tmpl w:val="B99C3D72"/>
-    <w:lvl w:ilvl="0" w:tplc="D33E911C" w:tentative="1">
+    <w:tmpl w:val="8A80E7FC"/>
+    <w:lvl w:ilvl="0" w:tplc="3B7EB704" w:tentative="1">
+      <w:start w:val="1"/>
+      <w:numFmt w:val="bullet"/>
+      <w:lvlText w:val="•"/>
+      <w:lvlJc w:val="left"/>
+      <w:pPr>
+        <w:ind w:left="720" w:hanging="280"/>
+      </w:pPr>
+    </w:lvl>
+    <w:lvl w:ilvl="1" w:tplc="BCF81BE2" w:tentative="1">
+      <w:start w:val="1"/>
+      <w:numFmt w:val="bullet"/>
+      <w:lvlText w:val="–"/>
+      <w:lvlJc w:val="left"/>
+      <w:pPr>
+        <w:ind w:left="1080" w:hanging="280"/>
+      </w:pPr>
+    </w:lvl>
+    <w:lvl w:ilvl="2" w:tplc="0B66AE72" w:tentative="1">
+      <w:start w:val="1"/>
+      <w:numFmt w:val="bullet"/>
+      <w:lvlText w:val="▪"/>
+      <w:lvlJc w:val="left"/>
+      <w:pPr>
+        <w:ind w:left="1440" w:hanging="280"/>
+      </w:pPr>
+    </w:lvl>
+    <w:lvl w:ilvl="3" w:tplc="00868E30">
+      <w:numFmt w:val="decimal"/>
+      <w:lvlText w:val=""/>
+      <w:lvlJc w:val="left"/>
+    </w:lvl>
+    <w:lvl w:ilvl="4" w:tplc="34701B94">
+      <w:numFmt w:val="decimal"/>
+      <w:lvlText w:val=""/>
+      <w:lvlJc w:val="left"/>
+    </w:lvl>
+    <w:lvl w:ilvl="5" w:tplc="685E6C6C">
+      <w:numFmt w:val="decimal"/>
+      <w:lvlText w:val=""/>
+      <w:lvlJc w:val="left"/>
+    </w:lvl>
+    <w:lvl w:ilvl="6" w:tplc="D24EB12A">
+      <w:numFmt w:val="decimal"/>
+      <w:lvlText w:val=""/>
+      <w:lvlJc w:val="left"/>
+    </w:lvl>
+    <w:lvl w:ilvl="7" w:tplc="4586B866">
+      <w:numFmt w:val="decimal"/>
+      <w:lvlText w:val=""/>
+      <w:lvlJc w:val="left"/>
+    </w:lvl>
+    <w:lvl w:ilvl="8" w:tplc="A788AC64">
+      <w:numFmt w:val="decimal"/>
+      <w:lvlText w:val=""/>
+      <w:lvlJc w:val="left"/>
+    </w:lvl>
+  </w:abstractNum>
+  <w:abstractNum w:abstractNumId="1" w15:restartNumberingAfterBreak="0">
+    <w:nsid w:val="24311C47"/>
+    <w:multiLevelType w:val="hybridMultilevel"/>
+    <w:tmpl w:val="1AE4F71E"/>
+    <w:lvl w:ilvl="0" w:tplc="C11A96C2" w:tentative="1">
+      <w:start w:val="1"/>
+      <w:numFmt w:val="decimal"/>
+      <w:lvlText w:val="%1."/>
+      <w:lvlJc w:val="left"/>
+      <w:pPr>
+        <w:ind w:left="720" w:hanging="360"/>
+      </w:pPr>
+    </w:lvl>
+    <w:lvl w:ilvl="1" w:tplc="04CEAA58" w:tentative="1">
+      <w:start w:val="1"/>
+      <w:numFmt w:val="lowerLetter"/>
+      <w:lvlText w:val="%2."/>
+      <w:lvlJc w:val="left"/>
+      <w:pPr>
+        <w:ind w:left="1080" w:hanging="360"/>
+      </w:pPr>
+    </w:lvl>
+    <w:lvl w:ilvl="2" w:tplc="6FB0541E" w:tentative="1">
+      <w:start w:val="1"/>
+      <w:numFmt w:val="lowerRoman"/>
+      <w:lvlText w:val="%3."/>
+      <w:lvlJc w:val="left"/>
+      <w:pPr>
+        <w:ind w:left="1440" w:hanging="360"/>
+      </w:pPr>
+    </w:lvl>
+    <w:lvl w:ilvl="3" w:tplc="5D0CECD6">
+      <w:numFmt w:val="decimal"/>
+      <w:lvlText w:val=""/>
+      <w:lvlJc w:val="left"/>
+    </w:lvl>
+    <w:lvl w:ilvl="4" w:tplc="6CEAB6AC">
+      <w:numFmt w:val="decimal"/>
+      <w:lvlText w:val=""/>
+      <w:lvlJc w:val="left"/>
+    </w:lvl>
+    <w:lvl w:ilvl="5" w:tplc="90E4F49E">
+      <w:numFmt w:val="decimal"/>
+      <w:lvlText w:val=""/>
+      <w:lvlJc w:val="left"/>
+    </w:lvl>
+    <w:lvl w:ilvl="6" w:tplc="F81E3130">
+      <w:numFmt w:val="decimal"/>
+      <w:lvlText w:val=""/>
+      <w:lvlJc w:val="left"/>
+    </w:lvl>
+    <w:lvl w:ilvl="7" w:tplc="82240B26">
+      <w:numFmt w:val="decimal"/>
+      <w:lvlText w:val=""/>
+      <w:lvlJc w:val="left"/>
+    </w:lvl>
+    <w:lvl w:ilvl="8" w:tplc="13F6248E">
+      <w:numFmt w:val="decimal"/>
+      <w:lvlText w:val=""/>
+      <w:lvlJc w:val="left"/>
+    </w:lvl>
+  </w:abstractNum>
+  <w:abstractNum w:abstractNumId="2" w15:restartNumberingAfterBreak="0">
+    <w:nsid w:val="45C27594"/>
+    <w:multiLevelType w:val="hybridMultilevel"/>
+    <w:tmpl w:val="85F6ADDC"/>
+    <w:lvl w:ilvl="0" w:tplc="539295A8" w:tentative="1">
       <w:start w:val="1"/>
       <w:numFmt w:val="bullet"/>
       <w:lvlText w:val="●"/>
@@ -39445,7 +39831,7 @@
         <w:ind w:left="720" w:hanging="360"/>
       </w:pPr>
     </w:lvl>
-    <w:lvl w:ilvl="1" w:tplc="526433FC" w:tentative="1">
+    <w:lvl w:ilvl="1" w:tplc="E17E1AEC" w:tentative="1">
       <w:start w:val="1"/>
       <w:numFmt w:val="bullet"/>
       <w:lvlText w:val="○"/>
@@ -39454,7 +39840,7 @@
         <w:ind w:left="1440" w:hanging="360"/>
       </w:pPr>
     </w:lvl>
-    <w:lvl w:ilvl="2" w:tplc="C5D29600" w:tentative="1">
+    <w:lvl w:ilvl="2" w:tplc="53F06DC6" w:tentative="1">
       <w:start w:val="1"/>
       <w:numFmt w:val="bullet"/>
       <w:lvlText w:val="■"/>
@@ -39463,7 +39849,7 @@
         <w:ind w:left="2160" w:hanging="360"/>
       </w:pPr>
     </w:lvl>
-    <w:lvl w:ilvl="3" w:tplc="237CD662" w:tentative="1">
+    <w:lvl w:ilvl="3" w:tplc="A27C10D2" w:tentative="1">
       <w:start w:val="1"/>
       <w:numFmt w:val="bullet"/>
       <w:lvlText w:val="●"/>
@@ -39472,7 +39858,7 @@
         <w:ind w:left="2880" w:hanging="360"/>
       </w:pPr>
     </w:lvl>
-    <w:lvl w:ilvl="4" w:tplc="2652A3A8" w:tentative="1">
+    <w:lvl w:ilvl="4" w:tplc="C48817A6" w:tentative="1">
       <w:start w:val="1"/>
       <w:numFmt w:val="bullet"/>
       <w:lvlText w:val="○"/>
@@ -39481,7 +39867,7 @@
         <w:ind w:left="3600" w:hanging="360"/>
       </w:pPr>
     </w:lvl>
-    <w:lvl w:ilvl="5" w:tplc="E83AAC2C" w:tentative="1">
+    <w:lvl w:ilvl="5" w:tplc="A4585D28" w:tentative="1">
       <w:start w:val="1"/>
       <w:numFmt w:val="bullet"/>
       <w:lvlText w:val="■"/>
@@ -39490,7 +39876,7 @@
         <w:ind w:left="4320" w:hanging="360"/>
       </w:pPr>
     </w:lvl>
-    <w:lvl w:ilvl="6" w:tplc="A0847D78" w:tentative="1">
+    <w:lvl w:ilvl="6" w:tplc="1BE443C4" w:tentative="1">
       <w:start w:val="1"/>
       <w:numFmt w:val="bullet"/>
       <w:lvlText w:val="●"/>
@@ -39499,7 +39885,7 @@
         <w:ind w:left="5040" w:hanging="360"/>
       </w:pPr>
     </w:lvl>
-    <w:lvl w:ilvl="7" w:tplc="D68C5380" w:tentative="1">
+    <w:lvl w:ilvl="7" w:tplc="1D26C44A" w:tentative="1">
       <w:start w:val="1"/>
       <w:numFmt w:val="bullet"/>
       <w:lvlText w:val="●"/>
@@ -39508,7 +39894,7 @@
         <w:ind w:left="5760" w:hanging="360"/>
       </w:pPr>
     </w:lvl>
-    <w:lvl w:ilvl="8" w:tplc="EB92C27C" w:tentative="1">
+    <w:lvl w:ilvl="8" w:tplc="BF745DC8" w:tentative="1">
       <w:start w:val="1"/>
       <w:numFmt w:val="bullet"/>
       <w:lvlText w:val="●"/>
@@ -39518,132 +39904,8 @@
       </w:pPr>
     </w:lvl>
   </w:abstractNum>
-  <w:abstractNum w:abstractNumId="1" w15:restartNumberingAfterBreak="0">
-    <w:nsid w:val="641C44A1"/>
-    <w:multiLevelType w:val="hybridMultilevel"/>
-    <w:tmpl w:val="1D0E1EEC"/>
-    <w:lvl w:ilvl="0" w:tplc="C2C4909C" w:tentative="1">
-      <w:start w:val="1"/>
-      <w:numFmt w:val="decimal"/>
-      <w:lvlText w:val="%1."/>
-      <w:lvlJc w:val="left"/>
-      <w:pPr>
-        <w:ind w:left="720" w:hanging="360"/>
-      </w:pPr>
-    </w:lvl>
-    <w:lvl w:ilvl="1" w:tplc="5CBE4BE2" w:tentative="1">
-      <w:start w:val="1"/>
-      <w:numFmt w:val="lowerLetter"/>
-      <w:lvlText w:val="%2."/>
-      <w:lvlJc w:val="left"/>
-      <w:pPr>
-        <w:ind w:left="1080" w:hanging="360"/>
-      </w:pPr>
-    </w:lvl>
-    <w:lvl w:ilvl="2" w:tplc="8BB883C2" w:tentative="1">
-      <w:start w:val="1"/>
-      <w:numFmt w:val="lowerRoman"/>
-      <w:lvlText w:val="%3."/>
-      <w:lvlJc w:val="left"/>
-      <w:pPr>
-        <w:ind w:left="1440" w:hanging="360"/>
-      </w:pPr>
-    </w:lvl>
-    <w:lvl w:ilvl="3" w:tplc="25F0E602">
-      <w:numFmt w:val="decimal"/>
-      <w:lvlText w:val=""/>
-      <w:lvlJc w:val="left"/>
-    </w:lvl>
-    <w:lvl w:ilvl="4" w:tplc="589AA0E2">
-      <w:numFmt w:val="decimal"/>
-      <w:lvlText w:val=""/>
-      <w:lvlJc w:val="left"/>
-    </w:lvl>
-    <w:lvl w:ilvl="5" w:tplc="6E9008BE">
-      <w:numFmt w:val="decimal"/>
-      <w:lvlText w:val=""/>
-      <w:lvlJc w:val="left"/>
-    </w:lvl>
-    <w:lvl w:ilvl="6" w:tplc="DE248DF0">
-      <w:numFmt w:val="decimal"/>
-      <w:lvlText w:val=""/>
-      <w:lvlJc w:val="left"/>
-    </w:lvl>
-    <w:lvl w:ilvl="7" w:tplc="D6922FEA">
-      <w:numFmt w:val="decimal"/>
-      <w:lvlText w:val=""/>
-      <w:lvlJc w:val="left"/>
-    </w:lvl>
-    <w:lvl w:ilvl="8" w:tplc="ABE4F788">
-      <w:numFmt w:val="decimal"/>
-      <w:lvlText w:val=""/>
-      <w:lvlJc w:val="left"/>
-    </w:lvl>
-  </w:abstractNum>
-  <w:abstractNum w:abstractNumId="2" w15:restartNumberingAfterBreak="0">
-    <w:nsid w:val="6BA86892"/>
-    <w:multiLevelType w:val="hybridMultilevel"/>
-    <w:tmpl w:val="F3940B8E"/>
-    <w:lvl w:ilvl="0" w:tplc="B0DC9C58" w:tentative="1">
-      <w:start w:val="1"/>
-      <w:numFmt w:val="bullet"/>
-      <w:lvlText w:val="•"/>
-      <w:lvlJc w:val="left"/>
-      <w:pPr>
-        <w:ind w:left="720" w:hanging="280"/>
-      </w:pPr>
-    </w:lvl>
-    <w:lvl w:ilvl="1" w:tplc="8ADA4888" w:tentative="1">
-      <w:start w:val="1"/>
-      <w:numFmt w:val="bullet"/>
-      <w:lvlText w:val="–"/>
-      <w:lvlJc w:val="left"/>
-      <w:pPr>
-        <w:ind w:left="1080" w:hanging="280"/>
-      </w:pPr>
-    </w:lvl>
-    <w:lvl w:ilvl="2" w:tplc="05EA48B6" w:tentative="1">
-      <w:start w:val="1"/>
-      <w:numFmt w:val="bullet"/>
-      <w:lvlText w:val="▪"/>
-      <w:lvlJc w:val="left"/>
-      <w:pPr>
-        <w:ind w:left="1440" w:hanging="280"/>
-      </w:pPr>
-    </w:lvl>
-    <w:lvl w:ilvl="3" w:tplc="BF0A9C80">
-      <w:numFmt w:val="decimal"/>
-      <w:lvlText w:val=""/>
-      <w:lvlJc w:val="left"/>
-    </w:lvl>
-    <w:lvl w:ilvl="4" w:tplc="42366352">
-      <w:numFmt w:val="decimal"/>
-      <w:lvlText w:val=""/>
-      <w:lvlJc w:val="left"/>
-    </w:lvl>
-    <w:lvl w:ilvl="5" w:tplc="C72EBB5C">
-      <w:numFmt w:val="decimal"/>
-      <w:lvlText w:val=""/>
-      <w:lvlJc w:val="left"/>
-    </w:lvl>
-    <w:lvl w:ilvl="6" w:tplc="62528228">
-      <w:numFmt w:val="decimal"/>
-      <w:lvlText w:val=""/>
-      <w:lvlJc w:val="left"/>
-    </w:lvl>
-    <w:lvl w:ilvl="7" w:tplc="C9E60CE4">
-      <w:numFmt w:val="decimal"/>
-      <w:lvlText w:val=""/>
-      <w:lvlJc w:val="left"/>
-    </w:lvl>
-    <w:lvl w:ilvl="8" w:tplc="007E3280">
-      <w:numFmt w:val="decimal"/>
-      <w:lvlText w:val=""/>
-      <w:lvlJc w:val="left"/>
-    </w:lvl>
-  </w:abstractNum>
-  <w:num w:numId="1" w16cid:durableId="1563642546">
-    <w:abstractNumId w:val="0"/>
+  <w:num w:numId="1" w16cid:durableId="1587886448">
+    <w:abstractNumId w:val="2"/>
     <w:lvlOverride w:ilvl="0">
       <w:startOverride w:val="1"/>
     </w:lvlOverride>
@@ -40347,7 +40609,7 @@
     <w:autoRedefine/>
     <w:uiPriority w:val="39"/>
     <w:unhideWhenUsed/>
-    <w:rsid w:val="00A73AEC"/>
+    <w:rsid w:val="00C4180B"/>
     <w:pPr>
       <w:spacing w:after="100"/>
     </w:pPr>
@@ -40359,7 +40621,7 @@
     <w:autoRedefine/>
     <w:uiPriority w:val="39"/>
     <w:unhideWhenUsed/>
-    <w:rsid w:val="00A73AEC"/>
+    <w:rsid w:val="00C4180B"/>
     <w:pPr>
       <w:spacing w:after="100"/>
       <w:ind w:left="210"/>
@@ -40371,7 +40633,7 @@
     <w:next w:val="Normal"/>
     <w:uiPriority w:val="99"/>
     <w:unhideWhenUsed/>
-    <w:rsid w:val="00A73AEC"/>
+    <w:rsid w:val="00C4180B"/>
   </w:style>
 </w:styles>
 </file>

</xml_diff>